<commit_message>
Context section added and completed
Will check over it again tomorrow for spelling and sanity
</commit_message>
<xml_diff>
--- a/COMP 3000.docx
+++ b/COMP 3000.docx
@@ -3143,13 +3143,23 @@
     </w:p>
     <w:p>
       <w:r>
-        <w:t xml:space="preserve">The more traditional form of a NIDS is signature-based where traffic is compared against a database of rules or signatures which makes it an effective tool against established threats. This gives them a high precision against known threats and has a low false positive </w:t>
-      </w:r>
-      <w:proofErr w:type="gramStart"/>
-      <w:r>
-        <w:t>rate, but</w:t>
-      </w:r>
-      <w:proofErr w:type="gramEnd"/>
+        <w:t>The more traditional form of a N</w:t>
+      </w:r>
+      <w:r>
+        <w:t>etwork Intrusion Detection System (N</w:t>
+      </w:r>
+      <w:r>
+        <w:t>IDS</w:t>
+      </w:r>
+      <w:r>
+        <w:t>)</w:t>
+      </w:r>
+      <w:r>
+        <w:t xml:space="preserve"> is signature-based where traffic is compared against a database of rules or signatures which makes it an effective tool against established threats. This gives them a high precision against known threats and has a low false positive </w:t>
+      </w:r>
+      <w:r>
+        <w:t>rate but</w:t>
+      </w:r>
       <w:r>
         <w:t xml:space="preserve"> suffers against new types of attacks as the database needs to be manually updated to deal with new threats.</w:t>
       </w:r>
@@ -3182,6 +3192,69 @@
       </w:r>
       <w:bookmarkEnd w:id="4"/>
     </w:p>
+    <w:p>
+      <w:r>
+        <w:t>Within the current cybersecurity landscape, intrusion detection play a vital role by identifying potentially malicious traffic within a network</w:t>
+      </w:r>
+      <w:r>
+        <w:t xml:space="preserve">. Network Intrusion detection Systems monitor network traffic and analyses and learns patterns to help detect unauthorized access or suspicious activity. A majority of these systems rely on signature-based detection, with the traffic being compared against a list of known attack signatures. </w:t>
+      </w:r>
+    </w:p>
+    <w:p>
+      <w:r>
+        <w:t xml:space="preserve">Some of the most widely used tools make use of </w:t>
+      </w:r>
+      <w:r>
+        <w:t>signature-based</w:t>
+      </w:r>
+      <w:r>
+        <w:t xml:space="preserve"> detection, examples of these being Snort and Suricata, both of which are open source and widely used by private users and organizations. These tools are very good at detecting attacks that have been previously </w:t>
+      </w:r>
+      <w:r>
+        <w:t>documented,</w:t>
+      </w:r>
+      <w:r>
+        <w:t xml:space="preserve"> and the system has been updated to detect</w:t>
+      </w:r>
+      <w:r>
+        <w:t xml:space="preserve">. </w:t>
+      </w:r>
+    </w:p>
+    <w:p>
+      <w:r>
+        <w:t>As cybercrime grows ever more profitable and with the incident rate of cyber crime rising by 37% over the past five years (Bridewell, 2026), the different attack types and vectors continue to evolve, with attackers modifying previously used techniques or developing new attacks using exploits not commonly known, meaning that the signature-based system can’t be updated to detect these attacks. This creates big problems for signature-based systems as attacks that haven’t yet been seen may bypass the detection systems.</w:t>
+      </w:r>
+    </w:p>
+    <w:p>
+      <w:r>
+        <w:t>Alongside the new and changing threats, modern networks generate and receive immensely large volumes of traffic due to the recent growth in cloud services, online services, and personal devices. Monitoring such a large amount of traffic data is unfeasible for an analyst to manage in</w:t>
+      </w:r>
+      <w:r>
+        <w:t xml:space="preserve"> a timely manner that would allow them to respond to an attack and the signature-based systems may also struggle with the highly complex and widely differing traffic patterns.</w:t>
+      </w:r>
+    </w:p>
+    <w:p>
+      <w:r>
+        <w:t>Recent research studies have explored the use of ma</w:t>
+      </w:r>
+      <w:r>
+        <w:t xml:space="preserve">chine learning in order to enhance security detection such as the article Machine Learning for Network Intrusion Detection-A Comparative Study </w:t>
+      </w:r>
+      <w:r>
+        <w:t>(Al Lail, Garcia and Olivo, 2023)</w:t>
+      </w:r>
+      <w:r>
+        <w:t xml:space="preserve"> in the study they implemented and evaluated a number of machine learning algorithms against the CICIDS-2017 dataset and were able to achieve detection rates of 97%. This article helps to demonstrate that machine learning models can analyse large datasets of network traffic and identify both normal and malicious traffic with very high accuracy. And unlike </w:t>
+      </w:r>
+      <w:r>
+        <w:t>pure signature-based detection, has the potential to identify new attacks by recognising anomalous patterns of network activity.</w:t>
+      </w:r>
+    </w:p>
+    <w:p>
+      <w:r>
+        <w:t>With this context established, this project focuses on the development of a machine learning based Network Intrusion Detection System that can analyse network traffic data and identify and score suspicious behaviour based on its perceived risk. This aims to demonstrate the use of machine learning in network security and test the effectiveness of it when trained on a machine with modern day middle ground specifications.</w:t>
+      </w:r>
+    </w:p>
     <w:p/>
     <w:p>
       <w:pPr>
@@ -3299,12 +3372,10 @@
         <w:pStyle w:val="Heading3"/>
       </w:pPr>
       <w:bookmarkStart w:id="16" w:name="_Toc223507573"/>
-      <w:proofErr w:type="spellStart"/>
       <w:r>
         <w:t>Github</w:t>
       </w:r>
       <w:bookmarkEnd w:id="16"/>
-      <w:proofErr w:type="spellEnd"/>
     </w:p>
     <w:p>
       <w:pPr>
@@ -3572,7 +3643,16 @@
     </w:p>
     <w:p>
       <w:r>
-        <w:t xml:space="preserve">Cloudflare 2025 Year in Review. Available at </w:t>
+        <w:t>Cloudflare, “</w:t>
+      </w:r>
+      <w:r>
+        <w:t>Cloudflare 2025 Year in Review</w:t>
+      </w:r>
+      <w:r>
+        <w:t>”</w:t>
+      </w:r>
+      <w:r>
+        <w:t xml:space="preserve">. Available at </w:t>
       </w:r>
       <w:hyperlink r:id="rId5" w:history="1">
         <w:r>
@@ -3584,6 +3664,43 @@
       </w:hyperlink>
       <w:r>
         <w:t xml:space="preserve"> (Accessed15/03/2026)</w:t>
+      </w:r>
+    </w:p>
+    <w:p>
+      <w:r>
+        <w:t>UK Public Cyber Crime Incidents Rise 37% Over Five Years</w:t>
+      </w:r>
+      <w:r>
+        <w:t>. Available at:</w:t>
+      </w:r>
+      <w:r>
+        <w:t xml:space="preserve"> </w:t>
+      </w:r>
+      <w:hyperlink r:id="rId6" w:history="1">
+        <w:r>
+          <w:rPr>
+            <w:rStyle w:val="Hyperlink"/>
+          </w:rPr>
+          <w:t>https://www.bridewell.com/insights/blogs/detail/uk-public-cyber-crime-incidents-rise-37--over-five-years</w:t>
+        </w:r>
+      </w:hyperlink>
+      <w:r>
+        <w:t xml:space="preserve"> (Accessed 16/03/2026) </w:t>
+      </w:r>
+    </w:p>
+    <w:p>
+      <w:r>
+        <w:t xml:space="preserve">Al Lail, M., Garcia, A. and Olivo, S. (2023) ‘Machine Learning for Network Intrusion Detection—A Comparative Study’, </w:t>
+      </w:r>
+      <w:r>
+        <w:rPr>
+          <w:i/>
+          <w:iCs/>
+        </w:rPr>
+        <w:t>Future Internet</w:t>
+      </w:r>
+      <w:r>
+        <w:t>, 15(7), p. 243. Available at: https://www.mdpi.com/1999-5903/15/7/243</w:t>
       </w:r>
     </w:p>
     <w:p>
@@ -4209,7 +4326,6 @@
   <w:style w:type="character" w:default="1" w:styleId="DefaultParagraphFont">
     <w:name w:val="Default Paragraph Font"/>
     <w:uiPriority w:val="1"/>
-    <w:semiHidden/>
     <w:unhideWhenUsed/>
   </w:style>
   <w:style w:type="table" w:default="1" w:styleId="TableNormal">

</xml_diff>

<commit_message>
Work started on LSEP section
</commit_message>
<xml_diff>
--- a/COMP 3000.docx
+++ b/COMP 3000.docx
@@ -3639,15 +3639,7 @@
         <w:t>Within the current cybersecurity landscape, intrusion detection play a vital role by identifying potentially malicious traffic within a network</w:t>
       </w:r>
       <w:r>
-        <w:t xml:space="preserve">. Network Intrusion detection Systems monitor network traffic and analyses and learns patterns to help detect unauthorized access or suspicious activity. </w:t>
-      </w:r>
-      <w:proofErr w:type="gramStart"/>
-      <w:r>
-        <w:t>A majority of</w:t>
-      </w:r>
-      <w:proofErr w:type="gramEnd"/>
-      <w:r>
-        <w:t xml:space="preserve"> these systems rely on signature-based detection, with the traffic being compared against a list of known attack signatures. </w:t>
+        <w:t xml:space="preserve">. Network Intrusion detection Systems monitor network traffic and analyses and learns patterns to help detect unauthorized access or suspicious activity. A majority of these systems rely on signature-based detection, with the traffic being compared against a list of known attack signatures. </w:t>
       </w:r>
     </w:p>
     <w:p>
@@ -3743,13 +3735,8 @@
       </w:r>
     </w:p>
     <w:p>
-      <w:proofErr w:type="gramStart"/>
-      <w:r>
-        <w:t>In order to</w:t>
-      </w:r>
-      <w:proofErr w:type="gramEnd"/>
-      <w:r>
-        <w:t xml:space="preserve"> achieve my aim, my project will tackle the following objectives</w:t>
+      <w:r>
+        <w:t>In order to achieve my aim, my project will tackle the following objectives</w:t>
       </w:r>
     </w:p>
     <w:p>
@@ -3768,15 +3755,7 @@
         <w:t>Investigate pre-existing intrusion detection approaches,</w:t>
       </w:r>
       <w:r>
-        <w:t xml:space="preserve"> notably signature-based and anomaly-based intrusion detection </w:t>
-      </w:r>
-      <w:proofErr w:type="gramStart"/>
-      <w:r>
-        <w:t>systems, and</w:t>
-      </w:r>
-      <w:proofErr w:type="gramEnd"/>
-      <w:r>
-        <w:t xml:space="preserve"> discuss the strengths and weaknesses.</w:t>
+        <w:t xml:space="preserve"> notably signature-based and anomaly-based intrusion detection systems, and discuss the strengths and weaknesses.</w:t>
       </w:r>
     </w:p>
     <w:p>
@@ -3813,13 +3792,8 @@
         </w:rPr>
         <w:t xml:space="preserve">Select an appropriate NIDS training and testing dataset and preprocess as needed, </w:t>
       </w:r>
-      <w:proofErr w:type="gramStart"/>
-      <w:r>
-        <w:t>To</w:t>
-      </w:r>
-      <w:proofErr w:type="gramEnd"/>
-      <w:r>
-        <w:t xml:space="preserve"> ensure features aren’t leaked to bias the machine learning models</w:t>
+      <w:r>
+        <w:t>To ensure features aren’t leaked to bias the machine learning models</w:t>
       </w:r>
       <w:r>
         <w:t>.</w:t>
@@ -3991,15 +3965,7 @@
       </w:r>
       <w:r>
         <w:lastRenderedPageBreak/>
-        <w:t xml:space="preserve">identify insider threats. But this type of monitoring can be very resource intensive as it </w:t>
-      </w:r>
-      <w:proofErr w:type="gramStart"/>
-      <w:r>
-        <w:t>has to</w:t>
-      </w:r>
-      <w:proofErr w:type="gramEnd"/>
-      <w:r>
-        <w:t xml:space="preserve"> be deployed on every device on the network.</w:t>
+        <w:t>identify insider threats. But this type of monitoring can be very resource intensive as it has to be deployed on every device on the network.</w:t>
       </w:r>
     </w:p>
     <w:p>
@@ -4031,80 +3997,120 @@
       <w:bookmarkEnd w:id="6"/>
     </w:p>
     <w:p>
+      <w:r>
+        <w:t>There are a number of already existing applications that make use of AI for network intrusion detection</w:t>
+      </w:r>
+      <w:r>
+        <w:t>, and example of this usage is Suricata, Suricata makes use of isolation forest models for its threat detection, allowing it to run alongside Suricata’s signature based detection systems, allowing them to offer an easily accessible hybrid detection system.</w:t>
+      </w:r>
+    </w:p>
+    <w:p>
+      <w:r>
+        <w:t xml:space="preserve">Another example of AI usage is from snort, one of the most commonly used </w:t>
+      </w:r>
+      <w:r>
+        <w:t>open-source intrusion detection systems, that traditionally makes use of signature-based detection for its systems, has introduced Snort_ML which uses neural networks instead of the traditional rule sets.</w:t>
+      </w:r>
+    </w:p>
+    <w:p>
+      <w:r>
+        <w:t>The fact that two of the biggest open source IDS providers are shifting towards ML for detection, starts to show where the industry is starting to turn, favouring hybrid or AI systems rather than just having signature based systems.</w:t>
+      </w:r>
+    </w:p>
+    <w:p>
       <w:pPr>
         <w:pStyle w:val="Heading2"/>
       </w:pPr>
-      <w:bookmarkStart w:id="7" w:name="_Toc224653780"/>
-      <w:r>
-        <w:t>Examples</w:t>
+    </w:p>
+    <w:p>
+      <w:pPr>
+        <w:pStyle w:val="Heading2"/>
+      </w:pPr>
+      <w:bookmarkStart w:id="7" w:name="_Toc224653781"/>
+      <w:r>
+        <w:t>Legal, Social, Ethical, Professional(LSEP)</w:t>
       </w:r>
       <w:bookmarkEnd w:id="7"/>
     </w:p>
     <w:p>
+      <w:r>
+        <w:t>There is a number of legal problems that AI  face</w:t>
+      </w:r>
+      <w:r>
+        <w:t>s</w:t>
+      </w:r>
+      <w:r>
+        <w:t>, one of the most common is gaining proper access to the data needed to train the model, within the AI IDS field there are 2 types of data that is used to train the model, synthetic and real</w:t>
+      </w:r>
+      <w:r>
+        <w:t>, synthetic tends to be the most common type of training data available, an example of this is the UNSW NB-15, that is generally only available for usage in academic environments due to the licensing, meaning that commercially that you aren’t legally allowed to use it without direct permission from the researchers that developed it.</w:t>
+      </w:r>
+    </w:p>
+    <w:p>
+      <w:pPr>
+        <w:pStyle w:val="Heading1"/>
+      </w:pPr>
+      <w:bookmarkStart w:id="8" w:name="_Toc224653782"/>
+      <w:r>
+        <w:t>Project Management</w:t>
+      </w:r>
+      <w:bookmarkEnd w:id="8"/>
+    </w:p>
+    <w:p>
       <w:pPr>
         <w:pStyle w:val="Heading2"/>
       </w:pPr>
-      <w:bookmarkStart w:id="8" w:name="_Toc224653781"/>
-      <w:r>
-        <w:t>Legal, Social, Ethical, Professional(LSEP)</w:t>
-      </w:r>
-      <w:bookmarkEnd w:id="8"/>
-    </w:p>
+      <w:bookmarkStart w:id="9" w:name="_Toc224653779"/>
+      <w:bookmarkStart w:id="10" w:name="_Toc224653783"/>
+      <w:r>
+        <w:t>Implementation Method</w:t>
+      </w:r>
+      <w:bookmarkEnd w:id="9"/>
+    </w:p>
+    <w:p>
+      <w:pPr>
+        <w:pStyle w:val="Heading2"/>
+      </w:pPr>
+      <w:r>
+        <w:t>Agile</w:t>
+      </w:r>
+      <w:bookmarkEnd w:id="10"/>
+      <w:r>
+        <w:t xml:space="preserve"> Development Methodology</w:t>
+      </w:r>
+    </w:p>
+    <w:p/>
     <w:p>
       <w:pPr>
         <w:pStyle w:val="Heading1"/>
       </w:pPr>
-      <w:bookmarkStart w:id="9" w:name="_Toc224653782"/>
-      <w:r>
-        <w:t>Project Management</w:t>
-      </w:r>
-      <w:bookmarkEnd w:id="9"/>
-    </w:p>
-    <w:p>
-      <w:pPr>
-        <w:pStyle w:val="Heading2"/>
-      </w:pPr>
-      <w:bookmarkStart w:id="10" w:name="_Toc224653783"/>
-      <w:bookmarkStart w:id="11" w:name="_Toc224653779"/>
-      <w:r>
-        <w:t>Implementation Method</w:t>
-      </w:r>
-      <w:bookmarkEnd w:id="11"/>
-    </w:p>
-    <w:p>
-      <w:pPr>
-        <w:pStyle w:val="Heading2"/>
-      </w:pPr>
-      <w:r>
-        <w:t>Agile</w:t>
-      </w:r>
-      <w:bookmarkEnd w:id="10"/>
-      <w:r>
-        <w:t xml:space="preserve"> Development Methodology</w:t>
-      </w:r>
-    </w:p>
-    <w:p/>
-    <w:p>
-      <w:pPr>
-        <w:pStyle w:val="Heading1"/>
-      </w:pPr>
-      <w:bookmarkStart w:id="12" w:name="_Toc224653784"/>
+      <w:bookmarkStart w:id="11" w:name="_Toc224653784"/>
       <w:r>
         <w:lastRenderedPageBreak/>
         <w:t>Tools Used</w:t>
       </w:r>
+      <w:bookmarkEnd w:id="11"/>
+      <w:r>
+        <w:t xml:space="preserve"> and Technologies</w:t>
+      </w:r>
+    </w:p>
+    <w:p>
+      <w:pPr>
+        <w:pStyle w:val="Heading3"/>
+      </w:pPr>
+      <w:bookmarkStart w:id="12" w:name="_Toc224653785"/>
+      <w:r>
+        <w:t>Python</w:t>
+      </w:r>
       <w:bookmarkEnd w:id="12"/>
-      <w:r>
-        <w:t xml:space="preserve"> and Technologies</w:t>
-      </w:r>
     </w:p>
     <w:p>
       <w:pPr>
         <w:pStyle w:val="Heading3"/>
       </w:pPr>
-      <w:bookmarkStart w:id="13" w:name="_Toc224653785"/>
-      <w:r>
-        <w:t>Python</w:t>
+      <w:bookmarkStart w:id="13" w:name="_Toc224653786"/>
+      <w:r>
+        <w:t>Python Libraries</w:t>
       </w:r>
       <w:bookmarkEnd w:id="13"/>
     </w:p>
@@ -4112,9 +4118,9 @@
       <w:pPr>
         <w:pStyle w:val="Heading3"/>
       </w:pPr>
-      <w:bookmarkStart w:id="14" w:name="_Toc224653786"/>
-      <w:r>
-        <w:t>Python Libraries</w:t>
+      <w:bookmarkStart w:id="14" w:name="_Toc224653787"/>
+      <w:r>
+        <w:t>Jupyter Notebook</w:t>
       </w:r>
       <w:bookmarkEnd w:id="14"/>
     </w:p>
@@ -4122,242 +4128,242 @@
       <w:pPr>
         <w:pStyle w:val="Heading3"/>
       </w:pPr>
-      <w:bookmarkStart w:id="15" w:name="_Toc224653787"/>
-      <w:r>
-        <w:t>Jupyter Notebook</w:t>
+      <w:r>
+        <w:t>GitHub</w:t>
+      </w:r>
+    </w:p>
+    <w:p>
+      <w:pPr>
+        <w:pStyle w:val="Heading1"/>
+      </w:pPr>
+      <w:r>
+        <w:t>Development Requirements</w:t>
+      </w:r>
+    </w:p>
+    <w:p>
+      <w:pPr>
+        <w:pStyle w:val="Heading2"/>
+      </w:pPr>
+      <w:bookmarkStart w:id="15" w:name="_Toc224653790"/>
+      <w:r>
+        <w:t>Functional Requirements</w:t>
       </w:r>
       <w:bookmarkEnd w:id="15"/>
     </w:p>
     <w:p>
       <w:pPr>
+        <w:pStyle w:val="Heading2"/>
+      </w:pPr>
+      <w:bookmarkStart w:id="16" w:name="_Toc224653791"/>
+      <w:r>
+        <w:t>Non-Functional Requirements</w:t>
+      </w:r>
+      <w:bookmarkEnd w:id="16"/>
+    </w:p>
+    <w:p>
+      <w:pPr>
+        <w:pStyle w:val="Heading2"/>
+      </w:pPr>
+      <w:bookmarkStart w:id="17" w:name="_Toc224653792"/>
+      <w:r>
+        <w:t>MVP</w:t>
+      </w:r>
+      <w:bookmarkEnd w:id="17"/>
+    </w:p>
+    <w:p>
+      <w:pPr>
+        <w:pStyle w:val="Heading2"/>
+      </w:pPr>
+      <w:bookmarkStart w:id="18" w:name="_Toc224653793"/>
+      <w:r>
+        <w:t xml:space="preserve">Final Aims and </w:t>
+      </w:r>
+      <w:bookmarkEnd w:id="18"/>
+      <w:r>
+        <w:t>objectives</w:t>
+      </w:r>
+    </w:p>
+    <w:p>
+      <w:pPr>
+        <w:pStyle w:val="Heading2"/>
+      </w:pPr>
+      <w:bookmarkStart w:id="19" w:name="_Toc224653794"/>
+      <w:r>
+        <w:t>Sprint 1</w:t>
+      </w:r>
+      <w:bookmarkEnd w:id="19"/>
+    </w:p>
+    <w:p>
+      <w:pPr>
         <w:pStyle w:val="Heading3"/>
       </w:pPr>
-      <w:r>
-        <w:t>GitHub</w:t>
-      </w:r>
-    </w:p>
-    <w:p>
-      <w:pPr>
-        <w:pStyle w:val="Heading1"/>
-      </w:pPr>
-      <w:r>
-        <w:t>Development Requirements</w:t>
-      </w:r>
+      <w:bookmarkStart w:id="20" w:name="_Toc224653795"/>
+      <w:r>
+        <w:t>Research on development tools</w:t>
+      </w:r>
+      <w:bookmarkEnd w:id="20"/>
+    </w:p>
+    <w:p>
+      <w:pPr>
+        <w:pStyle w:val="Heading3"/>
+      </w:pPr>
+      <w:bookmarkStart w:id="21" w:name="_Toc224653796"/>
+      <w:r>
+        <w:t>Beginning of Accuracy Testing</w:t>
+      </w:r>
+      <w:bookmarkEnd w:id="21"/>
     </w:p>
     <w:p>
       <w:pPr>
         <w:pStyle w:val="Heading2"/>
       </w:pPr>
-      <w:bookmarkStart w:id="16" w:name="_Toc224653790"/>
-      <w:r>
-        <w:t>Functional Requirements</w:t>
-      </w:r>
-      <w:bookmarkEnd w:id="16"/>
+      <w:bookmarkStart w:id="22" w:name="_Toc224653797"/>
+      <w:r>
+        <w:t>Sprint 2</w:t>
+      </w:r>
+      <w:bookmarkEnd w:id="22"/>
+    </w:p>
+    <w:p>
+      <w:pPr>
+        <w:pStyle w:val="Heading3"/>
+      </w:pPr>
+      <w:bookmarkStart w:id="23" w:name="_Toc224653798"/>
+      <w:r>
+        <w:t>Accuracy testing Cont.</w:t>
+      </w:r>
+      <w:bookmarkEnd w:id="23"/>
+    </w:p>
+    <w:p>
+      <w:pPr>
+        <w:pStyle w:val="Heading3"/>
+      </w:pPr>
+      <w:bookmarkStart w:id="24" w:name="_Toc224653799"/>
+      <w:r>
+        <w:t>Issues encountered</w:t>
+      </w:r>
+      <w:bookmarkEnd w:id="24"/>
     </w:p>
     <w:p>
       <w:pPr>
         <w:pStyle w:val="Heading2"/>
       </w:pPr>
-      <w:bookmarkStart w:id="17" w:name="_Toc224653791"/>
-      <w:r>
-        <w:t>Non-Functional Requirements</w:t>
-      </w:r>
-      <w:bookmarkEnd w:id="17"/>
+      <w:bookmarkStart w:id="25" w:name="_Toc224653800"/>
+      <w:r>
+        <w:t>Sprint 3</w:t>
+      </w:r>
+      <w:bookmarkEnd w:id="25"/>
+      <w:r>
+        <w:t xml:space="preserve"> </w:t>
+      </w:r>
+    </w:p>
+    <w:p>
+      <w:pPr>
+        <w:pStyle w:val="Heading3"/>
+      </w:pPr>
+      <w:bookmarkStart w:id="26" w:name="_Toc224653801"/>
+      <w:r>
+        <w:t>Even Further Accuracy Testing</w:t>
+      </w:r>
+      <w:bookmarkEnd w:id="26"/>
+    </w:p>
+    <w:p>
+      <w:pPr>
+        <w:pStyle w:val="Heading3"/>
+      </w:pPr>
+      <w:bookmarkStart w:id="27" w:name="_Toc224653802"/>
+      <w:r>
+        <w:t>Solutions to issues</w:t>
+      </w:r>
+      <w:bookmarkEnd w:id="27"/>
     </w:p>
     <w:p>
       <w:pPr>
         <w:pStyle w:val="Heading2"/>
       </w:pPr>
-      <w:bookmarkStart w:id="18" w:name="_Toc224653792"/>
-      <w:r>
-        <w:t>MVP</w:t>
-      </w:r>
-      <w:bookmarkEnd w:id="18"/>
+      <w:bookmarkStart w:id="28" w:name="_Toc224653803"/>
+      <w:r>
+        <w:t>Sprint 4</w:t>
+      </w:r>
+      <w:bookmarkEnd w:id="28"/>
+    </w:p>
+    <w:p>
+      <w:pPr>
+        <w:pStyle w:val="Heading3"/>
+      </w:pPr>
+      <w:bookmarkStart w:id="29" w:name="_Toc224653804"/>
+      <w:r>
+        <w:t>Extraction of Trained model</w:t>
+      </w:r>
+      <w:bookmarkEnd w:id="29"/>
     </w:p>
     <w:p>
       <w:pPr>
         <w:pStyle w:val="Heading2"/>
       </w:pPr>
-      <w:bookmarkStart w:id="19" w:name="_Toc224653793"/>
-      <w:r>
-        <w:t xml:space="preserve">Final Aims and </w:t>
-      </w:r>
-      <w:bookmarkEnd w:id="19"/>
-      <w:r>
-        <w:t>objectives</w:t>
-      </w:r>
+      <w:bookmarkStart w:id="30" w:name="_Toc224653805"/>
+      <w:r>
+        <w:t>Sprint 5</w:t>
+      </w:r>
+      <w:bookmarkEnd w:id="30"/>
+    </w:p>
+    <w:p>
+      <w:pPr>
+        <w:pStyle w:val="Heading3"/>
+      </w:pPr>
+      <w:bookmarkStart w:id="31" w:name="_Toc224653806"/>
+      <w:r>
+        <w:t>Output for IDS</w:t>
+      </w:r>
+      <w:bookmarkEnd w:id="31"/>
     </w:p>
     <w:p>
       <w:pPr>
         <w:pStyle w:val="Heading2"/>
       </w:pPr>
-      <w:bookmarkStart w:id="20" w:name="_Toc224653794"/>
-      <w:r>
-        <w:t>Sprint 1</w:t>
-      </w:r>
-      <w:bookmarkEnd w:id="20"/>
+      <w:bookmarkStart w:id="32" w:name="_Toc224653807"/>
+      <w:r>
+        <w:t>Sprint 6</w:t>
+      </w:r>
+      <w:bookmarkEnd w:id="32"/>
     </w:p>
     <w:p>
       <w:pPr>
         <w:pStyle w:val="Heading3"/>
       </w:pPr>
-      <w:bookmarkStart w:id="21" w:name="_Toc224653795"/>
-      <w:r>
-        <w:t>Research on development tools</w:t>
-      </w:r>
-      <w:bookmarkEnd w:id="21"/>
-    </w:p>
-    <w:p>
-      <w:pPr>
-        <w:pStyle w:val="Heading3"/>
-      </w:pPr>
-      <w:bookmarkStart w:id="22" w:name="_Toc224653796"/>
-      <w:r>
-        <w:t>Beginning of Accuracy Testing</w:t>
-      </w:r>
-      <w:bookmarkEnd w:id="22"/>
-    </w:p>
-    <w:p>
-      <w:pPr>
-        <w:pStyle w:val="Heading2"/>
-      </w:pPr>
-      <w:bookmarkStart w:id="23" w:name="_Toc224653797"/>
-      <w:r>
-        <w:t>Sprint 2</w:t>
-      </w:r>
-      <w:bookmarkEnd w:id="23"/>
-    </w:p>
-    <w:p>
-      <w:pPr>
-        <w:pStyle w:val="Heading3"/>
-      </w:pPr>
-      <w:bookmarkStart w:id="24" w:name="_Toc224653798"/>
-      <w:r>
-        <w:t>Accuracy testing Cont.</w:t>
-      </w:r>
-      <w:bookmarkEnd w:id="24"/>
-    </w:p>
-    <w:p>
-      <w:pPr>
-        <w:pStyle w:val="Heading3"/>
-      </w:pPr>
-      <w:bookmarkStart w:id="25" w:name="_Toc224653799"/>
-      <w:r>
-        <w:t>Issues encountered</w:t>
-      </w:r>
-      <w:bookmarkEnd w:id="25"/>
-    </w:p>
-    <w:p>
-      <w:pPr>
-        <w:pStyle w:val="Heading2"/>
-      </w:pPr>
-      <w:bookmarkStart w:id="26" w:name="_Toc224653800"/>
-      <w:r>
-        <w:t>Sprint 3</w:t>
-      </w:r>
-      <w:bookmarkEnd w:id="26"/>
-      <w:r>
-        <w:t xml:space="preserve"> </w:t>
-      </w:r>
-    </w:p>
-    <w:p>
-      <w:pPr>
-        <w:pStyle w:val="Heading3"/>
-      </w:pPr>
-      <w:bookmarkStart w:id="27" w:name="_Toc224653801"/>
-      <w:r>
-        <w:t>Even Further Accuracy Testing</w:t>
-      </w:r>
-      <w:bookmarkEnd w:id="27"/>
-    </w:p>
-    <w:p>
-      <w:pPr>
-        <w:pStyle w:val="Heading3"/>
-      </w:pPr>
-      <w:bookmarkStart w:id="28" w:name="_Toc224653802"/>
-      <w:r>
-        <w:t>Solutions to issues</w:t>
-      </w:r>
-      <w:bookmarkEnd w:id="28"/>
-    </w:p>
-    <w:p>
-      <w:pPr>
-        <w:pStyle w:val="Heading2"/>
-      </w:pPr>
-      <w:bookmarkStart w:id="29" w:name="_Toc224653803"/>
-      <w:r>
-        <w:t>Sprint 4</w:t>
-      </w:r>
-      <w:bookmarkEnd w:id="29"/>
-    </w:p>
-    <w:p>
-      <w:pPr>
-        <w:pStyle w:val="Heading3"/>
-      </w:pPr>
-      <w:bookmarkStart w:id="30" w:name="_Toc224653804"/>
-      <w:r>
-        <w:t>Extraction of Trained model</w:t>
-      </w:r>
-      <w:bookmarkEnd w:id="30"/>
-    </w:p>
-    <w:p>
-      <w:pPr>
-        <w:pStyle w:val="Heading2"/>
-      </w:pPr>
-      <w:bookmarkStart w:id="31" w:name="_Toc224653805"/>
-      <w:r>
-        <w:t>Sprint 5</w:t>
-      </w:r>
-      <w:bookmarkEnd w:id="31"/>
-    </w:p>
-    <w:p>
-      <w:pPr>
-        <w:pStyle w:val="Heading3"/>
-      </w:pPr>
-      <w:bookmarkStart w:id="32" w:name="_Toc224653806"/>
-      <w:r>
-        <w:t>Output for IDS</w:t>
-      </w:r>
-      <w:bookmarkEnd w:id="32"/>
-    </w:p>
-    <w:p>
-      <w:pPr>
-        <w:pStyle w:val="Heading2"/>
-      </w:pPr>
-      <w:bookmarkStart w:id="33" w:name="_Toc224653807"/>
-      <w:r>
-        <w:t>Sprint 6</w:t>
-      </w:r>
-      <w:bookmarkEnd w:id="33"/>
-    </w:p>
-    <w:p>
-      <w:pPr>
-        <w:pStyle w:val="Heading3"/>
-      </w:pPr>
-      <w:bookmarkStart w:id="34" w:name="_Toc224653808"/>
+      <w:bookmarkStart w:id="33" w:name="_Toc224653808"/>
       <w:r>
         <w:lastRenderedPageBreak/>
         <w:t>Email Alerts</w:t>
       </w:r>
+      <w:bookmarkEnd w:id="33"/>
+    </w:p>
+    <w:p>
+      <w:pPr>
+        <w:pStyle w:val="Heading2"/>
+      </w:pPr>
+      <w:bookmarkStart w:id="34" w:name="_Toc224653809"/>
+      <w:r>
+        <w:t>Sprint 7</w:t>
+      </w:r>
       <w:bookmarkEnd w:id="34"/>
     </w:p>
     <w:p>
       <w:pPr>
-        <w:pStyle w:val="Heading2"/>
-      </w:pPr>
-      <w:bookmarkStart w:id="35" w:name="_Toc224653809"/>
-      <w:r>
-        <w:t>Sprint 7</w:t>
+        <w:pStyle w:val="Heading3"/>
+      </w:pPr>
+      <w:bookmarkStart w:id="35" w:name="_Toc224653810"/>
+      <w:r>
+        <w:t>End of Development</w:t>
       </w:r>
       <w:bookmarkEnd w:id="35"/>
     </w:p>
     <w:p>
       <w:pPr>
-        <w:pStyle w:val="Heading3"/>
-      </w:pPr>
-      <w:bookmarkStart w:id="36" w:name="_Toc224653810"/>
-      <w:r>
-        <w:t>End of Development</w:t>
+        <w:pStyle w:val="Heading1"/>
+      </w:pPr>
+      <w:bookmarkStart w:id="36" w:name="_Toc224653811"/>
+      <w:r>
+        <w:t>End of Project Report</w:t>
       </w:r>
       <w:bookmarkEnd w:id="36"/>
     </w:p>
@@ -4365,9 +4371,9 @@
       <w:pPr>
         <w:pStyle w:val="Heading1"/>
       </w:pPr>
-      <w:bookmarkStart w:id="37" w:name="_Toc224653811"/>
-      <w:r>
-        <w:t>End of Project Report</w:t>
+      <w:bookmarkStart w:id="37" w:name="_Toc224653812"/>
+      <w:r>
+        <w:t>Project Post-Mortem</w:t>
       </w:r>
       <w:bookmarkEnd w:id="37"/>
     </w:p>
@@ -4375,9 +4381,9 @@
       <w:pPr>
         <w:pStyle w:val="Heading1"/>
       </w:pPr>
-      <w:bookmarkStart w:id="38" w:name="_Toc224653812"/>
-      <w:r>
-        <w:t>Project Post-Mortem</w:t>
+      <w:bookmarkStart w:id="38" w:name="_Toc224653813"/>
+      <w:r>
+        <w:t>Conclusions</w:t>
       </w:r>
       <w:bookmarkEnd w:id="38"/>
     </w:p>
@@ -4385,21 +4391,11 @@
       <w:pPr>
         <w:pStyle w:val="Heading1"/>
       </w:pPr>
-      <w:bookmarkStart w:id="39" w:name="_Toc224653813"/>
-      <w:r>
-        <w:t>Conclusions</w:t>
+      <w:bookmarkStart w:id="39" w:name="_Toc224653814"/>
+      <w:r>
+        <w:t>References</w:t>
       </w:r>
       <w:bookmarkEnd w:id="39"/>
-    </w:p>
-    <w:p>
-      <w:pPr>
-        <w:pStyle w:val="Heading1"/>
-      </w:pPr>
-      <w:bookmarkStart w:id="40" w:name="_Toc224653814"/>
-      <w:r>
-        <w:t>References</w:t>
-      </w:r>
-      <w:bookmarkEnd w:id="40"/>
     </w:p>
     <w:p>
       <w:r>
@@ -4467,11 +4463,11 @@
       <w:pPr>
         <w:pStyle w:val="Heading1"/>
       </w:pPr>
-      <w:bookmarkStart w:id="41" w:name="_Toc224653815"/>
+      <w:bookmarkStart w:id="40" w:name="_Toc224653815"/>
       <w:r>
         <w:t>Appendix</w:t>
       </w:r>
-      <w:bookmarkEnd w:id="41"/>
+      <w:bookmarkEnd w:id="40"/>
     </w:p>
     <w:p/>
     <w:p/>

</xml_diff>

<commit_message>
LSEP done, work started on agile
</commit_message>
<xml_diff>
--- a/COMP 3000.docx
+++ b/COMP 3000.docx
@@ -3664,15 +3664,7 @@
     </w:p>
     <w:p>
       <w:r>
-        <w:t xml:space="preserve">As cybercrime grows ever more profitable and with the incident rate of </w:t>
-      </w:r>
-      <w:proofErr w:type="spellStart"/>
-      <w:r>
-        <w:t>cyber crime</w:t>
-      </w:r>
-      <w:proofErr w:type="spellEnd"/>
-      <w:r>
-        <w:t xml:space="preserve"> rising by 37% over the past five years (Bridewell, 2026), the different attack types and vectors continue to evolve, with attackers modifying previously used techniques or developing new attacks using exploits not commonly known, meaning that the signature-based system can’t be updated to detect these attacks. This creates big problems for signature-based systems as attacks that haven’t yet been seen may bypass the detection systems.</w:t>
+        <w:t>As cybercrime grows ever more profitable and with the incident rate of cyber crime rising by 37% over the past five years (Bridewell, 2026), the different attack types and vectors continue to evolve, with attackers modifying previously used techniques or developing new attacks using exploits not commonly known, meaning that the signature-based system can’t be updated to detect these attacks. This creates big problems for signature-based systems as attacks that haven’t yet been seen may bypass the detection systems.</w:t>
       </w:r>
     </w:p>
     <w:p>
@@ -4047,6 +4039,33 @@
       </w:r>
     </w:p>
     <w:p>
+      <w:r>
+        <w:t>While traditionally there aren’t any social considerations relating to AI usage in intrusion detection, in the current day and age, there is a stigma around AI usage that stems from a lack of understanding of what the AI would be doing as when they hear that AI has been integrated, the mind jumps to use of Generative AI which people have a strong stance against the usage of genAI.</w:t>
+      </w:r>
+    </w:p>
+    <w:p>
+      <w:r>
+        <w:t>The only ethical consideration for this project that I can think is how the data for training has been obtained, have I gathered it in a shady manner, through not being clear on my intentions</w:t>
+      </w:r>
+      <w:r>
+        <w:t xml:space="preserve"> in the gathering of data. No, in this project the data has been ethically sourced through the University of New South Wales as they provide the UNSW NB-15 dataset for free for academic usage which this project falls under.</w:t>
+      </w:r>
+    </w:p>
+    <w:p>
+      <w:r>
+        <w:lastRenderedPageBreak/>
+        <w:t xml:space="preserve">For professional considerations, when AI is introduced into </w:t>
+      </w:r>
+      <w:r>
+        <w:t xml:space="preserve">a field, there is one question that is frequently asked, will this affect jobs, for this type of implementation, no it will not, as it still requires the analyst to view this data then act on it, the same as the traditional signature-based detection systems. </w:t>
+      </w:r>
+    </w:p>
+    <w:p>
+      <w:r>
+        <w:t>This is doubly so due to its nature as a Intrusion Detection system, rather than an Intrusion Prevention System, as by itself, an IDS system can do nothing about the intrusion attempts but alert an analyst or user.</w:t>
+      </w:r>
+    </w:p>
+    <w:p>
       <w:pPr>
         <w:pStyle w:val="Heading1"/>
       </w:pPr>
@@ -4063,22 +4082,27 @@
       <w:bookmarkStart w:id="9" w:name="_Toc224653779"/>
       <w:bookmarkStart w:id="10" w:name="_Toc224653783"/>
       <w:r>
+        <w:t>Agile Development Methodology</w:t>
+      </w:r>
+    </w:p>
+    <w:p>
+      <w:r>
+        <w:t>For this project, I will make use of the Agile Development Methodology, this is a commonly used for software development in professional settings, it works by splitting work into smaller chunks that are completed over a short period of time, usually two weeks</w:t>
+      </w:r>
+      <w:r>
+        <w:t>. It is split up into six stages; initiation, planning, development, testing, deployment, and review, these stages are repeating in each two week sprint, allowing for meaningful, incremental development. For my project, I will be making use of the traditional two week sprints</w:t>
+      </w:r>
+    </w:p>
+    <w:p>
+      <w:pPr>
+        <w:pStyle w:val="Heading2"/>
+      </w:pPr>
+      <w:r>
         <w:t>Implementation Method</w:t>
       </w:r>
       <w:bookmarkEnd w:id="9"/>
     </w:p>
-    <w:p>
-      <w:pPr>
-        <w:pStyle w:val="Heading2"/>
-      </w:pPr>
-      <w:r>
-        <w:t>Agile</w:t>
-      </w:r>
-      <w:bookmarkEnd w:id="10"/>
-      <w:r>
-        <w:t xml:space="preserve"> Development Methodology</w:t>
-      </w:r>
-    </w:p>
+    <w:bookmarkEnd w:id="10"/>
     <w:p/>
     <w:p>
       <w:pPr>

</xml_diff>

<commit_message>
Tools and technologies completed, moving onto implementation
</commit_message>
<xml_diff>
--- a/COMP 3000.docx
+++ b/COMP 3000.docx
@@ -3664,7 +3664,15 @@
     </w:p>
     <w:p>
       <w:r>
-        <w:t>As cybercrime grows ever more profitable and with the incident rate of cyber crime rising by 37% over the past five years (Bridewell, 2026), the different attack types and vectors continue to evolve, with attackers modifying previously used techniques or developing new attacks using exploits not commonly known, meaning that the signature-based system can’t be updated to detect these attacks. This creates big problems for signature-based systems as attacks that haven’t yet been seen may bypass the detection systems.</w:t>
+        <w:t xml:space="preserve">As cybercrime grows ever more profitable and with the incident rate of </w:t>
+      </w:r>
+      <w:proofErr w:type="spellStart"/>
+      <w:r>
+        <w:t>cyber crime</w:t>
+      </w:r>
+      <w:proofErr w:type="spellEnd"/>
+      <w:r>
+        <w:t xml:space="preserve"> rising by 37% over the past five years (Bridewell, 2026), the different attack types and vectors continue to evolve, with attackers modifying previously used techniques or developing new attacks using exploits not commonly known, meaning that the signature-based system can’t be updated to detect these attacks. This creates big problems for signature-based systems as attacks that haven’t yet been seen may bypass the detection systems.</w:t>
       </w:r>
     </w:p>
     <w:p>
@@ -4045,7 +4053,15 @@
     </w:p>
     <w:p>
       <w:r>
-        <w:t>The only ethical consideration for this project that I can think is how the data for training has been obtained, have I gathered it in a shady manner, through not being clear on my intentions</w:t>
+        <w:t xml:space="preserve">The only ethical consideration for this project that I can think is how the data for training has been obtained, have I gathered it in a shady manner, </w:t>
+      </w:r>
+      <w:proofErr w:type="spellStart"/>
+      <w:r>
+        <w:t>through</w:t>
+      </w:r>
+      <w:proofErr w:type="spellEnd"/>
+      <w:r>
+        <w:t xml:space="preserve"> not being clear on my intentions</w:t>
       </w:r>
       <w:r>
         <w:t xml:space="preserve"> in the gathering of data. No, in this project the data has been ethically sourced through the University of New South Wales as they provide the UNSW NB-15 dataset for free for academic usage which this project falls under.</w:t>
@@ -4090,7 +4106,7 @@
         <w:t>For this project, I will make use of the Agile Development Methodology, this is a commonly used for software development in professional settings, it works by splitting work into smaller chunks that are completed over a short period of time, usually two weeks</w:t>
       </w:r>
       <w:r>
-        <w:t>. It is split up into six stages; initiation, planning, development, testing, deployment, and review, these stages are repeating in each two week sprint, allowing for meaningful, incremental development. For my project, I will be making use of the traditional two week sprints</w:t>
+        <w:t xml:space="preserve">. It is split up into six stages; initiation, planning, development, testing, deployment, and review, these stages are repeating in each two week sprint, allowing for meaningful, incremental development. </w:t>
       </w:r>
     </w:p>
     <w:p>
@@ -4101,6 +4117,11 @@
         <w:t>Implementation Method</w:t>
       </w:r>
       <w:bookmarkEnd w:id="9"/>
+    </w:p>
+    <w:p>
+      <w:r>
+        <w:t>I plan to implement agile in what is common practice in software development, making use of the stages described above, repeating every 2 weeks with the start and end marked by a meeting with my project supervisor. These bi-weekly meetings with my supervisor are key as it helps provide accountability and encouragement to get the work done well and on time, towards the end of this report there will be a log of my sprint notes, to help provide evidence of the work being done on time and frequently across the sprints and the project as a whole.</w:t>
+      </w:r>
     </w:p>
     <w:bookmarkEnd w:id="10"/>
     <w:p/>
@@ -4110,303 +4131,463 @@
       </w:pPr>
       <w:bookmarkStart w:id="11" w:name="_Toc224653784"/>
       <w:r>
+        <w:t>Tools Used</w:t>
+      </w:r>
+      <w:bookmarkEnd w:id="11"/>
+      <w:r>
+        <w:t xml:space="preserve"> and Technologies</w:t>
+      </w:r>
+    </w:p>
+    <w:p>
+      <w:r>
+        <w:t>In order for this project to work, I’ve had to make use of a number of tools and technologies to fulfil my aims and objectives. I will cover the different tools I used and how and why I made use of these tools.</w:t>
+      </w:r>
+    </w:p>
+    <w:p>
+      <w:pPr>
+        <w:pStyle w:val="Heading3"/>
+      </w:pPr>
+      <w:bookmarkStart w:id="12" w:name="_Toc224653785"/>
+      <w:r>
+        <w:t>Python</w:t>
+      </w:r>
+      <w:bookmarkEnd w:id="12"/>
+    </w:p>
+    <w:p>
+      <w:r>
+        <w:t xml:space="preserve">Python is one of the main building blocks for this project as without it, none of it would work due to the availability of some key libraries that allow me to fulfil my aims, for this project, I used </w:t>
+      </w:r>
+      <w:r>
+        <w:t>Python 3 due to its previously mentioned libraries for machine learning that aren’t available in other languages. All of my code written for this project has been done in python as the language is massively versatile.</w:t>
+      </w:r>
+    </w:p>
+    <w:p>
+      <w:pPr>
+        <w:pStyle w:val="Heading3"/>
+      </w:pPr>
+      <w:bookmarkStart w:id="13" w:name="_Toc224653786"/>
+      <w:bookmarkStart w:id="14" w:name="_Toc224653787"/>
+      <w:r>
+        <w:t>Jupyter Notebook</w:t>
+      </w:r>
+      <w:bookmarkEnd w:id="14"/>
+    </w:p>
+    <w:p>
+      <w:r>
+        <w:t xml:space="preserve">Jupyter notebook was used as the main IDE for this project, due to how well it complements machine learning development with its use of cells, as the cells allow you to run individual segments of code without rerunning the entire code file, which is critical for machine learning due to how long it can take to run certain code blocks, such as model training, which for very </w:t>
+      </w:r>
+      <w:r>
         <w:lastRenderedPageBreak/>
-        <w:t>Tools Used</w:t>
-      </w:r>
-      <w:bookmarkEnd w:id="11"/>
-      <w:r>
-        <w:t xml:space="preserve"> and Technologies</w:t>
+        <w:t>demanding models, can take many hours to run</w:t>
+      </w:r>
+      <w:r>
+        <w:t>. It also stores results in the file so you can view the information gained at a later date without rerunning the code.</w:t>
       </w:r>
     </w:p>
     <w:p>
       <w:pPr>
         <w:pStyle w:val="Heading3"/>
       </w:pPr>
-      <w:bookmarkStart w:id="12" w:name="_Toc224653785"/>
-      <w:r>
-        <w:t>Python</w:t>
-      </w:r>
-      <w:bookmarkEnd w:id="12"/>
-    </w:p>
+      <w:r>
+        <w:t>Python Libraries</w:t>
+      </w:r>
+      <w:bookmarkEnd w:id="13"/>
+    </w:p>
+    <w:p>
+      <w:r>
+        <w:t>For this project, a range of python libraries were use to implement the features set out in the aims and objectives</w:t>
+      </w:r>
+      <w:r>
+        <w:t xml:space="preserve"> earlier in the report, in the </w:t>
+      </w:r>
+      <w:proofErr w:type="spellStart"/>
+      <w:r>
+        <w:t>bulletpoints</w:t>
+      </w:r>
+      <w:proofErr w:type="spellEnd"/>
+      <w:r>
+        <w:t xml:space="preserve"> below, I will layout how and why each library was used.</w:t>
+      </w:r>
+    </w:p>
+    <w:p>
+      <w:pPr>
+        <w:pStyle w:val="ListParagraph"/>
+        <w:numPr>
+          <w:ilvl w:val="0"/>
+          <w:numId w:val="2"/>
+        </w:numPr>
+      </w:pPr>
+      <w:r>
+        <w:rPr>
+          <w:b/>
+          <w:bCs/>
+        </w:rPr>
+        <w:t xml:space="preserve">Pandas and </w:t>
+      </w:r>
+      <w:proofErr w:type="spellStart"/>
+      <w:r>
+        <w:rPr>
+          <w:b/>
+          <w:bCs/>
+        </w:rPr>
+        <w:t>Numpy</w:t>
+      </w:r>
+      <w:proofErr w:type="spellEnd"/>
+      <w:r>
+        <w:t>: This was used to process the data the code needed to run, such as the dataset csv file, and the data stored and processed by the code itself. Without these libraries.</w:t>
+      </w:r>
+    </w:p>
+    <w:p>
+      <w:pPr>
+        <w:pStyle w:val="ListParagraph"/>
+        <w:numPr>
+          <w:ilvl w:val="0"/>
+          <w:numId w:val="2"/>
+        </w:numPr>
+      </w:pPr>
+      <w:r>
+        <w:rPr>
+          <w:b/>
+          <w:bCs/>
+        </w:rPr>
+        <w:t xml:space="preserve">Scikit-Learn + </w:t>
+      </w:r>
+      <w:proofErr w:type="spellStart"/>
+      <w:r>
+        <w:rPr>
+          <w:b/>
+          <w:bCs/>
+        </w:rPr>
+        <w:t>XGBoost</w:t>
+      </w:r>
+      <w:proofErr w:type="spellEnd"/>
+      <w:r>
+        <w:t>: These two libraries make up a large portion of the backbone of machine leaning development in python, with Scikit-Learn encompassing many different types of models, algorithms, preprocessing and a number of other features, this allows implementation of AI models to run much smoother than it would without it.</w:t>
+      </w:r>
+    </w:p>
+    <w:p>
+      <w:pPr>
+        <w:pStyle w:val="ListParagraph"/>
+        <w:numPr>
+          <w:ilvl w:val="0"/>
+          <w:numId w:val="2"/>
+        </w:numPr>
+      </w:pPr>
+      <w:proofErr w:type="spellStart"/>
+      <w:r>
+        <w:rPr>
+          <w:b/>
+          <w:bCs/>
+        </w:rPr>
+        <w:t>JobLib</w:t>
+      </w:r>
+      <w:proofErr w:type="spellEnd"/>
+      <w:r>
+        <w:t>: This was used in order to dump the model and feature columns from python to  a PKL file to allow for usage within other Jupyter notebook files without having to retrain the model, saving a considerable amount of time.</w:t>
+      </w:r>
+    </w:p>
+    <w:p>
+      <w:pPr>
+        <w:pStyle w:val="ListParagraph"/>
+        <w:numPr>
+          <w:ilvl w:val="0"/>
+          <w:numId w:val="2"/>
+        </w:numPr>
+      </w:pPr>
+      <w:r>
+        <w:rPr>
+          <w:b/>
+          <w:bCs/>
+        </w:rPr>
+        <w:t>SMTPLib</w:t>
+      </w:r>
+      <w:r>
+        <w:t>:</w:t>
+      </w:r>
+      <w:r>
+        <w:t xml:space="preserve"> </w:t>
+      </w:r>
+      <w:r>
+        <w:t>This was used in order to implement email alerts,</w:t>
+      </w:r>
+      <w:r>
+        <w:t xml:space="preserve"> allowing the users to be informed if suspicious behaviour has been detected within the traffic log files.</w:t>
+      </w:r>
+    </w:p>
+    <w:p>
+      <w:pPr>
+        <w:pStyle w:val="ListParagraph"/>
+      </w:pPr>
+    </w:p>
+    <w:p/>
     <w:p>
       <w:pPr>
         <w:pStyle w:val="Heading3"/>
       </w:pPr>
-      <w:bookmarkStart w:id="13" w:name="_Toc224653786"/>
-      <w:r>
-        <w:t>Python Libraries</w:t>
-      </w:r>
-      <w:bookmarkEnd w:id="13"/>
+      <w:r>
+        <w:t>GitHub</w:t>
+      </w:r>
+    </w:p>
+    <w:p>
+      <w:r>
+        <w:t>GitHub was utilized for version control to ensure that even if hardware or software problems occurred, a version was easily accessible to ensure easy access to software. It also helps provide evidence for work done due to its easy to access commit history</w:t>
+      </w:r>
+      <w:r>
+        <w:t>.</w:t>
+      </w:r>
+    </w:p>
+    <w:p>
+      <w:pPr>
+        <w:pStyle w:val="Heading1"/>
+      </w:pPr>
+      <w:r>
+        <w:lastRenderedPageBreak/>
+        <w:t>Development Requirements</w:t>
+      </w:r>
+    </w:p>
+    <w:p>
+      <w:pPr>
+        <w:pStyle w:val="Heading2"/>
+      </w:pPr>
+      <w:bookmarkStart w:id="15" w:name="_Toc224653790"/>
+      <w:r>
+        <w:t>Functional Requirements</w:t>
+      </w:r>
+      <w:bookmarkEnd w:id="15"/>
+    </w:p>
+    <w:p>
+      <w:pPr>
+        <w:pStyle w:val="Heading2"/>
+      </w:pPr>
+      <w:bookmarkStart w:id="16" w:name="_Toc224653791"/>
+      <w:r>
+        <w:t>Non-Functional Requirements</w:t>
+      </w:r>
+      <w:bookmarkEnd w:id="16"/>
+    </w:p>
+    <w:p>
+      <w:pPr>
+        <w:pStyle w:val="Heading2"/>
+      </w:pPr>
+      <w:bookmarkStart w:id="17" w:name="_Toc224653792"/>
+      <w:r>
+        <w:t>MVP</w:t>
+      </w:r>
+      <w:bookmarkEnd w:id="17"/>
+    </w:p>
+    <w:p>
+      <w:pPr>
+        <w:pStyle w:val="Heading2"/>
+      </w:pPr>
+      <w:bookmarkStart w:id="18" w:name="_Toc224653793"/>
+      <w:r>
+        <w:t xml:space="preserve">Final Aims and </w:t>
+      </w:r>
+      <w:bookmarkEnd w:id="18"/>
+      <w:r>
+        <w:t>objectives</w:t>
+      </w:r>
+    </w:p>
+    <w:p>
+      <w:pPr>
+        <w:pStyle w:val="Heading2"/>
+      </w:pPr>
+      <w:bookmarkStart w:id="19" w:name="_Toc224653794"/>
+      <w:r>
+        <w:t>Sprint 1</w:t>
+      </w:r>
+      <w:bookmarkEnd w:id="19"/>
     </w:p>
     <w:p>
       <w:pPr>
         <w:pStyle w:val="Heading3"/>
       </w:pPr>
-      <w:bookmarkStart w:id="14" w:name="_Toc224653787"/>
-      <w:r>
-        <w:t>Jupyter Notebook</w:t>
-      </w:r>
-      <w:bookmarkEnd w:id="14"/>
+      <w:bookmarkStart w:id="20" w:name="_Toc224653795"/>
+      <w:r>
+        <w:t>Research on development tools</w:t>
+      </w:r>
+      <w:bookmarkEnd w:id="20"/>
     </w:p>
     <w:p>
       <w:pPr>
         <w:pStyle w:val="Heading3"/>
       </w:pPr>
-      <w:r>
-        <w:t>GitHub</w:t>
-      </w:r>
+      <w:bookmarkStart w:id="21" w:name="_Toc224653796"/>
+      <w:r>
+        <w:t>Beginning of Accuracy Testing</w:t>
+      </w:r>
+      <w:bookmarkEnd w:id="21"/>
+    </w:p>
+    <w:p>
+      <w:pPr>
+        <w:pStyle w:val="Heading2"/>
+      </w:pPr>
+      <w:bookmarkStart w:id="22" w:name="_Toc224653797"/>
+      <w:r>
+        <w:t>Sprint 2</w:t>
+      </w:r>
+      <w:bookmarkEnd w:id="22"/>
+    </w:p>
+    <w:p>
+      <w:pPr>
+        <w:pStyle w:val="Heading3"/>
+      </w:pPr>
+      <w:bookmarkStart w:id="23" w:name="_Toc224653798"/>
+      <w:r>
+        <w:t>Accuracy testing Cont.</w:t>
+      </w:r>
+      <w:bookmarkEnd w:id="23"/>
+    </w:p>
+    <w:p>
+      <w:pPr>
+        <w:pStyle w:val="Heading3"/>
+      </w:pPr>
+      <w:bookmarkStart w:id="24" w:name="_Toc224653799"/>
+      <w:r>
+        <w:t>Issues encountered</w:t>
+      </w:r>
+      <w:bookmarkEnd w:id="24"/>
+    </w:p>
+    <w:p>
+      <w:pPr>
+        <w:pStyle w:val="Heading2"/>
+      </w:pPr>
+      <w:bookmarkStart w:id="25" w:name="_Toc224653800"/>
+      <w:r>
+        <w:t>Sprint 3</w:t>
+      </w:r>
+      <w:bookmarkEnd w:id="25"/>
+      <w:r>
+        <w:t xml:space="preserve"> </w:t>
+      </w:r>
+    </w:p>
+    <w:p>
+      <w:pPr>
+        <w:pStyle w:val="Heading3"/>
+      </w:pPr>
+      <w:bookmarkStart w:id="26" w:name="_Toc224653801"/>
+      <w:r>
+        <w:t>Even Further Accuracy Testing</w:t>
+      </w:r>
+      <w:bookmarkEnd w:id="26"/>
+    </w:p>
+    <w:p>
+      <w:pPr>
+        <w:pStyle w:val="Heading3"/>
+      </w:pPr>
+      <w:bookmarkStart w:id="27" w:name="_Toc224653802"/>
+      <w:r>
+        <w:t>Solutions to issues</w:t>
+      </w:r>
+      <w:bookmarkEnd w:id="27"/>
+    </w:p>
+    <w:p>
+      <w:pPr>
+        <w:pStyle w:val="Heading2"/>
+      </w:pPr>
+      <w:bookmarkStart w:id="28" w:name="_Toc224653803"/>
+      <w:r>
+        <w:t>Sprint 4</w:t>
+      </w:r>
+      <w:bookmarkEnd w:id="28"/>
+    </w:p>
+    <w:p>
+      <w:pPr>
+        <w:pStyle w:val="Heading3"/>
+      </w:pPr>
+      <w:bookmarkStart w:id="29" w:name="_Toc224653804"/>
+      <w:r>
+        <w:t>Extraction of Trained model</w:t>
+      </w:r>
+      <w:bookmarkEnd w:id="29"/>
+    </w:p>
+    <w:p>
+      <w:pPr>
+        <w:pStyle w:val="Heading2"/>
+      </w:pPr>
+      <w:bookmarkStart w:id="30" w:name="_Toc224653805"/>
+      <w:r>
+        <w:t>Sprint 5</w:t>
+      </w:r>
+      <w:bookmarkEnd w:id="30"/>
+    </w:p>
+    <w:p>
+      <w:pPr>
+        <w:pStyle w:val="Heading3"/>
+      </w:pPr>
+      <w:bookmarkStart w:id="31" w:name="_Toc224653806"/>
+      <w:r>
+        <w:t>Output for IDS</w:t>
+      </w:r>
+      <w:bookmarkEnd w:id="31"/>
+    </w:p>
+    <w:p>
+      <w:pPr>
+        <w:pStyle w:val="Heading2"/>
+      </w:pPr>
+      <w:bookmarkStart w:id="32" w:name="_Toc224653807"/>
+      <w:r>
+        <w:t>Sprint 6</w:t>
+      </w:r>
+      <w:bookmarkEnd w:id="32"/>
+    </w:p>
+    <w:p>
+      <w:pPr>
+        <w:pStyle w:val="Heading3"/>
+      </w:pPr>
+      <w:bookmarkStart w:id="33" w:name="_Toc224653808"/>
+      <w:r>
+        <w:t>Email Alerts</w:t>
+      </w:r>
+      <w:bookmarkEnd w:id="33"/>
+    </w:p>
+    <w:p>
+      <w:pPr>
+        <w:pStyle w:val="Heading2"/>
+      </w:pPr>
+      <w:bookmarkStart w:id="34" w:name="_Toc224653809"/>
+      <w:r>
+        <w:t>Sprint 7</w:t>
+      </w:r>
+      <w:bookmarkEnd w:id="34"/>
+    </w:p>
+    <w:p>
+      <w:pPr>
+        <w:pStyle w:val="Heading3"/>
+      </w:pPr>
+      <w:bookmarkStart w:id="35" w:name="_Toc224653810"/>
+      <w:r>
+        <w:t>End of Development</w:t>
+      </w:r>
+      <w:bookmarkEnd w:id="35"/>
     </w:p>
     <w:p>
       <w:pPr>
         <w:pStyle w:val="Heading1"/>
       </w:pPr>
-      <w:r>
-        <w:t>Development Requirements</w:t>
-      </w:r>
-    </w:p>
-    <w:p>
-      <w:pPr>
-        <w:pStyle w:val="Heading2"/>
-      </w:pPr>
-      <w:bookmarkStart w:id="15" w:name="_Toc224653790"/>
-      <w:r>
-        <w:t>Functional Requirements</w:t>
-      </w:r>
-      <w:bookmarkEnd w:id="15"/>
-    </w:p>
-    <w:p>
-      <w:pPr>
-        <w:pStyle w:val="Heading2"/>
-      </w:pPr>
-      <w:bookmarkStart w:id="16" w:name="_Toc224653791"/>
-      <w:r>
-        <w:t>Non-Functional Requirements</w:t>
-      </w:r>
-      <w:bookmarkEnd w:id="16"/>
-    </w:p>
-    <w:p>
-      <w:pPr>
-        <w:pStyle w:val="Heading2"/>
-      </w:pPr>
-      <w:bookmarkStart w:id="17" w:name="_Toc224653792"/>
-      <w:r>
-        <w:t>MVP</w:t>
-      </w:r>
-      <w:bookmarkEnd w:id="17"/>
-    </w:p>
-    <w:p>
-      <w:pPr>
-        <w:pStyle w:val="Heading2"/>
-      </w:pPr>
-      <w:bookmarkStart w:id="18" w:name="_Toc224653793"/>
-      <w:r>
-        <w:t xml:space="preserve">Final Aims and </w:t>
-      </w:r>
-      <w:bookmarkEnd w:id="18"/>
-      <w:r>
-        <w:t>objectives</w:t>
-      </w:r>
-    </w:p>
-    <w:p>
-      <w:pPr>
-        <w:pStyle w:val="Heading2"/>
-      </w:pPr>
-      <w:bookmarkStart w:id="19" w:name="_Toc224653794"/>
-      <w:r>
-        <w:t>Sprint 1</w:t>
-      </w:r>
-      <w:bookmarkEnd w:id="19"/>
-    </w:p>
-    <w:p>
-      <w:pPr>
-        <w:pStyle w:val="Heading3"/>
-      </w:pPr>
-      <w:bookmarkStart w:id="20" w:name="_Toc224653795"/>
-      <w:r>
-        <w:t>Research on development tools</w:t>
-      </w:r>
-      <w:bookmarkEnd w:id="20"/>
-    </w:p>
-    <w:p>
-      <w:pPr>
-        <w:pStyle w:val="Heading3"/>
-      </w:pPr>
-      <w:bookmarkStart w:id="21" w:name="_Toc224653796"/>
-      <w:r>
-        <w:t>Beginning of Accuracy Testing</w:t>
-      </w:r>
-      <w:bookmarkEnd w:id="21"/>
-    </w:p>
-    <w:p>
-      <w:pPr>
-        <w:pStyle w:val="Heading2"/>
-      </w:pPr>
-      <w:bookmarkStart w:id="22" w:name="_Toc224653797"/>
-      <w:r>
-        <w:t>Sprint 2</w:t>
-      </w:r>
-      <w:bookmarkEnd w:id="22"/>
-    </w:p>
-    <w:p>
-      <w:pPr>
-        <w:pStyle w:val="Heading3"/>
-      </w:pPr>
-      <w:bookmarkStart w:id="23" w:name="_Toc224653798"/>
-      <w:r>
-        <w:t>Accuracy testing Cont.</w:t>
-      </w:r>
-      <w:bookmarkEnd w:id="23"/>
-    </w:p>
-    <w:p>
-      <w:pPr>
-        <w:pStyle w:val="Heading3"/>
-      </w:pPr>
-      <w:bookmarkStart w:id="24" w:name="_Toc224653799"/>
-      <w:r>
-        <w:t>Issues encountered</w:t>
-      </w:r>
-      <w:bookmarkEnd w:id="24"/>
-    </w:p>
-    <w:p>
-      <w:pPr>
-        <w:pStyle w:val="Heading2"/>
-      </w:pPr>
-      <w:bookmarkStart w:id="25" w:name="_Toc224653800"/>
-      <w:r>
-        <w:t>Sprint 3</w:t>
-      </w:r>
-      <w:bookmarkEnd w:id="25"/>
-      <w:r>
-        <w:t xml:space="preserve"> </w:t>
-      </w:r>
-    </w:p>
-    <w:p>
-      <w:pPr>
-        <w:pStyle w:val="Heading3"/>
-      </w:pPr>
-      <w:bookmarkStart w:id="26" w:name="_Toc224653801"/>
-      <w:r>
-        <w:t>Even Further Accuracy Testing</w:t>
-      </w:r>
-      <w:bookmarkEnd w:id="26"/>
-    </w:p>
-    <w:p>
-      <w:pPr>
-        <w:pStyle w:val="Heading3"/>
-      </w:pPr>
-      <w:bookmarkStart w:id="27" w:name="_Toc224653802"/>
-      <w:r>
-        <w:t>Solutions to issues</w:t>
-      </w:r>
-      <w:bookmarkEnd w:id="27"/>
-    </w:p>
-    <w:p>
-      <w:pPr>
-        <w:pStyle w:val="Heading2"/>
-      </w:pPr>
-      <w:bookmarkStart w:id="28" w:name="_Toc224653803"/>
-      <w:r>
-        <w:t>Sprint 4</w:t>
-      </w:r>
-      <w:bookmarkEnd w:id="28"/>
-    </w:p>
-    <w:p>
-      <w:pPr>
-        <w:pStyle w:val="Heading3"/>
-      </w:pPr>
-      <w:bookmarkStart w:id="29" w:name="_Toc224653804"/>
-      <w:r>
-        <w:t>Extraction of Trained model</w:t>
-      </w:r>
-      <w:bookmarkEnd w:id="29"/>
-    </w:p>
-    <w:p>
-      <w:pPr>
-        <w:pStyle w:val="Heading2"/>
-      </w:pPr>
-      <w:bookmarkStart w:id="30" w:name="_Toc224653805"/>
-      <w:r>
-        <w:t>Sprint 5</w:t>
-      </w:r>
-      <w:bookmarkEnd w:id="30"/>
-    </w:p>
-    <w:p>
-      <w:pPr>
-        <w:pStyle w:val="Heading3"/>
-      </w:pPr>
-      <w:bookmarkStart w:id="31" w:name="_Toc224653806"/>
-      <w:r>
-        <w:t>Output for IDS</w:t>
-      </w:r>
-      <w:bookmarkEnd w:id="31"/>
-    </w:p>
-    <w:p>
-      <w:pPr>
-        <w:pStyle w:val="Heading2"/>
-      </w:pPr>
-      <w:bookmarkStart w:id="32" w:name="_Toc224653807"/>
-      <w:r>
-        <w:t>Sprint 6</w:t>
-      </w:r>
-      <w:bookmarkEnd w:id="32"/>
-    </w:p>
-    <w:p>
-      <w:pPr>
-        <w:pStyle w:val="Heading3"/>
-      </w:pPr>
-      <w:bookmarkStart w:id="33" w:name="_Toc224653808"/>
+      <w:bookmarkStart w:id="36" w:name="_Toc224653811"/>
+      <w:r>
+        <w:t>End of Project Report</w:t>
+      </w:r>
+      <w:bookmarkEnd w:id="36"/>
+    </w:p>
+    <w:p>
+      <w:pPr>
+        <w:pStyle w:val="Heading1"/>
+      </w:pPr>
+      <w:bookmarkStart w:id="37" w:name="_Toc224653812"/>
+      <w:r>
+        <w:t>Project Post-Mortem</w:t>
+      </w:r>
+      <w:bookmarkEnd w:id="37"/>
+    </w:p>
+    <w:p>
+      <w:pPr>
+        <w:pStyle w:val="Heading1"/>
+      </w:pPr>
+      <w:bookmarkStart w:id="38" w:name="_Toc224653813"/>
       <w:r>
         <w:lastRenderedPageBreak/>
-        <w:t>Email Alerts</w:t>
-      </w:r>
-      <w:bookmarkEnd w:id="33"/>
-    </w:p>
-    <w:p>
-      <w:pPr>
-        <w:pStyle w:val="Heading2"/>
-      </w:pPr>
-      <w:bookmarkStart w:id="34" w:name="_Toc224653809"/>
-      <w:r>
-        <w:t>Sprint 7</w:t>
-      </w:r>
-      <w:bookmarkEnd w:id="34"/>
-    </w:p>
-    <w:p>
-      <w:pPr>
-        <w:pStyle w:val="Heading3"/>
-      </w:pPr>
-      <w:bookmarkStart w:id="35" w:name="_Toc224653810"/>
-      <w:r>
-        <w:t>End of Development</w:t>
-      </w:r>
-      <w:bookmarkEnd w:id="35"/>
-    </w:p>
-    <w:p>
-      <w:pPr>
-        <w:pStyle w:val="Heading1"/>
-      </w:pPr>
-      <w:bookmarkStart w:id="36" w:name="_Toc224653811"/>
-      <w:r>
-        <w:t>End of Project Report</w:t>
-      </w:r>
-      <w:bookmarkEnd w:id="36"/>
-    </w:p>
-    <w:p>
-      <w:pPr>
-        <w:pStyle w:val="Heading1"/>
-      </w:pPr>
-      <w:bookmarkStart w:id="37" w:name="_Toc224653812"/>
-      <w:r>
-        <w:t>Project Post-Mortem</w:t>
-      </w:r>
-      <w:bookmarkEnd w:id="37"/>
-    </w:p>
-    <w:p>
-      <w:pPr>
-        <w:pStyle w:val="Heading1"/>
-      </w:pPr>
-      <w:bookmarkStart w:id="38" w:name="_Toc224653813"/>
-      <w:r>
         <w:t>Conclusions</w:t>
       </w:r>
       <w:bookmarkEnd w:id="38"/>
@@ -4594,8 +4775,124 @@
       </w:pPr>
     </w:lvl>
   </w:abstractNum>
+  <w:abstractNum w:abstractNumId="1" w15:restartNumberingAfterBreak="0">
+    <w:nsid w:val="7A317285"/>
+    <w:multiLevelType w:val="hybridMultilevel"/>
+    <w:tmpl w:val="5FD046B8"/>
+    <w:lvl w:ilvl="0" w:tplc="08090001">
+      <w:start w:val="1"/>
+      <w:numFmt w:val="bullet"/>
+      <w:lvlText w:val=""/>
+      <w:lvlJc w:val="left"/>
+      <w:pPr>
+        <w:ind w:left="720" w:hanging="360"/>
+      </w:pPr>
+      <w:rPr>
+        <w:rFonts w:ascii="Symbol" w:hAnsi="Symbol" w:hint="default"/>
+      </w:rPr>
+    </w:lvl>
+    <w:lvl w:ilvl="1" w:tplc="08090003" w:tentative="1">
+      <w:start w:val="1"/>
+      <w:numFmt w:val="bullet"/>
+      <w:lvlText w:val="o"/>
+      <w:lvlJc w:val="left"/>
+      <w:pPr>
+        <w:ind w:left="1440" w:hanging="360"/>
+      </w:pPr>
+      <w:rPr>
+        <w:rFonts w:ascii="Courier New" w:hAnsi="Courier New" w:cs="Courier New" w:hint="default"/>
+      </w:rPr>
+    </w:lvl>
+    <w:lvl w:ilvl="2" w:tplc="08090005" w:tentative="1">
+      <w:start w:val="1"/>
+      <w:numFmt w:val="bullet"/>
+      <w:lvlText w:val=""/>
+      <w:lvlJc w:val="left"/>
+      <w:pPr>
+        <w:ind w:left="2160" w:hanging="360"/>
+      </w:pPr>
+      <w:rPr>
+        <w:rFonts w:ascii="Wingdings" w:hAnsi="Wingdings" w:hint="default"/>
+      </w:rPr>
+    </w:lvl>
+    <w:lvl w:ilvl="3" w:tplc="08090001" w:tentative="1">
+      <w:start w:val="1"/>
+      <w:numFmt w:val="bullet"/>
+      <w:lvlText w:val=""/>
+      <w:lvlJc w:val="left"/>
+      <w:pPr>
+        <w:ind w:left="2880" w:hanging="360"/>
+      </w:pPr>
+      <w:rPr>
+        <w:rFonts w:ascii="Symbol" w:hAnsi="Symbol" w:hint="default"/>
+      </w:rPr>
+    </w:lvl>
+    <w:lvl w:ilvl="4" w:tplc="08090003" w:tentative="1">
+      <w:start w:val="1"/>
+      <w:numFmt w:val="bullet"/>
+      <w:lvlText w:val="o"/>
+      <w:lvlJc w:val="left"/>
+      <w:pPr>
+        <w:ind w:left="3600" w:hanging="360"/>
+      </w:pPr>
+      <w:rPr>
+        <w:rFonts w:ascii="Courier New" w:hAnsi="Courier New" w:cs="Courier New" w:hint="default"/>
+      </w:rPr>
+    </w:lvl>
+    <w:lvl w:ilvl="5" w:tplc="08090005" w:tentative="1">
+      <w:start w:val="1"/>
+      <w:numFmt w:val="bullet"/>
+      <w:lvlText w:val=""/>
+      <w:lvlJc w:val="left"/>
+      <w:pPr>
+        <w:ind w:left="4320" w:hanging="360"/>
+      </w:pPr>
+      <w:rPr>
+        <w:rFonts w:ascii="Wingdings" w:hAnsi="Wingdings" w:hint="default"/>
+      </w:rPr>
+    </w:lvl>
+    <w:lvl w:ilvl="6" w:tplc="08090001" w:tentative="1">
+      <w:start w:val="1"/>
+      <w:numFmt w:val="bullet"/>
+      <w:lvlText w:val=""/>
+      <w:lvlJc w:val="left"/>
+      <w:pPr>
+        <w:ind w:left="5040" w:hanging="360"/>
+      </w:pPr>
+      <w:rPr>
+        <w:rFonts w:ascii="Symbol" w:hAnsi="Symbol" w:hint="default"/>
+      </w:rPr>
+    </w:lvl>
+    <w:lvl w:ilvl="7" w:tplc="08090003" w:tentative="1">
+      <w:start w:val="1"/>
+      <w:numFmt w:val="bullet"/>
+      <w:lvlText w:val="o"/>
+      <w:lvlJc w:val="left"/>
+      <w:pPr>
+        <w:ind w:left="5760" w:hanging="360"/>
+      </w:pPr>
+      <w:rPr>
+        <w:rFonts w:ascii="Courier New" w:hAnsi="Courier New" w:cs="Courier New" w:hint="default"/>
+      </w:rPr>
+    </w:lvl>
+    <w:lvl w:ilvl="8" w:tplc="08090005" w:tentative="1">
+      <w:start w:val="1"/>
+      <w:numFmt w:val="bullet"/>
+      <w:lvlText w:val=""/>
+      <w:lvlJc w:val="left"/>
+      <w:pPr>
+        <w:ind w:left="6480" w:hanging="360"/>
+      </w:pPr>
+      <w:rPr>
+        <w:rFonts w:ascii="Wingdings" w:hAnsi="Wingdings" w:hint="default"/>
+      </w:rPr>
+    </w:lvl>
+  </w:abstractNum>
   <w:num w:numId="1" w16cid:durableId="1281718803">
     <w:abstractNumId w:val="0"/>
+  </w:num>
+  <w:num w:numId="2" w16cid:durableId="998538337">
+    <w:abstractNumId w:val="1"/>
   </w:num>
 </w:numbering>
 </file>

</xml_diff>

<commit_message>
Trying to fix some change issues
</commit_message>
<xml_diff>
--- a/COMP 3000.docx
+++ b/COMP 3000.docx
@@ -4789,7 +4789,14 @@
       </w:r>
       <w:bookmarkEnd w:id="19"/>
     </w:p>
-    <w:p/>
+    <w:p>
+      <w:r>
+        <w:t>Some Text Here</w:t>
+      </w:r>
+      <w:r>
+        <w:t>.</w:t>
+      </w:r>
+    </w:p>
     <w:p>
       <w:pPr>
         <w:pStyle w:val="Heading2"/>

</xml_diff>

<commit_message>
System architecture system written, pipeline diagram added.
</commit_message>
<xml_diff>
--- a/COMP 3000.docx
+++ b/COMP 3000.docx
@@ -3858,15 +3858,7 @@
         <w:t>Within the current cybersecurity landscape, intrusion detection play a vital role by identifying potentially malicious traffic within a network</w:t>
       </w:r>
       <w:r>
-        <w:t xml:space="preserve">. Network Intrusion detection Systems monitor network traffic and analyses and learns patterns to help detect unauthorized access or suspicious activity. </w:t>
-      </w:r>
-      <w:proofErr w:type="gramStart"/>
-      <w:r>
-        <w:t>A majority of</w:t>
-      </w:r>
-      <w:proofErr w:type="gramEnd"/>
-      <w:r>
-        <w:t xml:space="preserve"> these systems rely on signature-based detection, with the traffic being compared against a list of known attack signatures. </w:t>
+        <w:t xml:space="preserve">. Network Intrusion detection Systems monitor network traffic and analyses and learns patterns to help detect unauthorized access or suspicious activity. A majority of these systems rely on signature-based detection, with the traffic being compared against a list of known attack signatures. </w:t>
       </w:r>
     </w:p>
     <w:p>
@@ -3891,15 +3883,7 @@
     </w:p>
     <w:p>
       <w:r>
-        <w:t xml:space="preserve">As cybercrime grows ever more profitable and with the incident rate of </w:t>
-      </w:r>
-      <w:proofErr w:type="spellStart"/>
-      <w:r>
-        <w:t>cyber crime</w:t>
-      </w:r>
-      <w:proofErr w:type="spellEnd"/>
-      <w:r>
-        <w:t xml:space="preserve"> rising by 37% over the past five years (Bridewell, 2026), the different attack types and vectors continue to evolve, with attackers modifying previously used techniques or developing new attacks using exploits not commonly known, meaning that the signature-based system can’t be updated to detect these attacks. This creates big problems for signature-based systems as attacks that haven’t yet been seen may bypass the detection systems.</w:t>
+        <w:t>As cybercrime grows ever more profitable and with the incident rate of cyber crime rising by 37% over the past five years (Bridewell, 2026), the different attack types and vectors continue to evolve, with attackers modifying previously used techniques or developing new attacks using exploits not commonly known, meaning that the signature-based system can’t be updated to detect these attacks. This creates big problems for signature-based systems as attacks that haven’t yet been seen may bypass the detection systems.</w:t>
       </w:r>
     </w:p>
     <w:p>
@@ -3962,13 +3946,8 @@
       </w:r>
     </w:p>
     <w:p>
-      <w:proofErr w:type="gramStart"/>
-      <w:r>
-        <w:t>In order to</w:t>
-      </w:r>
-      <w:proofErr w:type="gramEnd"/>
-      <w:r>
-        <w:t xml:space="preserve"> achieve my aim, my project will tackle the following objectives</w:t>
+      <w:r>
+        <w:t>In order to achieve my aim, my project will tackle the following objectives</w:t>
       </w:r>
     </w:p>
     <w:p>
@@ -3987,15 +3966,7 @@
         <w:t>Investigate pre-existing intrusion detection approaches,</w:t>
       </w:r>
       <w:r>
-        <w:t xml:space="preserve"> notably signature-based and anomaly-based intrusion detection </w:t>
-      </w:r>
-      <w:proofErr w:type="gramStart"/>
-      <w:r>
-        <w:t>systems, and</w:t>
-      </w:r>
-      <w:proofErr w:type="gramEnd"/>
-      <w:r>
-        <w:t xml:space="preserve"> discuss the strengths and weaknesses.</w:t>
+        <w:t xml:space="preserve"> notably signature-based and anomaly-based intrusion detection systems, and discuss the strengths and weaknesses.</w:t>
       </w:r>
     </w:p>
     <w:p>
@@ -4032,13 +4003,8 @@
         </w:rPr>
         <w:t xml:space="preserve">Select an appropriate NIDS training and testing dataset and preprocess as needed, </w:t>
       </w:r>
-      <w:proofErr w:type="gramStart"/>
-      <w:r>
-        <w:t>To</w:t>
-      </w:r>
-      <w:proofErr w:type="gramEnd"/>
-      <w:r>
-        <w:t xml:space="preserve"> ensure features aren’t leaked to bias the machine learning models</w:t>
+      <w:r>
+        <w:t>To ensure features aren’t leaked to bias the machine learning models</w:t>
       </w:r>
       <w:r>
         <w:t>.</w:t>
@@ -4210,15 +4176,7 @@
     </w:p>
     <w:p>
       <w:r>
-        <w:t xml:space="preserve">This contrasts to Host-based which sits on individual devices and monitors system logs, file system integrity, any running processes, and changes to registry and any system calls made. By sitting directly on the device, it can detect changes to files and attempts at privilege escalation, making it very good at protecting critical devices and tracking user activity, which can help identify insider threats. But this type of monitoring can be very resource intensive as it </w:t>
-      </w:r>
-      <w:proofErr w:type="gramStart"/>
-      <w:r>
-        <w:t>has to</w:t>
-      </w:r>
-      <w:proofErr w:type="gramEnd"/>
-      <w:r>
-        <w:t xml:space="preserve"> be deployed on every device on the network.</w:t>
+        <w:t>This contrasts to Host-based which sits on individual devices and monitors system logs, file system integrity, any running processes, and changes to registry and any system calls made. By sitting directly on the device, it can detect changes to files and attempts at privilege escalation, making it very good at protecting critical devices and tracking user activity, which can help identify insider threats. But this type of monitoring can be very resource intensive as it has to be deployed on every device on the network.</w:t>
       </w:r>
     </w:p>
     <w:p>
@@ -4252,39 +4210,15 @@
     </w:p>
     <w:p>
       <w:r>
-        <w:t xml:space="preserve">There are </w:t>
-      </w:r>
-      <w:proofErr w:type="gramStart"/>
-      <w:r>
-        <w:t>a number of</w:t>
-      </w:r>
-      <w:proofErr w:type="gramEnd"/>
-      <w:r>
-        <w:t xml:space="preserve"> already existing applications that make use of AI for network intrusion detection</w:t>
-      </w:r>
-      <w:r>
-        <w:t xml:space="preserve">, and example of this usage is Suricata, Suricata makes use of isolation forest models for its threat detection, allowing it to run alongside Suricata’s </w:t>
-      </w:r>
-      <w:proofErr w:type="gramStart"/>
-      <w:r>
-        <w:t>signature based</w:t>
-      </w:r>
-      <w:proofErr w:type="gramEnd"/>
-      <w:r>
-        <w:t xml:space="preserve"> detection systems, allowing them to offer an easily accessible hybrid detection system.</w:t>
-      </w:r>
-    </w:p>
-    <w:p>
-      <w:r>
-        <w:t xml:space="preserve">Another example of AI usage is from snort, one of the </w:t>
-      </w:r>
-      <w:proofErr w:type="gramStart"/>
-      <w:r>
-        <w:t>most commonly used</w:t>
-      </w:r>
-      <w:proofErr w:type="gramEnd"/>
-      <w:r>
-        <w:t xml:space="preserve"> </w:t>
+        <w:t>There are a number of already existing applications that make use of AI for network intrusion detection</w:t>
+      </w:r>
+      <w:r>
+        <w:t>, and example of this usage is Suricata, Suricata makes use of isolation forest models for its threat detection, allowing it to run alongside Suricata’s signature based detection systems, allowing them to offer an easily accessible hybrid detection system.</w:t>
+      </w:r>
+    </w:p>
+    <w:p>
+      <w:r>
+        <w:t xml:space="preserve">Another example of AI usage is from snort, one of the most commonly used </w:t>
       </w:r>
       <w:r>
         <w:t>open-source intrusion detection systems, that traditionally makes use of signature-based detection for its systems, has introduced Snort_ML which uses neural networks instead of the traditional rule sets.</w:t>
@@ -4292,23 +4226,7 @@
     </w:p>
     <w:p>
       <w:r>
-        <w:t xml:space="preserve">The fact that two of the biggest </w:t>
-      </w:r>
-      <w:proofErr w:type="gramStart"/>
-      <w:r>
-        <w:t>open source</w:t>
-      </w:r>
-      <w:proofErr w:type="gramEnd"/>
-      <w:r>
-        <w:t xml:space="preserve"> IDS providers are shifting towards ML for detection, starts to show where the industry is starting to turn, favouring hybrid or AI systems rather than just having </w:t>
-      </w:r>
-      <w:proofErr w:type="gramStart"/>
-      <w:r>
-        <w:t>signature based</w:t>
-      </w:r>
-      <w:proofErr w:type="gramEnd"/>
-      <w:r>
-        <w:t xml:space="preserve"> systems.</w:t>
+        <w:t>The fact that two of the biggest open source IDS providers are shifting towards ML for detection, starts to show where the industry is starting to turn, favouring hybrid or AI systems rather than just having signature based systems.</w:t>
       </w:r>
     </w:p>
     <w:p>
@@ -4351,15 +4269,7 @@
     </w:p>
     <w:p>
       <w:r>
-        <w:t xml:space="preserve">The only ethical consideration for this project that I can think is how the data for training has been obtained, have I gathered it in a shady manner, </w:t>
-      </w:r>
-      <w:proofErr w:type="spellStart"/>
-      <w:r>
-        <w:t>through</w:t>
-      </w:r>
-      <w:proofErr w:type="spellEnd"/>
-      <w:r>
-        <w:t xml:space="preserve"> not being clear on my intentions</w:t>
+        <w:t>The only ethical consideration for this project that I can think is how the data for training has been obtained, have I gathered it in a shady manner, through not being clear on my intentions</w:t>
       </w:r>
       <w:r>
         <w:t xml:space="preserve"> in the gathering of data. No, in this project the data has been ethically sourced through the University of New South Wales as they provide the UNSW NB-15 dataset for free for academic usage which this project falls under.</w:t>
@@ -4375,15 +4285,7 @@
     </w:p>
     <w:p>
       <w:r>
-        <w:t xml:space="preserve">This is doubly so due to its nature as </w:t>
-      </w:r>
-      <w:proofErr w:type="gramStart"/>
-      <w:r>
-        <w:t>a</w:t>
-      </w:r>
-      <w:proofErr w:type="gramEnd"/>
-      <w:r>
-        <w:t xml:space="preserve"> Intrusion Detection system, rather than an Intrusion Prevention System, as by itself, an IDS system can do nothing about the intrusion attempts but alert an analyst or user.</w:t>
+        <w:t>This is doubly so due to its nature as a Intrusion Detection system, rather than an Intrusion Prevention System, as by itself, an IDS system can do nothing about the intrusion attempts but alert an analyst or user.</w:t>
       </w:r>
     </w:p>
     <w:p/>
@@ -4467,15 +4369,7 @@
     </w:p>
     <w:p>
       <w:r>
-        <w:t xml:space="preserve">These examples show that while there are possible alternatives to the agile methodology that ive chosen, they don’t fit the project as well as they all produce either a rigidness that </w:t>
-      </w:r>
-      <w:proofErr w:type="gramStart"/>
-      <w:r>
-        <w:t>would</w:t>
-      </w:r>
-      <w:proofErr w:type="gramEnd"/>
-      <w:r>
-        <w:t xml:space="preserve"> cripple the project if problems </w:t>
+        <w:t xml:space="preserve">These examples show that while there are possible alternatives to the agile methodology that ive chosen, they don’t fit the project as well as they all produce either a rigidness that would cripple the project if problems </w:t>
       </w:r>
       <w:r>
         <w:t>occur or</w:t>
@@ -4498,11 +4392,147 @@
       <w:bookmarkEnd w:id="14"/>
     </w:p>
     <w:p>
+      <w:r>
+        <w:t xml:space="preserve">My design for the system will work along the lines of standard machine learning practice, </w:t>
+      </w:r>
+      <w:r>
+        <w:t>using the standard stages of a machine learning pipeline: loading the dataset, preprocessing, feature scaling, feed the data to the model, make predictions against the data, then send an alert regarding the information. Below is a breakdown of the stages of my ML pipeline.</w:t>
+      </w:r>
+    </w:p>
+    <w:p>
+      <w:r>
+        <w:t>The first stage is loading the dataset into the Jupyter notebook file through the use of NumPy and pandas</w:t>
+      </w:r>
+      <w:r>
+        <w:t xml:space="preserve">, before loading the dataset, checking the dataset contains all of the expected features is advised considering the number of sites where these testing datasets are available from. </w:t>
+      </w:r>
+    </w:p>
+    <w:p>
+      <w:r>
+        <w:t>Next is preprocessing the data to ensure that the model can use it to train, this can involve cleaning the data to get rid of any inaccurate, incomplete, or incorrectly formatted data from the dataset,</w:t>
+      </w:r>
+      <w:r>
+        <w:t xml:space="preserve"> encoding the data to convert categorical data such as text or any </w:t>
+      </w:r>
+      <w:r>
+        <w:t>non-numerical</w:t>
+      </w:r>
+      <w:r>
+        <w:t xml:space="preserve"> categories into numerical form so that the ML algorithms can process it properly. </w:t>
+      </w:r>
+    </w:p>
+    <w:p>
+      <w:r>
+        <w:t>Dataset splitting can be vital for ML development depending on the data set being used as some datasets come split into testing and train files, this can be done in the Jupyter notebook file if needed to provide testing and training sets from a single dataset file.</w:t>
+      </w:r>
+    </w:p>
+    <w:p>
+      <w:r>
+        <w:t>Feature s</w:t>
+      </w:r>
+      <w:r>
+        <w:t>caling helps ensure that features that have wider ranging magnitudes don’t bias the learning process by limiting the range</w:t>
+      </w:r>
+      <w:r>
+        <w:t xml:space="preserve"> between a given range for example between minus 1 and 1 to reduce bias.</w:t>
+      </w:r>
+      <w:r>
+        <w:t xml:space="preserve"> </w:t>
+      </w:r>
+    </w:p>
+    <w:p>
+      <w:r>
+        <w:t>Loading the ML involves either training the model from scratch or loading a trained model from a saved file then feeding it the data you want it to train it on or test it against, this stage needs to be done correctly or the results will not be accurate, this stage also helps to determine issues with the previous stages as the accuracies of the models can point to problems, such as if the accuracy of the models is 99.99% it is highly likely that the models are cheating via a feature leak that is showing the models what is right and wrong.</w:t>
+      </w:r>
+    </w:p>
+    <w:p>
+      <w:r>
+        <w:lastRenderedPageBreak/>
+        <w:t>The prediction stage is where the data is fed to the loaded and trained model and it runs against the dataset and produces predictions that can be output to a file, and then depending on the results of the predictions can trigger alerts via multiple means such as SIEM platforms, application notifications, or emails through email API’s or smtp code.</w:t>
+      </w:r>
+    </w:p>
+    <w:p>
+      <w:r>
+        <w:t xml:space="preserve"> preprocessing the data</w:t>
+      </w:r>
+      <w:r>
+        <w:t xml:space="preserve"> if needed, split the data into test and train and </w:t>
+      </w:r>
+      <w:r>
+        <w:t>, scaling and weighting the features by importance</w:t>
+      </w:r>
+      <w:r>
+        <w:t>, training the model against a section of the data, feeding the model the other section of the data to have it make predictions to determine whether or not the traffic is malicious or normal, and finally if there is suspicious traffic, output the suspicious traffic to a txt file for examination, and then send an email alert to make users aware.</w:t>
+      </w:r>
+    </w:p>
+    <w:p>
+      <w:pPr>
+        <w:keepNext/>
+      </w:pPr>
+      <w:r>
+        <w:drawing>
+          <wp:inline distT="0" distB="0" distL="0" distR="0" wp14:anchorId="68021D72" wp14:editId="34308990">
+            <wp:extent cx="4324954" cy="5439534"/>
+            <wp:effectExtent l="0" t="0" r="0" b="0"/>
+            <wp:docPr id="1321682489" name="Picture 1"/>
+            <wp:cNvGraphicFramePr>
+              <a:graphicFrameLocks xmlns:a="http://schemas.openxmlformats.org/drawingml/2006/main" noChangeAspect="1"/>
+            </wp:cNvGraphicFramePr>
+            <a:graphic xmlns:a="http://schemas.openxmlformats.org/drawingml/2006/main">
+              <a:graphicData uri="http://schemas.openxmlformats.org/drawingml/2006/picture">
+                <pic:pic xmlns:pic="http://schemas.openxmlformats.org/drawingml/2006/picture">
+                  <pic:nvPicPr>
+                    <pic:cNvPr id="1321682489" name=""/>
+                    <pic:cNvPicPr/>
+                  </pic:nvPicPr>
+                  <pic:blipFill>
+                    <a:blip r:embed="rId6"/>
+                    <a:stretch>
+                      <a:fillRect/>
+                    </a:stretch>
+                  </pic:blipFill>
+                  <pic:spPr>
+                    <a:xfrm>
+                      <a:off x="0" y="0"/>
+                      <a:ext cx="4324954" cy="5439534"/>
+                    </a:xfrm>
+                    <a:prstGeom prst="rect">
+                      <a:avLst/>
+                    </a:prstGeom>
+                  </pic:spPr>
+                </pic:pic>
+              </a:graphicData>
+            </a:graphic>
+          </wp:inline>
+        </w:drawing>
+      </w:r>
+    </w:p>
+    <w:p>
+      <w:pPr>
+        <w:pStyle w:val="Caption"/>
+      </w:pPr>
+      <w:r>
+        <w:t xml:space="preserve">Figure </w:t>
+      </w:r>
+      <w:fldSimple w:instr=" SEQ Figure \* ARABIC ">
+        <w:r>
+          <w:rPr>
+            <w:noProof/>
+          </w:rPr>
+          <w:t>1</w:t>
+        </w:r>
+      </w:fldSimple>
+      <w:r>
+        <w:t>: Pipeline diagram for the ML system</w:t>
+      </w:r>
+    </w:p>
+    <w:p>
       <w:pPr>
         <w:pStyle w:val="Heading2"/>
       </w:pPr>
       <w:bookmarkStart w:id="15" w:name="_Toc225330885"/>
       <w:r>
+        <w:lastRenderedPageBreak/>
         <w:t>Dataset</w:t>
       </w:r>
       <w:bookmarkEnd w:id="15"/>
@@ -4569,15 +4599,7 @@
     </w:p>
     <w:p>
       <w:r>
-        <w:t xml:space="preserve">Python is one of the main building blocks for this project as without it, none of it would work due to the availability of some key libraries that allow me to fulfil my aims, for this project, I used Python 3 due to its previously mentioned libraries for machine learning that aren’t available in other languages. </w:t>
-      </w:r>
-      <w:proofErr w:type="gramStart"/>
-      <w:r>
-        <w:t>All of</w:t>
-      </w:r>
-      <w:proofErr w:type="gramEnd"/>
-      <w:r>
-        <w:t xml:space="preserve"> my code written for this project has been done in python as the language is massively versatile.</w:t>
+        <w:t>Python is one of the main building blocks for this project as without it, none of it would work due to the availability of some key libraries that allow me to fulfil my aims, for this project, I used Python 3 due to its previously mentioned libraries for machine learning that aren’t available in other languages. All of my code written for this project has been done in python as the language is massively versatile.</w:t>
       </w:r>
     </w:p>
     <w:p>
@@ -4592,19 +4614,7 @@
     </w:p>
     <w:p>
       <w:r>
-        <w:t xml:space="preserve">Jupyter notebook was used as the main IDE for this project, due to how well it complements machine learning development with its use of cells, as the cells allow you to run individual segments of code without rerunning the entire code file, which is critical for machine learning due to how long it can take to run certain code blocks, such as model training, which for very </w:t>
-      </w:r>
-      <w:r>
-        <w:lastRenderedPageBreak/>
-        <w:t xml:space="preserve">demanding models, can take many hours to run. It also stores results in the file so you can view the information gained </w:t>
-      </w:r>
-      <w:proofErr w:type="gramStart"/>
-      <w:r>
-        <w:t>at a later date</w:t>
-      </w:r>
-      <w:proofErr w:type="gramEnd"/>
-      <w:r>
-        <w:t xml:space="preserve"> without rerunning the code.</w:t>
+        <w:t>Jupyter notebook was used as the main IDE for this project, due to how well it complements machine learning development with its use of cells, as the cells allow you to run individual segments of code without rerunning the entire code file, which is critical for machine learning due to how long it can take to run certain code blocks, such as model training, which for very demanding models, can take many hours to run. It also stores results in the file so you can view the information gained at a later date without rerunning the code.</w:t>
       </w:r>
     </w:p>
     <w:p>
@@ -4619,15 +4629,7 @@
     </w:p>
     <w:p>
       <w:r>
-        <w:t xml:space="preserve">For this project, a range of python libraries were </w:t>
-      </w:r>
-      <w:proofErr w:type="gramStart"/>
-      <w:r>
-        <w:t>use</w:t>
-      </w:r>
-      <w:proofErr w:type="gramEnd"/>
-      <w:r>
-        <w:t xml:space="preserve"> to implement the features set out in the aims and objectives earlier in the report, in the bullet points below, I will layout how and why each library was used.</w:t>
+        <w:t>For this project, a range of python libraries were use to implement the features set out in the aims and objectives earlier in the report, in the bullet points below, I will layout how and why each library was used.</w:t>
       </w:r>
     </w:p>
     <w:p>
@@ -4665,15 +4667,7 @@
         <w:t>Scikit-Learn + XGBoost</w:t>
       </w:r>
       <w:r>
-        <w:t xml:space="preserve">: These two libraries make up a large portion of the backbone of machine leaning development in python, with Scikit-Learn encompassing many different types of models, algorithms, preprocessing and </w:t>
-      </w:r>
-      <w:proofErr w:type="gramStart"/>
-      <w:r>
-        <w:t>a number of</w:t>
-      </w:r>
-      <w:proofErr w:type="gramEnd"/>
-      <w:r>
-        <w:t xml:space="preserve"> other features, this allows implementation of AI models to run much smoother than it would without it.</w:t>
+        <w:t>: These two libraries make up a large portion of the backbone of machine leaning development in python, with Scikit-Learn encompassing many different types of models, algorithms, preprocessing and a number of other features, this allows implementation of AI models to run much smoother than it would without it.</w:t>
       </w:r>
     </w:p>
     <w:p>
@@ -4692,15 +4686,7 @@
         <w:t>JobLib</w:t>
       </w:r>
       <w:r>
-        <w:t xml:space="preserve">: This was used </w:t>
-      </w:r>
-      <w:proofErr w:type="gramStart"/>
-      <w:r>
-        <w:t>in order to</w:t>
-      </w:r>
-      <w:proofErr w:type="gramEnd"/>
-      <w:r>
-        <w:t xml:space="preserve"> dump the model and feature columns from python to  a PKL file to allow for usage within other Jupyter notebook files without having to retrain the model, saving a considerable amount of time.</w:t>
+        <w:t>: This was used in order to dump the model and feature columns from python to  a PKL file to allow for usage within other Jupyter notebook files without having to retrain the model, saving a considerable amount of time.</w:t>
       </w:r>
     </w:p>
     <w:p>
@@ -4719,15 +4705,7 @@
         <w:t>SMTPLib</w:t>
       </w:r>
       <w:r>
-        <w:t xml:space="preserve">: This was used </w:t>
-      </w:r>
-      <w:proofErr w:type="gramStart"/>
-      <w:r>
-        <w:t>in order to</w:t>
-      </w:r>
-      <w:proofErr w:type="gramEnd"/>
-      <w:r>
-        <w:t xml:space="preserve"> implement email alerts, allowing the users to be informed if suspicious behaviour has been detected within the traffic log files.</w:t>
+        <w:t>: This was used in order to implement email alerts, allowing the users to be informed if suspicious behaviour has been detected within the traffic log files.</w:t>
       </w:r>
     </w:p>
     <w:p>
@@ -4990,7 +4968,7 @@
       <w:r>
         <w:t xml:space="preserve">. Available at </w:t>
       </w:r>
-      <w:hyperlink r:id="rId6" w:history="1">
+      <w:hyperlink r:id="rId7" w:history="1">
         <w:r>
           <w:rPr>
             <w:rStyle w:val="Hyperlink"/>
@@ -5013,7 +4991,7 @@
       <w:r>
         <w:t xml:space="preserve"> </w:t>
       </w:r>
-      <w:hyperlink r:id="rId7" w:history="1">
+      <w:hyperlink r:id="rId8" w:history="1">
         <w:r>
           <w:rPr>
             <w:rStyle w:val="Hyperlink"/>
@@ -6264,6 +6242,25 @@
       <w:shd w:val="clear" w:color="auto" w:fill="E1DFDD"/>
     </w:rPr>
   </w:style>
+  <w:style w:type="paragraph" w:styleId="Caption">
+    <w:name w:val="caption"/>
+    <w:basedOn w:val="Normal"/>
+    <w:next w:val="Normal"/>
+    <w:uiPriority w:val="35"/>
+    <w:unhideWhenUsed/>
+    <w:qFormat/>
+    <w:rsid w:val="00374CE6"/>
+    <w:pPr>
+      <w:spacing w:after="200" w:line="240" w:lineRule="auto"/>
+    </w:pPr>
+    <w:rPr>
+      <w:i/>
+      <w:iCs/>
+      <w:color w:val="0E2841" w:themeColor="text2"/>
+      <w:sz w:val="18"/>
+      <w:szCs w:val="18"/>
+    </w:rPr>
+  </w:style>
 </w:styles>
 </file>
 

</xml_diff>

<commit_message>
Dataset and preprocessing complete, possible rewrite later
</commit_message>
<xml_diff>
--- a/COMP 3000.docx
+++ b/COMP 3000.docx
@@ -3883,7 +3883,15 @@
     </w:p>
     <w:p>
       <w:r>
-        <w:t>As cybercrime grows ever more profitable and with the incident rate of cyber crime rising by 37% over the past five years (Bridewell, 2026), the different attack types and vectors continue to evolve, with attackers modifying previously used techniques or developing new attacks using exploits not commonly known, meaning that the signature-based system can’t be updated to detect these attacks. This creates big problems for signature-based systems as attacks that haven’t yet been seen may bypass the detection systems.</w:t>
+        <w:t xml:space="preserve">As cybercrime grows ever more profitable and with the incident rate of </w:t>
+      </w:r>
+      <w:proofErr w:type="spellStart"/>
+      <w:r>
+        <w:t>cyber crime</w:t>
+      </w:r>
+      <w:proofErr w:type="spellEnd"/>
+      <w:r>
+        <w:t xml:space="preserve"> rising by 37% over the past five years (Bridewell, 2026), the different attack types and vectors continue to evolve, with attackers modifying previously used techniques or developing new attacks using exploits not commonly known, meaning that the signature-based system can’t be updated to detect these attacks. This creates big problems for signature-based systems as attacks that haven’t yet been seen may bypass the detection systems.</w:t>
       </w:r>
     </w:p>
     <w:p>
@@ -4269,7 +4277,15 @@
     </w:p>
     <w:p>
       <w:r>
-        <w:t>The only ethical consideration for this project that I can think is how the data for training has been obtained, have I gathered it in a shady manner, through not being clear on my intentions</w:t>
+        <w:t xml:space="preserve">The only ethical consideration for this project that I can think is how the data for training has been obtained, have I gathered it in a shady manner, </w:t>
+      </w:r>
+      <w:proofErr w:type="spellStart"/>
+      <w:r>
+        <w:t>through</w:t>
+      </w:r>
+      <w:proofErr w:type="spellEnd"/>
+      <w:r>
+        <w:t xml:space="preserve"> not being clear on my intentions</w:t>
       </w:r>
       <w:r>
         <w:t xml:space="preserve"> in the gathering of data. No, in this project the data has been ethically sourced through the University of New South Wales as they provide the UNSW NB-15 dataset for free for academic usage which this project falls under.</w:t>
@@ -4369,7 +4385,15 @@
     </w:p>
     <w:p>
       <w:r>
-        <w:t xml:space="preserve">These examples show that while there are possible alternatives to the agile methodology that ive chosen, they don’t fit the project as well as they all produce either a rigidness that would cripple the project if problems </w:t>
+        <w:t xml:space="preserve">These examples show that while there are possible alternatives to the agile methodology that </w:t>
+      </w:r>
+      <w:proofErr w:type="spellStart"/>
+      <w:r>
+        <w:t>ive</w:t>
+      </w:r>
+      <w:proofErr w:type="spellEnd"/>
+      <w:r>
+        <w:t xml:space="preserve"> chosen, they don’t fit the project as well as they all produce either a rigidness that would cripple the project if problems </w:t>
       </w:r>
       <w:r>
         <w:t>occur or</w:t>
@@ -4453,16 +4477,7 @@
     </w:p>
     <w:p>
       <w:r>
-        <w:t xml:space="preserve"> preprocessing the data</w:t>
-      </w:r>
-      <w:r>
-        <w:t xml:space="preserve"> if needed, split the data into test and train and </w:t>
-      </w:r>
-      <w:r>
-        <w:t>, scaling and weighting the features by importance</w:t>
-      </w:r>
-      <w:r>
-        <w:t>, training the model against a section of the data, feeding the model the other section of the data to have it make predictions to determine whether or not the traffic is malicious or normal, and finally if there is suspicious traffic, output the suspicious traffic to a txt file for examination, and then send an email alert to make users aware.</w:t>
+        <w:t xml:space="preserve"> </w:t>
       </w:r>
     </w:p>
     <w:p>
@@ -4470,6 +4485,9 @@
         <w:keepNext/>
       </w:pPr>
       <w:r>
+        <w:rPr>
+          <w:noProof/>
+        </w:rPr>
         <w:drawing>
           <wp:inline distT="0" distB="0" distL="0" distR="0" wp14:anchorId="68021D72" wp14:editId="34308990">
             <wp:extent cx="4324954" cy="5439534"/>
@@ -4532,10 +4550,38 @@
       </w:pPr>
       <w:bookmarkStart w:id="15" w:name="_Toc225330885"/>
       <w:r>
+        <w:t>Dataset</w:t>
+      </w:r>
+      <w:bookmarkEnd w:id="15"/>
+    </w:p>
+    <w:p>
+      <w:r>
+        <w:t>The dataset that this project will make use of is the UNSW-NB15 dataset produced by the university of New South Wales</w:t>
+      </w:r>
+      <w:r>
+        <w:t>.</w:t>
+      </w:r>
+      <w:r>
+        <w:t xml:space="preserve"> This data set has 49 features to give the model a range of different data points to train against and learn the patterns of. It contains 9 different types of attacks, these attacks are </w:t>
+      </w:r>
+      <w:r>
+        <w:t>Fuzzers, Analysis, Backdoors, DoS, Exploits, Generic, Reconnaissance, Shellcode and Worms</w:t>
+      </w:r>
+      <w:r>
+        <w:t xml:space="preserve">. </w:t>
+      </w:r>
+    </w:p>
+    <w:p>
+      <w:r>
+        <w:t>The reason that I chose this dataset is that while it is a more modern dataset with newer types of attacks than a lot of other datasets, the hardware needed to train a model on it is much more reasonable than other modern datasets such as the CICIDS2017 dataset</w:t>
+      </w:r>
+      <w:r>
+        <w:t xml:space="preserve"> as part of my reason </w:t>
+      </w:r>
+      <w:r>
         <w:lastRenderedPageBreak/>
-        <w:t>Dataset</w:t>
-      </w:r>
-      <w:bookmarkEnd w:id="15"/>
+        <w:t>for choosing this project is to find out if AI NIDS is something that an average consumer could reasonably make use without having massive computing power to train the models.</w:t>
+      </w:r>
     </w:p>
     <w:p>
       <w:pPr>
@@ -4548,6 +4594,41 @@
       <w:bookmarkEnd w:id="16"/>
     </w:p>
     <w:p>
+      <w:r>
+        <w:t>In order to ensure that the ML model to accept and process the data</w:t>
+      </w:r>
+      <w:r>
+        <w:t xml:space="preserve">, the data must be pre-processed, it needs to go through a number of steps to </w:t>
+      </w:r>
+      <w:r>
+        <w:t>that no errors occur during training and testing. One of the most important preprocessing steps is proper data encoding, this entails changing the data type of all non-numerical categorical columns to a number format such as float64 as a large number of ML models will not accept non-numerical data.</w:t>
+      </w:r>
+    </w:p>
+    <w:p>
+      <w:r>
+        <w:t>During preprocessing, it can be key to drop columns that could poison training, for the UNSW NB15, this would be the label, id, and attack_cat as label and attack_cat denote whether a line of traffic is an attack or not, while the id column</w:t>
+      </w:r>
+      <w:r>
+        <w:t xml:space="preserve"> can cause models to f</w:t>
+      </w:r>
+      <w:r>
+        <w:t>ocus on it and decrease the accuracy heavily going.</w:t>
+      </w:r>
+    </w:p>
+    <w:p>
+      <w:r>
+        <w:t>A key step of preprocessing is cleaning and scaling the data, cleaning matters as it gets rid of any incomplete, incorrect, or corrupt data so that the model doesn’t try to learn or make predictions based on bad data.</w:t>
+      </w:r>
+      <w:r>
+        <w:t xml:space="preserve"> </w:t>
+      </w:r>
+    </w:p>
+    <w:p>
+      <w:r>
+        <w:t>Scaling is used to ensure that features with large ranges don’t dominate learning due to their magnitude, scaling limits to the range of numbers features can contain, traditionally this centres around zero with a difference of one either side so minus one and positive one.</w:t>
+      </w:r>
+    </w:p>
+    <w:p>
       <w:pPr>
         <w:pStyle w:val="Heading2"/>
       </w:pPr>
@@ -4557,6 +4638,8 @@
       </w:r>
       <w:bookmarkEnd w:id="17"/>
     </w:p>
+    <w:p/>
+    <w:p/>
     <w:p>
       <w:pPr>
         <w:pStyle w:val="Heading2"/>
@@ -4614,7 +4697,11 @@
     </w:p>
     <w:p>
       <w:r>
-        <w:t>Jupyter notebook was used as the main IDE for this project, due to how well it complements machine learning development with its use of cells, as the cells allow you to run individual segments of code without rerunning the entire code file, which is critical for machine learning due to how long it can take to run certain code blocks, such as model training, which for very demanding models, can take many hours to run. It also stores results in the file so you can view the information gained at a later date without rerunning the code.</w:t>
+        <w:t xml:space="preserve">Jupyter notebook was used as the main IDE for this project, due to how well it complements machine learning development with its use of cells, as the cells allow you to run individual segments of code without rerunning the entire code file, which is critical for machine learning </w:t>
+      </w:r>
+      <w:r>
+        <w:lastRenderedPageBreak/>
+        <w:t>due to how long it can take to run certain code blocks, such as model training, which for very demanding models, can take many hours to run. It also stores results in the file so you can view the information gained at a later date without rerunning the code.</w:t>
       </w:r>
     </w:p>
     <w:p>
@@ -4629,7 +4716,15 @@
     </w:p>
     <w:p>
       <w:r>
-        <w:t>For this project, a range of python libraries were use to implement the features set out in the aims and objectives earlier in the report, in the bullet points below, I will layout how and why each library was used.</w:t>
+        <w:t xml:space="preserve">For this project, a range of python libraries were use to implement the features set out in the aims and objectives earlier in the report, in the bullet points below, I will </w:t>
+      </w:r>
+      <w:proofErr w:type="spellStart"/>
+      <w:r>
+        <w:t>layout</w:t>
+      </w:r>
+      <w:proofErr w:type="spellEnd"/>
+      <w:r>
+        <w:t xml:space="preserve"> how and why each library was used.</w:t>
       </w:r>
     </w:p>
     <w:p>
@@ -4664,8 +4759,17 @@
           <w:b/>
           <w:bCs/>
         </w:rPr>
-        <w:t>Scikit-Learn + XGBoost</w:t>
-      </w:r>
+        <w:t xml:space="preserve">Scikit-Learn + </w:t>
+      </w:r>
+      <w:proofErr w:type="spellStart"/>
+      <w:r>
+        <w:rPr>
+          <w:b/>
+          <w:bCs/>
+        </w:rPr>
+        <w:t>XGBoost</w:t>
+      </w:r>
+      <w:proofErr w:type="spellEnd"/>
       <w:r>
         <w:t>: These two libraries make up a large portion of the backbone of machine leaning development in python, with Scikit-Learn encompassing many different types of models, algorithms, preprocessing and a number of other features, this allows implementation of AI models to run much smoother than it would without it.</w:t>
       </w:r>
@@ -4678,6 +4782,7 @@
           <w:numId w:val="2"/>
         </w:numPr>
       </w:pPr>
+      <w:proofErr w:type="spellStart"/>
       <w:r>
         <w:rPr>
           <w:b/>
@@ -4685,6 +4790,7 @@
         </w:rPr>
         <w:t>JobLib</w:t>
       </w:r>
+      <w:proofErr w:type="spellEnd"/>
       <w:r>
         <w:t>: This was used in order to dump the model and feature columns from python to  a PKL file to allow for usage within other Jupyter notebook files without having to retrain the model, saving a considerable amount of time.</w:t>
       </w:r>
@@ -5851,7 +5957,6 @@
   <w:style w:type="character" w:default="1" w:styleId="DefaultParagraphFont">
     <w:name w:val="Default Paragraph Font"/>
     <w:uiPriority w:val="1"/>
-    <w:semiHidden/>
     <w:unhideWhenUsed/>
   </w:style>
   <w:style w:type="table" w:default="1" w:styleId="TableNormal">

</xml_diff>

<commit_message>
System Design completed, Work on implemnetation to begin tomorrow
</commit_message>
<xml_diff>
--- a/COMP 3000.docx
+++ b/COMP 3000.docx
@@ -263,7 +263,7 @@
           <w:r>
             <w:fldChar w:fldCharType="separate"/>
           </w:r>
-          <w:hyperlink w:anchor="_Toc225330870" w:history="1">
+          <w:hyperlink w:anchor="_Toc225684956" w:history="1">
             <w:r>
               <w:rPr>
                 <w:rStyle w:val="Hyperlink"/>
@@ -290,7 +290,7 @@
                 <w:noProof/>
                 <w:webHidden/>
               </w:rPr>
-              <w:instrText xml:space="preserve"> PAGEREF _Toc225330870 \h </w:instrText>
+              <w:instrText xml:space="preserve"> PAGEREF _Toc225684956 \h </w:instrText>
             </w:r>
             <w:r>
               <w:rPr>
@@ -337,7 +337,7 @@
               <w14:ligatures w14:val="standardContextual"/>
             </w:rPr>
           </w:pPr>
-          <w:hyperlink w:anchor="_Toc225330871" w:history="1">
+          <w:hyperlink w:anchor="_Toc225684957" w:history="1">
             <w:r>
               <w:rPr>
                 <w:rStyle w:val="Hyperlink"/>
@@ -364,7 +364,7 @@
                 <w:noProof/>
                 <w:webHidden/>
               </w:rPr>
-              <w:instrText xml:space="preserve"> PAGEREF _Toc225330871 \h </w:instrText>
+              <w:instrText xml:space="preserve"> PAGEREF _Toc225684957 \h </w:instrText>
             </w:r>
             <w:r>
               <w:rPr>
@@ -411,7 +411,7 @@
               <w14:ligatures w14:val="standardContextual"/>
             </w:rPr>
           </w:pPr>
-          <w:hyperlink w:anchor="_Toc225330872" w:history="1">
+          <w:hyperlink w:anchor="_Toc225684958" w:history="1">
             <w:r>
               <w:rPr>
                 <w:rStyle w:val="Hyperlink"/>
@@ -438,7 +438,7 @@
                 <w:noProof/>
                 <w:webHidden/>
               </w:rPr>
-              <w:instrText xml:space="preserve"> PAGEREF _Toc225330872 \h </w:instrText>
+              <w:instrText xml:space="preserve"> PAGEREF _Toc225684958 \h </w:instrText>
             </w:r>
             <w:r>
               <w:rPr>
@@ -485,7 +485,7 @@
               <w14:ligatures w14:val="standardContextual"/>
             </w:rPr>
           </w:pPr>
-          <w:hyperlink w:anchor="_Toc225330873" w:history="1">
+          <w:hyperlink w:anchor="_Toc225684959" w:history="1">
             <w:r>
               <w:rPr>
                 <w:rStyle w:val="Hyperlink"/>
@@ -512,7 +512,7 @@
                 <w:noProof/>
                 <w:webHidden/>
               </w:rPr>
-              <w:instrText xml:space="preserve"> PAGEREF _Toc225330873 \h </w:instrText>
+              <w:instrText xml:space="preserve"> PAGEREF _Toc225684959 \h </w:instrText>
             </w:r>
             <w:r>
               <w:rPr>
@@ -559,7 +559,7 @@
               <w14:ligatures w14:val="standardContextual"/>
             </w:rPr>
           </w:pPr>
-          <w:hyperlink w:anchor="_Toc225330874" w:history="1">
+          <w:hyperlink w:anchor="_Toc225684960" w:history="1">
             <w:r>
               <w:rPr>
                 <w:rStyle w:val="Hyperlink"/>
@@ -586,7 +586,7 @@
                 <w:noProof/>
                 <w:webHidden/>
               </w:rPr>
-              <w:instrText xml:space="preserve"> PAGEREF _Toc225330874 \h </w:instrText>
+              <w:instrText xml:space="preserve"> PAGEREF _Toc225684960 \h </w:instrText>
             </w:r>
             <w:r>
               <w:rPr>
@@ -633,7 +633,7 @@
               <w14:ligatures w14:val="standardContextual"/>
             </w:rPr>
           </w:pPr>
-          <w:hyperlink w:anchor="_Toc225330875" w:history="1">
+          <w:hyperlink w:anchor="_Toc225684961" w:history="1">
             <w:r>
               <w:rPr>
                 <w:rStyle w:val="Hyperlink"/>
@@ -660,7 +660,7 @@
                 <w:noProof/>
                 <w:webHidden/>
               </w:rPr>
-              <w:instrText xml:space="preserve"> PAGEREF _Toc225330875 \h </w:instrText>
+              <w:instrText xml:space="preserve"> PAGEREF _Toc225684961 \h </w:instrText>
             </w:r>
             <w:r>
               <w:rPr>
@@ -707,7 +707,7 @@
               <w14:ligatures w14:val="standardContextual"/>
             </w:rPr>
           </w:pPr>
-          <w:hyperlink w:anchor="_Toc225330876" w:history="1">
+          <w:hyperlink w:anchor="_Toc225684962" w:history="1">
             <w:r>
               <w:rPr>
                 <w:rStyle w:val="Hyperlink"/>
@@ -734,7 +734,7 @@
                 <w:noProof/>
                 <w:webHidden/>
               </w:rPr>
-              <w:instrText xml:space="preserve"> PAGEREF _Toc225330876 \h </w:instrText>
+              <w:instrText xml:space="preserve"> PAGEREF _Toc225684962 \h </w:instrText>
             </w:r>
             <w:r>
               <w:rPr>
@@ -781,7 +781,7 @@
               <w14:ligatures w14:val="standardContextual"/>
             </w:rPr>
           </w:pPr>
-          <w:hyperlink w:anchor="_Toc225330877" w:history="1">
+          <w:hyperlink w:anchor="_Toc225684963" w:history="1">
             <w:r>
               <w:rPr>
                 <w:rStyle w:val="Hyperlink"/>
@@ -808,7 +808,7 @@
                 <w:noProof/>
                 <w:webHidden/>
               </w:rPr>
-              <w:instrText xml:space="preserve"> PAGEREF _Toc225330877 \h </w:instrText>
+              <w:instrText xml:space="preserve"> PAGEREF _Toc225684963 \h </w:instrText>
             </w:r>
             <w:r>
               <w:rPr>
@@ -855,7 +855,7 @@
               <w14:ligatures w14:val="standardContextual"/>
             </w:rPr>
           </w:pPr>
-          <w:hyperlink w:anchor="_Toc225330878" w:history="1">
+          <w:hyperlink w:anchor="_Toc225684964" w:history="1">
             <w:r>
               <w:rPr>
                 <w:rStyle w:val="Hyperlink"/>
@@ -882,7 +882,7 @@
                 <w:noProof/>
                 <w:webHidden/>
               </w:rPr>
-              <w:instrText xml:space="preserve"> PAGEREF _Toc225330878 \h </w:instrText>
+              <w:instrText xml:space="preserve"> PAGEREF _Toc225684964 \h </w:instrText>
             </w:r>
             <w:r>
               <w:rPr>
@@ -929,7 +929,7 @@
               <w14:ligatures w14:val="standardContextual"/>
             </w:rPr>
           </w:pPr>
-          <w:hyperlink w:anchor="_Toc225330879" w:history="1">
+          <w:hyperlink w:anchor="_Toc225684965" w:history="1">
             <w:r>
               <w:rPr>
                 <w:rStyle w:val="Hyperlink"/>
@@ -956,7 +956,7 @@
                 <w:noProof/>
                 <w:webHidden/>
               </w:rPr>
-              <w:instrText xml:space="preserve"> PAGEREF _Toc225330879 \h </w:instrText>
+              <w:instrText xml:space="preserve"> PAGEREF _Toc225684965 \h </w:instrText>
             </w:r>
             <w:r>
               <w:rPr>
@@ -1003,7 +1003,7 @@
               <w14:ligatures w14:val="standardContextual"/>
             </w:rPr>
           </w:pPr>
-          <w:hyperlink w:anchor="_Toc225330880" w:history="1">
+          <w:hyperlink w:anchor="_Toc225684966" w:history="1">
             <w:r>
               <w:rPr>
                 <w:rStyle w:val="Hyperlink"/>
@@ -1030,7 +1030,7 @@
                 <w:noProof/>
                 <w:webHidden/>
               </w:rPr>
-              <w:instrText xml:space="preserve"> PAGEREF _Toc225330880 \h </w:instrText>
+              <w:instrText xml:space="preserve"> PAGEREF _Toc225684966 \h </w:instrText>
             </w:r>
             <w:r>
               <w:rPr>
@@ -1077,7 +1077,7 @@
               <w14:ligatures w14:val="standardContextual"/>
             </w:rPr>
           </w:pPr>
-          <w:hyperlink w:anchor="_Toc225330881" w:history="1">
+          <w:hyperlink w:anchor="_Toc225684967" w:history="1">
             <w:r>
               <w:rPr>
                 <w:rStyle w:val="Hyperlink"/>
@@ -1104,7 +1104,7 @@
                 <w:noProof/>
                 <w:webHidden/>
               </w:rPr>
-              <w:instrText xml:space="preserve"> PAGEREF _Toc225330881 \h </w:instrText>
+              <w:instrText xml:space="preserve"> PAGEREF _Toc225684967 \h </w:instrText>
             </w:r>
             <w:r>
               <w:rPr>
@@ -1151,7 +1151,7 @@
               <w14:ligatures w14:val="standardContextual"/>
             </w:rPr>
           </w:pPr>
-          <w:hyperlink w:anchor="_Toc225330882" w:history="1">
+          <w:hyperlink w:anchor="_Toc225684968" w:history="1">
             <w:r>
               <w:rPr>
                 <w:rStyle w:val="Hyperlink"/>
@@ -1178,7 +1178,7 @@
                 <w:noProof/>
                 <w:webHidden/>
               </w:rPr>
-              <w:instrText xml:space="preserve"> PAGEREF _Toc225330882 \h </w:instrText>
+              <w:instrText xml:space="preserve"> PAGEREF _Toc225684968 \h </w:instrText>
             </w:r>
             <w:r>
               <w:rPr>
@@ -1225,7 +1225,7 @@
               <w14:ligatures w14:val="standardContextual"/>
             </w:rPr>
           </w:pPr>
-          <w:hyperlink w:anchor="_Toc225330883" w:history="1">
+          <w:hyperlink w:anchor="_Toc225684969" w:history="1">
             <w:r>
               <w:rPr>
                 <w:rStyle w:val="Hyperlink"/>
@@ -1252,7 +1252,7 @@
                 <w:noProof/>
                 <w:webHidden/>
               </w:rPr>
-              <w:instrText xml:space="preserve"> PAGEREF _Toc225330883 \h </w:instrText>
+              <w:instrText xml:space="preserve"> PAGEREF _Toc225684969 \h </w:instrText>
             </w:r>
             <w:r>
               <w:rPr>
@@ -1299,7 +1299,7 @@
               <w14:ligatures w14:val="standardContextual"/>
             </w:rPr>
           </w:pPr>
-          <w:hyperlink w:anchor="_Toc225330884" w:history="1">
+          <w:hyperlink w:anchor="_Toc225684970" w:history="1">
             <w:r>
               <w:rPr>
                 <w:rStyle w:val="Hyperlink"/>
@@ -1326,7 +1326,7 @@
                 <w:noProof/>
                 <w:webHidden/>
               </w:rPr>
-              <w:instrText xml:space="preserve"> PAGEREF _Toc225330884 \h </w:instrText>
+              <w:instrText xml:space="preserve"> PAGEREF _Toc225684970 \h </w:instrText>
             </w:r>
             <w:r>
               <w:rPr>
@@ -1373,7 +1373,7 @@
               <w14:ligatures w14:val="standardContextual"/>
             </w:rPr>
           </w:pPr>
-          <w:hyperlink w:anchor="_Toc225330885" w:history="1">
+          <w:hyperlink w:anchor="_Toc225684971" w:history="1">
             <w:r>
               <w:rPr>
                 <w:rStyle w:val="Hyperlink"/>
@@ -1400,7 +1400,7 @@
                 <w:noProof/>
                 <w:webHidden/>
               </w:rPr>
-              <w:instrText xml:space="preserve"> PAGEREF _Toc225330885 \h </w:instrText>
+              <w:instrText xml:space="preserve"> PAGEREF _Toc225684971 \h </w:instrText>
             </w:r>
             <w:r>
               <w:rPr>
@@ -1420,7 +1420,7 @@
                 <w:noProof/>
                 <w:webHidden/>
               </w:rPr>
-              <w:t>8</w:t>
+              <w:t>9</w:t>
             </w:r>
             <w:r>
               <w:rPr>
@@ -1447,7 +1447,7 @@
               <w14:ligatures w14:val="standardContextual"/>
             </w:rPr>
           </w:pPr>
-          <w:hyperlink w:anchor="_Toc225330886" w:history="1">
+          <w:hyperlink w:anchor="_Toc225684972" w:history="1">
             <w:r>
               <w:rPr>
                 <w:rStyle w:val="Hyperlink"/>
@@ -1474,7 +1474,7 @@
                 <w:noProof/>
                 <w:webHidden/>
               </w:rPr>
-              <w:instrText xml:space="preserve"> PAGEREF _Toc225330886 \h </w:instrText>
+              <w:instrText xml:space="preserve"> PAGEREF _Toc225684972 \h </w:instrText>
             </w:r>
             <w:r>
               <w:rPr>
@@ -1494,7 +1494,7 @@
                 <w:noProof/>
                 <w:webHidden/>
               </w:rPr>
-              <w:t>8</w:t>
+              <w:t>10</w:t>
             </w:r>
             <w:r>
               <w:rPr>
@@ -1521,7 +1521,7 @@
               <w14:ligatures w14:val="standardContextual"/>
             </w:rPr>
           </w:pPr>
-          <w:hyperlink w:anchor="_Toc225330887" w:history="1">
+          <w:hyperlink w:anchor="_Toc225684973" w:history="1">
             <w:r>
               <w:rPr>
                 <w:rStyle w:val="Hyperlink"/>
@@ -1548,7 +1548,7 @@
                 <w:noProof/>
                 <w:webHidden/>
               </w:rPr>
-              <w:instrText xml:space="preserve"> PAGEREF _Toc225330887 \h </w:instrText>
+              <w:instrText xml:space="preserve"> PAGEREF _Toc225684973 \h </w:instrText>
             </w:r>
             <w:r>
               <w:rPr>
@@ -1568,7 +1568,7 @@
                 <w:noProof/>
                 <w:webHidden/>
               </w:rPr>
-              <w:t>8</w:t>
+              <w:t>10</w:t>
             </w:r>
             <w:r>
               <w:rPr>
@@ -1595,7 +1595,7 @@
               <w14:ligatures w14:val="standardContextual"/>
             </w:rPr>
           </w:pPr>
-          <w:hyperlink w:anchor="_Toc225330888" w:history="1">
+          <w:hyperlink w:anchor="_Toc225684974" w:history="1">
             <w:r>
               <w:rPr>
                 <w:rStyle w:val="Hyperlink"/>
@@ -1622,7 +1622,7 @@
                 <w:noProof/>
                 <w:webHidden/>
               </w:rPr>
-              <w:instrText xml:space="preserve"> PAGEREF _Toc225330888 \h </w:instrText>
+              <w:instrText xml:space="preserve"> PAGEREF _Toc225684974 \h </w:instrText>
             </w:r>
             <w:r>
               <w:rPr>
@@ -1642,7 +1642,7 @@
                 <w:noProof/>
                 <w:webHidden/>
               </w:rPr>
-              <w:t>8</w:t>
+              <w:t>11</w:t>
             </w:r>
             <w:r>
               <w:rPr>
@@ -1669,7 +1669,7 @@
               <w14:ligatures w14:val="standardContextual"/>
             </w:rPr>
           </w:pPr>
-          <w:hyperlink w:anchor="_Toc225330889" w:history="1">
+          <w:hyperlink w:anchor="_Toc225684975" w:history="1">
             <w:r>
               <w:rPr>
                 <w:rStyle w:val="Hyperlink"/>
@@ -1696,7 +1696,7 @@
                 <w:noProof/>
                 <w:webHidden/>
               </w:rPr>
-              <w:instrText xml:space="preserve"> PAGEREF _Toc225330889 \h </w:instrText>
+              <w:instrText xml:space="preserve"> PAGEREF _Toc225684975 \h </w:instrText>
             </w:r>
             <w:r>
               <w:rPr>
@@ -1716,7 +1716,7 @@
                 <w:noProof/>
                 <w:webHidden/>
               </w:rPr>
-              <w:t>8</w:t>
+              <w:t>11</w:t>
             </w:r>
             <w:r>
               <w:rPr>
@@ -1743,7 +1743,7 @@
               <w14:ligatures w14:val="standardContextual"/>
             </w:rPr>
           </w:pPr>
-          <w:hyperlink w:anchor="_Toc225330890" w:history="1">
+          <w:hyperlink w:anchor="_Toc225684976" w:history="1">
             <w:r>
               <w:rPr>
                 <w:rStyle w:val="Hyperlink"/>
@@ -1770,7 +1770,7 @@
                 <w:noProof/>
                 <w:webHidden/>
               </w:rPr>
-              <w:instrText xml:space="preserve"> PAGEREF _Toc225330890 \h </w:instrText>
+              <w:instrText xml:space="preserve"> PAGEREF _Toc225684976 \h </w:instrText>
             </w:r>
             <w:r>
               <w:rPr>
@@ -1790,7 +1790,7 @@
                 <w:noProof/>
                 <w:webHidden/>
               </w:rPr>
-              <w:t>8</w:t>
+              <w:t>11</w:t>
             </w:r>
             <w:r>
               <w:rPr>
@@ -1817,7 +1817,7 @@
               <w14:ligatures w14:val="standardContextual"/>
             </w:rPr>
           </w:pPr>
-          <w:hyperlink w:anchor="_Toc225330891" w:history="1">
+          <w:hyperlink w:anchor="_Toc225684977" w:history="1">
             <w:r>
               <w:rPr>
                 <w:rStyle w:val="Hyperlink"/>
@@ -1844,7 +1844,7 @@
                 <w:noProof/>
                 <w:webHidden/>
               </w:rPr>
-              <w:instrText xml:space="preserve"> PAGEREF _Toc225330891 \h </w:instrText>
+              <w:instrText xml:space="preserve"> PAGEREF _Toc225684977 \h </w:instrText>
             </w:r>
             <w:r>
               <w:rPr>
@@ -1864,7 +1864,7 @@
                 <w:noProof/>
                 <w:webHidden/>
               </w:rPr>
-              <w:t>8</w:t>
+              <w:t>11</w:t>
             </w:r>
             <w:r>
               <w:rPr>
@@ -1891,7 +1891,7 @@
               <w14:ligatures w14:val="standardContextual"/>
             </w:rPr>
           </w:pPr>
-          <w:hyperlink w:anchor="_Toc225330892" w:history="1">
+          <w:hyperlink w:anchor="_Toc225684978" w:history="1">
             <w:r>
               <w:rPr>
                 <w:rStyle w:val="Hyperlink"/>
@@ -1918,7 +1918,7 @@
                 <w:noProof/>
                 <w:webHidden/>
               </w:rPr>
-              <w:instrText xml:space="preserve"> PAGEREF _Toc225330892 \h </w:instrText>
+              <w:instrText xml:space="preserve"> PAGEREF _Toc225684978 \h </w:instrText>
             </w:r>
             <w:r>
               <w:rPr>
@@ -1938,7 +1938,7 @@
                 <w:noProof/>
                 <w:webHidden/>
               </w:rPr>
-              <w:t>8</w:t>
+              <w:t>11</w:t>
             </w:r>
             <w:r>
               <w:rPr>
@@ -1965,7 +1965,7 @@
               <w14:ligatures w14:val="standardContextual"/>
             </w:rPr>
           </w:pPr>
-          <w:hyperlink w:anchor="_Toc225330893" w:history="1">
+          <w:hyperlink w:anchor="_Toc225684979" w:history="1">
             <w:r>
               <w:rPr>
                 <w:rStyle w:val="Hyperlink"/>
@@ -1992,7 +1992,7 @@
                 <w:noProof/>
                 <w:webHidden/>
               </w:rPr>
-              <w:instrText xml:space="preserve"> PAGEREF _Toc225330893 \h </w:instrText>
+              <w:instrText xml:space="preserve"> PAGEREF _Toc225684979 \h </w:instrText>
             </w:r>
             <w:r>
               <w:rPr>
@@ -2012,7 +2012,7 @@
                 <w:noProof/>
                 <w:webHidden/>
               </w:rPr>
-              <w:t>9</w:t>
+              <w:t>12</w:t>
             </w:r>
             <w:r>
               <w:rPr>
@@ -2039,7 +2039,7 @@
               <w14:ligatures w14:val="standardContextual"/>
             </w:rPr>
           </w:pPr>
-          <w:hyperlink w:anchor="_Toc225330894" w:history="1">
+          <w:hyperlink w:anchor="_Toc225684980" w:history="1">
             <w:r>
               <w:rPr>
                 <w:rStyle w:val="Hyperlink"/>
@@ -2066,7 +2066,7 @@
                 <w:noProof/>
                 <w:webHidden/>
               </w:rPr>
-              <w:instrText xml:space="preserve"> PAGEREF _Toc225330894 \h </w:instrText>
+              <w:instrText xml:space="preserve"> PAGEREF _Toc225684980 \h </w:instrText>
             </w:r>
             <w:r>
               <w:rPr>
@@ -2086,7 +2086,7 @@
                 <w:noProof/>
                 <w:webHidden/>
               </w:rPr>
-              <w:t>9</w:t>
+              <w:t>12</w:t>
             </w:r>
             <w:r>
               <w:rPr>
@@ -2113,12 +2113,382 @@
               <w14:ligatures w14:val="standardContextual"/>
             </w:rPr>
           </w:pPr>
-          <w:hyperlink w:anchor="_Toc225330895" w:history="1">
+          <w:hyperlink w:anchor="_Toc225684981" w:history="1">
             <w:r>
               <w:rPr>
                 <w:rStyle w:val="Hyperlink"/>
                 <w:noProof/>
               </w:rPr>
+              <w:t>Model Training</w:t>
+            </w:r>
+            <w:r>
+              <w:rPr>
+                <w:noProof/>
+                <w:webHidden/>
+              </w:rPr>
+              <w:tab/>
+            </w:r>
+            <w:r>
+              <w:rPr>
+                <w:noProof/>
+                <w:webHidden/>
+              </w:rPr>
+              <w:fldChar w:fldCharType="begin"/>
+            </w:r>
+            <w:r>
+              <w:rPr>
+                <w:noProof/>
+                <w:webHidden/>
+              </w:rPr>
+              <w:instrText xml:space="preserve"> PAGEREF _Toc225684981 \h </w:instrText>
+            </w:r>
+            <w:r>
+              <w:rPr>
+                <w:noProof/>
+                <w:webHidden/>
+              </w:rPr>
+            </w:r>
+            <w:r>
+              <w:rPr>
+                <w:noProof/>
+                <w:webHidden/>
+              </w:rPr>
+              <w:fldChar w:fldCharType="separate"/>
+            </w:r>
+            <w:r>
+              <w:rPr>
+                <w:noProof/>
+                <w:webHidden/>
+              </w:rPr>
+              <w:t>12</w:t>
+            </w:r>
+            <w:r>
+              <w:rPr>
+                <w:noProof/>
+                <w:webHidden/>
+              </w:rPr>
+              <w:fldChar w:fldCharType="end"/>
+            </w:r>
+          </w:hyperlink>
+        </w:p>
+        <w:p>
+          <w:pPr>
+            <w:pStyle w:val="TOC2"/>
+            <w:tabs>
+              <w:tab w:val="right" w:leader="dot" w:pos="9016"/>
+            </w:tabs>
+            <w:rPr>
+              <w:rFonts w:eastAsiaTheme="minorEastAsia"/>
+              <w:noProof/>
+              <w:kern w:val="2"/>
+              <w:sz w:val="24"/>
+              <w:szCs w:val="24"/>
+              <w:lang w:eastAsia="en-GB"/>
+              <w14:ligatures w14:val="standardContextual"/>
+            </w:rPr>
+          </w:pPr>
+          <w:hyperlink w:anchor="_Toc225684982" w:history="1">
+            <w:r>
+              <w:rPr>
+                <w:rStyle w:val="Hyperlink"/>
+                <w:noProof/>
+              </w:rPr>
+              <w:t>Model Evaluation</w:t>
+            </w:r>
+            <w:r>
+              <w:rPr>
+                <w:noProof/>
+                <w:webHidden/>
+              </w:rPr>
+              <w:tab/>
+            </w:r>
+            <w:r>
+              <w:rPr>
+                <w:noProof/>
+                <w:webHidden/>
+              </w:rPr>
+              <w:fldChar w:fldCharType="begin"/>
+            </w:r>
+            <w:r>
+              <w:rPr>
+                <w:noProof/>
+                <w:webHidden/>
+              </w:rPr>
+              <w:instrText xml:space="preserve"> PAGEREF _Toc225684982 \h </w:instrText>
+            </w:r>
+            <w:r>
+              <w:rPr>
+                <w:noProof/>
+                <w:webHidden/>
+              </w:rPr>
+            </w:r>
+            <w:r>
+              <w:rPr>
+                <w:noProof/>
+                <w:webHidden/>
+              </w:rPr>
+              <w:fldChar w:fldCharType="separate"/>
+            </w:r>
+            <w:r>
+              <w:rPr>
+                <w:noProof/>
+                <w:webHidden/>
+              </w:rPr>
+              <w:t>12</w:t>
+            </w:r>
+            <w:r>
+              <w:rPr>
+                <w:noProof/>
+                <w:webHidden/>
+              </w:rPr>
+              <w:fldChar w:fldCharType="end"/>
+            </w:r>
+          </w:hyperlink>
+        </w:p>
+        <w:p>
+          <w:pPr>
+            <w:pStyle w:val="TOC2"/>
+            <w:tabs>
+              <w:tab w:val="right" w:leader="dot" w:pos="9016"/>
+            </w:tabs>
+            <w:rPr>
+              <w:rFonts w:eastAsiaTheme="minorEastAsia"/>
+              <w:noProof/>
+              <w:kern w:val="2"/>
+              <w:sz w:val="24"/>
+              <w:szCs w:val="24"/>
+              <w:lang w:eastAsia="en-GB"/>
+              <w14:ligatures w14:val="standardContextual"/>
+            </w:rPr>
+          </w:pPr>
+          <w:hyperlink w:anchor="_Toc225684983" w:history="1">
+            <w:r>
+              <w:rPr>
+                <w:rStyle w:val="Hyperlink"/>
+                <w:noProof/>
+              </w:rPr>
+              <w:t>Model Extraction and Deployment</w:t>
+            </w:r>
+            <w:r>
+              <w:rPr>
+                <w:noProof/>
+                <w:webHidden/>
+              </w:rPr>
+              <w:tab/>
+            </w:r>
+            <w:r>
+              <w:rPr>
+                <w:noProof/>
+                <w:webHidden/>
+              </w:rPr>
+              <w:fldChar w:fldCharType="begin"/>
+            </w:r>
+            <w:r>
+              <w:rPr>
+                <w:noProof/>
+                <w:webHidden/>
+              </w:rPr>
+              <w:instrText xml:space="preserve"> PAGEREF _Toc225684983 \h </w:instrText>
+            </w:r>
+            <w:r>
+              <w:rPr>
+                <w:noProof/>
+                <w:webHidden/>
+              </w:rPr>
+            </w:r>
+            <w:r>
+              <w:rPr>
+                <w:noProof/>
+                <w:webHidden/>
+              </w:rPr>
+              <w:fldChar w:fldCharType="separate"/>
+            </w:r>
+            <w:r>
+              <w:rPr>
+                <w:noProof/>
+                <w:webHidden/>
+              </w:rPr>
+              <w:t>12</w:t>
+            </w:r>
+            <w:r>
+              <w:rPr>
+                <w:noProof/>
+                <w:webHidden/>
+              </w:rPr>
+              <w:fldChar w:fldCharType="end"/>
+            </w:r>
+          </w:hyperlink>
+        </w:p>
+        <w:p>
+          <w:pPr>
+            <w:pStyle w:val="TOC2"/>
+            <w:tabs>
+              <w:tab w:val="right" w:leader="dot" w:pos="9016"/>
+            </w:tabs>
+            <w:rPr>
+              <w:rFonts w:eastAsiaTheme="minorEastAsia"/>
+              <w:noProof/>
+              <w:kern w:val="2"/>
+              <w:sz w:val="24"/>
+              <w:szCs w:val="24"/>
+              <w:lang w:eastAsia="en-GB"/>
+              <w14:ligatures w14:val="standardContextual"/>
+            </w:rPr>
+          </w:pPr>
+          <w:hyperlink w:anchor="_Toc225684984" w:history="1">
+            <w:r>
+              <w:rPr>
+                <w:rStyle w:val="Hyperlink"/>
+                <w:noProof/>
+              </w:rPr>
+              <w:t>NIDS Output System</w:t>
+            </w:r>
+            <w:r>
+              <w:rPr>
+                <w:noProof/>
+                <w:webHidden/>
+              </w:rPr>
+              <w:tab/>
+            </w:r>
+            <w:r>
+              <w:rPr>
+                <w:noProof/>
+                <w:webHidden/>
+              </w:rPr>
+              <w:fldChar w:fldCharType="begin"/>
+            </w:r>
+            <w:r>
+              <w:rPr>
+                <w:noProof/>
+                <w:webHidden/>
+              </w:rPr>
+              <w:instrText xml:space="preserve"> PAGEREF _Toc225684984 \h </w:instrText>
+            </w:r>
+            <w:r>
+              <w:rPr>
+                <w:noProof/>
+                <w:webHidden/>
+              </w:rPr>
+            </w:r>
+            <w:r>
+              <w:rPr>
+                <w:noProof/>
+                <w:webHidden/>
+              </w:rPr>
+              <w:fldChar w:fldCharType="separate"/>
+            </w:r>
+            <w:r>
+              <w:rPr>
+                <w:noProof/>
+                <w:webHidden/>
+              </w:rPr>
+              <w:t>12</w:t>
+            </w:r>
+            <w:r>
+              <w:rPr>
+                <w:noProof/>
+                <w:webHidden/>
+              </w:rPr>
+              <w:fldChar w:fldCharType="end"/>
+            </w:r>
+          </w:hyperlink>
+        </w:p>
+        <w:p>
+          <w:pPr>
+            <w:pStyle w:val="TOC2"/>
+            <w:tabs>
+              <w:tab w:val="right" w:leader="dot" w:pos="9016"/>
+            </w:tabs>
+            <w:rPr>
+              <w:rFonts w:eastAsiaTheme="minorEastAsia"/>
+              <w:noProof/>
+              <w:kern w:val="2"/>
+              <w:sz w:val="24"/>
+              <w:szCs w:val="24"/>
+              <w:lang w:eastAsia="en-GB"/>
+              <w14:ligatures w14:val="standardContextual"/>
+            </w:rPr>
+          </w:pPr>
+          <w:hyperlink w:anchor="_Toc225684985" w:history="1">
+            <w:r>
+              <w:rPr>
+                <w:rStyle w:val="Hyperlink"/>
+                <w:noProof/>
+              </w:rPr>
+              <w:t>Email Alert System</w:t>
+            </w:r>
+            <w:r>
+              <w:rPr>
+                <w:noProof/>
+                <w:webHidden/>
+              </w:rPr>
+              <w:tab/>
+            </w:r>
+            <w:r>
+              <w:rPr>
+                <w:noProof/>
+                <w:webHidden/>
+              </w:rPr>
+              <w:fldChar w:fldCharType="begin"/>
+            </w:r>
+            <w:r>
+              <w:rPr>
+                <w:noProof/>
+                <w:webHidden/>
+              </w:rPr>
+              <w:instrText xml:space="preserve"> PAGEREF _Toc225684985 \h </w:instrText>
+            </w:r>
+            <w:r>
+              <w:rPr>
+                <w:noProof/>
+                <w:webHidden/>
+              </w:rPr>
+            </w:r>
+            <w:r>
+              <w:rPr>
+                <w:noProof/>
+                <w:webHidden/>
+              </w:rPr>
+              <w:fldChar w:fldCharType="separate"/>
+            </w:r>
+            <w:r>
+              <w:rPr>
+                <w:noProof/>
+                <w:webHidden/>
+              </w:rPr>
+              <w:t>12</w:t>
+            </w:r>
+            <w:r>
+              <w:rPr>
+                <w:noProof/>
+                <w:webHidden/>
+              </w:rPr>
+              <w:fldChar w:fldCharType="end"/>
+            </w:r>
+          </w:hyperlink>
+        </w:p>
+        <w:p>
+          <w:pPr>
+            <w:pStyle w:val="TOC2"/>
+            <w:tabs>
+              <w:tab w:val="right" w:leader="dot" w:pos="9016"/>
+            </w:tabs>
+            <w:rPr>
+              <w:rFonts w:eastAsiaTheme="minorEastAsia"/>
+              <w:noProof/>
+              <w:kern w:val="2"/>
+              <w:sz w:val="24"/>
+              <w:szCs w:val="24"/>
+              <w:lang w:eastAsia="en-GB"/>
+              <w14:ligatures w14:val="standardContextual"/>
+            </w:rPr>
+          </w:pPr>
+          <w:hyperlink w:anchor="_Toc225684986" w:history="1">
+            <w:r>
+              <w:rPr>
+                <w:rStyle w:val="Hyperlink"/>
+                <w:noProof/>
+              </w:rPr>
               <w:t>Sprint 1</w:t>
             </w:r>
             <w:r>
@@ -2140,7 +2510,7 @@
                 <w:noProof/>
                 <w:webHidden/>
               </w:rPr>
-              <w:instrText xml:space="preserve"> PAGEREF _Toc225330895 \h </w:instrText>
+              <w:instrText xml:space="preserve"> PAGEREF _Toc225684986 \h </w:instrText>
             </w:r>
             <w:r>
               <w:rPr>
@@ -2160,7 +2530,7 @@
                 <w:noProof/>
                 <w:webHidden/>
               </w:rPr>
-              <w:t>10</w:t>
+              <w:t>13</w:t>
             </w:r>
             <w:r>
               <w:rPr>
@@ -2187,7 +2557,7 @@
               <w14:ligatures w14:val="standardContextual"/>
             </w:rPr>
           </w:pPr>
-          <w:hyperlink w:anchor="_Toc225330896" w:history="1">
+          <w:hyperlink w:anchor="_Toc225684987" w:history="1">
             <w:r>
               <w:rPr>
                 <w:rStyle w:val="Hyperlink"/>
@@ -2214,7 +2584,7 @@
                 <w:noProof/>
                 <w:webHidden/>
               </w:rPr>
-              <w:instrText xml:space="preserve"> PAGEREF _Toc225330896 \h </w:instrText>
+              <w:instrText xml:space="preserve"> PAGEREF _Toc225684987 \h </w:instrText>
             </w:r>
             <w:r>
               <w:rPr>
@@ -2234,7 +2604,7 @@
                 <w:noProof/>
                 <w:webHidden/>
               </w:rPr>
-              <w:t>10</w:t>
+              <w:t>13</w:t>
             </w:r>
             <w:r>
               <w:rPr>
@@ -2261,7 +2631,7 @@
               <w14:ligatures w14:val="standardContextual"/>
             </w:rPr>
           </w:pPr>
-          <w:hyperlink w:anchor="_Toc225330897" w:history="1">
+          <w:hyperlink w:anchor="_Toc225684988" w:history="1">
             <w:r>
               <w:rPr>
                 <w:rStyle w:val="Hyperlink"/>
@@ -2288,7 +2658,7 @@
                 <w:noProof/>
                 <w:webHidden/>
               </w:rPr>
-              <w:instrText xml:space="preserve"> PAGEREF _Toc225330897 \h </w:instrText>
+              <w:instrText xml:space="preserve"> PAGEREF _Toc225684988 \h </w:instrText>
             </w:r>
             <w:r>
               <w:rPr>
@@ -2308,7 +2678,7 @@
                 <w:noProof/>
                 <w:webHidden/>
               </w:rPr>
-              <w:t>10</w:t>
+              <w:t>13</w:t>
             </w:r>
             <w:r>
               <w:rPr>
@@ -2335,7 +2705,7 @@
               <w14:ligatures w14:val="standardContextual"/>
             </w:rPr>
           </w:pPr>
-          <w:hyperlink w:anchor="_Toc225330898" w:history="1">
+          <w:hyperlink w:anchor="_Toc225684989" w:history="1">
             <w:r>
               <w:rPr>
                 <w:rStyle w:val="Hyperlink"/>
@@ -2362,7 +2732,7 @@
                 <w:noProof/>
                 <w:webHidden/>
               </w:rPr>
-              <w:instrText xml:space="preserve"> PAGEREF _Toc225330898 \h </w:instrText>
+              <w:instrText xml:space="preserve"> PAGEREF _Toc225684989 \h </w:instrText>
             </w:r>
             <w:r>
               <w:rPr>
@@ -2382,7 +2752,7 @@
                 <w:noProof/>
                 <w:webHidden/>
               </w:rPr>
-              <w:t>10</w:t>
+              <w:t>13</w:t>
             </w:r>
             <w:r>
               <w:rPr>
@@ -2409,7 +2779,7 @@
               <w14:ligatures w14:val="standardContextual"/>
             </w:rPr>
           </w:pPr>
-          <w:hyperlink w:anchor="_Toc225330899" w:history="1">
+          <w:hyperlink w:anchor="_Toc225684990" w:history="1">
             <w:r>
               <w:rPr>
                 <w:rStyle w:val="Hyperlink"/>
@@ -2436,7 +2806,7 @@
                 <w:noProof/>
                 <w:webHidden/>
               </w:rPr>
-              <w:instrText xml:space="preserve"> PAGEREF _Toc225330899 \h </w:instrText>
+              <w:instrText xml:space="preserve"> PAGEREF _Toc225684990 \h </w:instrText>
             </w:r>
             <w:r>
               <w:rPr>
@@ -2456,7 +2826,7 @@
                 <w:noProof/>
                 <w:webHidden/>
               </w:rPr>
-              <w:t>10</w:t>
+              <w:t>13</w:t>
             </w:r>
             <w:r>
               <w:rPr>
@@ -2483,7 +2853,7 @@
               <w14:ligatures w14:val="standardContextual"/>
             </w:rPr>
           </w:pPr>
-          <w:hyperlink w:anchor="_Toc225330900" w:history="1">
+          <w:hyperlink w:anchor="_Toc225684991" w:history="1">
             <w:r>
               <w:rPr>
                 <w:rStyle w:val="Hyperlink"/>
@@ -2510,7 +2880,7 @@
                 <w:noProof/>
                 <w:webHidden/>
               </w:rPr>
-              <w:instrText xml:space="preserve"> PAGEREF _Toc225330900 \h </w:instrText>
+              <w:instrText xml:space="preserve"> PAGEREF _Toc225684991 \h </w:instrText>
             </w:r>
             <w:r>
               <w:rPr>
@@ -2530,7 +2900,7 @@
                 <w:noProof/>
                 <w:webHidden/>
               </w:rPr>
-              <w:t>10</w:t>
+              <w:t>13</w:t>
             </w:r>
             <w:r>
               <w:rPr>
@@ -2557,7 +2927,7 @@
               <w14:ligatures w14:val="standardContextual"/>
             </w:rPr>
           </w:pPr>
-          <w:hyperlink w:anchor="_Toc225330901" w:history="1">
+          <w:hyperlink w:anchor="_Toc225684992" w:history="1">
             <w:r>
               <w:rPr>
                 <w:rStyle w:val="Hyperlink"/>
@@ -2584,7 +2954,7 @@
                 <w:noProof/>
                 <w:webHidden/>
               </w:rPr>
-              <w:instrText xml:space="preserve"> PAGEREF _Toc225330901 \h </w:instrText>
+              <w:instrText xml:space="preserve"> PAGEREF _Toc225684992 \h </w:instrText>
             </w:r>
             <w:r>
               <w:rPr>
@@ -2604,7 +2974,7 @@
                 <w:noProof/>
                 <w:webHidden/>
               </w:rPr>
-              <w:t>10</w:t>
+              <w:t>13</w:t>
             </w:r>
             <w:r>
               <w:rPr>
@@ -2631,7 +3001,7 @@
               <w14:ligatures w14:val="standardContextual"/>
             </w:rPr>
           </w:pPr>
-          <w:hyperlink w:anchor="_Toc225330902" w:history="1">
+          <w:hyperlink w:anchor="_Toc225684993" w:history="1">
             <w:r>
               <w:rPr>
                 <w:rStyle w:val="Hyperlink"/>
@@ -2658,7 +3028,7 @@
                 <w:noProof/>
                 <w:webHidden/>
               </w:rPr>
-              <w:instrText xml:space="preserve"> PAGEREF _Toc225330902 \h </w:instrText>
+              <w:instrText xml:space="preserve"> PAGEREF _Toc225684993 \h </w:instrText>
             </w:r>
             <w:r>
               <w:rPr>
@@ -2678,7 +3048,7 @@
                 <w:noProof/>
                 <w:webHidden/>
               </w:rPr>
-              <w:t>10</w:t>
+              <w:t>13</w:t>
             </w:r>
             <w:r>
               <w:rPr>
@@ -2705,7 +3075,7 @@
               <w14:ligatures w14:val="standardContextual"/>
             </w:rPr>
           </w:pPr>
-          <w:hyperlink w:anchor="_Toc225330903" w:history="1">
+          <w:hyperlink w:anchor="_Toc225684994" w:history="1">
             <w:r>
               <w:rPr>
                 <w:rStyle w:val="Hyperlink"/>
@@ -2732,7 +3102,7 @@
                 <w:noProof/>
                 <w:webHidden/>
               </w:rPr>
-              <w:instrText xml:space="preserve"> PAGEREF _Toc225330903 \h </w:instrText>
+              <w:instrText xml:space="preserve"> PAGEREF _Toc225684994 \h </w:instrText>
             </w:r>
             <w:r>
               <w:rPr>
@@ -2752,7 +3122,7 @@
                 <w:noProof/>
                 <w:webHidden/>
               </w:rPr>
-              <w:t>10</w:t>
+              <w:t>13</w:t>
             </w:r>
             <w:r>
               <w:rPr>
@@ -2779,7 +3149,7 @@
               <w14:ligatures w14:val="standardContextual"/>
             </w:rPr>
           </w:pPr>
-          <w:hyperlink w:anchor="_Toc225330904" w:history="1">
+          <w:hyperlink w:anchor="_Toc225684995" w:history="1">
             <w:r>
               <w:rPr>
                 <w:rStyle w:val="Hyperlink"/>
@@ -2806,7 +3176,7 @@
                 <w:noProof/>
                 <w:webHidden/>
               </w:rPr>
-              <w:instrText xml:space="preserve"> PAGEREF _Toc225330904 \h </w:instrText>
+              <w:instrText xml:space="preserve"> PAGEREF _Toc225684995 \h </w:instrText>
             </w:r>
             <w:r>
               <w:rPr>
@@ -2826,7 +3196,7 @@
                 <w:noProof/>
                 <w:webHidden/>
               </w:rPr>
-              <w:t>10</w:t>
+              <w:t>13</w:t>
             </w:r>
             <w:r>
               <w:rPr>
@@ -2853,7 +3223,7 @@
               <w14:ligatures w14:val="standardContextual"/>
             </w:rPr>
           </w:pPr>
-          <w:hyperlink w:anchor="_Toc225330905" w:history="1">
+          <w:hyperlink w:anchor="_Toc225684996" w:history="1">
             <w:r>
               <w:rPr>
                 <w:rStyle w:val="Hyperlink"/>
@@ -2880,7 +3250,7 @@
                 <w:noProof/>
                 <w:webHidden/>
               </w:rPr>
-              <w:instrText xml:space="preserve"> PAGEREF _Toc225330905 \h </w:instrText>
+              <w:instrText xml:space="preserve"> PAGEREF _Toc225684996 \h </w:instrText>
             </w:r>
             <w:r>
               <w:rPr>
@@ -2900,7 +3270,7 @@
                 <w:noProof/>
                 <w:webHidden/>
               </w:rPr>
-              <w:t>10</w:t>
+              <w:t>13</w:t>
             </w:r>
             <w:r>
               <w:rPr>
@@ -2927,7 +3297,7 @@
               <w14:ligatures w14:val="standardContextual"/>
             </w:rPr>
           </w:pPr>
-          <w:hyperlink w:anchor="_Toc225330906" w:history="1">
+          <w:hyperlink w:anchor="_Toc225684997" w:history="1">
             <w:r>
               <w:rPr>
                 <w:rStyle w:val="Hyperlink"/>
@@ -2954,7 +3324,7 @@
                 <w:noProof/>
                 <w:webHidden/>
               </w:rPr>
-              <w:instrText xml:space="preserve"> PAGEREF _Toc225330906 \h </w:instrText>
+              <w:instrText xml:space="preserve"> PAGEREF _Toc225684997 \h </w:instrText>
             </w:r>
             <w:r>
               <w:rPr>
@@ -2974,7 +3344,7 @@
                 <w:noProof/>
                 <w:webHidden/>
               </w:rPr>
-              <w:t>10</w:t>
+              <w:t>13</w:t>
             </w:r>
             <w:r>
               <w:rPr>
@@ -3001,7 +3371,7 @@
               <w14:ligatures w14:val="standardContextual"/>
             </w:rPr>
           </w:pPr>
-          <w:hyperlink w:anchor="_Toc225330907" w:history="1">
+          <w:hyperlink w:anchor="_Toc225684998" w:history="1">
             <w:r>
               <w:rPr>
                 <w:rStyle w:val="Hyperlink"/>
@@ -3028,7 +3398,7 @@
                 <w:noProof/>
                 <w:webHidden/>
               </w:rPr>
-              <w:instrText xml:space="preserve"> PAGEREF _Toc225330907 \h </w:instrText>
+              <w:instrText xml:space="preserve"> PAGEREF _Toc225684998 \h </w:instrText>
             </w:r>
             <w:r>
               <w:rPr>
@@ -3048,7 +3418,7 @@
                 <w:noProof/>
                 <w:webHidden/>
               </w:rPr>
-              <w:t>10</w:t>
+              <w:t>13</w:t>
             </w:r>
             <w:r>
               <w:rPr>
@@ -3075,7 +3445,7 @@
               <w14:ligatures w14:val="standardContextual"/>
             </w:rPr>
           </w:pPr>
-          <w:hyperlink w:anchor="_Toc225330908" w:history="1">
+          <w:hyperlink w:anchor="_Toc225684999" w:history="1">
             <w:r>
               <w:rPr>
                 <w:rStyle w:val="Hyperlink"/>
@@ -3102,7 +3472,7 @@
                 <w:noProof/>
                 <w:webHidden/>
               </w:rPr>
-              <w:instrText xml:space="preserve"> PAGEREF _Toc225330908 \h </w:instrText>
+              <w:instrText xml:space="preserve"> PAGEREF _Toc225684999 \h </w:instrText>
             </w:r>
             <w:r>
               <w:rPr>
@@ -3122,7 +3492,7 @@
                 <w:noProof/>
                 <w:webHidden/>
               </w:rPr>
-              <w:t>10</w:t>
+              <w:t>13</w:t>
             </w:r>
             <w:r>
               <w:rPr>
@@ -3149,7 +3519,7 @@
               <w14:ligatures w14:val="standardContextual"/>
             </w:rPr>
           </w:pPr>
-          <w:hyperlink w:anchor="_Toc225330909" w:history="1">
+          <w:hyperlink w:anchor="_Toc225685000" w:history="1">
             <w:r>
               <w:rPr>
                 <w:rStyle w:val="Hyperlink"/>
@@ -3176,7 +3546,7 @@
                 <w:noProof/>
                 <w:webHidden/>
               </w:rPr>
-              <w:instrText xml:space="preserve"> PAGEREF _Toc225330909 \h </w:instrText>
+              <w:instrText xml:space="preserve"> PAGEREF _Toc225685000 \h </w:instrText>
             </w:r>
             <w:r>
               <w:rPr>
@@ -3196,7 +3566,7 @@
                 <w:noProof/>
                 <w:webHidden/>
               </w:rPr>
-              <w:t>10</w:t>
+              <w:t>13</w:t>
             </w:r>
             <w:r>
               <w:rPr>
@@ -3223,7 +3593,7 @@
               <w14:ligatures w14:val="standardContextual"/>
             </w:rPr>
           </w:pPr>
-          <w:hyperlink w:anchor="_Toc225330910" w:history="1">
+          <w:hyperlink w:anchor="_Toc225685001" w:history="1">
             <w:r>
               <w:rPr>
                 <w:rStyle w:val="Hyperlink"/>
@@ -3250,7 +3620,7 @@
                 <w:noProof/>
                 <w:webHidden/>
               </w:rPr>
-              <w:instrText xml:space="preserve"> PAGEREF _Toc225330910 \h </w:instrText>
+              <w:instrText xml:space="preserve"> PAGEREF _Toc225685001 \h </w:instrText>
             </w:r>
             <w:r>
               <w:rPr>
@@ -3270,7 +3640,7 @@
                 <w:noProof/>
                 <w:webHidden/>
               </w:rPr>
-              <w:t>10</w:t>
+              <w:t>13</w:t>
             </w:r>
             <w:r>
               <w:rPr>
@@ -3297,7 +3667,7 @@
               <w14:ligatures w14:val="standardContextual"/>
             </w:rPr>
           </w:pPr>
-          <w:hyperlink w:anchor="_Toc225330911" w:history="1">
+          <w:hyperlink w:anchor="_Toc225685002" w:history="1">
             <w:r>
               <w:rPr>
                 <w:rStyle w:val="Hyperlink"/>
@@ -3324,7 +3694,7 @@
                 <w:noProof/>
                 <w:webHidden/>
               </w:rPr>
-              <w:instrText xml:space="preserve"> PAGEREF _Toc225330911 \h </w:instrText>
+              <w:instrText xml:space="preserve"> PAGEREF _Toc225685002 \h </w:instrText>
             </w:r>
             <w:r>
               <w:rPr>
@@ -3344,7 +3714,7 @@
                 <w:noProof/>
                 <w:webHidden/>
               </w:rPr>
-              <w:t>10</w:t>
+              <w:t>13</w:t>
             </w:r>
             <w:r>
               <w:rPr>
@@ -3371,7 +3741,7 @@
               <w14:ligatures w14:val="standardContextual"/>
             </w:rPr>
           </w:pPr>
-          <w:hyperlink w:anchor="_Toc225330912" w:history="1">
+          <w:hyperlink w:anchor="_Toc225685003" w:history="1">
             <w:r>
               <w:rPr>
                 <w:rStyle w:val="Hyperlink"/>
@@ -3398,7 +3768,7 @@
                 <w:noProof/>
                 <w:webHidden/>
               </w:rPr>
-              <w:instrText xml:space="preserve"> PAGEREF _Toc225330912 \h </w:instrText>
+              <w:instrText xml:space="preserve"> PAGEREF _Toc225685003 \h </w:instrText>
             </w:r>
             <w:r>
               <w:rPr>
@@ -3418,7 +3788,7 @@
                 <w:noProof/>
                 <w:webHidden/>
               </w:rPr>
-              <w:t>10</w:t>
+              <w:t>13</w:t>
             </w:r>
             <w:r>
               <w:rPr>
@@ -3445,7 +3815,7 @@
               <w14:ligatures w14:val="standardContextual"/>
             </w:rPr>
           </w:pPr>
-          <w:hyperlink w:anchor="_Toc225330913" w:history="1">
+          <w:hyperlink w:anchor="_Toc225685004" w:history="1">
             <w:r>
               <w:rPr>
                 <w:rStyle w:val="Hyperlink"/>
@@ -3472,7 +3842,7 @@
                 <w:noProof/>
                 <w:webHidden/>
               </w:rPr>
-              <w:instrText xml:space="preserve"> PAGEREF _Toc225330913 \h </w:instrText>
+              <w:instrText xml:space="preserve"> PAGEREF _Toc225685004 \h </w:instrText>
             </w:r>
             <w:r>
               <w:rPr>
@@ -3492,7 +3862,7 @@
                 <w:noProof/>
                 <w:webHidden/>
               </w:rPr>
-              <w:t>10</w:t>
+              <w:t>13</w:t>
             </w:r>
             <w:r>
               <w:rPr>
@@ -3519,7 +3889,7 @@
               <w14:ligatures w14:val="standardContextual"/>
             </w:rPr>
           </w:pPr>
-          <w:hyperlink w:anchor="_Toc225330914" w:history="1">
+          <w:hyperlink w:anchor="_Toc225685005" w:history="1">
             <w:r>
               <w:rPr>
                 <w:rStyle w:val="Hyperlink"/>
@@ -3546,7 +3916,7 @@
                 <w:noProof/>
                 <w:webHidden/>
               </w:rPr>
-              <w:instrText xml:space="preserve"> PAGEREF _Toc225330914 \h </w:instrText>
+              <w:instrText xml:space="preserve"> PAGEREF _Toc225685005 \h </w:instrText>
             </w:r>
             <w:r>
               <w:rPr>
@@ -3566,7 +3936,7 @@
                 <w:noProof/>
                 <w:webHidden/>
               </w:rPr>
-              <w:t>10</w:t>
+              <w:t>13</w:t>
             </w:r>
             <w:r>
               <w:rPr>
@@ -3593,7 +3963,7 @@
               <w14:ligatures w14:val="standardContextual"/>
             </w:rPr>
           </w:pPr>
-          <w:hyperlink w:anchor="_Toc225330915" w:history="1">
+          <w:hyperlink w:anchor="_Toc225685006" w:history="1">
             <w:r>
               <w:rPr>
                 <w:rStyle w:val="Hyperlink"/>
@@ -3620,7 +3990,7 @@
                 <w:noProof/>
                 <w:webHidden/>
               </w:rPr>
-              <w:instrText xml:space="preserve"> PAGEREF _Toc225330915 \h </w:instrText>
+              <w:instrText xml:space="preserve"> PAGEREF _Toc225685006 \h </w:instrText>
             </w:r>
             <w:r>
               <w:rPr>
@@ -3640,7 +4010,7 @@
                 <w:noProof/>
                 <w:webHidden/>
               </w:rPr>
-              <w:t>10</w:t>
+              <w:t>13</w:t>
             </w:r>
             <w:r>
               <w:rPr>
@@ -3667,7 +4037,7 @@
               <w14:ligatures w14:val="standardContextual"/>
             </w:rPr>
           </w:pPr>
-          <w:hyperlink w:anchor="_Toc225330916" w:history="1">
+          <w:hyperlink w:anchor="_Toc225685007" w:history="1">
             <w:r>
               <w:rPr>
                 <w:rStyle w:val="Hyperlink"/>
@@ -3694,7 +4064,7 @@
                 <w:noProof/>
                 <w:webHidden/>
               </w:rPr>
-              <w:instrText xml:space="preserve"> PAGEREF _Toc225330916 \h </w:instrText>
+              <w:instrText xml:space="preserve"> PAGEREF _Toc225685007 \h </w:instrText>
             </w:r>
             <w:r>
               <w:rPr>
@@ -3714,7 +4084,7 @@
                 <w:noProof/>
                 <w:webHidden/>
               </w:rPr>
-              <w:t>11</w:t>
+              <w:t>14</w:t>
             </w:r>
             <w:r>
               <w:rPr>
@@ -3751,7 +4121,7 @@
       <w:pPr>
         <w:pStyle w:val="Heading1"/>
       </w:pPr>
-      <w:bookmarkStart w:id="0" w:name="_Toc225330870"/>
+      <w:bookmarkStart w:id="0" w:name="_Toc225684956"/>
       <w:r>
         <w:t>Acknowledgement</w:t>
       </w:r>
@@ -3766,7 +4136,7 @@
       <w:pPr>
         <w:pStyle w:val="Heading1"/>
       </w:pPr>
-      <w:bookmarkStart w:id="1" w:name="_Toc225330871"/>
+      <w:bookmarkStart w:id="1" w:name="_Toc225684957"/>
       <w:r>
         <w:t>Abstract</w:t>
       </w:r>
@@ -3781,7 +4151,7 @@
       <w:pPr>
         <w:pStyle w:val="Heading1"/>
       </w:pPr>
-      <w:bookmarkStart w:id="2" w:name="_Toc225330872"/>
+      <w:bookmarkStart w:id="2" w:name="_Toc225684958"/>
       <w:r>
         <w:t>Introduction</w:t>
       </w:r>
@@ -3791,7 +4161,7 @@
       <w:pPr>
         <w:pStyle w:val="Heading2"/>
       </w:pPr>
-      <w:bookmarkStart w:id="3" w:name="_Toc225330873"/>
+      <w:bookmarkStart w:id="3" w:name="_Toc225684959"/>
       <w:r>
         <w:t>Project background</w:t>
       </w:r>
@@ -3807,6 +4177,7 @@
     </w:p>
     <w:p>
       <w:r>
+        <w:lastRenderedPageBreak/>
         <w:t>The more traditional form of a N</w:t>
       </w:r>
       <w:r>
@@ -3830,108 +4201,110 @@
     </w:p>
     <w:p>
       <w:r>
+        <w:t xml:space="preserve">To help deal with this, this project </w:t>
+      </w:r>
+      <w:r>
+        <w:t>centres</w:t>
+      </w:r>
+      <w:r>
+        <w:t xml:space="preserve"> around the development of a Network intrusion detection system that makes use of machine learning to identify suspicious patterns within network traffic, by training against features from a networks traffic data, it can learn behaviour patterns </w:t>
+      </w:r>
+      <w:r>
+        <w:t>from both normal and malicious traffic and can  improve overall detection capabilities allowing the system to identify anomalies or threats that would be captured by the rule based systems.</w:t>
+      </w:r>
+    </w:p>
+    <w:p>
+      <w:pPr>
+        <w:pStyle w:val="Heading2"/>
+      </w:pPr>
+      <w:bookmarkStart w:id="4" w:name="_Toc225684960"/>
+      <w:r>
+        <w:t>Context</w:t>
+      </w:r>
+      <w:bookmarkEnd w:id="4"/>
+    </w:p>
+    <w:p>
+      <w:r>
+        <w:t>Within the current cybersecurity landscape, intrusion detection play a vital role by identifying potentially malicious traffic within a network</w:t>
+      </w:r>
+      <w:r>
+        <w:t xml:space="preserve">. Network Intrusion detection Systems monitor network traffic and analyses and learns patterns to help detect unauthorized access or suspicious activity. A majority of these systems rely on signature-based detection, with the traffic being compared against a list of known attack signatures. </w:t>
+      </w:r>
+    </w:p>
+    <w:p>
+      <w:r>
+        <w:t xml:space="preserve">Some of the most widely used tools make use of </w:t>
+      </w:r>
+      <w:r>
+        <w:t>signature-based</w:t>
+      </w:r>
+      <w:r>
+        <w:t xml:space="preserve"> detection, examples of these being Snort and Suricata, both of which are open source and widely used by private users and organizations. These tools are very good at detecting attacks that have been previously </w:t>
+      </w:r>
+      <w:r>
+        <w:t>documented,</w:t>
+      </w:r>
+      <w:r>
+        <w:t xml:space="preserve"> and the system has been updated to detect</w:t>
+      </w:r>
+      <w:r>
+        <w:t xml:space="preserve">. </w:t>
+      </w:r>
+    </w:p>
+    <w:p>
+      <w:r>
+        <w:t xml:space="preserve">As cybercrime grows ever more profitable and with the incident rate of </w:t>
+      </w:r>
+      <w:proofErr w:type="spellStart"/>
+      <w:r>
+        <w:t>cyber crime</w:t>
+      </w:r>
+      <w:proofErr w:type="spellEnd"/>
+      <w:r>
+        <w:t xml:space="preserve"> rising by 37% over the past five years (Bridewell, 2026), the different attack types and vectors continue to evolve, with attackers modifying previously used techniques or developing new attacks using exploits not commonly known, meaning that the signature-based system can’t be updated to detect these attacks. This creates big problems for signature-based systems as attacks that haven’t yet been seen may bypass the detection systems.</w:t>
+      </w:r>
+    </w:p>
+    <w:p>
+      <w:r>
+        <w:t>Alongside the new and changing threats, modern networks generate and receive immensely large volumes of traffic due to the recent growth in cloud services, online services, and personal devices. Monitoring such a large amount of traffic data is unfeasible for an analyst to manage in</w:t>
+      </w:r>
+      <w:r>
+        <w:t xml:space="preserve"> a timely manner that would allow them to respond to an attack and the signature-based systems may also struggle with the highly complex and widely differing traffic patterns.</w:t>
+      </w:r>
+    </w:p>
+    <w:p>
+      <w:r>
+        <w:t>Recent research studies have explored the use of ma</w:t>
+      </w:r>
+      <w:r>
+        <w:t xml:space="preserve">chine learning in order to enhance security detection such as the article Machine Learning for Network Intrusion Detection-A Comparative Study </w:t>
+      </w:r>
+      <w:r>
+        <w:t>(Al Lail, Garcia and Olivo, 2023)</w:t>
+      </w:r>
+      <w:r>
+        <w:t xml:space="preserve"> in the study they implemented and evaluated a number of machine learning algorithms against the CICIDS-2017 dataset and were able to achieve detection rates of 97%. This article helps to demonstrate that machine learning models can analyse large datasets of network traffic and identify both normal and malicious traffic with very high accuracy. And unlike </w:t>
+      </w:r>
+      <w:r>
+        <w:t>pure signature-based detection, has the potential to identify new attacks by recognising anomalous patterns of network activity.</w:t>
+      </w:r>
+    </w:p>
+    <w:p>
+      <w:r>
+        <w:t xml:space="preserve">With this context established, this project focuses on the development of a machine learning based Network Intrusion Detection System that can analyse network traffic data and identify and score suspicious behaviour based on its perceived risk. This aims to demonstrate the use </w:t>
+      </w:r>
+      <w:r>
         <w:lastRenderedPageBreak/>
-        <w:t xml:space="preserve">To help deal with this, this project </w:t>
-      </w:r>
-      <w:r>
-        <w:t>centres</w:t>
-      </w:r>
-      <w:r>
-        <w:t xml:space="preserve"> around the development of a Network intrusion detection system that makes use of machine learning to identify suspicious patterns within network traffic, by training against features from a networks traffic data, it can learn behaviour patterns </w:t>
-      </w:r>
-      <w:r>
-        <w:t>from both normal and malicious traffic and can  improve overall detection capabilities allowing the system to identify anomalies or threats that would be captured by the rule based systems.</w:t>
-      </w:r>
-    </w:p>
+        <w:t>of machine learning in network security and test the effectiveness of it when trained on a machine with modern day middle ground specifications.</w:t>
+      </w:r>
+    </w:p>
+    <w:p/>
     <w:p>
       <w:pPr>
         <w:pStyle w:val="Heading2"/>
       </w:pPr>
-      <w:bookmarkStart w:id="4" w:name="_Toc225330874"/>
-      <w:r>
-        <w:t>Context</w:t>
-      </w:r>
-      <w:bookmarkEnd w:id="4"/>
-    </w:p>
-    <w:p>
-      <w:r>
-        <w:t>Within the current cybersecurity landscape, intrusion detection play a vital role by identifying potentially malicious traffic within a network</w:t>
-      </w:r>
-      <w:r>
-        <w:t xml:space="preserve">. Network Intrusion detection Systems monitor network traffic and analyses and learns patterns to help detect unauthorized access or suspicious activity. A majority of these systems rely on signature-based detection, with the traffic being compared against a list of known attack signatures. </w:t>
-      </w:r>
-    </w:p>
-    <w:p>
-      <w:r>
-        <w:t xml:space="preserve">Some of the most widely used tools make use of </w:t>
-      </w:r>
-      <w:r>
-        <w:t>signature-based</w:t>
-      </w:r>
-      <w:r>
-        <w:t xml:space="preserve"> detection, examples of these being Snort and Suricata, both of which are open source and widely used by private users and organizations. These tools are very good at detecting attacks that have been previously </w:t>
-      </w:r>
-      <w:r>
-        <w:t>documented,</w:t>
-      </w:r>
-      <w:r>
-        <w:t xml:space="preserve"> and the system has been updated to detect</w:t>
-      </w:r>
-      <w:r>
-        <w:t xml:space="preserve">. </w:t>
-      </w:r>
-    </w:p>
-    <w:p>
-      <w:r>
-        <w:t xml:space="preserve">As cybercrime grows ever more profitable and with the incident rate of </w:t>
-      </w:r>
-      <w:proofErr w:type="spellStart"/>
-      <w:r>
-        <w:t>cyber crime</w:t>
-      </w:r>
-      <w:proofErr w:type="spellEnd"/>
-      <w:r>
-        <w:t xml:space="preserve"> rising by 37% over the past five years (Bridewell, 2026), the different attack types and vectors continue to evolve, with attackers modifying previously used techniques or developing new attacks using exploits not commonly known, meaning that the signature-based system can’t be updated to detect these attacks. This creates big problems for signature-based systems as attacks that haven’t yet been seen may bypass the detection systems.</w:t>
-      </w:r>
-    </w:p>
-    <w:p>
-      <w:r>
-        <w:t>Alongside the new and changing threats, modern networks generate and receive immensely large volumes of traffic due to the recent growth in cloud services, online services, and personal devices. Monitoring such a large amount of traffic data is unfeasible for an analyst to manage in</w:t>
-      </w:r>
-      <w:r>
-        <w:t xml:space="preserve"> a timely manner that would allow them to respond to an attack and the signature-based systems may also struggle with the highly complex and widely differing traffic patterns.</w:t>
-      </w:r>
-    </w:p>
-    <w:p>
-      <w:r>
-        <w:t>Recent research studies have explored the use of ma</w:t>
-      </w:r>
-      <w:r>
-        <w:t xml:space="preserve">chine learning in order to enhance security detection such as the article Machine Learning for Network Intrusion Detection-A Comparative Study </w:t>
-      </w:r>
-      <w:r>
-        <w:t>(Al Lail, Garcia and Olivo, 2023)</w:t>
-      </w:r>
-      <w:r>
-        <w:t xml:space="preserve"> in the study they implemented and evaluated a number of machine learning algorithms against the CICIDS-2017 dataset and were able to achieve detection rates of 97%. This article helps to demonstrate that machine learning models can analyse large datasets of network traffic and identify both normal and malicious traffic with very high accuracy. And unlike </w:t>
-      </w:r>
-      <w:r>
-        <w:t>pure signature-based detection, has the potential to identify new attacks by recognising anomalous patterns of network activity.</w:t>
-      </w:r>
-    </w:p>
-    <w:p>
-      <w:r>
-        <w:t>With this context established, this project focuses on the development of a machine learning based Network Intrusion Detection System that can analyse network traffic data and identify and score suspicious behaviour based on its perceived risk. This aims to demonstrate the use of machine learning in network security and test the effectiveness of it when trained on a machine with modern day middle ground specifications.</w:t>
-      </w:r>
-    </w:p>
-    <w:p/>
-    <w:p>
-      <w:pPr>
-        <w:pStyle w:val="Heading2"/>
-      </w:pPr>
-      <w:bookmarkStart w:id="5" w:name="_Toc225330875"/>
-      <w:r>
-        <w:lastRenderedPageBreak/>
+      <w:bookmarkStart w:id="5" w:name="_Toc225684961"/>
+      <w:r>
         <w:t>Aims and Objectives</w:t>
       </w:r>
       <w:bookmarkEnd w:id="5"/>
@@ -4125,7 +4498,7 @@
       <w:pPr>
         <w:pStyle w:val="Heading1"/>
       </w:pPr>
-      <w:bookmarkStart w:id="6" w:name="_Toc225330876"/>
+      <w:bookmarkStart w:id="6" w:name="_Toc225684962"/>
       <w:r>
         <w:t>Literature Review</w:t>
       </w:r>
@@ -4135,7 +4508,7 @@
       <w:pPr>
         <w:pStyle w:val="Heading2"/>
       </w:pPr>
-      <w:bookmarkStart w:id="7" w:name="_Toc225330877"/>
+      <w:bookmarkStart w:id="7" w:name="_Toc225684963"/>
       <w:r>
         <w:t>What is a</w:t>
       </w:r>
@@ -4173,106 +4546,103 @@
     </w:p>
     <w:p>
       <w:r>
+        <w:lastRenderedPageBreak/>
         <w:t xml:space="preserve">By monitoring inbound and outbound packets, it allows the system to observe and identify traffic patterns and anomalies across all devices on the network, making it best for identifying external attacks, large network scans, and attempts at unauthorized access. </w:t>
       </w:r>
     </w:p>
     <w:p>
       <w:r>
+        <w:t>But while it has the strength of being able to cover many hosts with a single installation, it struggles against encrypted traffic as it cannot scan for payloads and signatures within the packet.</w:t>
+      </w:r>
+    </w:p>
+    <w:p>
+      <w:r>
+        <w:t>This contrasts to Host-based which sits on individual devices and monitors system logs, file system integrity, any running processes, and changes to registry and any system calls made. By sitting directly on the device, it can detect changes to files and attempts at privilege escalation, making it very good at protecting critical devices and tracking user activity, which can help identify insider threats. But this type of monitoring can be very resource intensive as it has to be deployed on every device on the network.</w:t>
+      </w:r>
+    </w:p>
+    <w:p>
+      <w:r>
+        <w:t xml:space="preserve">Despite which type of IDS is being used, they tend to fall into two types for detection, signature based which </w:t>
+      </w:r>
+      <w:r>
+        <w:t>compares traffic to known attack signatures and patterns, and anomaly-based detection which works by establishing a known baseline for activity and produces alerts on deviations from this established norm.</w:t>
+      </w:r>
+    </w:p>
+    <w:p>
+      <w:r>
+        <w:t xml:space="preserve"> It is worth noting that both have their own pros and cons, with signature having high accuracy and low false positive but misses new attack types, whereas  anomaly tends to have slightly lower accuracy and higher false positives but makes up for this by detecting newer attack patterns.</w:t>
+      </w:r>
+    </w:p>
+    <w:p>
+      <w:pPr>
+        <w:pStyle w:val="Heading2"/>
+      </w:pPr>
+      <w:bookmarkStart w:id="8" w:name="_Toc225684964"/>
+      <w:r>
+        <w:t xml:space="preserve">Existing implementation of AI </w:t>
+      </w:r>
+      <w:r>
+        <w:t>N</w:t>
+      </w:r>
+      <w:r>
+        <w:t>IDS</w:t>
+      </w:r>
+      <w:bookmarkEnd w:id="8"/>
+    </w:p>
+    <w:p>
+      <w:r>
+        <w:t>There are a number of already existing applications that make use of AI for network intrusion detection</w:t>
+      </w:r>
+      <w:r>
+        <w:t>, and example of this usage is Suricata, Suricata makes use of isolation forest models for its threat detection, allowing it to run alongside Suricata’s signature based detection systems, allowing them to offer an easily accessible hybrid detection system.</w:t>
+      </w:r>
+    </w:p>
+    <w:p>
+      <w:r>
+        <w:t xml:space="preserve">Another example of AI usage is from snort, one of the most commonly used </w:t>
+      </w:r>
+      <w:r>
+        <w:t>open-source intrusion detection systems, that traditionally makes use of signature-based detection for its systems, has introduced Snort_ML which uses neural networks instead of the traditional rule sets.</w:t>
+      </w:r>
+    </w:p>
+    <w:p>
+      <w:r>
+        <w:t>The fact that two of the biggest open source IDS providers are shifting towards ML for detection, starts to show where the industry is starting to turn, favouring hybrid or AI systems rather than just having signature based systems.</w:t>
+      </w:r>
+    </w:p>
+    <w:p>
+      <w:pPr>
+        <w:pStyle w:val="Heading2"/>
+      </w:pPr>
+    </w:p>
+    <w:p>
+      <w:pPr>
+        <w:pStyle w:val="Heading2"/>
+      </w:pPr>
+      <w:bookmarkStart w:id="9" w:name="_Toc225684965"/>
+      <w:r>
+        <w:t>Legal, Social, Ethical, Professional(LSEP)</w:t>
+      </w:r>
+      <w:bookmarkEnd w:id="9"/>
+    </w:p>
+    <w:p>
+      <w:r>
+        <w:t>There is a number of legal problems that AI  face</w:t>
+      </w:r>
+      <w:r>
+        <w:t>s</w:t>
+      </w:r>
+      <w:r>
+        <w:t>, one of the most common is gaining proper access to the data needed to train the model, within the AI IDS field there are 2 types of data that is used to train the model, synthetic and real</w:t>
+      </w:r>
+      <w:r>
+        <w:t>, synthetic tends to be the most common type of training data available, an example of this is the UNSW NB-15, that is generally only available for usage in academic environments due to the licensing, meaning that commercially that you aren’t legally allowed to use it without direct permission from the researchers that developed it.</w:t>
+      </w:r>
+    </w:p>
+    <w:p>
+      <w:r>
         <w:lastRenderedPageBreak/>
-        <w:t>But while it has the strength of being able to cover many hosts with a single installation, it struggles against encrypted traffic as it cannot scan for payloads and signatures within the packet.</w:t>
-      </w:r>
-    </w:p>
-    <w:p>
-      <w:r>
-        <w:t>This contrasts to Host-based which sits on individual devices and monitors system logs, file system integrity, any running processes, and changes to registry and any system calls made. By sitting directly on the device, it can detect changes to files and attempts at privilege escalation, making it very good at protecting critical devices and tracking user activity, which can help identify insider threats. But this type of monitoring can be very resource intensive as it has to be deployed on every device on the network.</w:t>
-      </w:r>
-    </w:p>
-    <w:p>
-      <w:r>
-        <w:t xml:space="preserve">Despite which type of IDS is being used, they tend to fall into two types for detection, signature based which </w:t>
-      </w:r>
-      <w:r>
-        <w:t>compares traffic to known attack signatures and patterns, and anomaly-based detection which works by establishing a known baseline for activity and produces alerts on deviations from this established norm.</w:t>
-      </w:r>
-    </w:p>
-    <w:p>
-      <w:r>
-        <w:t xml:space="preserve"> It is worth noting that both have their own pros and cons, with signature having high accuracy and low false positive but misses new attack types, whereas  anomaly tends to have slightly lower accuracy and higher false positives but makes up for this by detecting newer attack patterns.</w:t>
-      </w:r>
-    </w:p>
-    <w:p>
-      <w:pPr>
-        <w:pStyle w:val="Heading2"/>
-      </w:pPr>
-      <w:bookmarkStart w:id="8" w:name="_Toc225330878"/>
-      <w:r>
-        <w:t xml:space="preserve">Existing implementation of AI </w:t>
-      </w:r>
-      <w:r>
-        <w:t>N</w:t>
-      </w:r>
-      <w:r>
-        <w:t>IDS</w:t>
-      </w:r>
-      <w:bookmarkEnd w:id="8"/>
-    </w:p>
-    <w:p>
-      <w:r>
-        <w:t>There are a number of already existing applications that make use of AI for network intrusion detection</w:t>
-      </w:r>
-      <w:r>
-        <w:t>, and example of this usage is Suricata, Suricata makes use of isolation forest models for its threat detection, allowing it to run alongside Suricata’s signature based detection systems, allowing them to offer an easily accessible hybrid detection system.</w:t>
-      </w:r>
-    </w:p>
-    <w:p>
-      <w:r>
-        <w:t xml:space="preserve">Another example of AI usage is from snort, one of the most commonly used </w:t>
-      </w:r>
-      <w:r>
-        <w:t>open-source intrusion detection systems, that traditionally makes use of signature-based detection for its systems, has introduced Snort_ML which uses neural networks instead of the traditional rule sets.</w:t>
-      </w:r>
-    </w:p>
-    <w:p>
-      <w:r>
-        <w:t>The fact that two of the biggest open source IDS providers are shifting towards ML for detection, starts to show where the industry is starting to turn, favouring hybrid or AI systems rather than just having signature based systems.</w:t>
-      </w:r>
-    </w:p>
-    <w:p>
-      <w:pPr>
-        <w:pStyle w:val="Heading2"/>
-      </w:pPr>
-    </w:p>
-    <w:p>
-      <w:pPr>
-        <w:pStyle w:val="Heading2"/>
-      </w:pPr>
-      <w:bookmarkStart w:id="9" w:name="_Toc225330879"/>
-      <w:r>
-        <w:t>Legal, Social, Ethical, Professional(LSEP)</w:t>
-      </w:r>
-      <w:bookmarkEnd w:id="9"/>
-    </w:p>
-    <w:p>
-      <w:r>
-        <w:t>There is a number of legal problems that AI  face</w:t>
-      </w:r>
-      <w:r>
-        <w:t>s</w:t>
-      </w:r>
-      <w:r>
-        <w:t>, one of the most common is gaining proper access to the data needed to train the model, within the AI IDS field there are 2 types of data that is used to train the model, synthetic and real</w:t>
-      </w:r>
-      <w:r>
-        <w:t>, synthetic tends to be the most common type of training data available, an example of this is the UNSW NB-15, that is generally only available for usage in academic environments due to the licensing, meaning that commercially that you aren’t legally allowed to use it without direct permission from the researchers that developed it.</w:t>
-      </w:r>
-    </w:p>
-    <w:p>
-      <w:r>
-        <w:t xml:space="preserve">While traditionally there aren’t any social considerations relating to AI usage in intrusion detection, in the current day and age, there is a stigma around AI usage that stems from a lack of understanding of what the AI would be doing as when they hear that AI has been integrated, </w:t>
-      </w:r>
-      <w:r>
-        <w:lastRenderedPageBreak/>
-        <w:t>the mind jumps to use of Generative AI which people have a strong stance against the usage of genAI.</w:t>
+        <w:t>While traditionally there aren’t any social considerations relating to AI usage in intrusion detection, in the current day and age, there is a stigma around AI usage that stems from a lack of understanding of what the AI would be doing as when they hear that AI has been integrated, the mind jumps to use of Generative AI which people have a strong stance against the usage of genAI.</w:t>
       </w:r>
     </w:p>
     <w:p>
@@ -4301,7 +4671,15 @@
     </w:p>
     <w:p>
       <w:r>
-        <w:t>This is doubly so due to its nature as a Intrusion Detection system, rather than an Intrusion Prevention System, as by itself, an IDS system can do nothing about the intrusion attempts but alert an analyst or user.</w:t>
+        <w:t xml:space="preserve">This is doubly so due to its nature as </w:t>
+      </w:r>
+      <w:proofErr w:type="spellStart"/>
+      <w:r>
+        <w:t>a</w:t>
+      </w:r>
+      <w:proofErr w:type="spellEnd"/>
+      <w:r>
+        <w:t xml:space="preserve"> Intrusion Detection system, rather than an Intrusion Prevention System, as by itself, an IDS system can do nothing about the intrusion attempts but alert an analyst or user.</w:t>
       </w:r>
     </w:p>
     <w:p/>
@@ -4310,7 +4688,7 @@
       <w:pPr>
         <w:pStyle w:val="Heading1"/>
       </w:pPr>
-      <w:bookmarkStart w:id="10" w:name="_Toc225330880"/>
+      <w:bookmarkStart w:id="10" w:name="_Toc225684966"/>
       <w:r>
         <w:t>Project Methodology and System Design</w:t>
       </w:r>
@@ -4320,7 +4698,7 @@
       <w:pPr>
         <w:pStyle w:val="Heading2"/>
       </w:pPr>
-      <w:bookmarkStart w:id="11" w:name="_Toc225330881"/>
+      <w:bookmarkStart w:id="11" w:name="_Toc225684967"/>
       <w:r>
         <w:t>Agile Development Methodology</w:t>
       </w:r>
@@ -4335,7 +4713,7 @@
       <w:pPr>
         <w:pStyle w:val="Heading2"/>
       </w:pPr>
-      <w:bookmarkStart w:id="12" w:name="_Toc225330882"/>
+      <w:bookmarkStart w:id="12" w:name="_Toc225684968"/>
       <w:r>
         <w:t>Implementation Method</w:t>
       </w:r>
@@ -4350,7 +4728,7 @@
       <w:pPr>
         <w:pStyle w:val="Heading2"/>
       </w:pPr>
-      <w:bookmarkStart w:id="13" w:name="_Toc225330883"/>
+      <w:bookmarkStart w:id="13" w:name="_Toc225684969"/>
       <w:r>
         <w:t>Alternative Approaches</w:t>
       </w:r>
@@ -4363,11 +4741,11 @@
     </w:p>
     <w:p>
       <w:r>
-        <w:t xml:space="preserve">Waterfall remains a choice often mentioned when asked about project methodologies, it fits best for projects where there are fixed requirements that are well defined, but its main weakness is that it is highly inflexible to change once development has started. Part of software development and use of technology is that problems will always appear, meaning that you may </w:t>
+        <w:t xml:space="preserve">Waterfall remains a choice often mentioned when asked about project methodologies, it fits best for projects where there are fixed requirements that are well defined, but its main </w:t>
       </w:r>
       <w:r>
         <w:lastRenderedPageBreak/>
-        <w:t>need to pivot and make changes which simply wouldn’t be possible with waterfall due to its linear and rigid nature.</w:t>
+        <w:t>weakness is that it is highly inflexible to change once development has started. Part of software development and use of technology is that problems will always appear, meaning that you may need to pivot and make changes which simply wouldn’t be possible with waterfall due to its linear and rigid nature.</w:t>
       </w:r>
     </w:p>
     <w:p>
@@ -4409,7 +4787,7 @@
       <w:pPr>
         <w:pStyle w:val="Heading2"/>
       </w:pPr>
-      <w:bookmarkStart w:id="14" w:name="_Toc225330884"/>
+      <w:bookmarkStart w:id="14" w:name="_Toc225684970"/>
       <w:r>
         <w:t>System Architecture</w:t>
       </w:r>
@@ -4548,7 +4926,7 @@
       <w:pPr>
         <w:pStyle w:val="Heading2"/>
       </w:pPr>
-      <w:bookmarkStart w:id="15" w:name="_Toc225330885"/>
+      <w:bookmarkStart w:id="15" w:name="_Toc225684971"/>
       <w:r>
         <w:t>Dataset</w:t>
       </w:r>
@@ -4587,7 +4965,7 @@
       <w:pPr>
         <w:pStyle w:val="Heading2"/>
       </w:pPr>
-      <w:bookmarkStart w:id="16" w:name="_Toc225330886"/>
+      <w:bookmarkStart w:id="16" w:name="_Toc225684972"/>
       <w:r>
         <w:t>Data Preprocessing</w:t>
       </w:r>
@@ -4606,7 +4984,13 @@
     </w:p>
     <w:p>
       <w:r>
-        <w:t>During preprocessing, it can be key to drop columns that could poison training, for the UNSW NB15, this would be the label, id, and attack_cat as label and attack_cat denote whether a line of traffic is an attack or not, while the id column</w:t>
+        <w:t xml:space="preserve">During preprocessing, it </w:t>
+      </w:r>
+      <w:r>
+        <w:t>is</w:t>
+      </w:r>
+      <w:r>
+        <w:t xml:space="preserve"> key to drop columns that could poison training, for the UNSW NB15, this would be the label, id, and attack_cat as label and attack_cat denote whether a line of traffic is an attack or not, while the id column</w:t>
       </w:r>
       <w:r>
         <w:t xml:space="preserve"> can cause models to f</w:t>
@@ -4632,7 +5016,7 @@
       <w:pPr>
         <w:pStyle w:val="Heading2"/>
       </w:pPr>
-      <w:bookmarkStart w:id="17" w:name="_Toc225330887"/>
+      <w:bookmarkStart w:id="17" w:name="_Toc225684973"/>
       <w:r>
         <w:t>Machine Learning Models Used</w:t>
       </w:r>
@@ -4745,6 +5129,16 @@
         </w:rPr>
         <w:t>Random Forest:</w:t>
       </w:r>
+      <w:r>
+        <w:rPr>
+          <w:b/>
+          <w:bCs/>
+        </w:rPr>
+        <w:t xml:space="preserve"> </w:t>
+      </w:r>
+      <w:r>
+        <w:t>Random Forest makes predictions through the use of multiple decision trees in order to determine a single result, making use of feature randomness to ensure low levels of correlation between the different trees.</w:t>
+      </w:r>
     </w:p>
     <w:p>
       <w:pPr>
@@ -4755,11 +5149,10 @@
         </w:numPr>
       </w:pPr>
       <w:r>
-        <w:rPr>
-          <w:b/>
-          <w:bCs/>
-        </w:rPr>
         <w:t>KNN:</w:t>
+      </w:r>
+      <w:r>
+        <w:t xml:space="preserve"> This algorithm works on the principle that data points that have similar traits to each other sit near each other, this is done by calculating the distances between different data points compared to unlabelled data points.</w:t>
       </w:r>
     </w:p>
     <w:p>
@@ -4777,6 +5170,23 @@
         </w:rPr>
         <w:t>Logistic Regression:</w:t>
       </w:r>
+      <w:r>
+        <w:rPr>
+          <w:b/>
+          <w:bCs/>
+        </w:rPr>
+        <w:t xml:space="preserve"> </w:t>
+      </w:r>
+      <w:r>
+        <w:t>This model works to predict the probability of a specific outcome occurring, in this case, whether or not a piece of data is malicious or not</w:t>
+      </w:r>
+      <w:r>
+        <w:t xml:space="preserve">, the </w:t>
+      </w:r>
+      <w:r>
+        <w:lastRenderedPageBreak/>
+        <w:t>probabilities of the outcomes are confined to between zero and one, with the probabilities determined, the results are fitted to an S curve to map the values to the probability</w:t>
+      </w:r>
     </w:p>
     <w:p>
       <w:pPr>
@@ -4793,6 +5203,16 @@
         </w:rPr>
         <w:t>Linear SVM:</w:t>
       </w:r>
+      <w:r>
+        <w:rPr>
+          <w:b/>
+          <w:bCs/>
+        </w:rPr>
+        <w:t xml:space="preserve"> </w:t>
+      </w:r>
+      <w:r>
+        <w:t>This is best used for binary classification where the data can be split by a straight line into two classes, in the case for this project it would be normal and malicious traffic.</w:t>
+      </w:r>
     </w:p>
     <w:p>
       <w:pPr>
@@ -4809,20 +5229,34 @@
         </w:rPr>
         <w:t>XGBoost:</w:t>
       </w:r>
+      <w:r>
+        <w:rPr>
+          <w:b/>
+          <w:bCs/>
+        </w:rPr>
+        <w:t xml:space="preserve"> </w:t>
+      </w:r>
+      <w:r>
+        <w:t>This is a gradient boosting algorithm that works by adding more simple models to correct errors made by the models before it, it is optimized for large datasets which while and has built in routines for handling missing data.</w:t>
+      </w:r>
     </w:p>
     <w:p/>
     <w:p>
       <w:pPr>
         <w:pStyle w:val="Heading2"/>
       </w:pPr>
-      <w:bookmarkStart w:id="18" w:name="_Toc225330888"/>
-      <w:r>
-        <w:lastRenderedPageBreak/>
+      <w:bookmarkStart w:id="18" w:name="_Toc225684974"/>
+      <w:r>
         <w:t>Detection Pipeline</w:t>
       </w:r>
       <w:bookmarkEnd w:id="18"/>
     </w:p>
     <w:p>
+      <w:r>
+        <w:t>The pipeline for detection goes through four stages to ensure proper data flow and proper predictions, first is input where the dataset is loaded and the necessary pre-processing is completed, the data is then fed to the model and it runs predictions based on its training, the events the model marks as suspicious are saved to a text file, if the model finds suspicious events, an alert is triggered which sends an email to pre-determined email address, alerting them of the results.</w:t>
+      </w:r>
+    </w:p>
+    <w:p>
       <w:pPr>
         <w:pStyle w:val="Heading2"/>
       </w:pPr>
@@ -4831,7 +5265,7 @@
       <w:pPr>
         <w:pStyle w:val="Heading1"/>
       </w:pPr>
-      <w:bookmarkStart w:id="19" w:name="_Toc225330889"/>
+      <w:bookmarkStart w:id="19" w:name="_Toc225684975"/>
       <w:r>
         <w:t>Tools Used and Technologies</w:t>
       </w:r>
@@ -4846,7 +5280,7 @@
       <w:pPr>
         <w:pStyle w:val="Heading3"/>
       </w:pPr>
-      <w:bookmarkStart w:id="20" w:name="_Toc225330890"/>
+      <w:bookmarkStart w:id="20" w:name="_Toc225684976"/>
       <w:r>
         <w:t>Python</w:t>
       </w:r>
@@ -4861,7 +5295,7 @@
       <w:pPr>
         <w:pStyle w:val="Heading3"/>
       </w:pPr>
-      <w:bookmarkStart w:id="21" w:name="_Toc225330891"/>
+      <w:bookmarkStart w:id="21" w:name="_Toc225684977"/>
       <w:r>
         <w:t>Jupyter Notebook</w:t>
       </w:r>
@@ -4876,7 +5310,7 @@
       <w:pPr>
         <w:pStyle w:val="Heading3"/>
       </w:pPr>
-      <w:bookmarkStart w:id="22" w:name="_Toc225330892"/>
+      <w:bookmarkStart w:id="22" w:name="_Toc225684978"/>
       <w:r>
         <w:t>Python Libraries</w:t>
       </w:r>
@@ -4908,6 +5342,7 @@
           <w:b/>
           <w:bCs/>
         </w:rPr>
+        <w:lastRenderedPageBreak/>
         <w:t>Pandas and NumPy</w:t>
       </w:r>
       <w:r>
@@ -4962,6 +5397,7 @@
           <w:numId w:val="2"/>
         </w:numPr>
       </w:pPr>
+      <w:proofErr w:type="spellStart"/>
       <w:r>
         <w:rPr>
           <w:b/>
@@ -4969,6 +5405,7 @@
         </w:rPr>
         <w:t>SMTPLib</w:t>
       </w:r>
+      <w:proofErr w:type="spellEnd"/>
       <w:r>
         <w:t>: This was used in order to implement email alerts, allowing the users to be informed if suspicious behaviour has been detected within the traffic log files.</w:t>
       </w:r>
@@ -4983,9 +5420,8 @@
       <w:pPr>
         <w:pStyle w:val="Heading3"/>
       </w:pPr>
-      <w:bookmarkStart w:id="23" w:name="_Toc225330893"/>
-      <w:r>
-        <w:lastRenderedPageBreak/>
+      <w:bookmarkStart w:id="23" w:name="_Toc225684979"/>
+      <w:r>
         <w:t>GitHub</w:t>
       </w:r>
       <w:bookmarkEnd w:id="23"/>
@@ -5000,83 +5436,133 @@
       <w:pPr>
         <w:pStyle w:val="Heading1"/>
       </w:pPr>
-      <w:bookmarkStart w:id="24" w:name="_Toc225330894"/>
+      <w:bookmarkStart w:id="24" w:name="_Toc225684980"/>
       <w:r>
         <w:t>Implementation</w:t>
       </w:r>
       <w:bookmarkEnd w:id="24"/>
     </w:p>
+    <w:p>
+      <w:pPr>
+        <w:pStyle w:val="Heading2"/>
+      </w:pPr>
+      <w:bookmarkStart w:id="25" w:name="_Toc225684981"/>
+      <w:r>
+        <w:t>Model Training</w:t>
+      </w:r>
+      <w:bookmarkEnd w:id="25"/>
+    </w:p>
+    <w:p>
+      <w:pPr>
+        <w:pStyle w:val="Heading2"/>
+      </w:pPr>
+      <w:bookmarkStart w:id="26" w:name="_Toc225684982"/>
+      <w:r>
+        <w:t>Model Evaluation</w:t>
+      </w:r>
+      <w:bookmarkEnd w:id="26"/>
+    </w:p>
+    <w:p>
+      <w:pPr>
+        <w:pStyle w:val="Heading2"/>
+      </w:pPr>
+      <w:bookmarkStart w:id="27" w:name="_Toc225684983"/>
+      <w:r>
+        <w:t>Model Extraction and Deployment</w:t>
+      </w:r>
+      <w:bookmarkEnd w:id="27"/>
+    </w:p>
+    <w:p>
+      <w:pPr>
+        <w:pStyle w:val="Heading2"/>
+      </w:pPr>
+      <w:bookmarkStart w:id="28" w:name="_Toc225684984"/>
+      <w:r>
+        <w:t>NIDS Output System</w:t>
+      </w:r>
+      <w:bookmarkEnd w:id="28"/>
+    </w:p>
+    <w:p>
+      <w:pPr>
+        <w:pStyle w:val="Heading2"/>
+      </w:pPr>
+      <w:bookmarkStart w:id="29" w:name="_Toc225684985"/>
+      <w:r>
+        <w:t>Email Alert System</w:t>
+      </w:r>
+      <w:bookmarkEnd w:id="29"/>
+    </w:p>
     <w:p/>
     <w:p>
       <w:pPr>
         <w:pStyle w:val="Heading2"/>
       </w:pPr>
-      <w:bookmarkStart w:id="25" w:name="_Toc225330895"/>
+      <w:bookmarkStart w:id="30" w:name="_Toc225684986"/>
       <w:r>
         <w:lastRenderedPageBreak/>
         <w:t>Sprint 1</w:t>
       </w:r>
-      <w:bookmarkEnd w:id="25"/>
+      <w:bookmarkEnd w:id="30"/>
     </w:p>
     <w:p>
       <w:pPr>
         <w:pStyle w:val="Heading3"/>
       </w:pPr>
-      <w:bookmarkStart w:id="26" w:name="_Toc225330896"/>
+      <w:bookmarkStart w:id="31" w:name="_Toc225684987"/>
       <w:r>
         <w:t>Research on development tools</w:t>
       </w:r>
-      <w:bookmarkEnd w:id="26"/>
+      <w:bookmarkEnd w:id="31"/>
     </w:p>
     <w:p>
       <w:pPr>
         <w:pStyle w:val="Heading3"/>
       </w:pPr>
-      <w:bookmarkStart w:id="27" w:name="_Toc225330897"/>
+      <w:bookmarkStart w:id="32" w:name="_Toc225684988"/>
       <w:r>
         <w:t>Beginning of Accuracy Testing</w:t>
       </w:r>
-      <w:bookmarkEnd w:id="27"/>
+      <w:bookmarkEnd w:id="32"/>
     </w:p>
     <w:p>
       <w:pPr>
         <w:pStyle w:val="Heading2"/>
       </w:pPr>
-      <w:bookmarkStart w:id="28" w:name="_Toc225330898"/>
+      <w:bookmarkStart w:id="33" w:name="_Toc225684989"/>
       <w:r>
         <w:t>Sprint 2</w:t>
       </w:r>
-      <w:bookmarkEnd w:id="28"/>
+      <w:bookmarkEnd w:id="33"/>
     </w:p>
     <w:p>
       <w:pPr>
         <w:pStyle w:val="Heading3"/>
       </w:pPr>
-      <w:bookmarkStart w:id="29" w:name="_Toc225330899"/>
+      <w:bookmarkStart w:id="34" w:name="_Toc225684990"/>
       <w:r>
         <w:t>Accuracy testing Cont.</w:t>
       </w:r>
-      <w:bookmarkEnd w:id="29"/>
+      <w:bookmarkEnd w:id="34"/>
     </w:p>
     <w:p>
       <w:pPr>
         <w:pStyle w:val="Heading3"/>
       </w:pPr>
-      <w:bookmarkStart w:id="30" w:name="_Toc225330900"/>
+      <w:bookmarkStart w:id="35" w:name="_Toc225684991"/>
       <w:r>
         <w:t>Issues encountered</w:t>
       </w:r>
-      <w:bookmarkEnd w:id="30"/>
+      <w:bookmarkEnd w:id="35"/>
     </w:p>
     <w:p>
       <w:pPr>
         <w:pStyle w:val="Heading2"/>
       </w:pPr>
-      <w:bookmarkStart w:id="31" w:name="_Toc225330901"/>
+      <w:bookmarkStart w:id="36" w:name="_Toc225684992"/>
       <w:r>
         <w:t>Sprint 3</w:t>
       </w:r>
-      <w:bookmarkEnd w:id="31"/>
+      <w:bookmarkEnd w:id="36"/>
       <w:r>
         <w:t xml:space="preserve"> </w:t>
       </w:r>
@@ -5085,141 +5571,141 @@
       <w:pPr>
         <w:pStyle w:val="Heading3"/>
       </w:pPr>
-      <w:bookmarkStart w:id="32" w:name="_Toc225330902"/>
+      <w:bookmarkStart w:id="37" w:name="_Toc225684993"/>
       <w:r>
         <w:t>Even Further Accuracy Testing</w:t>
       </w:r>
-      <w:bookmarkEnd w:id="32"/>
+      <w:bookmarkEnd w:id="37"/>
     </w:p>
     <w:p>
       <w:pPr>
         <w:pStyle w:val="Heading3"/>
       </w:pPr>
-      <w:bookmarkStart w:id="33" w:name="_Toc225330903"/>
+      <w:bookmarkStart w:id="38" w:name="_Toc225684994"/>
       <w:r>
         <w:t>Solutions to issues</w:t>
       </w:r>
-      <w:bookmarkEnd w:id="33"/>
+      <w:bookmarkEnd w:id="38"/>
     </w:p>
     <w:p>
       <w:pPr>
         <w:pStyle w:val="Heading2"/>
       </w:pPr>
-      <w:bookmarkStart w:id="34" w:name="_Toc225330904"/>
+      <w:bookmarkStart w:id="39" w:name="_Toc225684995"/>
       <w:r>
         <w:t>Sprint 4</w:t>
       </w:r>
-      <w:bookmarkEnd w:id="34"/>
+      <w:bookmarkEnd w:id="39"/>
     </w:p>
     <w:p>
       <w:pPr>
         <w:pStyle w:val="Heading3"/>
       </w:pPr>
-      <w:bookmarkStart w:id="35" w:name="_Toc225330905"/>
+      <w:bookmarkStart w:id="40" w:name="_Toc225684996"/>
       <w:r>
         <w:t>Extraction of Trained model</w:t>
       </w:r>
-      <w:bookmarkEnd w:id="35"/>
+      <w:bookmarkEnd w:id="40"/>
     </w:p>
     <w:p>
       <w:pPr>
         <w:pStyle w:val="Heading2"/>
       </w:pPr>
-      <w:bookmarkStart w:id="36" w:name="_Toc225330906"/>
+      <w:bookmarkStart w:id="41" w:name="_Toc225684997"/>
       <w:r>
         <w:t>Sprint 5</w:t>
       </w:r>
-      <w:bookmarkEnd w:id="36"/>
+      <w:bookmarkEnd w:id="41"/>
     </w:p>
     <w:p>
       <w:pPr>
         <w:pStyle w:val="Heading3"/>
       </w:pPr>
-      <w:bookmarkStart w:id="37" w:name="_Toc225330907"/>
+      <w:bookmarkStart w:id="42" w:name="_Toc225684998"/>
       <w:r>
         <w:t>Output for IDS</w:t>
       </w:r>
-      <w:bookmarkEnd w:id="37"/>
+      <w:bookmarkEnd w:id="42"/>
     </w:p>
     <w:p>
       <w:pPr>
         <w:pStyle w:val="Heading2"/>
       </w:pPr>
-      <w:bookmarkStart w:id="38" w:name="_Toc225330908"/>
+      <w:bookmarkStart w:id="43" w:name="_Toc225684999"/>
       <w:r>
         <w:t>Sprint 6</w:t>
       </w:r>
-      <w:bookmarkEnd w:id="38"/>
+      <w:bookmarkEnd w:id="43"/>
     </w:p>
     <w:p>
       <w:pPr>
         <w:pStyle w:val="Heading3"/>
       </w:pPr>
-      <w:bookmarkStart w:id="39" w:name="_Toc225330909"/>
+      <w:bookmarkStart w:id="44" w:name="_Toc225685000"/>
       <w:r>
         <w:t>Email Alerts</w:t>
       </w:r>
-      <w:bookmarkEnd w:id="39"/>
+      <w:bookmarkEnd w:id="44"/>
     </w:p>
     <w:p>
       <w:pPr>
         <w:pStyle w:val="Heading2"/>
       </w:pPr>
-      <w:bookmarkStart w:id="40" w:name="_Toc225330910"/>
+      <w:bookmarkStart w:id="45" w:name="_Toc225685001"/>
       <w:r>
         <w:t>Sprint 7</w:t>
       </w:r>
-      <w:bookmarkEnd w:id="40"/>
+      <w:bookmarkEnd w:id="45"/>
     </w:p>
     <w:p>
       <w:pPr>
         <w:pStyle w:val="Heading3"/>
       </w:pPr>
-      <w:bookmarkStart w:id="41" w:name="_Toc225330911"/>
+      <w:bookmarkStart w:id="46" w:name="_Toc225685002"/>
       <w:r>
         <w:t>End of Development</w:t>
       </w:r>
-      <w:bookmarkEnd w:id="41"/>
+      <w:bookmarkEnd w:id="46"/>
     </w:p>
     <w:p>
       <w:pPr>
         <w:pStyle w:val="Heading1"/>
       </w:pPr>
-      <w:bookmarkStart w:id="42" w:name="_Toc225330912"/>
+      <w:bookmarkStart w:id="47" w:name="_Toc225685003"/>
       <w:r>
         <w:t>End of Project Report</w:t>
       </w:r>
-      <w:bookmarkEnd w:id="42"/>
+      <w:bookmarkEnd w:id="47"/>
     </w:p>
     <w:p>
       <w:pPr>
         <w:pStyle w:val="Heading1"/>
       </w:pPr>
-      <w:bookmarkStart w:id="43" w:name="_Toc225330913"/>
+      <w:bookmarkStart w:id="48" w:name="_Toc225685004"/>
       <w:r>
         <w:t>Project Post-Mortem</w:t>
       </w:r>
-      <w:bookmarkEnd w:id="43"/>
+      <w:bookmarkEnd w:id="48"/>
     </w:p>
     <w:p>
       <w:pPr>
         <w:pStyle w:val="Heading1"/>
       </w:pPr>
-      <w:bookmarkStart w:id="44" w:name="_Toc225330914"/>
+      <w:bookmarkStart w:id="49" w:name="_Toc225685005"/>
       <w:r>
         <w:t>Conclusions</w:t>
       </w:r>
-      <w:bookmarkEnd w:id="44"/>
+      <w:bookmarkEnd w:id="49"/>
     </w:p>
     <w:p>
       <w:pPr>
         <w:pStyle w:val="Heading1"/>
       </w:pPr>
-      <w:bookmarkStart w:id="45" w:name="_Toc225330915"/>
+      <w:bookmarkStart w:id="50" w:name="_Toc225685006"/>
       <w:r>
         <w:t>References</w:t>
       </w:r>
-      <w:bookmarkEnd w:id="45"/>
+      <w:bookmarkEnd w:id="50"/>
     </w:p>
     <w:p>
       <w:r>
@@ -5288,11 +5774,11 @@
       <w:pPr>
         <w:pStyle w:val="Heading1"/>
       </w:pPr>
-      <w:bookmarkStart w:id="46" w:name="_Toc225330916"/>
+      <w:bookmarkStart w:id="51" w:name="_Toc225685007"/>
       <w:r>
         <w:t>Appendix</w:t>
       </w:r>
-      <w:bookmarkEnd w:id="46"/>
+      <w:bookmarkEnd w:id="51"/>
     </w:p>
     <w:p/>
     <w:p/>
@@ -6349,6 +6835,7 @@
   <w:style w:type="character" w:default="1" w:styleId="DefaultParagraphFont">
     <w:name w:val="Default Paragraph Font"/>
     <w:uiPriority w:val="1"/>
+    <w:semiHidden/>
     <w:unhideWhenUsed/>
   </w:style>
   <w:style w:type="table" w:default="1" w:styleId="TableNormal">

</xml_diff>

<commit_message>
First section of implementation completed, model evaluation work starts tomorrow
</commit_message>
<xml_diff>
--- a/COMP 3000.docx
+++ b/COMP 3000.docx
@@ -5453,15 +5453,716 @@
       <w:bookmarkEnd w:id="25"/>
     </w:p>
     <w:p>
+      <w:r>
+        <w:t xml:space="preserve">The aim of this phase of implementation was to determine which of the five chosen machine learning algorithms produced the highest results, determined by the metrics defined earlier in this report, these being Accuracy, Recall, Precision, and F1. </w:t>
+      </w:r>
+    </w:p>
+    <w:p>
+      <w:r>
+        <w:t xml:space="preserve">The first steps taken were to import the required dependencies, including Pandas, </w:t>
+      </w:r>
+      <w:proofErr w:type="spellStart"/>
+      <w:r>
+        <w:t>SK</w:t>
+      </w:r>
+      <w:r>
+        <w:t>lear</w:t>
+      </w:r>
+      <w:r>
+        <w:t>n</w:t>
+      </w:r>
+      <w:proofErr w:type="spellEnd"/>
+      <w:r>
+        <w:t xml:space="preserve"> and its numerous modules, NumPy, and XGBoost, then moved to establish the file path to the test and train files of the dataset and loading it into the notebook using pandas.</w:t>
+      </w:r>
+    </w:p>
+    <w:p>
+      <w:pPr>
+        <w:keepNext/>
+      </w:pPr>
+      <w:r>
+        <w:lastRenderedPageBreak/>
+        <w:drawing>
+          <wp:inline distT="0" distB="0" distL="0" distR="0" wp14:anchorId="614EB440" wp14:editId="325F4EA4">
+            <wp:extent cx="5731510" cy="3338830"/>
+            <wp:effectExtent l="0" t="0" r="2540" b="0"/>
+            <wp:docPr id="343881347" name="Picture 1"/>
+            <wp:cNvGraphicFramePr>
+              <a:graphicFrameLocks xmlns:a="http://schemas.openxmlformats.org/drawingml/2006/main" noChangeAspect="1"/>
+            </wp:cNvGraphicFramePr>
+            <a:graphic xmlns:a="http://schemas.openxmlformats.org/drawingml/2006/main">
+              <a:graphicData uri="http://schemas.openxmlformats.org/drawingml/2006/picture">
+                <pic:pic xmlns:pic="http://schemas.openxmlformats.org/drawingml/2006/picture">
+                  <pic:nvPicPr>
+                    <pic:cNvPr id="343881347" name=""/>
+                    <pic:cNvPicPr/>
+                  </pic:nvPicPr>
+                  <pic:blipFill>
+                    <a:blip r:embed="rId7"/>
+                    <a:stretch>
+                      <a:fillRect/>
+                    </a:stretch>
+                  </pic:blipFill>
+                  <pic:spPr>
+                    <a:xfrm>
+                      <a:off x="0" y="0"/>
+                      <a:ext cx="5731510" cy="3338830"/>
+                    </a:xfrm>
+                    <a:prstGeom prst="rect">
+                      <a:avLst/>
+                    </a:prstGeom>
+                  </pic:spPr>
+                </pic:pic>
+              </a:graphicData>
+            </a:graphic>
+          </wp:inline>
+        </w:drawing>
+      </w:r>
+    </w:p>
+    <w:p>
+      <w:pPr>
+        <w:pStyle w:val="Caption"/>
+      </w:pPr>
+      <w:r>
+        <w:t xml:space="preserve">Figure </w:t>
+      </w:r>
+      <w:fldSimple w:instr=" SEQ Figure \* ARABIC ">
+        <w:r>
+          <w:rPr>
+            <w:noProof/>
+          </w:rPr>
+          <w:t>2</w:t>
+        </w:r>
+      </w:fldSimple>
+      <w:r>
+        <w:t>:Dependency Imports and Dataset Loading for Accuracy Testing</w:t>
+      </w:r>
+    </w:p>
+    <w:p>
+      <w:r>
+        <w:t>The next step of the development pipeline was the pre-processing of the data, this proved to provide more challenge than anticipated, leading to it taking up time over two sprints as there was a feature leak that was impacting the accuracy of two of the models negatively.</w:t>
+      </w:r>
+    </w:p>
+    <w:p>
+      <w:r>
+        <w:t>I started by removing the non-feature columns and any columns that could produce leaks that would poison the training and testing by either allowing the models to cheat using columns like attack_cat which contains the type of attack the line was, or poison it and reduce the accuracy like the id column did during the development of this section.</w:t>
+      </w:r>
+    </w:p>
+    <w:p>
+      <w:pPr>
+        <w:keepNext/>
+      </w:pPr>
+      <w:r>
+        <w:drawing>
+          <wp:inline distT="0" distB="0" distL="0" distR="0" wp14:anchorId="4B84AB9E" wp14:editId="6CAB91BE">
+            <wp:extent cx="5731510" cy="1380490"/>
+            <wp:effectExtent l="0" t="0" r="2540" b="0"/>
+            <wp:docPr id="546564597" name="Picture 1"/>
+            <wp:cNvGraphicFramePr>
+              <a:graphicFrameLocks xmlns:a="http://schemas.openxmlformats.org/drawingml/2006/main" noChangeAspect="1"/>
+            </wp:cNvGraphicFramePr>
+            <a:graphic xmlns:a="http://schemas.openxmlformats.org/drawingml/2006/main">
+              <a:graphicData uri="http://schemas.openxmlformats.org/drawingml/2006/picture">
+                <pic:pic xmlns:pic="http://schemas.openxmlformats.org/drawingml/2006/picture">
+                  <pic:nvPicPr>
+                    <pic:cNvPr id="546564597" name=""/>
+                    <pic:cNvPicPr/>
+                  </pic:nvPicPr>
+                  <pic:blipFill>
+                    <a:blip r:embed="rId8"/>
+                    <a:stretch>
+                      <a:fillRect/>
+                    </a:stretch>
+                  </pic:blipFill>
+                  <pic:spPr>
+                    <a:xfrm>
+                      <a:off x="0" y="0"/>
+                      <a:ext cx="5731510" cy="1380490"/>
+                    </a:xfrm>
+                    <a:prstGeom prst="rect">
+                      <a:avLst/>
+                    </a:prstGeom>
+                  </pic:spPr>
+                </pic:pic>
+              </a:graphicData>
+            </a:graphic>
+          </wp:inline>
+        </w:drawing>
+      </w:r>
+    </w:p>
+    <w:p>
+      <w:pPr>
+        <w:pStyle w:val="Caption"/>
+      </w:pPr>
+      <w:r>
+        <w:t xml:space="preserve">Figure </w:t>
+      </w:r>
+      <w:fldSimple w:instr=" SEQ Figure \* ARABIC ">
+        <w:r>
+          <w:rPr>
+            <w:noProof/>
+          </w:rPr>
+          <w:t>3</w:t>
+        </w:r>
+      </w:fldSimple>
+      <w:r>
+        <w:t>:Dropping features to prevent leaks</w:t>
+      </w:r>
+    </w:p>
+    <w:p>
+      <w:r>
+        <w:t>After dropping the columns, pre-processing could begin properly, as there were multiple models that needed to be trained on this data, it needed to fit the criteria of all five, this first meant getting rid of any empty space in columns in both test and train, then made use of one-hot encoding to convert any object columns into data that can be read by algorithms that only accept numerical input</w:t>
+      </w:r>
+      <w:r>
+        <w:t>.</w:t>
+      </w:r>
+    </w:p>
+    <w:p>
+      <w:r>
+        <w:t xml:space="preserve">With the columns encoded, the next task was to align the features of the testing and training dataset, this ensures that when the model are run against the test dataset, it doesn’t throw errors, as the training dataset contains features that are not present in the test dataset, then as </w:t>
+      </w:r>
+      <w:r>
+        <w:lastRenderedPageBreak/>
+        <w:t>a last measure to ensure that the models do not break due to data being non numerical, the encoded columns datatype is set as float64.</w:t>
+      </w:r>
+    </w:p>
+    <w:p>
+      <w:r>
+        <w:t>The final step was to assign class weights to the training columns, this is due to XGBoost making use of class weights, so to ensure best results, I have included it.</w:t>
+      </w:r>
+    </w:p>
+    <w:p>
+      <w:pPr>
+        <w:keepNext/>
+      </w:pPr>
+      <w:r>
+        <w:drawing>
+          <wp:inline distT="0" distB="0" distL="0" distR="0" wp14:anchorId="5C0EC1D9" wp14:editId="7F8A4655">
+            <wp:extent cx="5731510" cy="4686300"/>
+            <wp:effectExtent l="0" t="0" r="2540" b="0"/>
+            <wp:docPr id="1297574706" name="Picture 1"/>
+            <wp:cNvGraphicFramePr>
+              <a:graphicFrameLocks xmlns:a="http://schemas.openxmlformats.org/drawingml/2006/main" noChangeAspect="1"/>
+            </wp:cNvGraphicFramePr>
+            <a:graphic xmlns:a="http://schemas.openxmlformats.org/drawingml/2006/main">
+              <a:graphicData uri="http://schemas.openxmlformats.org/drawingml/2006/picture">
+                <pic:pic xmlns:pic="http://schemas.openxmlformats.org/drawingml/2006/picture">
+                  <pic:nvPicPr>
+                    <pic:cNvPr id="1297574706" name=""/>
+                    <pic:cNvPicPr/>
+                  </pic:nvPicPr>
+                  <pic:blipFill>
+                    <a:blip r:embed="rId9"/>
+                    <a:stretch>
+                      <a:fillRect/>
+                    </a:stretch>
+                  </pic:blipFill>
+                  <pic:spPr>
+                    <a:xfrm>
+                      <a:off x="0" y="0"/>
+                      <a:ext cx="5731510" cy="4686300"/>
+                    </a:xfrm>
+                    <a:prstGeom prst="rect">
+                      <a:avLst/>
+                    </a:prstGeom>
+                  </pic:spPr>
+                </pic:pic>
+              </a:graphicData>
+            </a:graphic>
+          </wp:inline>
+        </w:drawing>
+      </w:r>
+    </w:p>
+    <w:p>
+      <w:pPr>
+        <w:pStyle w:val="Caption"/>
+      </w:pPr>
+      <w:r>
+        <w:t xml:space="preserve">Figure </w:t>
+      </w:r>
+      <w:fldSimple w:instr=" SEQ Figure \* ARABIC ">
+        <w:r>
+          <w:rPr>
+            <w:noProof/>
+          </w:rPr>
+          <w:t>4</w:t>
+        </w:r>
+      </w:fldSimple>
+      <w:r>
+        <w:t xml:space="preserve">: Data Pre-processing and feature </w:t>
+      </w:r>
+      <w:r>
+        <w:t>alignment</w:t>
+      </w:r>
+    </w:p>
+    <w:p>
+      <w:r>
+        <w:t>The final stages of model training stage are training and results</w:t>
+      </w:r>
+      <w:r>
+        <w:t>, training started by defining the models being used and the parameters that I wa</w:t>
+      </w:r>
+      <w:r>
+        <w:t>s using to train the models, a limitation I faced during training was a hardware limitation of that I was using my own hardware to train these models which limited the depth and rigour of the model training.</w:t>
+      </w:r>
+    </w:p>
+    <w:p>
+      <w:r>
+        <w:t>As previously mentioned, the models I trained during this stage of development are Random Forest, KNN, Logistic Regression, Linear SVM, and XGBoost, I chose these models due to the range of techniques used by the different models in order to determine which would best suit and perform the best against the UNSW NB-15 dataset</w:t>
+      </w:r>
+      <w:r>
+        <w:t>. Below is a section of the code showing the parameters that were used for training.</w:t>
+      </w:r>
+    </w:p>
+    <w:p>
+      <w:r>
+        <w:lastRenderedPageBreak/>
+        <w:drawing>
+          <wp:inline distT="0" distB="0" distL="0" distR="0" wp14:anchorId="19579E01" wp14:editId="30589978">
+            <wp:extent cx="5731510" cy="2922905"/>
+            <wp:effectExtent l="0" t="0" r="2540" b="0"/>
+            <wp:docPr id="631310949" name="Picture 1"/>
+            <wp:cNvGraphicFramePr>
+              <a:graphicFrameLocks xmlns:a="http://schemas.openxmlformats.org/drawingml/2006/main" noChangeAspect="1"/>
+            </wp:cNvGraphicFramePr>
+            <a:graphic xmlns:a="http://schemas.openxmlformats.org/drawingml/2006/main">
+              <a:graphicData uri="http://schemas.openxmlformats.org/drawingml/2006/picture">
+                <pic:pic xmlns:pic="http://schemas.openxmlformats.org/drawingml/2006/picture">
+                  <pic:nvPicPr>
+                    <pic:cNvPr id="631310949" name=""/>
+                    <pic:cNvPicPr/>
+                  </pic:nvPicPr>
+                  <pic:blipFill>
+                    <a:blip r:embed="rId10"/>
+                    <a:stretch>
+                      <a:fillRect/>
+                    </a:stretch>
+                  </pic:blipFill>
+                  <pic:spPr>
+                    <a:xfrm>
+                      <a:off x="0" y="0"/>
+                      <a:ext cx="5731510" cy="2922905"/>
+                    </a:xfrm>
+                    <a:prstGeom prst="rect">
+                      <a:avLst/>
+                    </a:prstGeom>
+                  </pic:spPr>
+                </pic:pic>
+              </a:graphicData>
+            </a:graphic>
+          </wp:inline>
+        </w:drawing>
+      </w:r>
+    </w:p>
+    <w:p>
+      <w:r>
+        <w:t xml:space="preserve">Now with the models setup with proper parameters, the models are fit against the training split of the dataset and the </w:t>
+      </w:r>
+      <w:r>
+        <w:t>various metrics can be gathered using the results of the models running predictions against the testing split of the dataset. Below is a table containing the results of the predictions made by the five models</w:t>
+      </w:r>
+    </w:p>
+    <w:tbl>
+      <w:tblPr>
+        <w:tblStyle w:val="TableGrid"/>
+        <w:tblW w:w="0" w:type="auto"/>
+        <w:tblLook w:val="04A0" w:firstRow="1" w:lastRow="0" w:firstColumn="1" w:lastColumn="0" w:noHBand="0" w:noVBand="1"/>
+      </w:tblPr>
+      <w:tblGrid>
+        <w:gridCol w:w="1803"/>
+        <w:gridCol w:w="1803"/>
+        <w:gridCol w:w="1803"/>
+        <w:gridCol w:w="1803"/>
+        <w:gridCol w:w="1804"/>
+      </w:tblGrid>
+      <w:tr>
+        <w:tc>
+          <w:tcPr>
+            <w:tcW w:w="1803" w:type="dxa"/>
+          </w:tcPr>
+          <w:p>
+            <w:r>
+              <w:t>Model</w:t>
+            </w:r>
+          </w:p>
+        </w:tc>
+        <w:tc>
+          <w:tcPr>
+            <w:tcW w:w="1803" w:type="dxa"/>
+          </w:tcPr>
+          <w:p>
+            <w:r>
+              <w:t>Accuracy</w:t>
+            </w:r>
+          </w:p>
+        </w:tc>
+        <w:tc>
+          <w:tcPr>
+            <w:tcW w:w="1803" w:type="dxa"/>
+          </w:tcPr>
+          <w:p>
+            <w:r>
+              <w:t>Recall</w:t>
+            </w:r>
+          </w:p>
+        </w:tc>
+        <w:tc>
+          <w:tcPr>
+            <w:tcW w:w="1803" w:type="dxa"/>
+          </w:tcPr>
+          <w:p>
+            <w:r>
+              <w:t>Precision</w:t>
+            </w:r>
+          </w:p>
+        </w:tc>
+        <w:tc>
+          <w:tcPr>
+            <w:tcW w:w="1804" w:type="dxa"/>
+          </w:tcPr>
+          <w:p>
+            <w:r>
+              <w:t>F1</w:t>
+            </w:r>
+          </w:p>
+        </w:tc>
+      </w:tr>
+      <w:tr>
+        <w:tc>
+          <w:tcPr>
+            <w:tcW w:w="1803" w:type="dxa"/>
+          </w:tcPr>
+          <w:p>
+            <w:r>
+              <w:t>Random Forest</w:t>
+            </w:r>
+          </w:p>
+        </w:tc>
+        <w:tc>
+          <w:tcPr>
+            <w:tcW w:w="1803" w:type="dxa"/>
+          </w:tcPr>
+          <w:p>
+            <w:r>
+              <w:t>0.9099</w:t>
+            </w:r>
+          </w:p>
+        </w:tc>
+        <w:tc>
+          <w:tcPr>
+            <w:tcW w:w="1803" w:type="dxa"/>
+          </w:tcPr>
+          <w:p>
+            <w:r>
+              <w:t>0.9683</w:t>
+            </w:r>
+          </w:p>
+        </w:tc>
+        <w:tc>
+          <w:tcPr>
+            <w:tcW w:w="1803" w:type="dxa"/>
+          </w:tcPr>
+          <w:p>
+            <w:r>
+              <w:t>0.8801</w:t>
+            </w:r>
+          </w:p>
+        </w:tc>
+        <w:tc>
+          <w:tcPr>
+            <w:tcW w:w="1804" w:type="dxa"/>
+          </w:tcPr>
+          <w:p>
+            <w:r>
+              <w:t>0.9221</w:t>
+            </w:r>
+          </w:p>
+        </w:tc>
+      </w:tr>
+      <w:tr>
+        <w:tc>
+          <w:tcPr>
+            <w:tcW w:w="1803" w:type="dxa"/>
+          </w:tcPr>
+          <w:p>
+            <w:r>
+              <w:t>XGBoost</w:t>
+            </w:r>
+          </w:p>
+        </w:tc>
+        <w:tc>
+          <w:tcPr>
+            <w:tcW w:w="1803" w:type="dxa"/>
+          </w:tcPr>
+          <w:p>
+            <w:r>
+              <w:t>0.9081</w:t>
+            </w:r>
+          </w:p>
+        </w:tc>
+        <w:tc>
+          <w:tcPr>
+            <w:tcW w:w="1803" w:type="dxa"/>
+          </w:tcPr>
+          <w:p>
+            <w:r>
+              <w:t>0.9646</w:t>
+            </w:r>
+          </w:p>
+        </w:tc>
+        <w:tc>
+          <w:tcPr>
+            <w:tcW w:w="1803" w:type="dxa"/>
+          </w:tcPr>
+          <w:p>
+            <w:r>
+              <w:t>0.8800</w:t>
+            </w:r>
+          </w:p>
+        </w:tc>
+        <w:tc>
+          <w:tcPr>
+            <w:tcW w:w="1804" w:type="dxa"/>
+          </w:tcPr>
+          <w:p>
+            <w:r>
+              <w:t>0.9203</w:t>
+            </w:r>
+          </w:p>
+        </w:tc>
+      </w:tr>
+      <w:tr>
+        <w:tc>
+          <w:tcPr>
+            <w:tcW w:w="1803" w:type="dxa"/>
+          </w:tcPr>
+          <w:p>
+            <w:r>
+              <w:t>KNN</w:t>
+            </w:r>
+          </w:p>
+        </w:tc>
+        <w:tc>
+          <w:tcPr>
+            <w:tcW w:w="1803" w:type="dxa"/>
+          </w:tcPr>
+          <w:p>
+            <w:r>
+              <w:t>0.7855</w:t>
+            </w:r>
+          </w:p>
+        </w:tc>
+        <w:tc>
+          <w:tcPr>
+            <w:tcW w:w="1803" w:type="dxa"/>
+          </w:tcPr>
+          <w:p>
+            <w:r>
+              <w:t>0.9423</w:t>
+            </w:r>
+          </w:p>
+        </w:tc>
+        <w:tc>
+          <w:tcPr>
+            <w:tcW w:w="1803" w:type="dxa"/>
+          </w:tcPr>
+          <w:p>
+            <w:r>
+              <w:t>0.7395</w:t>
+            </w:r>
+          </w:p>
+        </w:tc>
+        <w:tc>
+          <w:tcPr>
+            <w:tcW w:w="1804" w:type="dxa"/>
+          </w:tcPr>
+          <w:p>
+            <w:r>
+              <w:t>0.8287</w:t>
+            </w:r>
+          </w:p>
+        </w:tc>
+      </w:tr>
+      <w:tr>
+        <w:tc>
+          <w:tcPr>
+            <w:tcW w:w="1803" w:type="dxa"/>
+          </w:tcPr>
+          <w:p>
+            <w:r>
+              <w:t>Logistic Regression</w:t>
+            </w:r>
+          </w:p>
+        </w:tc>
+        <w:tc>
+          <w:tcPr>
+            <w:tcW w:w="1803" w:type="dxa"/>
+          </w:tcPr>
+          <w:p>
+            <w:r>
+              <w:t>0.7277</w:t>
+            </w:r>
+          </w:p>
+        </w:tc>
+        <w:tc>
+          <w:tcPr>
+            <w:tcW w:w="1803" w:type="dxa"/>
+          </w:tcPr>
+          <w:p>
+            <w:r>
+              <w:t>0.7556</w:t>
+            </w:r>
+          </w:p>
+        </w:tc>
+        <w:tc>
+          <w:tcPr>
+            <w:tcW w:w="1803" w:type="dxa"/>
+          </w:tcPr>
+          <w:p>
+            <w:r>
+              <w:t>0.7513</w:t>
+            </w:r>
+          </w:p>
+        </w:tc>
+        <w:tc>
+          <w:tcPr>
+            <w:tcW w:w="1804" w:type="dxa"/>
+          </w:tcPr>
+          <w:p>
+            <w:r>
+              <w:t>0.7534</w:t>
+            </w:r>
+          </w:p>
+        </w:tc>
+      </w:tr>
+      <w:tr>
+        <w:tc>
+          <w:tcPr>
+            <w:tcW w:w="1803" w:type="dxa"/>
+          </w:tcPr>
+          <w:p>
+            <w:r>
+              <w:t>Linear SVM</w:t>
+            </w:r>
+          </w:p>
+        </w:tc>
+        <w:tc>
+          <w:tcPr>
+            <w:tcW w:w="1803" w:type="dxa"/>
+          </w:tcPr>
+          <w:p>
+            <w:r>
+              <w:t>0.7184</w:t>
+            </w:r>
+          </w:p>
+        </w:tc>
+        <w:tc>
+          <w:tcPr>
+            <w:tcW w:w="1803" w:type="dxa"/>
+          </w:tcPr>
+          <w:p>
+            <w:r>
+              <w:t>0.8712</w:t>
+            </w:r>
+          </w:p>
+        </w:tc>
+        <w:tc>
+          <w:tcPr>
+            <w:tcW w:w="1803" w:type="dxa"/>
+          </w:tcPr>
+          <w:p>
+            <w:r>
+              <w:t>0.6948</w:t>
+            </w:r>
+          </w:p>
+        </w:tc>
+        <w:tc>
+          <w:tcPr>
+            <w:tcW w:w="1804" w:type="dxa"/>
+          </w:tcPr>
+          <w:p>
+            <w:r>
+              <w:t>0.7731</w:t>
+            </w:r>
+          </w:p>
+        </w:tc>
+      </w:tr>
+    </w:tbl>
+    <w:p/>
+    <w:p>
+      <w:pPr>
+        <w:keepNext/>
+      </w:pPr>
+      <w:r>
+        <w:drawing>
+          <wp:inline distT="0" distB="0" distL="0" distR="0" wp14:anchorId="09A3F89D" wp14:editId="27B380B1">
+            <wp:extent cx="5731510" cy="2898140"/>
+            <wp:effectExtent l="0" t="0" r="2540" b="0"/>
+            <wp:docPr id="1636166694" name="Picture 1"/>
+            <wp:cNvGraphicFramePr>
+              <a:graphicFrameLocks xmlns:a="http://schemas.openxmlformats.org/drawingml/2006/main" noChangeAspect="1"/>
+            </wp:cNvGraphicFramePr>
+            <a:graphic xmlns:a="http://schemas.openxmlformats.org/drawingml/2006/main">
+              <a:graphicData uri="http://schemas.openxmlformats.org/drawingml/2006/picture">
+                <pic:pic xmlns:pic="http://schemas.openxmlformats.org/drawingml/2006/picture">
+                  <pic:nvPicPr>
+                    <pic:cNvPr id="1636166694" name=""/>
+                    <pic:cNvPicPr/>
+                  </pic:nvPicPr>
+                  <pic:blipFill>
+                    <a:blip r:embed="rId11"/>
+                    <a:stretch>
+                      <a:fillRect/>
+                    </a:stretch>
+                  </pic:blipFill>
+                  <pic:spPr>
+                    <a:xfrm>
+                      <a:off x="0" y="0"/>
+                      <a:ext cx="5731510" cy="2898140"/>
+                    </a:xfrm>
+                    <a:prstGeom prst="rect">
+                      <a:avLst/>
+                    </a:prstGeom>
+                  </pic:spPr>
+                </pic:pic>
+              </a:graphicData>
+            </a:graphic>
+          </wp:inline>
+        </w:drawing>
+      </w:r>
+    </w:p>
+    <w:p>
+      <w:pPr>
+        <w:pStyle w:val="Caption"/>
+      </w:pPr>
+      <w:r>
+        <w:t xml:space="preserve">Figure </w:t>
+      </w:r>
+      <w:fldSimple w:instr=" SEQ Figure \* ARABIC ">
+        <w:r>
+          <w:rPr>
+            <w:noProof/>
+          </w:rPr>
+          <w:t>5</w:t>
+        </w:r>
+      </w:fldSimple>
+      <w:r>
+        <w:t>: Results code and Results from predictions against testing split</w:t>
+      </w:r>
+    </w:p>
+    <w:p/>
+    <w:p>
       <w:pPr>
         <w:pStyle w:val="Heading2"/>
       </w:pPr>
       <w:bookmarkStart w:id="26" w:name="_Toc225684982"/>
       <w:r>
+        <w:lastRenderedPageBreak/>
         <w:t>Model Evaluation</w:t>
       </w:r>
       <w:bookmarkEnd w:id="26"/>
     </w:p>
+    <w:p/>
     <w:p>
       <w:pPr>
         <w:pStyle w:val="Heading2"/>
@@ -5720,7 +6421,7 @@
       <w:r>
         <w:t xml:space="preserve">. Available at </w:t>
       </w:r>
-      <w:hyperlink r:id="rId7" w:history="1">
+      <w:hyperlink r:id="rId12" w:history="1">
         <w:r>
           <w:rPr>
             <w:rStyle w:val="Hyperlink"/>
@@ -5743,7 +6444,7 @@
       <w:r>
         <w:t xml:space="preserve"> </w:t>
       </w:r>
-      <w:hyperlink r:id="rId8" w:history="1">
+      <w:hyperlink r:id="rId13" w:history="1">
         <w:r>
           <w:rPr>
             <w:rStyle w:val="Hyperlink"/>
@@ -7245,6 +7946,25 @@
       <w:szCs w:val="18"/>
     </w:rPr>
   </w:style>
+  <w:style w:type="table" w:styleId="TableGrid">
+    <w:name w:val="Table Grid"/>
+    <w:basedOn w:val="TableNormal"/>
+    <w:uiPriority w:val="39"/>
+    <w:rsid w:val="009514FE"/>
+    <w:pPr>
+      <w:spacing w:after="0" w:line="240" w:lineRule="auto"/>
+    </w:pPr>
+    <w:tblPr>
+      <w:tblBorders>
+        <w:top w:val="single" w:sz="4" w:space="0" w:color="auto"/>
+        <w:left w:val="single" w:sz="4" w:space="0" w:color="auto"/>
+        <w:bottom w:val="single" w:sz="4" w:space="0" w:color="auto"/>
+        <w:right w:val="single" w:sz="4" w:space="0" w:color="auto"/>
+        <w:insideH w:val="single" w:sz="4" w:space="0" w:color="auto"/>
+        <w:insideV w:val="single" w:sz="4" w:space="0" w:color="auto"/>
+      </w:tblBorders>
+    </w:tblPr>
+  </w:style>
 </w:styles>
 </file>
 

</xml_diff>

<commit_message>
Model evaluation, and part of extraction and deployment completed
</commit_message>
<xml_diff>
--- a/COMP 3000.docx
+++ b/COMP 3000.docx
@@ -4253,15 +4253,7 @@
     </w:p>
     <w:p>
       <w:r>
-        <w:t xml:space="preserve">As cybercrime grows ever more profitable and with the incident rate of </w:t>
-      </w:r>
-      <w:proofErr w:type="spellStart"/>
-      <w:r>
-        <w:t>cyber crime</w:t>
-      </w:r>
-      <w:proofErr w:type="spellEnd"/>
-      <w:r>
-        <w:t xml:space="preserve"> rising by 37% over the past five years (Bridewell, 2026), the different attack types and vectors continue to evolve, with attackers modifying previously used techniques or developing new attacks using exploits not commonly known, meaning that the signature-based system can’t be updated to detect these attacks. This creates big problems for signature-based systems as attacks that haven’t yet been seen may bypass the detection systems.</w:t>
+        <w:t>As cybercrime grows ever more profitable and with the incident rate of cyber crime rising by 37% over the past five years (Bridewell, 2026), the different attack types and vectors continue to evolve, with attackers modifying previously used techniques or developing new attacks using exploits not commonly known, meaning that the signature-based system can’t be updated to detect these attacks. This creates big problems for signature-based systems as attacks that haven’t yet been seen may bypass the detection systems.</w:t>
       </w:r>
     </w:p>
     <w:p>
@@ -4647,15 +4639,7 @@
     </w:p>
     <w:p>
       <w:r>
-        <w:t xml:space="preserve">The only ethical consideration for this project that I can think is how the data for training has been obtained, have I gathered it in a shady manner, </w:t>
-      </w:r>
-      <w:proofErr w:type="spellStart"/>
-      <w:r>
-        <w:t>through</w:t>
-      </w:r>
-      <w:proofErr w:type="spellEnd"/>
-      <w:r>
-        <w:t xml:space="preserve"> not being clear on my intentions</w:t>
+        <w:t>The only ethical consideration for this project that I can think is how the data for training has been obtained, have I gathered it in a shady manner, through not being clear on my intentions</w:t>
       </w:r>
       <w:r>
         <w:t xml:space="preserve"> in the gathering of data. No, in this project the data has been ethically sourced through the University of New South Wales as they provide the UNSW NB-15 dataset for free for academic usage which this project falls under.</w:t>
@@ -4671,15 +4655,7 @@
     </w:p>
     <w:p>
       <w:r>
-        <w:t xml:space="preserve">This is doubly so due to its nature as </w:t>
-      </w:r>
-      <w:proofErr w:type="spellStart"/>
-      <w:r>
-        <w:t>a</w:t>
-      </w:r>
-      <w:proofErr w:type="spellEnd"/>
-      <w:r>
-        <w:t xml:space="preserve"> Intrusion Detection system, rather than an Intrusion Prevention System, as by itself, an IDS system can do nothing about the intrusion attempts but alert an analyst or user.</w:t>
+        <w:t>This is doubly so due to its nature as a Intrusion Detection system, rather than an Intrusion Prevention System, as by itself, an IDS system can do nothing about the intrusion attempts but alert an analyst or user.</w:t>
       </w:r>
     </w:p>
     <w:p/>
@@ -4763,15 +4739,7 @@
     </w:p>
     <w:p>
       <w:r>
-        <w:t xml:space="preserve">These examples show that while there are possible alternatives to the agile methodology that </w:t>
-      </w:r>
-      <w:proofErr w:type="spellStart"/>
-      <w:r>
-        <w:t>ive</w:t>
-      </w:r>
-      <w:proofErr w:type="spellEnd"/>
-      <w:r>
-        <w:t xml:space="preserve"> chosen, they don’t fit the project as well as they all produce either a rigidness that would cripple the project if problems </w:t>
+        <w:t xml:space="preserve">These examples show that while there are possible alternatives to the agile methodology that ive chosen, they don’t fit the project as well as they all produce either a rigidness that would cripple the project if problems </w:t>
       </w:r>
       <w:r>
         <w:t>occur or</w:t>
@@ -5318,15 +5286,7 @@
     </w:p>
     <w:p>
       <w:r>
-        <w:t xml:space="preserve">For this project, a range of python libraries were use to implement the features set out in the aims and objectives earlier in the report, in the bullet points below, I will </w:t>
-      </w:r>
-      <w:proofErr w:type="spellStart"/>
-      <w:r>
-        <w:t>layout</w:t>
-      </w:r>
-      <w:proofErr w:type="spellEnd"/>
-      <w:r>
-        <w:t xml:space="preserve"> how and why each library was used.</w:t>
+        <w:t>For this project, a range of python libraries were use to implement the features set out in the aims and objectives earlier in the report, in the bullet points below, I will layout how and why each library was used.</w:t>
       </w:r>
     </w:p>
     <w:p>
@@ -5376,7 +5336,6 @@
           <w:numId w:val="2"/>
         </w:numPr>
       </w:pPr>
-      <w:proofErr w:type="spellStart"/>
       <w:r>
         <w:rPr>
           <w:b/>
@@ -5384,7 +5343,6 @@
         </w:rPr>
         <w:t>JobLib</w:t>
       </w:r>
-      <w:proofErr w:type="spellEnd"/>
       <w:r>
         <w:t>: This was used in order to dump the model and feature columns from python to  a PKL file to allow for usage within other Jupyter notebook files without having to retrain the model, saving a considerable amount of time.</w:t>
       </w:r>
@@ -5397,7 +5355,6 @@
           <w:numId w:val="2"/>
         </w:numPr>
       </w:pPr>
-      <w:proofErr w:type="spellStart"/>
       <w:r>
         <w:rPr>
           <w:b/>
@@ -5405,7 +5362,6 @@
         </w:rPr>
         <w:t>SMTPLib</w:t>
       </w:r>
-      <w:proofErr w:type="spellEnd"/>
       <w:r>
         <w:t>: This was used in order to implement email alerts, allowing the users to be informed if suspicious behaviour has been detected within the traffic log files.</w:t>
       </w:r>
@@ -5461,7 +5417,6 @@
       <w:r>
         <w:t xml:space="preserve">The first steps taken were to import the required dependencies, including Pandas, </w:t>
       </w:r>
-      <w:proofErr w:type="spellStart"/>
       <w:r>
         <w:t>SK</w:t>
       </w:r>
@@ -5469,11 +5424,7 @@
         <w:t>lear</w:t>
       </w:r>
       <w:r>
-        <w:t>n</w:t>
-      </w:r>
-      <w:proofErr w:type="spellEnd"/>
-      <w:r>
-        <w:t xml:space="preserve"> and its numerous modules, NumPy, and XGBoost, then moved to establish the file path to the test and train files of the dataset and loading it into the notebook using pandas.</w:t>
+        <w:t>n and its numerous modules, NumPy, and XGBoost, then moved to establish the file path to the test and train files of the dataset and loading it into the notebook using pandas.</w:t>
       </w:r>
     </w:p>
     <w:p>
@@ -5481,6 +5432,9 @@
         <w:keepNext/>
       </w:pPr>
       <w:r>
+        <w:rPr>
+          <w:noProof/>
+        </w:rPr>
         <w:lastRenderedPageBreak/>
         <w:drawing>
           <wp:inline distT="0" distB="0" distL="0" distR="0" wp14:anchorId="614EB440" wp14:editId="325F4EA4">
@@ -5553,6 +5507,9 @@
         <w:keepNext/>
       </w:pPr>
       <w:r>
+        <w:rPr>
+          <w:noProof/>
+        </w:rPr>
         <w:drawing>
           <wp:inline distT="0" distB="0" distL="0" distR="0" wp14:anchorId="4B84AB9E" wp14:editId="6CAB91BE">
             <wp:extent cx="5731510" cy="1380490"/>
@@ -5636,6 +5593,9 @@
         <w:keepNext/>
       </w:pPr>
       <w:r>
+        <w:rPr>
+          <w:noProof/>
+        </w:rPr>
         <w:drawing>
           <wp:inline distT="0" distB="0" distL="0" distR="0" wp14:anchorId="5C0EC1D9" wp14:editId="7F8A4655">
             <wp:extent cx="5731510" cy="4686300"/>
@@ -5716,6 +5676,9 @@
     </w:p>
     <w:p>
       <w:r>
+        <w:rPr>
+          <w:noProof/>
+        </w:rPr>
         <w:lastRenderedPageBreak/>
         <w:drawing>
           <wp:inline distT="0" distB="0" distL="0" distR="0" wp14:anchorId="19579E01" wp14:editId="30589978">
@@ -5781,7 +5744,19 @@
             <w:tcW w:w="1803" w:type="dxa"/>
           </w:tcPr>
           <w:p>
-            <w:r>
+            <w:pPr>
+              <w:rPr>
+                <w:b/>
+                <w:bCs/>
+                <w:u w:val="single"/>
+              </w:rPr>
+            </w:pPr>
+            <w:r>
+              <w:rPr>
+                <w:b/>
+                <w:bCs/>
+                <w:u w:val="single"/>
+              </w:rPr>
               <w:t>Model</w:t>
             </w:r>
           </w:p>
@@ -5791,7 +5766,19 @@
             <w:tcW w:w="1803" w:type="dxa"/>
           </w:tcPr>
           <w:p>
-            <w:r>
+            <w:pPr>
+              <w:rPr>
+                <w:b/>
+                <w:bCs/>
+                <w:u w:val="single"/>
+              </w:rPr>
+            </w:pPr>
+            <w:r>
+              <w:rPr>
+                <w:b/>
+                <w:bCs/>
+                <w:u w:val="single"/>
+              </w:rPr>
               <w:t>Accuracy</w:t>
             </w:r>
           </w:p>
@@ -5801,7 +5788,19 @@
             <w:tcW w:w="1803" w:type="dxa"/>
           </w:tcPr>
           <w:p>
-            <w:r>
+            <w:pPr>
+              <w:rPr>
+                <w:b/>
+                <w:bCs/>
+                <w:u w:val="single"/>
+              </w:rPr>
+            </w:pPr>
+            <w:r>
+              <w:rPr>
+                <w:b/>
+                <w:bCs/>
+                <w:u w:val="single"/>
+              </w:rPr>
               <w:t>Recall</w:t>
             </w:r>
           </w:p>
@@ -5811,7 +5810,19 @@
             <w:tcW w:w="1803" w:type="dxa"/>
           </w:tcPr>
           <w:p>
-            <w:r>
+            <w:pPr>
+              <w:rPr>
+                <w:b/>
+                <w:bCs/>
+                <w:u w:val="single"/>
+              </w:rPr>
+            </w:pPr>
+            <w:r>
+              <w:rPr>
+                <w:b/>
+                <w:bCs/>
+                <w:u w:val="single"/>
+              </w:rPr>
               <w:t>Precision</w:t>
             </w:r>
           </w:p>
@@ -5821,7 +5832,19 @@
             <w:tcW w:w="1804" w:type="dxa"/>
           </w:tcPr>
           <w:p>
-            <w:r>
+            <w:pPr>
+              <w:rPr>
+                <w:b/>
+                <w:bCs/>
+                <w:u w:val="single"/>
+              </w:rPr>
+            </w:pPr>
+            <w:r>
+              <w:rPr>
+                <w:b/>
+                <w:bCs/>
+                <w:u w:val="single"/>
+              </w:rPr>
               <w:t>F1</w:t>
             </w:r>
           </w:p>
@@ -6094,6 +6117,9 @@
         <w:keepNext/>
       </w:pPr>
       <w:r>
+        <w:rPr>
+          <w:noProof/>
+        </w:rPr>
         <w:drawing>
           <wp:inline distT="0" distB="0" distL="0" distR="0" wp14:anchorId="09A3F89D" wp14:editId="27B380B1">
             <wp:extent cx="5731510" cy="2898140"/>
@@ -6162,7 +6188,27 @@
       </w:r>
       <w:bookmarkEnd w:id="26"/>
     </w:p>
-    <w:p/>
+    <w:p>
+      <w:r>
+        <w:t xml:space="preserve">Following on from the model training, I conducted an evaluation of the models and the results of each to determine which algorithm provided the most optimal performance for use in intrusion detection. </w:t>
+      </w:r>
+    </w:p>
+    <w:p>
+      <w:r>
+        <w:t>This was done by comparing the accuracy, precision, recall, and f1 scores of each model, shown in the table above, these metrics were chosen as they provide a balanced assessment of classification performance that is widely used as standard for model training and evaluation.</w:t>
+      </w:r>
+    </w:p>
+    <w:p>
+      <w:r>
+        <w:t>The random forest model was chosen due to its high scores across all metric showing strong detection capabilities</w:t>
+      </w:r>
+      <w:r>
+        <w:t xml:space="preserve"> while maintaining a proper balance between false positives and false negatives in its predictions</w:t>
+      </w:r>
+      <w:r>
+        <w:t>.</w:t>
+      </w:r>
+    </w:p>
     <w:p>
       <w:pPr>
         <w:pStyle w:val="Heading2"/>
@@ -6172,6 +6218,56 @@
         <w:t>Model Extraction and Deployment</w:t>
       </w:r>
       <w:bookmarkEnd w:id="27"/>
+    </w:p>
+    <w:p>
+      <w:r>
+        <w:t xml:space="preserve">With the optimal model identified, I moved to a separate jupyter notebook file to train only the Random Forest model with same parameters that were used for the first round of training. </w:t>
+      </w:r>
+    </w:p>
+    <w:p>
+      <w:r>
+        <w:t>To</w:t>
+      </w:r>
+      <w:r>
+        <w:t xml:space="preserve"> </w:t>
+      </w:r>
+      <w:r>
+        <w:t xml:space="preserve">ensure the model trains to the same precision as it showed during first round of training the same steps of preprocessing were used, including dropping the columns to reduce the risk of feature leak to prevent the model from cheating, to ensure fairness all of the data was encoded in the same datatype as it was previously. </w:t>
+      </w:r>
+    </w:p>
+    <w:p>
+      <w:r>
+        <w:t xml:space="preserve">For use in the next step of implementation, I saved the feature columns to a list to be saved and extracted with the model. As detailed previously, the model was trained again using the same parameters, then making use of the </w:t>
+      </w:r>
+      <w:r>
+        <w:t xml:space="preserve">JobLib </w:t>
+      </w:r>
+      <w:r>
+        <w:t>library, the model and feature columns were dumped into two separate PKL files and saved to my PC</w:t>
+      </w:r>
+      <w:r>
+        <w:t>.</w:t>
+      </w:r>
+      <w:r>
+        <w:t xml:space="preserve"> </w:t>
+      </w:r>
+    </w:p>
+    <w:p>
+      <w:r>
+        <w:t>T</w:t>
+      </w:r>
+      <w:r>
+        <w:t>he reason</w:t>
+      </w:r>
+      <w:r>
+        <w:t>ing</w:t>
+      </w:r>
+      <w:r>
+        <w:t xml:space="preserve"> behind doing this extra step is that it allows me to reuse the models for predictions in other notebooks, without the need for retraining</w:t>
+      </w:r>
+      <w:r>
+        <w:t>, significantly reducing the computation processing overhead and allows for faster predictions during operation.</w:t>
+      </w:r>
     </w:p>
     <w:p>
       <w:pPr>

</xml_diff>

<commit_message>
Finished work on Model Extraction and deployment, NIDS output system, and Email alert system sections of the report
</commit_message>
<xml_diff>
--- a/COMP 3000.docx
+++ b/COMP 3000.docx
@@ -4253,7 +4253,15 @@
     </w:p>
     <w:p>
       <w:r>
-        <w:t>As cybercrime grows ever more profitable and with the incident rate of cyber crime rising by 37% over the past five years (Bridewell, 2026), the different attack types and vectors continue to evolve, with attackers modifying previously used techniques or developing new attacks using exploits not commonly known, meaning that the signature-based system can’t be updated to detect these attacks. This creates big problems for signature-based systems as attacks that haven’t yet been seen may bypass the detection systems.</w:t>
+        <w:t xml:space="preserve">As cybercrime grows ever more profitable and with the incident rate of </w:t>
+      </w:r>
+      <w:proofErr w:type="spellStart"/>
+      <w:r>
+        <w:t>cyber crime</w:t>
+      </w:r>
+      <w:proofErr w:type="spellEnd"/>
+      <w:r>
+        <w:t xml:space="preserve"> rising by 37% over the past five years (Bridewell, 2026), the different attack types and vectors continue to evolve, with attackers modifying previously used techniques or developing new attacks using exploits not commonly known, meaning that the signature-based system can’t be updated to detect these attacks. This creates big problems for signature-based systems as attacks that haven’t yet been seen may bypass the detection systems.</w:t>
       </w:r>
     </w:p>
     <w:p>
@@ -4639,7 +4647,15 @@
     </w:p>
     <w:p>
       <w:r>
-        <w:t>The only ethical consideration for this project that I can think is how the data for training has been obtained, have I gathered it in a shady manner, through not being clear on my intentions</w:t>
+        <w:t xml:space="preserve">The only ethical consideration for this project that I can think is how the data for training has been obtained, have I gathered it in a shady manner, </w:t>
+      </w:r>
+      <w:proofErr w:type="spellStart"/>
+      <w:r>
+        <w:t>through</w:t>
+      </w:r>
+      <w:proofErr w:type="spellEnd"/>
+      <w:r>
+        <w:t xml:space="preserve"> not being clear on my intentions</w:t>
       </w:r>
       <w:r>
         <w:t xml:space="preserve"> in the gathering of data. No, in this project the data has been ethically sourced through the University of New South Wales as they provide the UNSW NB-15 dataset for free for academic usage which this project falls under.</w:t>
@@ -4655,7 +4671,15 @@
     </w:p>
     <w:p>
       <w:r>
-        <w:t>This is doubly so due to its nature as a Intrusion Detection system, rather than an Intrusion Prevention System, as by itself, an IDS system can do nothing about the intrusion attempts but alert an analyst or user.</w:t>
+        <w:t xml:space="preserve">This is doubly so due to its nature as </w:t>
+      </w:r>
+      <w:proofErr w:type="spellStart"/>
+      <w:r>
+        <w:t>a</w:t>
+      </w:r>
+      <w:proofErr w:type="spellEnd"/>
+      <w:r>
+        <w:t xml:space="preserve"> Intrusion Detection system, rather than an Intrusion Prevention System, as by itself, an IDS system can do nothing about the intrusion attempts but alert an analyst or user.</w:t>
       </w:r>
     </w:p>
     <w:p/>
@@ -4739,7 +4763,15 @@
     </w:p>
     <w:p>
       <w:r>
-        <w:t xml:space="preserve">These examples show that while there are possible alternatives to the agile methodology that ive chosen, they don’t fit the project as well as they all produce either a rigidness that would cripple the project if problems </w:t>
+        <w:t xml:space="preserve">These examples show that while there are possible alternatives to the agile methodology that </w:t>
+      </w:r>
+      <w:proofErr w:type="spellStart"/>
+      <w:r>
+        <w:t>ive</w:t>
+      </w:r>
+      <w:proofErr w:type="spellEnd"/>
+      <w:r>
+        <w:t xml:space="preserve"> chosen, they don’t fit the project as well as they all produce either a rigidness that would cripple the project if problems </w:t>
       </w:r>
       <w:r>
         <w:t>occur or</w:t>
@@ -5286,7 +5318,15 @@
     </w:p>
     <w:p>
       <w:r>
-        <w:t>For this project, a range of python libraries were use to implement the features set out in the aims and objectives earlier in the report, in the bullet points below, I will layout how and why each library was used.</w:t>
+        <w:t xml:space="preserve">For this project, a range of python libraries were use to implement the features set out in the aims and objectives earlier in the report, in the bullet points below, I will </w:t>
+      </w:r>
+      <w:proofErr w:type="spellStart"/>
+      <w:r>
+        <w:t>layout</w:t>
+      </w:r>
+      <w:proofErr w:type="spellEnd"/>
+      <w:r>
+        <w:t xml:space="preserve"> how and why each library was used.</w:t>
       </w:r>
     </w:p>
     <w:p>
@@ -5336,6 +5376,7 @@
           <w:numId w:val="2"/>
         </w:numPr>
       </w:pPr>
+      <w:proofErr w:type="spellStart"/>
       <w:r>
         <w:rPr>
           <w:b/>
@@ -5343,6 +5384,7 @@
         </w:rPr>
         <w:t>JobLib</w:t>
       </w:r>
+      <w:proofErr w:type="spellEnd"/>
       <w:r>
         <w:t>: This was used in order to dump the model and feature columns from python to  a PKL file to allow for usage within other Jupyter notebook files without having to retrain the model, saving a considerable amount of time.</w:t>
       </w:r>
@@ -5355,6 +5397,7 @@
           <w:numId w:val="2"/>
         </w:numPr>
       </w:pPr>
+      <w:proofErr w:type="spellStart"/>
       <w:r>
         <w:rPr>
           <w:b/>
@@ -5362,6 +5405,7 @@
         </w:rPr>
         <w:t>SMTPLib</w:t>
       </w:r>
+      <w:proofErr w:type="spellEnd"/>
       <w:r>
         <w:t>: This was used in order to implement email alerts, allowing the users to be informed if suspicious behaviour has been detected within the traffic log files.</w:t>
       </w:r>
@@ -5417,6 +5461,7 @@
       <w:r>
         <w:t xml:space="preserve">The first steps taken were to import the required dependencies, including Pandas, </w:t>
       </w:r>
+      <w:proofErr w:type="spellStart"/>
       <w:r>
         <w:t>SK</w:t>
       </w:r>
@@ -5424,7 +5469,11 @@
         <w:t>lear</w:t>
       </w:r>
       <w:r>
-        <w:t>n and its numerous modules, NumPy, and XGBoost, then moved to establish the file path to the test and train files of the dataset and loading it into the notebook using pandas.</w:t>
+        <w:t>n</w:t>
+      </w:r>
+      <w:proofErr w:type="spellEnd"/>
+      <w:r>
+        <w:t xml:space="preserve"> and its numerous modules, NumPy, and XGBoost, then moved to establish the file path to the test and train files of the dataset and loading it into the notebook using pandas.</w:t>
       </w:r>
     </w:p>
     <w:p>
@@ -6221,7 +6270,15 @@
     </w:p>
     <w:p>
       <w:r>
-        <w:t xml:space="preserve">With the optimal model identified, I moved to a separate jupyter notebook file to train only the Random Forest model with same parameters that were used for the first round of training. </w:t>
+        <w:t xml:space="preserve">With the optimal model identified, I moved to a separate </w:t>
+      </w:r>
+      <w:proofErr w:type="spellStart"/>
+      <w:r>
+        <w:t>jupyter</w:t>
+      </w:r>
+      <w:proofErr w:type="spellEnd"/>
+      <w:r>
+        <w:t xml:space="preserve"> notebook file to train only the Random Forest model with same parameters that were used for the first round of training. </w:t>
       </w:r>
     </w:p>
     <w:p>
@@ -6239,8 +6296,13 @@
       <w:r>
         <w:t xml:space="preserve">For use in the next step of implementation, I saved the feature columns to a list to be saved and extracted with the model. As detailed previously, the model was trained again using the same parameters, then making use of the </w:t>
       </w:r>
-      <w:r>
-        <w:t xml:space="preserve">JobLib </w:t>
+      <w:proofErr w:type="spellStart"/>
+      <w:r>
+        <w:t>JobLib</w:t>
+      </w:r>
+      <w:proofErr w:type="spellEnd"/>
+      <w:r>
+        <w:t xml:space="preserve"> </w:t>
       </w:r>
       <w:r>
         <w:t>library, the model and feature columns were dumped into two separate PKL files and saved to my PC</w:t>
@@ -6254,6 +6316,63 @@
     </w:p>
     <w:p>
       <w:r>
+        <w:drawing>
+          <wp:anchor distT="0" distB="0" distL="114300" distR="114300" simplePos="0" relativeHeight="251658240" behindDoc="0" locked="0" layoutInCell="1" allowOverlap="1" wp14:anchorId="4AEEB6DD" wp14:editId="069CE43F">
+            <wp:simplePos x="0" y="0"/>
+            <wp:positionH relativeFrom="column">
+              <wp:posOffset>-495935</wp:posOffset>
+            </wp:positionH>
+            <wp:positionV relativeFrom="paragraph">
+              <wp:posOffset>651510</wp:posOffset>
+            </wp:positionV>
+            <wp:extent cx="6654601" cy="2430780"/>
+            <wp:effectExtent l="0" t="0" r="0" b="7620"/>
+            <wp:wrapTopAndBottom/>
+            <wp:docPr id="359277602" name="Picture 1"/>
+            <wp:cNvGraphicFramePr>
+              <a:graphicFrameLocks xmlns:a="http://schemas.openxmlformats.org/drawingml/2006/main" noChangeAspect="1"/>
+            </wp:cNvGraphicFramePr>
+            <a:graphic xmlns:a="http://schemas.openxmlformats.org/drawingml/2006/main">
+              <a:graphicData uri="http://schemas.openxmlformats.org/drawingml/2006/picture">
+                <pic:pic xmlns:pic="http://schemas.openxmlformats.org/drawingml/2006/picture">
+                  <pic:nvPicPr>
+                    <pic:cNvPr id="359277602" name=""/>
+                    <pic:cNvPicPr/>
+                  </pic:nvPicPr>
+                  <pic:blipFill>
+                    <a:blip r:embed="rId12">
+                      <a:extLst>
+                        <a:ext uri="{28A0092B-C50C-407E-A947-70E740481C1C}">
+                          <a14:useLocalDpi xmlns:a14="http://schemas.microsoft.com/office/drawing/2010/main" val="0"/>
+                        </a:ext>
+                      </a:extLst>
+                    </a:blip>
+                    <a:stretch>
+                      <a:fillRect/>
+                    </a:stretch>
+                  </pic:blipFill>
+                  <pic:spPr>
+                    <a:xfrm>
+                      <a:off x="0" y="0"/>
+                      <a:ext cx="6654601" cy="2430780"/>
+                    </a:xfrm>
+                    <a:prstGeom prst="rect">
+                      <a:avLst/>
+                    </a:prstGeom>
+                  </pic:spPr>
+                </pic:pic>
+              </a:graphicData>
+            </a:graphic>
+            <wp14:sizeRelH relativeFrom="page">
+              <wp14:pctWidth>0</wp14:pctWidth>
+            </wp14:sizeRelH>
+            <wp14:sizeRelV relativeFrom="page">
+              <wp14:pctHeight>0</wp14:pctHeight>
+            </wp14:sizeRelV>
+          </wp:anchor>
+        </w:drawing>
+      </w:r>
+      <w:r>
         <w:t>T</w:t>
       </w:r>
       <w:r>
@@ -6269,6 +6388,49 @@
         <w:t>, significantly reducing the computation processing overhead and allows for faster predictions during operation.</w:t>
       </w:r>
     </w:p>
+    <w:p/>
+    <w:p>
+      <w:r>
+        <w:t xml:space="preserve">With the model and feature schema saved to a </w:t>
+      </w:r>
+      <w:proofErr w:type="spellStart"/>
+      <w:r>
+        <w:t>pkl</w:t>
+      </w:r>
+      <w:proofErr w:type="spellEnd"/>
+      <w:r>
+        <w:t xml:space="preserve"> file, the implementation of an output system for the NIDS could begin. To start, I made a new Jupyter notebook file, my reasoning for splitting the code for this project into three different files is that it makes the code easier to process mentally since all the code is in documents that describe what its purpose is clearly, it also </w:t>
+      </w:r>
+      <w:r>
+        <w:lastRenderedPageBreak/>
+        <w:t>reduces the computational overhead if the python kernel that it is running on needs to be reset for what ever reason, which would require me to run all cells of the notebook again, taking both time and computational resources.</w:t>
+      </w:r>
+    </w:p>
+    <w:p>
+      <w:r>
+        <w:t>As it is a new notebook file, the model needed to be loaded, as it had been saved, I loaded the PKL file of the Random Forest model trained in the previous notebook, after loading the feature schema also saved previously, I moved to pre-process the data</w:t>
+      </w:r>
+      <w:r>
+        <w:t xml:space="preserve"> using the same methods used previously</w:t>
+      </w:r>
+      <w:r>
+        <w:t xml:space="preserve">, with the added step of feature alignment to ensure that the model does not throw errors since the test split is missing some columns from train split. </w:t>
+      </w:r>
+    </w:p>
+    <w:p>
+      <w:r>
+        <w:t>With data pre-processed, the model can make predictions against data which is saved to be used by the output system and the email alert system that will be covered in the next two sections.</w:t>
+      </w:r>
+    </w:p>
+    <w:p>
+      <w:r>
+        <w:t>*Put image of Feature Alignment Code here*</w:t>
+      </w:r>
+    </w:p>
+    <w:p/>
+    <w:p/>
+    <w:p/>
+    <w:p/>
     <w:p>
       <w:pPr>
         <w:pStyle w:val="Heading2"/>
@@ -6280,6 +6442,148 @@
       <w:bookmarkEnd w:id="28"/>
     </w:p>
     <w:p>
+      <w:r>
+        <w:t>The predictions ran by the model mark the rows of network traffic with a risk score between zero and one, this is the back bone of both the alert system and output system, this is because the results are filtered based on a threshold that can be adjusted manually to any number between zero and one. This dictates how strict the results are filtered, the threshold level I used during testing was 0.9, this means that any rows of data that were ranked below 0.9 risk score aren’t included in output.</w:t>
+      </w:r>
+    </w:p>
+    <w:p>
+      <w:r>
+        <w:t>In order to establish context for output, during pre-processing, I preserved certain columns that would provide the most insight during output. The columns saved and the code used to do so can be seen below.</w:t>
+      </w:r>
+    </w:p>
+    <w:p>
+      <w:pPr>
+        <w:keepNext/>
+      </w:pPr>
+      <w:r>
+        <w:drawing>
+          <wp:inline distT="0" distB="0" distL="0" distR="0" wp14:anchorId="52366F44" wp14:editId="40200438">
+            <wp:extent cx="5731510" cy="610870"/>
+            <wp:effectExtent l="0" t="0" r="2540" b="0"/>
+            <wp:docPr id="1307608013" name="Picture 1"/>
+            <wp:cNvGraphicFramePr>
+              <a:graphicFrameLocks xmlns:a="http://schemas.openxmlformats.org/drawingml/2006/main" noChangeAspect="1"/>
+            </wp:cNvGraphicFramePr>
+            <a:graphic xmlns:a="http://schemas.openxmlformats.org/drawingml/2006/main">
+              <a:graphicData uri="http://schemas.openxmlformats.org/drawingml/2006/picture">
+                <pic:pic xmlns:pic="http://schemas.openxmlformats.org/drawingml/2006/picture">
+                  <pic:nvPicPr>
+                    <pic:cNvPr id="1307608013" name=""/>
+                    <pic:cNvPicPr/>
+                  </pic:nvPicPr>
+                  <pic:blipFill>
+                    <a:blip r:embed="rId13"/>
+                    <a:stretch>
+                      <a:fillRect/>
+                    </a:stretch>
+                  </pic:blipFill>
+                  <pic:spPr>
+                    <a:xfrm>
+                      <a:off x="0" y="0"/>
+                      <a:ext cx="5731510" cy="610870"/>
+                    </a:xfrm>
+                    <a:prstGeom prst="rect">
+                      <a:avLst/>
+                    </a:prstGeom>
+                  </pic:spPr>
+                </pic:pic>
+              </a:graphicData>
+            </a:graphic>
+          </wp:inline>
+        </w:drawing>
+      </w:r>
+    </w:p>
+    <w:p>
+      <w:pPr>
+        <w:pStyle w:val="Caption"/>
+      </w:pPr>
+      <w:r>
+        <w:t xml:space="preserve">Figure </w:t>
+      </w:r>
+      <w:fldSimple w:instr=" SEQ Figure \* ARABIC ">
+        <w:r>
+          <w:rPr>
+            <w:noProof/>
+          </w:rPr>
+          <w:t>6</w:t>
+        </w:r>
+      </w:fldSimple>
+      <w:r>
+        <w:t>: Columns preserved for context for output.</w:t>
+      </w:r>
+    </w:p>
+    <w:p>
+      <w:r>
+        <w:t>The output system functions by having the model predict the probability of traffic being mal</w:t>
+      </w:r>
+      <w:r>
+        <w:t>icious based on its training, and saving these results to the variable “probs” the comparing the resulting probabilities to the threshold, in this case 0.9, then taking the results that are over the threshold and outputting the score along with the columns that were preserved for context to a txt file.</w:t>
+      </w:r>
+    </w:p>
+    <w:p>
+      <w:pPr>
+        <w:keepNext/>
+      </w:pPr>
+      <w:r>
+        <w:lastRenderedPageBreak/>
+        <w:drawing>
+          <wp:inline distT="0" distB="0" distL="0" distR="0" wp14:anchorId="3821A277" wp14:editId="389400DA">
+            <wp:extent cx="5731510" cy="3009900"/>
+            <wp:effectExtent l="0" t="0" r="2540" b="0"/>
+            <wp:docPr id="2060953752" name="Picture 1"/>
+            <wp:cNvGraphicFramePr>
+              <a:graphicFrameLocks xmlns:a="http://schemas.openxmlformats.org/drawingml/2006/main" noChangeAspect="1"/>
+            </wp:cNvGraphicFramePr>
+            <a:graphic xmlns:a="http://schemas.openxmlformats.org/drawingml/2006/main">
+              <a:graphicData uri="http://schemas.openxmlformats.org/drawingml/2006/picture">
+                <pic:pic xmlns:pic="http://schemas.openxmlformats.org/drawingml/2006/picture">
+                  <pic:nvPicPr>
+                    <pic:cNvPr id="2060953752" name=""/>
+                    <pic:cNvPicPr/>
+                  </pic:nvPicPr>
+                  <pic:blipFill>
+                    <a:blip r:embed="rId14"/>
+                    <a:stretch>
+                      <a:fillRect/>
+                    </a:stretch>
+                  </pic:blipFill>
+                  <pic:spPr>
+                    <a:xfrm>
+                      <a:off x="0" y="0"/>
+                      <a:ext cx="5731510" cy="3009900"/>
+                    </a:xfrm>
+                    <a:prstGeom prst="rect">
+                      <a:avLst/>
+                    </a:prstGeom>
+                  </pic:spPr>
+                </pic:pic>
+              </a:graphicData>
+            </a:graphic>
+          </wp:inline>
+        </w:drawing>
+      </w:r>
+    </w:p>
+    <w:p>
+      <w:pPr>
+        <w:pStyle w:val="Caption"/>
+      </w:pPr>
+      <w:r>
+        <w:t xml:space="preserve">Figure </w:t>
+      </w:r>
+      <w:fldSimple w:instr=" SEQ Figure \* ARABIC ">
+        <w:r>
+          <w:rPr>
+            <w:noProof/>
+          </w:rPr>
+          <w:t>7</w:t>
+        </w:r>
+      </w:fldSimple>
+      <w:r>
+        <w:t>: Code for outputting suspicious code to a .TXT file.</w:t>
+      </w:r>
+    </w:p>
+    <w:p/>
+    <w:p>
       <w:pPr>
         <w:pStyle w:val="Heading2"/>
       </w:pPr>
@@ -6288,6 +6592,269 @@
         <w:t>Email Alert System</w:t>
       </w:r>
       <w:bookmarkEnd w:id="29"/>
+    </w:p>
+    <w:p>
+      <w:r>
+        <w:t xml:space="preserve">The email alert system makes use of the same backbone that the TXT output system makes use of, namely the risk score, but instead </w:t>
+      </w:r>
+      <w:r>
+        <w:t xml:space="preserve">of outputting through text, this system makes use of the </w:t>
+      </w:r>
+      <w:proofErr w:type="spellStart"/>
+      <w:r>
+        <w:t>SMTPLib</w:t>
+      </w:r>
+      <w:proofErr w:type="spellEnd"/>
+      <w:r>
+        <w:t xml:space="preserve"> library to function and googles smtp server to actually send the email.</w:t>
+      </w:r>
+    </w:p>
+    <w:p>
+      <w:r>
+        <w:t>In order to implement this, I had to make an email address for the system and setup and app password to allow the code to send emails automatically when the code is run</w:t>
+      </w:r>
+      <w:r>
+        <w:t xml:space="preserve">. </w:t>
+      </w:r>
+    </w:p>
+    <w:p>
+      <w:r>
+        <w:t>After setting the credentials to be used by the system, the next step was to implement the function that would actually gather the results, compose the email, and send the alert. This started by setting up the basic email content, its subject, it’s “To”, and its “From”, with the “To” set as my personal email for the purposes of testing the prototype</w:t>
+      </w:r>
+    </w:p>
+    <w:p>
+      <w:pPr>
+        <w:keepNext/>
+      </w:pPr>
+      <w:r>
+        <w:drawing>
+          <wp:inline distT="0" distB="0" distL="0" distR="0" wp14:anchorId="3BB4C69F" wp14:editId="66FEFBF9">
+            <wp:extent cx="5731510" cy="2087880"/>
+            <wp:effectExtent l="0" t="0" r="2540" b="7620"/>
+            <wp:docPr id="820281929" name="Picture 1"/>
+            <wp:cNvGraphicFramePr>
+              <a:graphicFrameLocks xmlns:a="http://schemas.openxmlformats.org/drawingml/2006/main" noChangeAspect="1"/>
+            </wp:cNvGraphicFramePr>
+            <a:graphic xmlns:a="http://schemas.openxmlformats.org/drawingml/2006/main">
+              <a:graphicData uri="http://schemas.openxmlformats.org/drawingml/2006/picture">
+                <pic:pic xmlns:pic="http://schemas.openxmlformats.org/drawingml/2006/picture">
+                  <pic:nvPicPr>
+                    <pic:cNvPr id="820281929" name=""/>
+                    <pic:cNvPicPr/>
+                  </pic:nvPicPr>
+                  <pic:blipFill>
+                    <a:blip r:embed="rId15"/>
+                    <a:stretch>
+                      <a:fillRect/>
+                    </a:stretch>
+                  </pic:blipFill>
+                  <pic:spPr>
+                    <a:xfrm>
+                      <a:off x="0" y="0"/>
+                      <a:ext cx="5731510" cy="2087880"/>
+                    </a:xfrm>
+                    <a:prstGeom prst="rect">
+                      <a:avLst/>
+                    </a:prstGeom>
+                  </pic:spPr>
+                </pic:pic>
+              </a:graphicData>
+            </a:graphic>
+          </wp:inline>
+        </w:drawing>
+      </w:r>
+    </w:p>
+    <w:p>
+      <w:pPr>
+        <w:pStyle w:val="Caption"/>
+      </w:pPr>
+      <w:r>
+        <w:t xml:space="preserve">Figure </w:t>
+      </w:r>
+      <w:fldSimple w:instr=" SEQ Figure \* ARABIC ">
+        <w:r>
+          <w:rPr>
+            <w:noProof/>
+          </w:rPr>
+          <w:t>8</w:t>
+        </w:r>
+      </w:fldSimple>
+      <w:r>
+        <w:t>: Code to configure credentials and basic contents [Password hidden for security purposes]</w:t>
+      </w:r>
+    </w:p>
+    <w:p>
+      <w:r>
+        <w:t xml:space="preserve">After this was to implement the proper body of the email, this started by establishing an alert summary variable that would display a few rows of the data in the email , to show the analyst an </w:t>
+      </w:r>
+      <w:r>
+        <w:lastRenderedPageBreak/>
+        <w:t xml:space="preserve">example of the scores the data has achieved to inspire urgent action. This was done as the test data set contains no </w:t>
+      </w:r>
+      <w:proofErr w:type="spellStart"/>
+      <w:r>
+        <w:t>ip</w:t>
+      </w:r>
+      <w:proofErr w:type="spellEnd"/>
+      <w:r>
+        <w:t xml:space="preserve"> addresses limiting the sensitivity of the information of the dataset while this can be helpful in this setting, it is a definite limitation of the dataset. </w:t>
+      </w:r>
+    </w:p>
+    <w:p>
+      <w:r>
+        <w:t>After the variable has been set properly, the full body can be defined, due to the nature of this system as a prototype, I have kept the body simple and text based, a future improvement if the development of project were to continue would be to overhaul the design of the email to look more professional, below you can see a code snapshot showing the contents of the body.</w:t>
+      </w:r>
+    </w:p>
+    <w:p>
+      <w:pPr>
+        <w:keepNext/>
+      </w:pPr>
+      <w:r>
+        <w:drawing>
+          <wp:inline distT="0" distB="0" distL="0" distR="0" wp14:anchorId="28C18755" wp14:editId="25567CD8">
+            <wp:extent cx="5731510" cy="2165985"/>
+            <wp:effectExtent l="0" t="0" r="2540" b="5715"/>
+            <wp:docPr id="1185560709" name="Picture 1"/>
+            <wp:cNvGraphicFramePr>
+              <a:graphicFrameLocks xmlns:a="http://schemas.openxmlformats.org/drawingml/2006/main" noChangeAspect="1"/>
+            </wp:cNvGraphicFramePr>
+            <a:graphic xmlns:a="http://schemas.openxmlformats.org/drawingml/2006/main">
+              <a:graphicData uri="http://schemas.openxmlformats.org/drawingml/2006/picture">
+                <pic:pic xmlns:pic="http://schemas.openxmlformats.org/drawingml/2006/picture">
+                  <pic:nvPicPr>
+                    <pic:cNvPr id="1185560709" name=""/>
+                    <pic:cNvPicPr/>
+                  </pic:nvPicPr>
+                  <pic:blipFill>
+                    <a:blip r:embed="rId16"/>
+                    <a:stretch>
+                      <a:fillRect/>
+                    </a:stretch>
+                  </pic:blipFill>
+                  <pic:spPr>
+                    <a:xfrm>
+                      <a:off x="0" y="0"/>
+                      <a:ext cx="5731510" cy="2165985"/>
+                    </a:xfrm>
+                    <a:prstGeom prst="rect">
+                      <a:avLst/>
+                    </a:prstGeom>
+                  </pic:spPr>
+                </pic:pic>
+              </a:graphicData>
+            </a:graphic>
+          </wp:inline>
+        </w:drawing>
+      </w:r>
+    </w:p>
+    <w:p>
+      <w:pPr>
+        <w:pStyle w:val="Caption"/>
+      </w:pPr>
+      <w:r>
+        <w:t xml:space="preserve">Figure </w:t>
+      </w:r>
+      <w:fldSimple w:instr=" SEQ Figure \* ARABIC ">
+        <w:r>
+          <w:rPr>
+            <w:noProof/>
+          </w:rPr>
+          <w:t>9</w:t>
+        </w:r>
+      </w:fldSimple>
+      <w:r>
+        <w:t>: Content of Email body code.</w:t>
+      </w:r>
+    </w:p>
+    <w:p>
+      <w:r>
+        <w:t xml:space="preserve">With the body now set, the next step of implementation is to add the code needed to send the email, this was achieved using the </w:t>
+      </w:r>
+      <w:proofErr w:type="spellStart"/>
+      <w:r>
+        <w:t>SMTPlib</w:t>
+      </w:r>
+      <w:proofErr w:type="spellEnd"/>
+      <w:r>
+        <w:t xml:space="preserve"> library and its SMTP_SSL feature, making use of googles SMTP server. Below is the code that was used to achieve this.</w:t>
+      </w:r>
+    </w:p>
+    <w:p>
+      <w:pPr>
+        <w:keepNext/>
+      </w:pPr>
+      <w:r>
+        <w:drawing>
+          <wp:inline distT="0" distB="0" distL="0" distR="0" wp14:anchorId="1C260E0C" wp14:editId="6FF31A54">
+            <wp:extent cx="5731510" cy="1904365"/>
+            <wp:effectExtent l="0" t="0" r="2540" b="635"/>
+            <wp:docPr id="191519242" name="Picture 1"/>
+            <wp:cNvGraphicFramePr>
+              <a:graphicFrameLocks xmlns:a="http://schemas.openxmlformats.org/drawingml/2006/main" noChangeAspect="1"/>
+            </wp:cNvGraphicFramePr>
+            <a:graphic xmlns:a="http://schemas.openxmlformats.org/drawingml/2006/main">
+              <a:graphicData uri="http://schemas.openxmlformats.org/drawingml/2006/picture">
+                <pic:pic xmlns:pic="http://schemas.openxmlformats.org/drawingml/2006/picture">
+                  <pic:nvPicPr>
+                    <pic:cNvPr id="191519242" name=""/>
+                    <pic:cNvPicPr/>
+                  </pic:nvPicPr>
+                  <pic:blipFill>
+                    <a:blip r:embed="rId17"/>
+                    <a:stretch>
+                      <a:fillRect/>
+                    </a:stretch>
+                  </pic:blipFill>
+                  <pic:spPr>
+                    <a:xfrm>
+                      <a:off x="0" y="0"/>
+                      <a:ext cx="5731510" cy="1904365"/>
+                    </a:xfrm>
+                    <a:prstGeom prst="rect">
+                      <a:avLst/>
+                    </a:prstGeom>
+                  </pic:spPr>
+                </pic:pic>
+              </a:graphicData>
+            </a:graphic>
+          </wp:inline>
+        </w:drawing>
+      </w:r>
+    </w:p>
+    <w:p>
+      <w:pPr>
+        <w:pStyle w:val="Caption"/>
+      </w:pPr>
+      <w:r>
+        <w:t xml:space="preserve">Figure </w:t>
+      </w:r>
+      <w:fldSimple w:instr=" SEQ Figure \* ARABIC ">
+        <w:r>
+          <w:rPr>
+            <w:noProof/>
+          </w:rPr>
+          <w:t>10</w:t>
+        </w:r>
+      </w:fldSimple>
+      <w:r>
+        <w:t>: Code for sending an automated email through SMTP.</w:t>
+      </w:r>
+    </w:p>
+    <w:p>
+      <w:r>
+        <w:t xml:space="preserve">The main reason for implementing alerts into this system is due to its nature as an Intrusion Detection System rather than an Intrusion Prevention System, and IDS cannot take action on its own to prevent </w:t>
+      </w:r>
+      <w:r>
+        <w:t>system intrusion, it can only alert the analyst or user who can take action on the information.</w:t>
+      </w:r>
+    </w:p>
+    <w:p>
+      <w:pPr>
+        <w:pStyle w:val="Heading2"/>
+      </w:pPr>
+      <w:r>
+        <w:t>Software Engineering Principles</w:t>
+      </w:r>
     </w:p>
     <w:p/>
     <w:p>
@@ -6517,7 +7084,7 @@
       <w:r>
         <w:t xml:space="preserve">. Available at </w:t>
       </w:r>
-      <w:hyperlink r:id="rId12" w:history="1">
+      <w:hyperlink r:id="rId18" w:history="1">
         <w:r>
           <w:rPr>
             <w:rStyle w:val="Hyperlink"/>
@@ -6540,7 +7107,7 @@
       <w:r>
         <w:t xml:space="preserve"> </w:t>
       </w:r>
-      <w:hyperlink r:id="rId13" w:history="1">
+      <w:hyperlink r:id="rId19" w:history="1">
         <w:r>
           <w:rPr>
             <w:rStyle w:val="Hyperlink"/>

</xml_diff>

<commit_message>
Software Engineering principles section added
</commit_message>
<xml_diff>
--- a/COMP 3000.docx
+++ b/COMP 3000.docx
@@ -4228,7 +4228,15 @@
         <w:t>Within the current cybersecurity landscape, intrusion detection play a vital role by identifying potentially malicious traffic within a network</w:t>
       </w:r>
       <w:r>
-        <w:t xml:space="preserve">. Network Intrusion detection Systems monitor network traffic and analyses and learns patterns to help detect unauthorized access or suspicious activity. A majority of these systems rely on signature-based detection, with the traffic being compared against a list of known attack signatures. </w:t>
+        <w:t xml:space="preserve">. Network Intrusion detection Systems monitor network traffic and analyses and learns patterns to help detect unauthorized access or suspicious activity. </w:t>
+      </w:r>
+      <w:proofErr w:type="gramStart"/>
+      <w:r>
+        <w:t>A majority of</w:t>
+      </w:r>
+      <w:proofErr w:type="gramEnd"/>
+      <w:r>
+        <w:t xml:space="preserve"> these systems rely on signature-based detection, with the traffic being compared against a list of known attack signatures. </w:t>
       </w:r>
     </w:p>
     <w:p>
@@ -4327,8 +4335,13 @@
       </w:r>
     </w:p>
     <w:p>
-      <w:r>
-        <w:t>In order to achieve my aim, my project will tackle the following objectives</w:t>
+      <w:proofErr w:type="gramStart"/>
+      <w:r>
+        <w:t>In order to</w:t>
+      </w:r>
+      <w:proofErr w:type="gramEnd"/>
+      <w:r>
+        <w:t xml:space="preserve"> achieve my aim, my project will tackle the following objectives</w:t>
       </w:r>
     </w:p>
     <w:p>
@@ -4347,7 +4360,15 @@
         <w:t>Investigate pre-existing intrusion detection approaches,</w:t>
       </w:r>
       <w:r>
-        <w:t xml:space="preserve"> notably signature-based and anomaly-based intrusion detection systems, and discuss the strengths and weaknesses.</w:t>
+        <w:t xml:space="preserve"> notably signature-based and anomaly-based intrusion detection </w:t>
+      </w:r>
+      <w:proofErr w:type="gramStart"/>
+      <w:r>
+        <w:t>systems, and</w:t>
+      </w:r>
+      <w:proofErr w:type="gramEnd"/>
+      <w:r>
+        <w:t xml:space="preserve"> discuss the strengths and weaknesses.</w:t>
       </w:r>
     </w:p>
     <w:p>
@@ -4671,15 +4692,7 @@
     </w:p>
     <w:p>
       <w:r>
-        <w:t xml:space="preserve">This is doubly so due to its nature as </w:t>
-      </w:r>
-      <w:proofErr w:type="spellStart"/>
-      <w:r>
-        <w:t>a</w:t>
-      </w:r>
-      <w:proofErr w:type="spellEnd"/>
-      <w:r>
-        <w:t xml:space="preserve"> Intrusion Detection system, rather than an Intrusion Prevention System, as by itself, an IDS system can do nothing about the intrusion attempts but alert an analyst or user.</w:t>
+        <w:t>This is doubly so due to its nature as a Intrusion Detection system, rather than an Intrusion Prevention System, as by itself, an IDS system can do nothing about the intrusion attempts but alert an analyst or user.</w:t>
       </w:r>
     </w:p>
     <w:p/>
@@ -4763,15 +4776,7 @@
     </w:p>
     <w:p>
       <w:r>
-        <w:t xml:space="preserve">These examples show that while there are possible alternatives to the agile methodology that </w:t>
-      </w:r>
-      <w:proofErr w:type="spellStart"/>
-      <w:r>
-        <w:t>ive</w:t>
-      </w:r>
-      <w:proofErr w:type="spellEnd"/>
-      <w:r>
-        <w:t xml:space="preserve"> chosen, they don’t fit the project as well as they all produce either a rigidness that would cripple the project if problems </w:t>
+        <w:t xml:space="preserve">These examples show that while there are possible alternatives to the agile methodology that ive chosen, they don’t fit the project as well as they all produce either a rigidness that would cripple the project if problems </w:t>
       </w:r>
       <w:r>
         <w:t>occur or</w:t>
@@ -5376,7 +5381,6 @@
           <w:numId w:val="2"/>
         </w:numPr>
       </w:pPr>
-      <w:proofErr w:type="spellStart"/>
       <w:r>
         <w:rPr>
           <w:b/>
@@ -5384,7 +5388,6 @@
         </w:rPr>
         <w:t>JobLib</w:t>
       </w:r>
-      <w:proofErr w:type="spellEnd"/>
       <w:r>
         <w:t>: This was used in order to dump the model and feature columns from python to  a PKL file to allow for usage within other Jupyter notebook files without having to retrain the model, saving a considerable amount of time.</w:t>
       </w:r>
@@ -5397,7 +5400,6 @@
           <w:numId w:val="2"/>
         </w:numPr>
       </w:pPr>
-      <w:proofErr w:type="spellStart"/>
       <w:r>
         <w:rPr>
           <w:b/>
@@ -5405,7 +5407,6 @@
         </w:rPr>
         <w:t>SMTPLib</w:t>
       </w:r>
-      <w:proofErr w:type="spellEnd"/>
       <w:r>
         <w:t>: This was used in order to implement email alerts, allowing the users to be informed if suspicious behaviour has been detected within the traffic log files.</w:t>
       </w:r>
@@ -6287,33 +6288,39 @@
         <w:t xml:space="preserve"> </w:t>
       </w:r>
       <w:r>
-        <w:t xml:space="preserve">ensure the model trains to the same precision as it showed during first round of training the same steps of preprocessing were used, including dropping the columns to reduce the risk of feature leak to prevent the model from cheating, to ensure fairness all of the data was encoded in the same datatype as it was previously. </w:t>
+        <w:t xml:space="preserve">ensure the model trains to the same precision as it showed during first round of training the same steps of preprocessing were used, including dropping the columns to reduce the risk of feature leak to prevent the model from cheating, to ensure fairness </w:t>
+      </w:r>
+      <w:proofErr w:type="gramStart"/>
+      <w:r>
+        <w:t>all of</w:t>
+      </w:r>
+      <w:proofErr w:type="gramEnd"/>
+      <w:r>
+        <w:t xml:space="preserve"> the data was encoded in the same datatype as it was previously. </w:t>
       </w:r>
     </w:p>
     <w:p>
       <w:r>
         <w:t xml:space="preserve">For use in the next step of implementation, I saved the feature columns to a list to be saved and extracted with the model. As detailed previously, the model was trained again using the same parameters, then making use of the </w:t>
       </w:r>
-      <w:proofErr w:type="spellStart"/>
-      <w:r>
-        <w:t>JobLib</w:t>
-      </w:r>
-      <w:proofErr w:type="spellEnd"/>
+      <w:r>
+        <w:t xml:space="preserve">JobLib </w:t>
+      </w:r>
+      <w:r>
+        <w:t>library, the model and feature columns were dumped into two separate PKL files and saved to my PC</w:t>
+      </w:r>
+      <w:r>
+        <w:t>.</w:t>
+      </w:r>
       <w:r>
         <w:t xml:space="preserve"> </w:t>
       </w:r>
-      <w:r>
-        <w:t>library, the model and feature columns were dumped into two separate PKL files and saved to my PC</w:t>
-      </w:r>
-      <w:r>
-        <w:t>.</w:t>
-      </w:r>
-      <w:r>
-        <w:t xml:space="preserve"> </w:t>
-      </w:r>
-    </w:p>
-    <w:p>
-      <w:r>
+    </w:p>
+    <w:p>
+      <w:r>
+        <w:rPr>
+          <w:noProof/>
+        </w:rPr>
         <w:drawing>
           <wp:anchor distT="0" distB="0" distL="114300" distR="114300" simplePos="0" relativeHeight="251658240" behindDoc="0" locked="0" layoutInCell="1" allowOverlap="1" wp14:anchorId="4AEEB6DD" wp14:editId="069CE43F">
             <wp:simplePos x="0" y="0"/>
@@ -6422,13 +6429,49 @@
     </w:p>
     <w:p>
       <w:r>
-        <w:t>*Put image of Feature Alignment Code here*</w:t>
+        <w:rPr>
+          <w:noProof/>
+        </w:rPr>
+        <w:drawing>
+          <wp:inline distT="0" distB="0" distL="0" distR="0" wp14:anchorId="26F3CB46" wp14:editId="1BB1C96B">
+            <wp:extent cx="5731510" cy="1220470"/>
+            <wp:effectExtent l="0" t="0" r="2540" b="0"/>
+            <wp:docPr id="1138474490" name="Picture 1"/>
+            <wp:cNvGraphicFramePr>
+              <a:graphicFrameLocks xmlns:a="http://schemas.openxmlformats.org/drawingml/2006/main" noChangeAspect="1"/>
+            </wp:cNvGraphicFramePr>
+            <a:graphic xmlns:a="http://schemas.openxmlformats.org/drawingml/2006/main">
+              <a:graphicData uri="http://schemas.openxmlformats.org/drawingml/2006/picture">
+                <pic:pic xmlns:pic="http://schemas.openxmlformats.org/drawingml/2006/picture">
+                  <pic:nvPicPr>
+                    <pic:cNvPr id="1138474490" name=""/>
+                    <pic:cNvPicPr/>
+                  </pic:nvPicPr>
+                  <pic:blipFill>
+                    <a:blip r:embed="rId13"/>
+                    <a:stretch>
+                      <a:fillRect/>
+                    </a:stretch>
+                  </pic:blipFill>
+                  <pic:spPr>
+                    <a:xfrm>
+                      <a:off x="0" y="0"/>
+                      <a:ext cx="5731510" cy="1220470"/>
+                    </a:xfrm>
+                    <a:prstGeom prst="rect">
+                      <a:avLst/>
+                    </a:prstGeom>
+                  </pic:spPr>
+                </pic:pic>
+              </a:graphicData>
+            </a:graphic>
+          </wp:inline>
+        </w:drawing>
       </w:r>
     </w:p>
     <w:p/>
     <w:p/>
     <w:p/>
-    <w:p/>
     <w:p>
       <w:pPr>
         <w:pStyle w:val="Heading2"/>
@@ -6441,12 +6484,25 @@
     </w:p>
     <w:p>
       <w:r>
-        <w:t>The predictions ran by the model mark the rows of network traffic with a risk score between zero and one, this is the back bone of both the alert system and output system, this is because the results are filtered based on a threshold that can be adjusted manually to any number between zero and one. This dictates how strict the results are filtered, the threshold level I used during testing was 0.9, this means that any rows of data that were ranked below 0.9 risk score aren’t included in output.</w:t>
-      </w:r>
-    </w:p>
-    <w:p>
-      <w:r>
-        <w:t>In order to establish context for output, during pre-processing, I preserved certain columns that would provide the most insight during output. The columns saved and the code used to do so can be seen below.</w:t>
+        <w:t xml:space="preserve">The predictions ran by the model mark the rows of network traffic with a risk score between zero and one, this is the </w:t>
+      </w:r>
+      <w:proofErr w:type="gramStart"/>
+      <w:r>
+        <w:t>back bone</w:t>
+      </w:r>
+      <w:proofErr w:type="gramEnd"/>
+      <w:r>
+        <w:t xml:space="preserve"> of both the alert system and output system, this is because the results are filtered based on a threshold that can be adjusted manually to any number between zero and one. This dictates how strict the results are filtered, the threshold level I used during testing was 0.9, this means that any rows of data that were ranked below 0.9 risk score aren’t included in output.</w:t>
+      </w:r>
+    </w:p>
+    <w:p>
+      <w:proofErr w:type="gramStart"/>
+      <w:r>
+        <w:t>In order to</w:t>
+      </w:r>
+      <w:proofErr w:type="gramEnd"/>
+      <w:r>
+        <w:t xml:space="preserve"> establish context for output, during pre-processing, I preserved certain columns that would provide the most insight during output. The columns saved and the code used to do so can be seen below.</w:t>
       </w:r>
     </w:p>
     <w:p>
@@ -6454,6 +6510,9 @@
         <w:keepNext/>
       </w:pPr>
       <w:r>
+        <w:rPr>
+          <w:noProof/>
+        </w:rPr>
         <w:drawing>
           <wp:inline distT="0" distB="0" distL="0" distR="0" wp14:anchorId="52366F44" wp14:editId="40200438">
             <wp:extent cx="5731510" cy="610870"/>
@@ -6470,7 +6529,7 @@
                     <pic:cNvPicPr/>
                   </pic:nvPicPr>
                   <pic:blipFill>
-                    <a:blip r:embed="rId13"/>
+                    <a:blip r:embed="rId14"/>
                     <a:stretch>
                       <a:fillRect/>
                     </a:stretch>
@@ -6523,6 +6582,9 @@
         <w:keepNext/>
       </w:pPr>
       <w:r>
+        <w:rPr>
+          <w:noProof/>
+        </w:rPr>
         <w:lastRenderedPageBreak/>
         <w:drawing>
           <wp:inline distT="0" distB="0" distL="0" distR="0" wp14:anchorId="3821A277" wp14:editId="389400DA">
@@ -6540,7 +6602,7 @@
                     <pic:cNvPicPr/>
                   </pic:nvPicPr>
                   <pic:blipFill>
-                    <a:blip r:embed="rId14"/>
+                    <a:blip r:embed="rId15"/>
                     <a:stretch>
                       <a:fillRect/>
                     </a:stretch>
@@ -6596,20 +6658,21 @@
         <w:t xml:space="preserve">The email alert system makes use of the same backbone that the TXT output system makes use of, namely the risk score, but instead </w:t>
       </w:r>
       <w:r>
-        <w:t xml:space="preserve">of outputting through text, this system makes use of the </w:t>
-      </w:r>
-      <w:proofErr w:type="spellStart"/>
-      <w:r>
-        <w:t>SMTPLib</w:t>
-      </w:r>
-      <w:proofErr w:type="spellEnd"/>
-      <w:r>
-        <w:t xml:space="preserve"> library to function and googles smtp server to actually send the email.</w:t>
-      </w:r>
-    </w:p>
-    <w:p>
-      <w:r>
-        <w:t>In order to implement this, I had to make an email address for the system and setup and app password to allow the code to send emails automatically when the code is run</w:t>
+        <w:t xml:space="preserve">of outputting through text, this system makes use of the SMTPLib library to function and googles smtp server to </w:t>
+      </w:r>
+      <w:r>
+        <w:t>send</w:t>
+      </w:r>
+      <w:r>
+        <w:t xml:space="preserve"> the email.</w:t>
+      </w:r>
+    </w:p>
+    <w:p>
+      <w:r>
+        <w:t>To</w:t>
+      </w:r>
+      <w:r>
+        <w:t xml:space="preserve"> implement this, I had to make an email address for the system and setup and app password to allow the code to send emails automatically when the code is run</w:t>
       </w:r>
       <w:r>
         <w:t xml:space="preserve">. </w:t>
@@ -6617,7 +6680,13 @@
     </w:p>
     <w:p>
       <w:r>
-        <w:t>After setting the credentials to be used by the system, the next step was to implement the function that would actually gather the results, compose the email, and send the alert. This started by setting up the basic email content, its subject, it’s “To”, and its “From”, with the “To” set as my personal email for the purposes of testing the prototype</w:t>
+        <w:t xml:space="preserve">After setting the credentials to be used by the system, the next step was to implement the function that would </w:t>
+      </w:r>
+      <w:r>
+        <w:t>gather</w:t>
+      </w:r>
+      <w:r>
+        <w:t xml:space="preserve"> the results, compose the email, and send the alert. This started by setting up the basic email content, its subject, it’s “To”, and its “From”, with the “To” set as my personal email for the purposes of testing the prototype</w:t>
       </w:r>
     </w:p>
     <w:p>
@@ -6625,6 +6694,9 @@
         <w:keepNext/>
       </w:pPr>
       <w:r>
+        <w:rPr>
+          <w:noProof/>
+        </w:rPr>
         <w:drawing>
           <wp:inline distT="0" distB="0" distL="0" distR="0" wp14:anchorId="3BB4C69F" wp14:editId="66FEFBF9">
             <wp:extent cx="5731510" cy="2087880"/>
@@ -6641,7 +6713,7 @@
                     <pic:cNvPicPr/>
                   </pic:nvPicPr>
                   <pic:blipFill>
-                    <a:blip r:embed="rId15"/>
+                    <a:blip r:embed="rId16"/>
                     <a:stretch>
                       <a:fillRect/>
                     </a:stretch>
@@ -6708,6 +6780,9 @@
         <w:keepNext/>
       </w:pPr>
       <w:r>
+        <w:rPr>
+          <w:noProof/>
+        </w:rPr>
         <w:drawing>
           <wp:inline distT="0" distB="0" distL="0" distR="0" wp14:anchorId="28C18755" wp14:editId="25567CD8">
             <wp:extent cx="5731510" cy="2165985"/>
@@ -6724,7 +6799,7 @@
                     <pic:cNvPicPr/>
                   </pic:nvPicPr>
                   <pic:blipFill>
-                    <a:blip r:embed="rId16"/>
+                    <a:blip r:embed="rId17"/>
                     <a:stretch>
                       <a:fillRect/>
                     </a:stretch>
@@ -6766,15 +6841,7 @@
     </w:p>
     <w:p>
       <w:r>
-        <w:t xml:space="preserve">With the body now set, the next step of implementation is to add the code needed to send the email, this was achieved using the </w:t>
-      </w:r>
-      <w:proofErr w:type="spellStart"/>
-      <w:r>
-        <w:t>SMTPlib</w:t>
-      </w:r>
-      <w:proofErr w:type="spellEnd"/>
-      <w:r>
-        <w:t xml:space="preserve"> library and its SMTP_SSL feature, making use of googles SMTP server. Below is the code that was used to achieve this.</w:t>
+        <w:t>With the body now set, the next step of implementation is to add the code needed to send the email, this was achieved using the SMTPlib library and its SMTP_SSL feature, making use of googles SMTP server. Below is the code that was used to achieve this.</w:t>
       </w:r>
     </w:p>
     <w:p>
@@ -6782,6 +6849,9 @@
         <w:keepNext/>
       </w:pPr>
       <w:r>
+        <w:rPr>
+          <w:noProof/>
+        </w:rPr>
         <w:drawing>
           <wp:inline distT="0" distB="0" distL="0" distR="0" wp14:anchorId="1C260E0C" wp14:editId="6FF31A54">
             <wp:extent cx="5731510" cy="1904365"/>
@@ -6798,7 +6868,7 @@
                     <pic:cNvPicPr/>
                   </pic:nvPicPr>
                   <pic:blipFill>
-                    <a:blip r:embed="rId17"/>
+                    <a:blip r:embed="rId18"/>
                     <a:stretch>
                       <a:fillRect/>
                     </a:stretch>
@@ -6840,10 +6910,26 @@
     </w:p>
     <w:p>
       <w:r>
-        <w:t xml:space="preserve">The main reason for implementing alerts into this system is due to its nature as an Intrusion Detection System rather than an Intrusion Prevention System, and IDS cannot take action on its own to prevent </w:t>
-      </w:r>
-      <w:r>
-        <w:t>system intrusion, it can only alert the analyst or user who can take action on the information.</w:t>
+        <w:t xml:space="preserve">The main reason for implementing alerts into this system is due to its nature as an Intrusion Detection System rather than an Intrusion Prevention System, and IDS cannot </w:t>
+      </w:r>
+      <w:proofErr w:type="gramStart"/>
+      <w:r>
+        <w:t>take action</w:t>
+      </w:r>
+      <w:proofErr w:type="gramEnd"/>
+      <w:r>
+        <w:t xml:space="preserve"> on its own to prevent </w:t>
+      </w:r>
+      <w:r>
+        <w:t xml:space="preserve">system intrusion, it can only alert the analyst or user who can </w:t>
+      </w:r>
+      <w:proofErr w:type="gramStart"/>
+      <w:r>
+        <w:t>take action</w:t>
+      </w:r>
+      <w:proofErr w:type="gramEnd"/>
+      <w:r>
+        <w:t xml:space="preserve"> on the information.</w:t>
       </w:r>
     </w:p>
     <w:p>
@@ -6852,6 +6938,26 @@
       </w:pPr>
       <w:r>
         <w:t>Software Engineering Principles</w:t>
+      </w:r>
+    </w:p>
+    <w:p>
+      <w:r>
+        <w:t xml:space="preserve">All code development in this project followed key software engineering principles. Code was structured into modular components to improve reusability, readability, and debugging. </w:t>
+      </w:r>
+      <w:r>
+        <w:lastRenderedPageBreak/>
+        <w:t xml:space="preserve">Reusable functions were implemented where appropriate following  Don’t repeat yourself (DRY) principles, and unnecessary complexity was </w:t>
+      </w:r>
+      <w:proofErr w:type="gramStart"/>
+      <w:r>
+        <w:t>avoid</w:t>
+      </w:r>
+      <w:r>
+        <w:t>ed</w:t>
+      </w:r>
+      <w:proofErr w:type="gramEnd"/>
+      <w:r>
+        <w:t xml:space="preserve"> wherever possible.</w:t>
       </w:r>
     </w:p>
     <w:p/>
@@ -7082,7 +7188,7 @@
       <w:r>
         <w:t xml:space="preserve">. Available at </w:t>
       </w:r>
-      <w:hyperlink r:id="rId18" w:history="1">
+      <w:hyperlink r:id="rId19" w:history="1">
         <w:r>
           <w:rPr>
             <w:rStyle w:val="Hyperlink"/>
@@ -7105,7 +7211,7 @@
       <w:r>
         <w:t xml:space="preserve"> </w:t>
       </w:r>
-      <w:hyperlink r:id="rId19" w:history="1">
+      <w:hyperlink r:id="rId20" w:history="1">
         <w:r>
           <w:rPr>
             <w:rStyle w:val="Hyperlink"/>

</xml_diff>

<commit_message>
Sprint log complete along with testing and validation sections, work started on discussion and evaluation
</commit_message>
<xml_diff>
--- a/COMP 3000.docx
+++ b/COMP 3000.docx
@@ -268,7 +268,7 @@
           <w:r>
             <w:fldChar w:fldCharType="separate"/>
           </w:r>
-          <w:hyperlink w:anchor="_Toc226120692" w:history="1">
+          <w:hyperlink w:anchor="_Toc226207024" w:history="1">
             <w:r>
               <w:rPr>
                 <w:rStyle w:val="Hyperlink"/>
@@ -295,7 +295,7 @@
                 <w:noProof/>
                 <w:webHidden/>
               </w:rPr>
-              <w:instrText xml:space="preserve"> PAGEREF _Toc226120692 \h </w:instrText>
+              <w:instrText xml:space="preserve"> PAGEREF _Toc226207024 \h </w:instrText>
             </w:r>
             <w:r>
               <w:rPr>
@@ -342,7 +342,7 @@
               <w14:ligatures w14:val="standardContextual"/>
             </w:rPr>
           </w:pPr>
-          <w:hyperlink w:anchor="_Toc226120693" w:history="1">
+          <w:hyperlink w:anchor="_Toc226207025" w:history="1">
             <w:r>
               <w:rPr>
                 <w:rStyle w:val="Hyperlink"/>
@@ -369,7 +369,7 @@
                 <w:noProof/>
                 <w:webHidden/>
               </w:rPr>
-              <w:instrText xml:space="preserve"> PAGEREF _Toc226120693 \h </w:instrText>
+              <w:instrText xml:space="preserve"> PAGEREF _Toc226207025 \h </w:instrText>
             </w:r>
             <w:r>
               <w:rPr>
@@ -416,7 +416,7 @@
               <w14:ligatures w14:val="standardContextual"/>
             </w:rPr>
           </w:pPr>
-          <w:hyperlink w:anchor="_Toc226120694" w:history="1">
+          <w:hyperlink w:anchor="_Toc226207026" w:history="1">
             <w:r>
               <w:rPr>
                 <w:rStyle w:val="Hyperlink"/>
@@ -443,7 +443,7 @@
                 <w:noProof/>
                 <w:webHidden/>
               </w:rPr>
-              <w:instrText xml:space="preserve"> PAGEREF _Toc226120694 \h </w:instrText>
+              <w:instrText xml:space="preserve"> PAGEREF _Toc226207026 \h </w:instrText>
             </w:r>
             <w:r>
               <w:rPr>
@@ -490,7 +490,7 @@
               <w14:ligatures w14:val="standardContextual"/>
             </w:rPr>
           </w:pPr>
-          <w:hyperlink w:anchor="_Toc226120695" w:history="1">
+          <w:hyperlink w:anchor="_Toc226207027" w:history="1">
             <w:r>
               <w:rPr>
                 <w:rStyle w:val="Hyperlink"/>
@@ -517,7 +517,7 @@
                 <w:noProof/>
                 <w:webHidden/>
               </w:rPr>
-              <w:instrText xml:space="preserve"> PAGEREF _Toc226120695 \h </w:instrText>
+              <w:instrText xml:space="preserve"> PAGEREF _Toc226207027 \h </w:instrText>
             </w:r>
             <w:r>
               <w:rPr>
@@ -564,7 +564,7 @@
               <w14:ligatures w14:val="standardContextual"/>
             </w:rPr>
           </w:pPr>
-          <w:hyperlink w:anchor="_Toc226120696" w:history="1">
+          <w:hyperlink w:anchor="_Toc226207028" w:history="1">
             <w:r>
               <w:rPr>
                 <w:rStyle w:val="Hyperlink"/>
@@ -591,7 +591,7 @@
                 <w:noProof/>
                 <w:webHidden/>
               </w:rPr>
-              <w:instrText xml:space="preserve"> PAGEREF _Toc226120696 \h </w:instrText>
+              <w:instrText xml:space="preserve"> PAGEREF _Toc226207028 \h </w:instrText>
             </w:r>
             <w:r>
               <w:rPr>
@@ -638,7 +638,7 @@
               <w14:ligatures w14:val="standardContextual"/>
             </w:rPr>
           </w:pPr>
-          <w:hyperlink w:anchor="_Toc226120697" w:history="1">
+          <w:hyperlink w:anchor="_Toc226207029" w:history="1">
             <w:r>
               <w:rPr>
                 <w:rStyle w:val="Hyperlink"/>
@@ -665,7 +665,7 @@
                 <w:noProof/>
                 <w:webHidden/>
               </w:rPr>
-              <w:instrText xml:space="preserve"> PAGEREF _Toc226120697 \h </w:instrText>
+              <w:instrText xml:space="preserve"> PAGEREF _Toc226207029 \h </w:instrText>
             </w:r>
             <w:r>
               <w:rPr>
@@ -685,7 +685,7 @@
                 <w:noProof/>
                 <w:webHidden/>
               </w:rPr>
-              <w:t>4</w:t>
+              <w:t>5</w:t>
             </w:r>
             <w:r>
               <w:rPr>
@@ -712,7 +712,7 @@
               <w14:ligatures w14:val="standardContextual"/>
             </w:rPr>
           </w:pPr>
-          <w:hyperlink w:anchor="_Toc226120698" w:history="1">
+          <w:hyperlink w:anchor="_Toc226207030" w:history="1">
             <w:r>
               <w:rPr>
                 <w:rStyle w:val="Hyperlink"/>
@@ -739,7 +739,7 @@
                 <w:noProof/>
                 <w:webHidden/>
               </w:rPr>
-              <w:instrText xml:space="preserve"> PAGEREF _Toc226120698 \h </w:instrText>
+              <w:instrText xml:space="preserve"> PAGEREF _Toc226207030 \h </w:instrText>
             </w:r>
             <w:r>
               <w:rPr>
@@ -786,7 +786,7 @@
               <w14:ligatures w14:val="standardContextual"/>
             </w:rPr>
           </w:pPr>
-          <w:hyperlink w:anchor="_Toc226120699" w:history="1">
+          <w:hyperlink w:anchor="_Toc226207031" w:history="1">
             <w:r>
               <w:rPr>
                 <w:rStyle w:val="Hyperlink"/>
@@ -813,7 +813,7 @@
                 <w:noProof/>
                 <w:webHidden/>
               </w:rPr>
-              <w:instrText xml:space="preserve"> PAGEREF _Toc226120699 \h </w:instrText>
+              <w:instrText xml:space="preserve"> PAGEREF _Toc226207031 \h </w:instrText>
             </w:r>
             <w:r>
               <w:rPr>
@@ -860,7 +860,7 @@
               <w14:ligatures w14:val="standardContextual"/>
             </w:rPr>
           </w:pPr>
-          <w:hyperlink w:anchor="_Toc226120700" w:history="1">
+          <w:hyperlink w:anchor="_Toc226207032" w:history="1">
             <w:r>
               <w:rPr>
                 <w:rStyle w:val="Hyperlink"/>
@@ -887,7 +887,7 @@
                 <w:noProof/>
                 <w:webHidden/>
               </w:rPr>
-              <w:instrText xml:space="preserve"> PAGEREF _Toc226120700 \h </w:instrText>
+              <w:instrText xml:space="preserve"> PAGEREF _Toc226207032 \h </w:instrText>
             </w:r>
             <w:r>
               <w:rPr>
@@ -934,7 +934,7 @@
               <w14:ligatures w14:val="standardContextual"/>
             </w:rPr>
           </w:pPr>
-          <w:hyperlink w:anchor="_Toc226120701" w:history="1">
+          <w:hyperlink w:anchor="_Toc226207033" w:history="1">
             <w:r>
               <w:rPr>
                 <w:rStyle w:val="Hyperlink"/>
@@ -961,7 +961,7 @@
                 <w:noProof/>
                 <w:webHidden/>
               </w:rPr>
-              <w:instrText xml:space="preserve"> PAGEREF _Toc226120701 \h </w:instrText>
+              <w:instrText xml:space="preserve"> PAGEREF _Toc226207033 \h </w:instrText>
             </w:r>
             <w:r>
               <w:rPr>
@@ -1008,7 +1008,7 @@
               <w14:ligatures w14:val="standardContextual"/>
             </w:rPr>
           </w:pPr>
-          <w:hyperlink w:anchor="_Toc226120702" w:history="1">
+          <w:hyperlink w:anchor="_Toc226207034" w:history="1">
             <w:r>
               <w:rPr>
                 <w:rStyle w:val="Hyperlink"/>
@@ -1035,7 +1035,7 @@
                 <w:noProof/>
                 <w:webHidden/>
               </w:rPr>
-              <w:instrText xml:space="preserve"> PAGEREF _Toc226120702 \h </w:instrText>
+              <w:instrText xml:space="preserve"> PAGEREF _Toc226207034 \h </w:instrText>
             </w:r>
             <w:r>
               <w:rPr>
@@ -1082,7 +1082,7 @@
               <w14:ligatures w14:val="standardContextual"/>
             </w:rPr>
           </w:pPr>
-          <w:hyperlink w:anchor="_Toc226120703" w:history="1">
+          <w:hyperlink w:anchor="_Toc226207035" w:history="1">
             <w:r>
               <w:rPr>
                 <w:rStyle w:val="Hyperlink"/>
@@ -1109,7 +1109,7 @@
                 <w:noProof/>
                 <w:webHidden/>
               </w:rPr>
-              <w:instrText xml:space="preserve"> PAGEREF _Toc226120703 \h </w:instrText>
+              <w:instrText xml:space="preserve"> PAGEREF _Toc226207035 \h </w:instrText>
             </w:r>
             <w:r>
               <w:rPr>
@@ -1156,7 +1156,7 @@
               <w14:ligatures w14:val="standardContextual"/>
             </w:rPr>
           </w:pPr>
-          <w:hyperlink w:anchor="_Toc226120704" w:history="1">
+          <w:hyperlink w:anchor="_Toc226207036" w:history="1">
             <w:r>
               <w:rPr>
                 <w:rStyle w:val="Hyperlink"/>
@@ -1183,7 +1183,7 @@
                 <w:noProof/>
                 <w:webHidden/>
               </w:rPr>
-              <w:instrText xml:space="preserve"> PAGEREF _Toc226120704 \h </w:instrText>
+              <w:instrText xml:space="preserve"> PAGEREF _Toc226207036 \h </w:instrText>
             </w:r>
             <w:r>
               <w:rPr>
@@ -1230,7 +1230,7 @@
               <w14:ligatures w14:val="standardContextual"/>
             </w:rPr>
           </w:pPr>
-          <w:hyperlink w:anchor="_Toc226120705" w:history="1">
+          <w:hyperlink w:anchor="_Toc226207037" w:history="1">
             <w:r>
               <w:rPr>
                 <w:rStyle w:val="Hyperlink"/>
@@ -1257,7 +1257,7 @@
                 <w:noProof/>
                 <w:webHidden/>
               </w:rPr>
-              <w:instrText xml:space="preserve"> PAGEREF _Toc226120705 \h </w:instrText>
+              <w:instrText xml:space="preserve"> PAGEREF _Toc226207037 \h </w:instrText>
             </w:r>
             <w:r>
               <w:rPr>
@@ -1304,7 +1304,7 @@
               <w14:ligatures w14:val="standardContextual"/>
             </w:rPr>
           </w:pPr>
-          <w:hyperlink w:anchor="_Toc226120706" w:history="1">
+          <w:hyperlink w:anchor="_Toc226207038" w:history="1">
             <w:r>
               <w:rPr>
                 <w:rStyle w:val="Hyperlink"/>
@@ -1331,7 +1331,7 @@
                 <w:noProof/>
                 <w:webHidden/>
               </w:rPr>
-              <w:instrText xml:space="preserve"> PAGEREF _Toc226120706 \h </w:instrText>
+              <w:instrText xml:space="preserve"> PAGEREF _Toc226207038 \h </w:instrText>
             </w:r>
             <w:r>
               <w:rPr>
@@ -1378,7 +1378,7 @@
               <w14:ligatures w14:val="standardContextual"/>
             </w:rPr>
           </w:pPr>
-          <w:hyperlink w:anchor="_Toc226120707" w:history="1">
+          <w:hyperlink w:anchor="_Toc226207039" w:history="1">
             <w:r>
               <w:rPr>
                 <w:rStyle w:val="Hyperlink"/>
@@ -1405,7 +1405,7 @@
                 <w:noProof/>
                 <w:webHidden/>
               </w:rPr>
-              <w:instrText xml:space="preserve"> PAGEREF _Toc226120707 \h </w:instrText>
+              <w:instrText xml:space="preserve"> PAGEREF _Toc226207039 \h </w:instrText>
             </w:r>
             <w:r>
               <w:rPr>
@@ -1452,7 +1452,7 @@
               <w14:ligatures w14:val="standardContextual"/>
             </w:rPr>
           </w:pPr>
-          <w:hyperlink w:anchor="_Toc226120708" w:history="1">
+          <w:hyperlink w:anchor="_Toc226207040" w:history="1">
             <w:r>
               <w:rPr>
                 <w:rStyle w:val="Hyperlink"/>
@@ -1479,7 +1479,7 @@
                 <w:noProof/>
                 <w:webHidden/>
               </w:rPr>
-              <w:instrText xml:space="preserve"> PAGEREF _Toc226120708 \h </w:instrText>
+              <w:instrText xml:space="preserve"> PAGEREF _Toc226207040 \h </w:instrText>
             </w:r>
             <w:r>
               <w:rPr>
@@ -1499,7 +1499,7 @@
                 <w:noProof/>
                 <w:webHidden/>
               </w:rPr>
-              <w:t>9</w:t>
+              <w:t>10</w:t>
             </w:r>
             <w:r>
               <w:rPr>
@@ -1526,7 +1526,7 @@
               <w14:ligatures w14:val="standardContextual"/>
             </w:rPr>
           </w:pPr>
-          <w:hyperlink w:anchor="_Toc226120709" w:history="1">
+          <w:hyperlink w:anchor="_Toc226207041" w:history="1">
             <w:r>
               <w:rPr>
                 <w:rStyle w:val="Hyperlink"/>
@@ -1553,7 +1553,7 @@
                 <w:noProof/>
                 <w:webHidden/>
               </w:rPr>
-              <w:instrText xml:space="preserve"> PAGEREF _Toc226120709 \h </w:instrText>
+              <w:instrText xml:space="preserve"> PAGEREF _Toc226207041 \h </w:instrText>
             </w:r>
             <w:r>
               <w:rPr>
@@ -1600,7 +1600,7 @@
               <w14:ligatures w14:val="standardContextual"/>
             </w:rPr>
           </w:pPr>
-          <w:hyperlink w:anchor="_Toc226120710" w:history="1">
+          <w:hyperlink w:anchor="_Toc226207042" w:history="1">
             <w:r>
               <w:rPr>
                 <w:rStyle w:val="Hyperlink"/>
@@ -1627,7 +1627,7 @@
                 <w:noProof/>
                 <w:webHidden/>
               </w:rPr>
-              <w:instrText xml:space="preserve"> PAGEREF _Toc226120710 \h </w:instrText>
+              <w:instrText xml:space="preserve"> PAGEREF _Toc226207042 \h </w:instrText>
             </w:r>
             <w:r>
               <w:rPr>
@@ -1674,7 +1674,7 @@
               <w14:ligatures w14:val="standardContextual"/>
             </w:rPr>
           </w:pPr>
-          <w:hyperlink w:anchor="_Toc226120711" w:history="1">
+          <w:hyperlink w:anchor="_Toc226207043" w:history="1">
             <w:r>
               <w:rPr>
                 <w:rStyle w:val="Hyperlink"/>
@@ -1701,7 +1701,7 @@
                 <w:noProof/>
                 <w:webHidden/>
               </w:rPr>
-              <w:instrText xml:space="preserve"> PAGEREF _Toc226120711 \h </w:instrText>
+              <w:instrText xml:space="preserve"> PAGEREF _Toc226207043 \h </w:instrText>
             </w:r>
             <w:r>
               <w:rPr>
@@ -1748,7 +1748,7 @@
               <w14:ligatures w14:val="standardContextual"/>
             </w:rPr>
           </w:pPr>
-          <w:hyperlink w:anchor="_Toc226120712" w:history="1">
+          <w:hyperlink w:anchor="_Toc226207044" w:history="1">
             <w:r>
               <w:rPr>
                 <w:rStyle w:val="Hyperlink"/>
@@ -1775,7 +1775,7 @@
                 <w:noProof/>
                 <w:webHidden/>
               </w:rPr>
-              <w:instrText xml:space="preserve"> PAGEREF _Toc226120712 \h </w:instrText>
+              <w:instrText xml:space="preserve"> PAGEREF _Toc226207044 \h </w:instrText>
             </w:r>
             <w:r>
               <w:rPr>
@@ -1822,7 +1822,7 @@
               <w14:ligatures w14:val="standardContextual"/>
             </w:rPr>
           </w:pPr>
-          <w:hyperlink w:anchor="_Toc226120713" w:history="1">
+          <w:hyperlink w:anchor="_Toc226207045" w:history="1">
             <w:r>
               <w:rPr>
                 <w:rStyle w:val="Hyperlink"/>
@@ -1849,7 +1849,7 @@
                 <w:noProof/>
                 <w:webHidden/>
               </w:rPr>
-              <w:instrText xml:space="preserve"> PAGEREF _Toc226120713 \h </w:instrText>
+              <w:instrText xml:space="preserve"> PAGEREF _Toc226207045 \h </w:instrText>
             </w:r>
             <w:r>
               <w:rPr>
@@ -1896,7 +1896,7 @@
               <w14:ligatures w14:val="standardContextual"/>
             </w:rPr>
           </w:pPr>
-          <w:hyperlink w:anchor="_Toc226120714" w:history="1">
+          <w:hyperlink w:anchor="_Toc226207046" w:history="1">
             <w:r>
               <w:rPr>
                 <w:rStyle w:val="Hyperlink"/>
@@ -1923,7 +1923,7 @@
                 <w:noProof/>
                 <w:webHidden/>
               </w:rPr>
-              <w:instrText xml:space="preserve"> PAGEREF _Toc226120714 \h </w:instrText>
+              <w:instrText xml:space="preserve"> PAGEREF _Toc226207046 \h </w:instrText>
             </w:r>
             <w:r>
               <w:rPr>
@@ -1970,7 +1970,7 @@
               <w14:ligatures w14:val="standardContextual"/>
             </w:rPr>
           </w:pPr>
-          <w:hyperlink w:anchor="_Toc226120715" w:history="1">
+          <w:hyperlink w:anchor="_Toc226207047" w:history="1">
             <w:r>
               <w:rPr>
                 <w:rStyle w:val="Hyperlink"/>
@@ -1997,7 +1997,7 @@
                 <w:noProof/>
                 <w:webHidden/>
               </w:rPr>
-              <w:instrText xml:space="preserve"> PAGEREF _Toc226120715 \h </w:instrText>
+              <w:instrText xml:space="preserve"> PAGEREF _Toc226207047 \h </w:instrText>
             </w:r>
             <w:r>
               <w:rPr>
@@ -2044,7 +2044,7 @@
               <w14:ligatures w14:val="standardContextual"/>
             </w:rPr>
           </w:pPr>
-          <w:hyperlink w:anchor="_Toc226120716" w:history="1">
+          <w:hyperlink w:anchor="_Toc226207048" w:history="1">
             <w:r>
               <w:rPr>
                 <w:rStyle w:val="Hyperlink"/>
@@ -2071,7 +2071,7 @@
                 <w:noProof/>
                 <w:webHidden/>
               </w:rPr>
-              <w:instrText xml:space="preserve"> PAGEREF _Toc226120716 \h </w:instrText>
+              <w:instrText xml:space="preserve"> PAGEREF _Toc226207048 \h </w:instrText>
             </w:r>
             <w:r>
               <w:rPr>
@@ -2118,7 +2118,7 @@
               <w14:ligatures w14:val="standardContextual"/>
             </w:rPr>
           </w:pPr>
-          <w:hyperlink w:anchor="_Toc226120717" w:history="1">
+          <w:hyperlink w:anchor="_Toc226207049" w:history="1">
             <w:r>
               <w:rPr>
                 <w:rStyle w:val="Hyperlink"/>
@@ -2145,7 +2145,7 @@
                 <w:noProof/>
                 <w:webHidden/>
               </w:rPr>
-              <w:instrText xml:space="preserve"> PAGEREF _Toc226120717 \h </w:instrText>
+              <w:instrText xml:space="preserve"> PAGEREF _Toc226207049 \h </w:instrText>
             </w:r>
             <w:r>
               <w:rPr>
@@ -2192,7 +2192,7 @@
               <w14:ligatures w14:val="standardContextual"/>
             </w:rPr>
           </w:pPr>
-          <w:hyperlink w:anchor="_Toc226120718" w:history="1">
+          <w:hyperlink w:anchor="_Toc226207050" w:history="1">
             <w:r>
               <w:rPr>
                 <w:rStyle w:val="Hyperlink"/>
@@ -2219,7 +2219,7 @@
                 <w:noProof/>
                 <w:webHidden/>
               </w:rPr>
-              <w:instrText xml:space="preserve"> PAGEREF _Toc226120718 \h </w:instrText>
+              <w:instrText xml:space="preserve"> PAGEREF _Toc226207050 \h </w:instrText>
             </w:r>
             <w:r>
               <w:rPr>
@@ -2266,7 +2266,7 @@
               <w14:ligatures w14:val="standardContextual"/>
             </w:rPr>
           </w:pPr>
-          <w:hyperlink w:anchor="_Toc226120719" w:history="1">
+          <w:hyperlink w:anchor="_Toc226207051" w:history="1">
             <w:r>
               <w:rPr>
                 <w:rStyle w:val="Hyperlink"/>
@@ -2293,7 +2293,7 @@
                 <w:noProof/>
                 <w:webHidden/>
               </w:rPr>
-              <w:instrText xml:space="preserve"> PAGEREF _Toc226120719 \h </w:instrText>
+              <w:instrText xml:space="preserve"> PAGEREF _Toc226207051 \h </w:instrText>
             </w:r>
             <w:r>
               <w:rPr>
@@ -2340,7 +2340,7 @@
               <w14:ligatures w14:val="standardContextual"/>
             </w:rPr>
           </w:pPr>
-          <w:hyperlink w:anchor="_Toc226120720" w:history="1">
+          <w:hyperlink w:anchor="_Toc226207052" w:history="1">
             <w:r>
               <w:rPr>
                 <w:rStyle w:val="Hyperlink"/>
@@ -2367,7 +2367,7 @@
                 <w:noProof/>
                 <w:webHidden/>
               </w:rPr>
-              <w:instrText xml:space="preserve"> PAGEREF _Toc226120720 \h </w:instrText>
+              <w:instrText xml:space="preserve"> PAGEREF _Toc226207052 \h </w:instrText>
             </w:r>
             <w:r>
               <w:rPr>
@@ -2414,7 +2414,7 @@
               <w14:ligatures w14:val="standardContextual"/>
             </w:rPr>
           </w:pPr>
-          <w:hyperlink w:anchor="_Toc226120721" w:history="1">
+          <w:hyperlink w:anchor="_Toc226207053" w:history="1">
             <w:r>
               <w:rPr>
                 <w:rStyle w:val="Hyperlink"/>
@@ -2441,7 +2441,7 @@
                 <w:noProof/>
                 <w:webHidden/>
               </w:rPr>
-              <w:instrText xml:space="preserve"> PAGEREF _Toc226120721 \h </w:instrText>
+              <w:instrText xml:space="preserve"> PAGEREF _Toc226207053 \h </w:instrText>
             </w:r>
             <w:r>
               <w:rPr>
@@ -2488,7 +2488,7 @@
               <w14:ligatures w14:val="standardContextual"/>
             </w:rPr>
           </w:pPr>
-          <w:hyperlink w:anchor="_Toc226120722" w:history="1">
+          <w:hyperlink w:anchor="_Toc226207054" w:history="1">
             <w:r>
               <w:rPr>
                 <w:rStyle w:val="Hyperlink"/>
@@ -2515,7 +2515,7 @@
                 <w:noProof/>
                 <w:webHidden/>
               </w:rPr>
-              <w:instrText xml:space="preserve"> PAGEREF _Toc226120722 \h </w:instrText>
+              <w:instrText xml:space="preserve"> PAGEREF _Toc226207054 \h </w:instrText>
             </w:r>
             <w:r>
               <w:rPr>
@@ -2562,7 +2562,7 @@
               <w14:ligatures w14:val="standardContextual"/>
             </w:rPr>
           </w:pPr>
-          <w:hyperlink w:anchor="_Toc226120723" w:history="1">
+          <w:hyperlink w:anchor="_Toc226207055" w:history="1">
             <w:r>
               <w:rPr>
                 <w:rStyle w:val="Hyperlink"/>
@@ -2589,7 +2589,7 @@
                 <w:noProof/>
                 <w:webHidden/>
               </w:rPr>
-              <w:instrText xml:space="preserve"> PAGEREF _Toc226120723 \h </w:instrText>
+              <w:instrText xml:space="preserve"> PAGEREF _Toc226207055 \h </w:instrText>
             </w:r>
             <w:r>
               <w:rPr>
@@ -2636,7 +2636,7 @@
               <w14:ligatures w14:val="standardContextual"/>
             </w:rPr>
           </w:pPr>
-          <w:hyperlink w:anchor="_Toc226120724" w:history="1">
+          <w:hyperlink w:anchor="_Toc226207056" w:history="1">
             <w:r>
               <w:rPr>
                 <w:rStyle w:val="Hyperlink"/>
@@ -2663,7 +2663,7 @@
                 <w:noProof/>
                 <w:webHidden/>
               </w:rPr>
-              <w:instrText xml:space="preserve"> PAGEREF _Toc226120724 \h </w:instrText>
+              <w:instrText xml:space="preserve"> PAGEREF _Toc226207056 \h </w:instrText>
             </w:r>
             <w:r>
               <w:rPr>
@@ -2710,7 +2710,7 @@
               <w14:ligatures w14:val="standardContextual"/>
             </w:rPr>
           </w:pPr>
-          <w:hyperlink w:anchor="_Toc226120725" w:history="1">
+          <w:hyperlink w:anchor="_Toc226207057" w:history="1">
             <w:r>
               <w:rPr>
                 <w:rStyle w:val="Hyperlink"/>
@@ -2737,7 +2737,7 @@
                 <w:noProof/>
                 <w:webHidden/>
               </w:rPr>
-              <w:instrText xml:space="preserve"> PAGEREF _Toc226120725 \h </w:instrText>
+              <w:instrText xml:space="preserve"> PAGEREF _Toc226207057 \h </w:instrText>
             </w:r>
             <w:r>
               <w:rPr>
@@ -2757,7 +2757,7 @@
                 <w:noProof/>
                 <w:webHidden/>
               </w:rPr>
-              <w:t>20</w:t>
+              <w:t>21</w:t>
             </w:r>
             <w:r>
               <w:rPr>
@@ -2784,7 +2784,7 @@
               <w14:ligatures w14:val="standardContextual"/>
             </w:rPr>
           </w:pPr>
-          <w:hyperlink w:anchor="_Toc226120726" w:history="1">
+          <w:hyperlink w:anchor="_Toc226207058" w:history="1">
             <w:r>
               <w:rPr>
                 <w:rStyle w:val="Hyperlink"/>
@@ -2811,7 +2811,7 @@
                 <w:noProof/>
                 <w:webHidden/>
               </w:rPr>
-              <w:instrText xml:space="preserve"> PAGEREF _Toc226120726 \h </w:instrText>
+              <w:instrText xml:space="preserve"> PAGEREF _Toc226207058 \h </w:instrText>
             </w:r>
             <w:r>
               <w:rPr>
@@ -2858,7 +2858,7 @@
               <w14:ligatures w14:val="standardContextual"/>
             </w:rPr>
           </w:pPr>
-          <w:hyperlink w:anchor="_Toc226120727" w:history="1">
+          <w:hyperlink w:anchor="_Toc226207059" w:history="1">
             <w:r>
               <w:rPr>
                 <w:rStyle w:val="Hyperlink"/>
@@ -2885,7 +2885,7 @@
                 <w:noProof/>
                 <w:webHidden/>
               </w:rPr>
-              <w:instrText xml:space="preserve"> PAGEREF _Toc226120727 \h </w:instrText>
+              <w:instrText xml:space="preserve"> PAGEREF _Toc226207059 \h </w:instrText>
             </w:r>
             <w:r>
               <w:rPr>
@@ -2905,7 +2905,7 @@
                 <w:noProof/>
                 <w:webHidden/>
               </w:rPr>
-              <w:t>21</w:t>
+              <w:t>22</w:t>
             </w:r>
             <w:r>
               <w:rPr>
@@ -2932,7 +2932,7 @@
               <w14:ligatures w14:val="standardContextual"/>
             </w:rPr>
           </w:pPr>
-          <w:hyperlink w:anchor="_Toc226120728" w:history="1">
+          <w:hyperlink w:anchor="_Toc226207060" w:history="1">
             <w:r>
               <w:rPr>
                 <w:rStyle w:val="Hyperlink"/>
@@ -2959,7 +2959,7 @@
                 <w:noProof/>
                 <w:webHidden/>
               </w:rPr>
-              <w:instrText xml:space="preserve"> PAGEREF _Toc226120728 \h </w:instrText>
+              <w:instrText xml:space="preserve"> PAGEREF _Toc226207060 \h </w:instrText>
             </w:r>
             <w:r>
               <w:rPr>
@@ -2979,7 +2979,7 @@
                 <w:noProof/>
                 <w:webHidden/>
               </w:rPr>
-              <w:t>22</w:t>
+              <w:t>23</w:t>
             </w:r>
             <w:r>
               <w:rPr>
@@ -3006,12 +3006,11 @@
               <w14:ligatures w14:val="standardContextual"/>
             </w:rPr>
           </w:pPr>
-          <w:hyperlink w:anchor="_Toc226120729" w:history="1">
+          <w:hyperlink w:anchor="_Toc226207061" w:history="1">
             <w:r>
               <w:rPr>
                 <w:rStyle w:val="Hyperlink"/>
                 <w:noProof/>
-                <w:lang w:val="fr-FR"/>
               </w:rPr>
               <w:t>Sprint 6 – Email Alert System</w:t>
             </w:r>
@@ -3034,7 +3033,7 @@
                 <w:noProof/>
                 <w:webHidden/>
               </w:rPr>
-              <w:instrText xml:space="preserve"> PAGEREF _Toc226120729 \h </w:instrText>
+              <w:instrText xml:space="preserve"> PAGEREF _Toc226207061 \h </w:instrText>
             </w:r>
             <w:r>
               <w:rPr>
@@ -3054,7 +3053,7 @@
                 <w:noProof/>
                 <w:webHidden/>
               </w:rPr>
-              <w:t>22</w:t>
+              <w:t>23</w:t>
             </w:r>
             <w:r>
               <w:rPr>
@@ -3081,7 +3080,7 @@
               <w14:ligatures w14:val="standardContextual"/>
             </w:rPr>
           </w:pPr>
-          <w:hyperlink w:anchor="_Toc226120730" w:history="1">
+          <w:hyperlink w:anchor="_Toc226207062" w:history="1">
             <w:r>
               <w:rPr>
                 <w:rStyle w:val="Hyperlink"/>
@@ -3108,7 +3107,7 @@
                 <w:noProof/>
                 <w:webHidden/>
               </w:rPr>
-              <w:instrText xml:space="preserve"> PAGEREF _Toc226120730 \h </w:instrText>
+              <w:instrText xml:space="preserve"> PAGEREF _Toc226207062 \h </w:instrText>
             </w:r>
             <w:r>
               <w:rPr>
@@ -3128,7 +3127,7 @@
                 <w:noProof/>
                 <w:webHidden/>
               </w:rPr>
-              <w:t>23</w:t>
+              <w:t>24</w:t>
             </w:r>
             <w:r>
               <w:rPr>
@@ -3155,13 +3154,13 @@
               <w14:ligatures w14:val="standardContextual"/>
             </w:rPr>
           </w:pPr>
-          <w:hyperlink w:anchor="_Toc226120731" w:history="1">
+          <w:hyperlink w:anchor="_Toc226207063" w:history="1">
             <w:r>
               <w:rPr>
                 <w:rStyle w:val="Hyperlink"/>
                 <w:noProof/>
               </w:rPr>
-              <w:t>End of Project Report</w:t>
+              <w:t>Testing and Validation</w:t>
             </w:r>
             <w:r>
               <w:rPr>
@@ -3182,7 +3181,7 @@
                 <w:noProof/>
                 <w:webHidden/>
               </w:rPr>
-              <w:instrText xml:space="preserve"> PAGEREF _Toc226120731 \h </w:instrText>
+              <w:instrText xml:space="preserve"> PAGEREF _Toc226207063 \h </w:instrText>
             </w:r>
             <w:r>
               <w:rPr>
@@ -3202,7 +3201,155 @@
                 <w:noProof/>
                 <w:webHidden/>
               </w:rPr>
-              <w:t>23</w:t>
+              <w:t>25</w:t>
+            </w:r>
+            <w:r>
+              <w:rPr>
+                <w:noProof/>
+                <w:webHidden/>
+              </w:rPr>
+              <w:fldChar w:fldCharType="end"/>
+            </w:r>
+          </w:hyperlink>
+        </w:p>
+        <w:p>
+          <w:pPr>
+            <w:pStyle w:val="TOC2"/>
+            <w:tabs>
+              <w:tab w:val="right" w:leader="dot" w:pos="9016"/>
+            </w:tabs>
+            <w:rPr>
+              <w:rFonts w:eastAsiaTheme="minorEastAsia"/>
+              <w:noProof/>
+              <w:kern w:val="2"/>
+              <w:sz w:val="24"/>
+              <w:szCs w:val="24"/>
+              <w:lang w:eastAsia="en-GB"/>
+              <w14:ligatures w14:val="standardContextual"/>
+            </w:rPr>
+          </w:pPr>
+          <w:hyperlink w:anchor="_Toc226207064" w:history="1">
+            <w:r>
+              <w:rPr>
+                <w:rStyle w:val="Hyperlink"/>
+                <w:noProof/>
+              </w:rPr>
+              <w:t>Testing</w:t>
+            </w:r>
+            <w:r>
+              <w:rPr>
+                <w:noProof/>
+                <w:webHidden/>
+              </w:rPr>
+              <w:tab/>
+            </w:r>
+            <w:r>
+              <w:rPr>
+                <w:noProof/>
+                <w:webHidden/>
+              </w:rPr>
+              <w:fldChar w:fldCharType="begin"/>
+            </w:r>
+            <w:r>
+              <w:rPr>
+                <w:noProof/>
+                <w:webHidden/>
+              </w:rPr>
+              <w:instrText xml:space="preserve"> PAGEREF _Toc226207064 \h </w:instrText>
+            </w:r>
+            <w:r>
+              <w:rPr>
+                <w:noProof/>
+                <w:webHidden/>
+              </w:rPr>
+            </w:r>
+            <w:r>
+              <w:rPr>
+                <w:noProof/>
+                <w:webHidden/>
+              </w:rPr>
+              <w:fldChar w:fldCharType="separate"/>
+            </w:r>
+            <w:r>
+              <w:rPr>
+                <w:noProof/>
+                <w:webHidden/>
+              </w:rPr>
+              <w:t>25</w:t>
+            </w:r>
+            <w:r>
+              <w:rPr>
+                <w:noProof/>
+                <w:webHidden/>
+              </w:rPr>
+              <w:fldChar w:fldCharType="end"/>
+            </w:r>
+          </w:hyperlink>
+        </w:p>
+        <w:p>
+          <w:pPr>
+            <w:pStyle w:val="TOC2"/>
+            <w:tabs>
+              <w:tab w:val="right" w:leader="dot" w:pos="9016"/>
+            </w:tabs>
+            <w:rPr>
+              <w:rFonts w:eastAsiaTheme="minorEastAsia"/>
+              <w:noProof/>
+              <w:kern w:val="2"/>
+              <w:sz w:val="24"/>
+              <w:szCs w:val="24"/>
+              <w:lang w:eastAsia="en-GB"/>
+              <w14:ligatures w14:val="standardContextual"/>
+            </w:rPr>
+          </w:pPr>
+          <w:hyperlink w:anchor="_Toc226207065" w:history="1">
+            <w:r>
+              <w:rPr>
+                <w:rStyle w:val="Hyperlink"/>
+                <w:noProof/>
+              </w:rPr>
+              <w:t>Output Validation</w:t>
+            </w:r>
+            <w:r>
+              <w:rPr>
+                <w:noProof/>
+                <w:webHidden/>
+              </w:rPr>
+              <w:tab/>
+            </w:r>
+            <w:r>
+              <w:rPr>
+                <w:noProof/>
+                <w:webHidden/>
+              </w:rPr>
+              <w:fldChar w:fldCharType="begin"/>
+            </w:r>
+            <w:r>
+              <w:rPr>
+                <w:noProof/>
+                <w:webHidden/>
+              </w:rPr>
+              <w:instrText xml:space="preserve"> PAGEREF _Toc226207065 \h </w:instrText>
+            </w:r>
+            <w:r>
+              <w:rPr>
+                <w:noProof/>
+                <w:webHidden/>
+              </w:rPr>
+            </w:r>
+            <w:r>
+              <w:rPr>
+                <w:noProof/>
+                <w:webHidden/>
+              </w:rPr>
+              <w:fldChar w:fldCharType="separate"/>
+            </w:r>
+            <w:r>
+              <w:rPr>
+                <w:noProof/>
+                <w:webHidden/>
+              </w:rPr>
+              <w:t>25</w:t>
             </w:r>
             <w:r>
               <w:rPr>
@@ -3229,13 +3376,13 @@
               <w14:ligatures w14:val="standardContextual"/>
             </w:rPr>
           </w:pPr>
-          <w:hyperlink w:anchor="_Toc226120732" w:history="1">
+          <w:hyperlink w:anchor="_Toc226207066" w:history="1">
             <w:r>
               <w:rPr>
                 <w:rStyle w:val="Hyperlink"/>
                 <w:noProof/>
               </w:rPr>
-              <w:t>Project Post-Mortem</w:t>
+              <w:t>Discussion and Critical Evaluation</w:t>
             </w:r>
             <w:r>
               <w:rPr>
@@ -3256,7 +3403,7 @@
                 <w:noProof/>
                 <w:webHidden/>
               </w:rPr>
-              <w:instrText xml:space="preserve"> PAGEREF _Toc226120732 \h </w:instrText>
+              <w:instrText xml:space="preserve"> PAGEREF _Toc226207066 \h </w:instrText>
             </w:r>
             <w:r>
               <w:rPr>
@@ -3276,7 +3423,377 @@
                 <w:noProof/>
                 <w:webHidden/>
               </w:rPr>
-              <w:t>23</w:t>
+              <w:t>25</w:t>
+            </w:r>
+            <w:r>
+              <w:rPr>
+                <w:noProof/>
+                <w:webHidden/>
+              </w:rPr>
+              <w:fldChar w:fldCharType="end"/>
+            </w:r>
+          </w:hyperlink>
+        </w:p>
+        <w:p>
+          <w:pPr>
+            <w:pStyle w:val="TOC2"/>
+            <w:tabs>
+              <w:tab w:val="right" w:leader="dot" w:pos="9016"/>
+            </w:tabs>
+            <w:rPr>
+              <w:rFonts w:eastAsiaTheme="minorEastAsia"/>
+              <w:noProof/>
+              <w:kern w:val="2"/>
+              <w:sz w:val="24"/>
+              <w:szCs w:val="24"/>
+              <w:lang w:eastAsia="en-GB"/>
+              <w14:ligatures w14:val="standardContextual"/>
+            </w:rPr>
+          </w:pPr>
+          <w:hyperlink w:anchor="_Toc226207067" w:history="1">
+            <w:r>
+              <w:rPr>
+                <w:rStyle w:val="Hyperlink"/>
+                <w:noProof/>
+              </w:rPr>
+              <w:t>System Performance</w:t>
+            </w:r>
+            <w:r>
+              <w:rPr>
+                <w:noProof/>
+                <w:webHidden/>
+              </w:rPr>
+              <w:tab/>
+            </w:r>
+            <w:r>
+              <w:rPr>
+                <w:noProof/>
+                <w:webHidden/>
+              </w:rPr>
+              <w:fldChar w:fldCharType="begin"/>
+            </w:r>
+            <w:r>
+              <w:rPr>
+                <w:noProof/>
+                <w:webHidden/>
+              </w:rPr>
+              <w:instrText xml:space="preserve"> PAGEREF _Toc226207067 \h </w:instrText>
+            </w:r>
+            <w:r>
+              <w:rPr>
+                <w:noProof/>
+                <w:webHidden/>
+              </w:rPr>
+            </w:r>
+            <w:r>
+              <w:rPr>
+                <w:noProof/>
+                <w:webHidden/>
+              </w:rPr>
+              <w:fldChar w:fldCharType="separate"/>
+            </w:r>
+            <w:r>
+              <w:rPr>
+                <w:noProof/>
+                <w:webHidden/>
+              </w:rPr>
+              <w:t>25</w:t>
+            </w:r>
+            <w:r>
+              <w:rPr>
+                <w:noProof/>
+                <w:webHidden/>
+              </w:rPr>
+              <w:fldChar w:fldCharType="end"/>
+            </w:r>
+          </w:hyperlink>
+        </w:p>
+        <w:p>
+          <w:pPr>
+            <w:pStyle w:val="TOC2"/>
+            <w:tabs>
+              <w:tab w:val="right" w:leader="dot" w:pos="9016"/>
+            </w:tabs>
+            <w:rPr>
+              <w:rFonts w:eastAsiaTheme="minorEastAsia"/>
+              <w:noProof/>
+              <w:kern w:val="2"/>
+              <w:sz w:val="24"/>
+              <w:szCs w:val="24"/>
+              <w:lang w:eastAsia="en-GB"/>
+              <w14:ligatures w14:val="standardContextual"/>
+            </w:rPr>
+          </w:pPr>
+          <w:hyperlink w:anchor="_Toc226207068" w:history="1">
+            <w:r>
+              <w:rPr>
+                <w:rStyle w:val="Hyperlink"/>
+                <w:noProof/>
+              </w:rPr>
+              <w:t>Strengths of System</w:t>
+            </w:r>
+            <w:r>
+              <w:rPr>
+                <w:noProof/>
+                <w:webHidden/>
+              </w:rPr>
+              <w:tab/>
+            </w:r>
+            <w:r>
+              <w:rPr>
+                <w:noProof/>
+                <w:webHidden/>
+              </w:rPr>
+              <w:fldChar w:fldCharType="begin"/>
+            </w:r>
+            <w:r>
+              <w:rPr>
+                <w:noProof/>
+                <w:webHidden/>
+              </w:rPr>
+              <w:instrText xml:space="preserve"> PAGEREF _Toc226207068 \h </w:instrText>
+            </w:r>
+            <w:r>
+              <w:rPr>
+                <w:noProof/>
+                <w:webHidden/>
+              </w:rPr>
+            </w:r>
+            <w:r>
+              <w:rPr>
+                <w:noProof/>
+                <w:webHidden/>
+              </w:rPr>
+              <w:fldChar w:fldCharType="separate"/>
+            </w:r>
+            <w:r>
+              <w:rPr>
+                <w:noProof/>
+                <w:webHidden/>
+              </w:rPr>
+              <w:t>26</w:t>
+            </w:r>
+            <w:r>
+              <w:rPr>
+                <w:noProof/>
+                <w:webHidden/>
+              </w:rPr>
+              <w:fldChar w:fldCharType="end"/>
+            </w:r>
+          </w:hyperlink>
+        </w:p>
+        <w:p>
+          <w:pPr>
+            <w:pStyle w:val="TOC2"/>
+            <w:tabs>
+              <w:tab w:val="right" w:leader="dot" w:pos="9016"/>
+            </w:tabs>
+            <w:rPr>
+              <w:rFonts w:eastAsiaTheme="minorEastAsia"/>
+              <w:noProof/>
+              <w:kern w:val="2"/>
+              <w:sz w:val="24"/>
+              <w:szCs w:val="24"/>
+              <w:lang w:eastAsia="en-GB"/>
+              <w14:ligatures w14:val="standardContextual"/>
+            </w:rPr>
+          </w:pPr>
+          <w:hyperlink w:anchor="_Toc226207069" w:history="1">
+            <w:r>
+              <w:rPr>
+                <w:rStyle w:val="Hyperlink"/>
+                <w:noProof/>
+              </w:rPr>
+              <w:t>Limitations</w:t>
+            </w:r>
+            <w:r>
+              <w:rPr>
+                <w:noProof/>
+                <w:webHidden/>
+              </w:rPr>
+              <w:tab/>
+            </w:r>
+            <w:r>
+              <w:rPr>
+                <w:noProof/>
+                <w:webHidden/>
+              </w:rPr>
+              <w:fldChar w:fldCharType="begin"/>
+            </w:r>
+            <w:r>
+              <w:rPr>
+                <w:noProof/>
+                <w:webHidden/>
+              </w:rPr>
+              <w:instrText xml:space="preserve"> PAGEREF _Toc226207069 \h </w:instrText>
+            </w:r>
+            <w:r>
+              <w:rPr>
+                <w:noProof/>
+                <w:webHidden/>
+              </w:rPr>
+            </w:r>
+            <w:r>
+              <w:rPr>
+                <w:noProof/>
+                <w:webHidden/>
+              </w:rPr>
+              <w:fldChar w:fldCharType="separate"/>
+            </w:r>
+            <w:r>
+              <w:rPr>
+                <w:noProof/>
+                <w:webHidden/>
+              </w:rPr>
+              <w:t>26</w:t>
+            </w:r>
+            <w:r>
+              <w:rPr>
+                <w:noProof/>
+                <w:webHidden/>
+              </w:rPr>
+              <w:fldChar w:fldCharType="end"/>
+            </w:r>
+          </w:hyperlink>
+        </w:p>
+        <w:p>
+          <w:pPr>
+            <w:pStyle w:val="TOC2"/>
+            <w:tabs>
+              <w:tab w:val="right" w:leader="dot" w:pos="9016"/>
+            </w:tabs>
+            <w:rPr>
+              <w:rFonts w:eastAsiaTheme="minorEastAsia"/>
+              <w:noProof/>
+              <w:kern w:val="2"/>
+              <w:sz w:val="24"/>
+              <w:szCs w:val="24"/>
+              <w:lang w:eastAsia="en-GB"/>
+              <w14:ligatures w14:val="standardContextual"/>
+            </w:rPr>
+          </w:pPr>
+          <w:hyperlink w:anchor="_Toc226207070" w:history="1">
+            <w:r>
+              <w:rPr>
+                <w:rStyle w:val="Hyperlink"/>
+                <w:noProof/>
+              </w:rPr>
+              <w:t>Comparison against existing systems</w:t>
+            </w:r>
+            <w:r>
+              <w:rPr>
+                <w:noProof/>
+                <w:webHidden/>
+              </w:rPr>
+              <w:tab/>
+            </w:r>
+            <w:r>
+              <w:rPr>
+                <w:noProof/>
+                <w:webHidden/>
+              </w:rPr>
+              <w:fldChar w:fldCharType="begin"/>
+            </w:r>
+            <w:r>
+              <w:rPr>
+                <w:noProof/>
+                <w:webHidden/>
+              </w:rPr>
+              <w:instrText xml:space="preserve"> PAGEREF _Toc226207070 \h </w:instrText>
+            </w:r>
+            <w:r>
+              <w:rPr>
+                <w:noProof/>
+                <w:webHidden/>
+              </w:rPr>
+            </w:r>
+            <w:r>
+              <w:rPr>
+                <w:noProof/>
+                <w:webHidden/>
+              </w:rPr>
+              <w:fldChar w:fldCharType="separate"/>
+            </w:r>
+            <w:r>
+              <w:rPr>
+                <w:noProof/>
+                <w:webHidden/>
+              </w:rPr>
+              <w:t>26</w:t>
+            </w:r>
+            <w:r>
+              <w:rPr>
+                <w:noProof/>
+                <w:webHidden/>
+              </w:rPr>
+              <w:fldChar w:fldCharType="end"/>
+            </w:r>
+          </w:hyperlink>
+        </w:p>
+        <w:p>
+          <w:pPr>
+            <w:pStyle w:val="TOC2"/>
+            <w:tabs>
+              <w:tab w:val="right" w:leader="dot" w:pos="9016"/>
+            </w:tabs>
+            <w:rPr>
+              <w:rFonts w:eastAsiaTheme="minorEastAsia"/>
+              <w:noProof/>
+              <w:kern w:val="2"/>
+              <w:sz w:val="24"/>
+              <w:szCs w:val="24"/>
+              <w:lang w:eastAsia="en-GB"/>
+              <w14:ligatures w14:val="standardContextual"/>
+            </w:rPr>
+          </w:pPr>
+          <w:hyperlink w:anchor="_Toc226207071" w:history="1">
+            <w:r>
+              <w:rPr>
+                <w:rStyle w:val="Hyperlink"/>
+                <w:noProof/>
+              </w:rPr>
+              <w:t>Evaluation against aims and objectives.</w:t>
+            </w:r>
+            <w:r>
+              <w:rPr>
+                <w:noProof/>
+                <w:webHidden/>
+              </w:rPr>
+              <w:tab/>
+            </w:r>
+            <w:r>
+              <w:rPr>
+                <w:noProof/>
+                <w:webHidden/>
+              </w:rPr>
+              <w:fldChar w:fldCharType="begin"/>
+            </w:r>
+            <w:r>
+              <w:rPr>
+                <w:noProof/>
+                <w:webHidden/>
+              </w:rPr>
+              <w:instrText xml:space="preserve"> PAGEREF _Toc226207071 \h </w:instrText>
+            </w:r>
+            <w:r>
+              <w:rPr>
+                <w:noProof/>
+                <w:webHidden/>
+              </w:rPr>
+            </w:r>
+            <w:r>
+              <w:rPr>
+                <w:noProof/>
+                <w:webHidden/>
+              </w:rPr>
+              <w:fldChar w:fldCharType="separate"/>
+            </w:r>
+            <w:r>
+              <w:rPr>
+                <w:noProof/>
+                <w:webHidden/>
+              </w:rPr>
+              <w:t>26</w:t>
             </w:r>
             <w:r>
               <w:rPr>
@@ -3303,13 +3820,13 @@
               <w14:ligatures w14:val="standardContextual"/>
             </w:rPr>
           </w:pPr>
-          <w:hyperlink w:anchor="_Toc226120733" w:history="1">
+          <w:hyperlink w:anchor="_Toc226207072" w:history="1">
             <w:r>
               <w:rPr>
                 <w:rStyle w:val="Hyperlink"/>
                 <w:noProof/>
               </w:rPr>
-              <w:t>Conclusions</w:t>
+              <w:t>Conclusion</w:t>
             </w:r>
             <w:r>
               <w:rPr>
@@ -3330,7 +3847,7 @@
                 <w:noProof/>
                 <w:webHidden/>
               </w:rPr>
-              <w:instrText xml:space="preserve"> PAGEREF _Toc226120733 \h </w:instrText>
+              <w:instrText xml:space="preserve"> PAGEREF _Toc226207072 \h </w:instrText>
             </w:r>
             <w:r>
               <w:rPr>
@@ -3350,7 +3867,7 @@
                 <w:noProof/>
                 <w:webHidden/>
               </w:rPr>
-              <w:t>23</w:t>
+              <w:t>26</w:t>
             </w:r>
             <w:r>
               <w:rPr>
@@ -3377,13 +3894,13 @@
               <w14:ligatures w14:val="standardContextual"/>
             </w:rPr>
           </w:pPr>
-          <w:hyperlink w:anchor="_Toc226120734" w:history="1">
+          <w:hyperlink w:anchor="_Toc226207073" w:history="1">
             <w:r>
               <w:rPr>
                 <w:rStyle w:val="Hyperlink"/>
                 <w:noProof/>
               </w:rPr>
-              <w:t>References</w:t>
+              <w:t>Future work</w:t>
             </w:r>
             <w:r>
               <w:rPr>
@@ -3404,7 +3921,7 @@
                 <w:noProof/>
                 <w:webHidden/>
               </w:rPr>
-              <w:instrText xml:space="preserve"> PAGEREF _Toc226120734 \h </w:instrText>
+              <w:instrText xml:space="preserve"> PAGEREF _Toc226207073 \h </w:instrText>
             </w:r>
             <w:r>
               <w:rPr>
@@ -3424,7 +3941,7 @@
                 <w:noProof/>
                 <w:webHidden/>
               </w:rPr>
-              <w:t>23</w:t>
+              <w:t>26</w:t>
             </w:r>
             <w:r>
               <w:rPr>
@@ -3451,13 +3968,13 @@
               <w14:ligatures w14:val="standardContextual"/>
             </w:rPr>
           </w:pPr>
-          <w:hyperlink w:anchor="_Toc226120735" w:history="1">
+          <w:hyperlink w:anchor="_Toc226207074" w:history="1">
             <w:r>
               <w:rPr>
                 <w:rStyle w:val="Hyperlink"/>
                 <w:noProof/>
               </w:rPr>
-              <w:t>Appendix</w:t>
+              <w:t>References</w:t>
             </w:r>
             <w:r>
               <w:rPr>
@@ -3478,7 +3995,7 @@
                 <w:noProof/>
                 <w:webHidden/>
               </w:rPr>
-              <w:instrText xml:space="preserve"> PAGEREF _Toc226120735 \h </w:instrText>
+              <w:instrText xml:space="preserve"> PAGEREF _Toc226207074 \h </w:instrText>
             </w:r>
             <w:r>
               <w:rPr>
@@ -3498,81 +4015,7 @@
                 <w:noProof/>
                 <w:webHidden/>
               </w:rPr>
-              <w:t>23</w:t>
-            </w:r>
-            <w:r>
-              <w:rPr>
-                <w:noProof/>
-                <w:webHidden/>
-              </w:rPr>
-              <w:fldChar w:fldCharType="end"/>
-            </w:r>
-          </w:hyperlink>
-        </w:p>
-        <w:p>
-          <w:pPr>
-            <w:pStyle w:val="TOC2"/>
-            <w:tabs>
-              <w:tab w:val="right" w:leader="dot" w:pos="9016"/>
-            </w:tabs>
-            <w:rPr>
-              <w:rFonts w:eastAsiaTheme="minorEastAsia"/>
-              <w:noProof/>
-              <w:kern w:val="2"/>
-              <w:sz w:val="24"/>
-              <w:szCs w:val="24"/>
-              <w:lang w:eastAsia="en-GB"/>
-              <w14:ligatures w14:val="standardContextual"/>
-            </w:rPr>
-          </w:pPr>
-          <w:hyperlink w:anchor="_Toc226120736" w:history="1">
-            <w:r>
-              <w:rPr>
-                <w:rStyle w:val="Hyperlink"/>
-                <w:noProof/>
-              </w:rPr>
-              <w:t>Sprint Logs</w:t>
-            </w:r>
-            <w:r>
-              <w:rPr>
-                <w:noProof/>
-                <w:webHidden/>
-              </w:rPr>
-              <w:tab/>
-            </w:r>
-            <w:r>
-              <w:rPr>
-                <w:noProof/>
-                <w:webHidden/>
-              </w:rPr>
-              <w:fldChar w:fldCharType="begin"/>
-            </w:r>
-            <w:r>
-              <w:rPr>
-                <w:noProof/>
-                <w:webHidden/>
-              </w:rPr>
-              <w:instrText xml:space="preserve"> PAGEREF _Toc226120736 \h </w:instrText>
-            </w:r>
-            <w:r>
-              <w:rPr>
-                <w:noProof/>
-                <w:webHidden/>
-              </w:rPr>
-            </w:r>
-            <w:r>
-              <w:rPr>
-                <w:noProof/>
-                <w:webHidden/>
-              </w:rPr>
-              <w:fldChar w:fldCharType="separate"/>
-            </w:r>
-            <w:r>
-              <w:rPr>
-                <w:noProof/>
-                <w:webHidden/>
-              </w:rPr>
-              <w:t>23</w:t>
+              <w:t>27</w:t>
             </w:r>
             <w:r>
               <w:rPr>
@@ -3608,7 +4051,7 @@
       <w:pPr>
         <w:pStyle w:val="Heading1"/>
       </w:pPr>
-      <w:bookmarkStart w:id="0" w:name="_Toc226120692"/>
+      <w:bookmarkStart w:id="0" w:name="_Toc226207024"/>
       <w:r>
         <w:t>Acknowledgement</w:t>
       </w:r>
@@ -3623,7 +4066,7 @@
       <w:pPr>
         <w:pStyle w:val="Heading1"/>
       </w:pPr>
-      <w:bookmarkStart w:id="1" w:name="_Toc226120693"/>
+      <w:bookmarkStart w:id="1" w:name="_Toc226207025"/>
       <w:r>
         <w:t>Abstract</w:t>
       </w:r>
@@ -3638,7 +4081,7 @@
       <w:pPr>
         <w:pStyle w:val="Heading1"/>
       </w:pPr>
-      <w:bookmarkStart w:id="2" w:name="_Toc226120694"/>
+      <w:bookmarkStart w:id="2" w:name="_Toc226207026"/>
       <w:r>
         <w:t>Introduction</w:t>
       </w:r>
@@ -3648,7 +4091,7 @@
       <w:pPr>
         <w:pStyle w:val="Heading2"/>
       </w:pPr>
-      <w:bookmarkStart w:id="3" w:name="_Toc226120695"/>
+      <w:bookmarkStart w:id="3" w:name="_Toc226207027"/>
       <w:r>
         <w:t>Project background</w:t>
       </w:r>
@@ -3664,6 +4107,7 @@
     </w:p>
     <w:p>
       <w:r>
+        <w:lastRenderedPageBreak/>
         <w:t>The more traditional form of a N</w:t>
       </w:r>
       <w:r>
@@ -3696,94 +4140,94 @@
         <w:t xml:space="preserve"> around the development of a Network intrusion detection system that makes use of machine learning to identify suspicious patterns within network traffic, by training against features from a networks traffic data, it can learn behaviour patterns </w:t>
       </w:r>
       <w:r>
-        <w:t xml:space="preserve">from both normal and malicious traffic and can  improve overall detection capabilities </w:t>
+        <w:t>from both normal and malicious traffic and can  improve overall detection capabilities allowing the system to identify anomalies or threats that would be captured by the rule based systems.</w:t>
+      </w:r>
+    </w:p>
+    <w:p>
+      <w:pPr>
+        <w:pStyle w:val="Heading2"/>
+      </w:pPr>
+      <w:bookmarkStart w:id="4" w:name="_Toc226207028"/>
+      <w:r>
+        <w:t>Context</w:t>
+      </w:r>
+      <w:bookmarkEnd w:id="4"/>
+    </w:p>
+    <w:p>
+      <w:r>
+        <w:t>Within the current cybersecurity landscape, intrusion detection play a vital role by identifying potentially malicious traffic within a network</w:t>
+      </w:r>
+      <w:r>
+        <w:t xml:space="preserve">. Network Intrusion detection Systems monitor network traffic and analyses and learns patterns to help detect unauthorized access or suspicious activity. A majority of these systems rely on signature-based detection, with the traffic being compared against a list of known attack signatures. </w:t>
+      </w:r>
+    </w:p>
+    <w:p>
+      <w:r>
+        <w:t xml:space="preserve">Some of the most widely used tools make use of </w:t>
+      </w:r>
+      <w:r>
+        <w:t>signature-based</w:t>
+      </w:r>
+      <w:r>
+        <w:t xml:space="preserve"> detection, examples of these being Snort and Suricata, both of which are open source and widely used by private users and organizations. These tools are very good at detecting attacks that have been previously </w:t>
+      </w:r>
+      <w:r>
+        <w:t>documented,</w:t>
+      </w:r>
+      <w:r>
+        <w:t xml:space="preserve"> and the system has been updated to detect</w:t>
+      </w:r>
+      <w:r>
+        <w:t xml:space="preserve">. </w:t>
+      </w:r>
+    </w:p>
+    <w:p>
+      <w:r>
+        <w:t xml:space="preserve">As cybercrime grows ever more profitable and with the incident rate of </w:t>
+      </w:r>
+      <w:proofErr w:type="spellStart"/>
+      <w:r>
+        <w:t>cyber crime</w:t>
+      </w:r>
+      <w:proofErr w:type="spellEnd"/>
+      <w:r>
+        <w:t xml:space="preserve"> rising by 37% over the past five years (Bridewell, 2026), the different attack types and vectors continue to evolve, with attackers modifying previously used techniques or developing new attacks using exploits not commonly known, meaning that the signature-based system can’t be updated to detect these attacks. This creates big problems for signature-based systems as attacks that haven’t yet been seen may bypass the detection systems.</w:t>
+      </w:r>
+    </w:p>
+    <w:p>
+      <w:r>
+        <w:t>Alongside the new and changing threats, modern networks generate and receive immensely large volumes of traffic due to the recent growth in cloud services, online services, and personal devices. Monitoring such a large amount of traffic data is unfeasible for an analyst to manage in</w:t>
+      </w:r>
+      <w:r>
+        <w:t xml:space="preserve"> a timely manner that would allow them to respond to an attack and the signature-based systems may also struggle with the highly complex and widely differing traffic patterns.</w:t>
+      </w:r>
+    </w:p>
+    <w:p>
+      <w:r>
+        <w:t>Recent research studies have explored the use of ma</w:t>
+      </w:r>
+      <w:r>
+        <w:t xml:space="preserve">chine learning in order to enhance security detection such as the article Machine Learning for Network Intrusion Detection-A Comparative Study (Al Lail, Garcia and Olivo, 2023) in the study they implemented and evaluated a number of machine learning algorithms against the CICIDS-2017 dataset and were able to achieve detection rates of 97%. This article helps to demonstrate that machine learning models can analyse large datasets of network traffic and identify both normal and malicious traffic with very high accuracy. And unlike </w:t>
+      </w:r>
+      <w:r>
+        <w:t>pure signature-based detection, has the potential to identify new attacks by recognising anomalous patterns of network activity.</w:t>
+      </w:r>
+    </w:p>
+    <w:p>
+      <w:r>
+        <w:t xml:space="preserve">With this context established, this project focuses on the development of a machine learning based Network Intrusion Detection System that can analyse network traffic data and identify and score suspicious behaviour based on its perceived risk. This aims to demonstrate the use </w:t>
       </w:r>
       <w:r>
         <w:lastRenderedPageBreak/>
-        <w:t>allowing the system to identify anomalies or threats that would be captured by the rule based systems.</w:t>
-      </w:r>
-    </w:p>
+        <w:t>of machine learning in network security and test the effectiveness of it when trained on a machine with modern day middle ground specifications.</w:t>
+      </w:r>
+    </w:p>
+    <w:p/>
     <w:p>
       <w:pPr>
         <w:pStyle w:val="Heading2"/>
       </w:pPr>
-      <w:bookmarkStart w:id="4" w:name="_Toc226120696"/>
-      <w:r>
-        <w:t>Context</w:t>
-      </w:r>
-      <w:bookmarkEnd w:id="4"/>
-    </w:p>
-    <w:p>
-      <w:r>
-        <w:t>Within the current cybersecurity landscape, intrusion detection play a vital role by identifying potentially malicious traffic within a network</w:t>
-      </w:r>
-      <w:r>
-        <w:t xml:space="preserve">. Network Intrusion detection Systems monitor network traffic and analyses and learns patterns to help detect unauthorized access or suspicious activity. A majority of these systems rely on signature-based detection, with the traffic being compared against a list of known attack signatures. </w:t>
-      </w:r>
-    </w:p>
-    <w:p>
-      <w:r>
-        <w:t xml:space="preserve">Some of the most widely used tools make use of </w:t>
-      </w:r>
-      <w:r>
-        <w:t>signature-based</w:t>
-      </w:r>
-      <w:r>
-        <w:t xml:space="preserve"> detection, examples of these being Snort and Suricata, both of which are open source and widely used by private users and organizations. These tools are very good at detecting attacks that have been previously </w:t>
-      </w:r>
-      <w:r>
-        <w:t>documented,</w:t>
-      </w:r>
-      <w:r>
-        <w:t xml:space="preserve"> and the system has been updated to detect</w:t>
-      </w:r>
-      <w:r>
-        <w:t xml:space="preserve">. </w:t>
-      </w:r>
-    </w:p>
-    <w:p>
-      <w:r>
-        <w:t xml:space="preserve">As cybercrime grows ever more profitable and with the incident rate of </w:t>
-      </w:r>
-      <w:proofErr w:type="spellStart"/>
-      <w:r>
-        <w:t>cyber crime</w:t>
-      </w:r>
-      <w:proofErr w:type="spellEnd"/>
-      <w:r>
-        <w:t xml:space="preserve"> rising by 37% over the past five years (Bridewell, 2026), the different attack types and vectors continue to evolve, with attackers modifying previously used techniques or developing new attacks using exploits not commonly known, meaning that the signature-based system can’t be updated to detect these attacks. This creates big problems for signature-based systems as attacks that haven’t yet been seen may bypass the detection systems.</w:t>
-      </w:r>
-    </w:p>
-    <w:p>
-      <w:r>
-        <w:t>Alongside the new and changing threats, modern networks generate and receive immensely large volumes of traffic due to the recent growth in cloud services, online services, and personal devices. Monitoring such a large amount of traffic data is unfeasible for an analyst to manage in</w:t>
-      </w:r>
-      <w:r>
-        <w:t xml:space="preserve"> a timely manner that would allow them to respond to an attack and the signature-based systems may also struggle with the highly complex and widely differing traffic patterns.</w:t>
-      </w:r>
-    </w:p>
-    <w:p>
-      <w:r>
-        <w:t>Recent research studies have explored the use of ma</w:t>
-      </w:r>
-      <w:r>
-        <w:t xml:space="preserve">chine learning in order to enhance security detection such as the article Machine Learning for Network Intrusion Detection-A Comparative Study (Al Lail, Garcia and Olivo, 2023) in the study they implemented and evaluated a number of machine learning algorithms against the CICIDS-2017 dataset and were able to achieve detection rates of 97%. This article helps to demonstrate that machine learning models can analyse large datasets of network traffic and identify both normal and malicious traffic with very high accuracy. And unlike </w:t>
-      </w:r>
-      <w:r>
-        <w:t>pure signature-based detection, has the potential to identify new attacks by recognising anomalous patterns of network activity.</w:t>
-      </w:r>
-    </w:p>
-    <w:p>
-      <w:r>
-        <w:t>With this context established, this project focuses on the development of a machine learning based Network Intrusion Detection System that can analyse network traffic data and identify and score suspicious behaviour based on its perceived risk. This aims to demonstrate the use of machine learning in network security and test the effectiveness of it when trained on a machine with modern day middle ground specifications.</w:t>
-      </w:r>
-    </w:p>
-    <w:p/>
-    <w:p>
-      <w:pPr>
-        <w:pStyle w:val="Heading2"/>
-      </w:pPr>
-      <w:bookmarkStart w:id="5" w:name="_Toc226120697"/>
+      <w:bookmarkStart w:id="5" w:name="_Toc226207029"/>
       <w:r>
         <w:t>Aims and Objectives</w:t>
       </w:r>
@@ -3800,7 +4244,6 @@
         <w:t xml:space="preserve"> network traffic logs to identify and classify activity that it classifies as suspicious. The aim of developing this tool is to offer improvement over the more traditional </w:t>
       </w:r>
       <w:r>
-        <w:lastRenderedPageBreak/>
         <w:t>signature-based</w:t>
       </w:r>
       <w:r>
@@ -3979,7 +4422,7 @@
       <w:pPr>
         <w:pStyle w:val="Heading1"/>
       </w:pPr>
-      <w:bookmarkStart w:id="6" w:name="_Toc226120698"/>
+      <w:bookmarkStart w:id="6" w:name="_Toc226207030"/>
       <w:r>
         <w:t>Literature Review</w:t>
       </w:r>
@@ -3989,7 +4432,7 @@
       <w:pPr>
         <w:pStyle w:val="Heading2"/>
       </w:pPr>
-      <w:bookmarkStart w:id="7" w:name="_Toc226120699"/>
+      <w:bookmarkStart w:id="7" w:name="_Toc226207031"/>
       <w:r>
         <w:t>What is a</w:t>
       </w:r>
@@ -4027,6 +4470,7 @@
     </w:p>
     <w:p>
       <w:r>
+        <w:lastRenderedPageBreak/>
         <w:t xml:space="preserve">By monitoring inbound and outbound packets, it allows the system to observe and identify traffic patterns and anomalies across all devices on the network, making it best for identifying external attacks, large network scans, and attempts at unauthorized access. </w:t>
       </w:r>
     </w:p>
@@ -4037,94 +4481,91 @@
     </w:p>
     <w:p>
       <w:r>
-        <w:t xml:space="preserve">This contrasts to Host-based which sits on individual devices and monitors system logs, file system integrity, any running processes, and changes to registry and any system calls made. By sitting directly on the device, it can detect changes to files and attempts at privilege escalation, making it very good at protecting critical devices and tracking user activity, which can help </w:t>
-      </w:r>
+        <w:t>This contrasts to Host-based which sits on individual devices and monitors system logs, file system integrity, any running processes, and changes to registry and any system calls made. By sitting directly on the device, it can detect changes to files and attempts at privilege escalation, making it very good at protecting critical devices and tracking user activity, which can help identify insider threats. But this type of monitoring can be very resource intensive as it has to be deployed on every device on the network.</w:t>
+      </w:r>
+    </w:p>
+    <w:p>
+      <w:r>
+        <w:t xml:space="preserve">Despite which type of IDS is being used, they tend to fall into two types for detection, signature based which </w:t>
+      </w:r>
+      <w:r>
+        <w:t>compares traffic to known attack signatures and patterns, and anomaly-based detection which works by establishing a known baseline for activity and produces alerts on deviations from this established norm.</w:t>
+      </w:r>
+    </w:p>
+    <w:p>
+      <w:r>
+        <w:t xml:space="preserve"> It is worth noting that both have their own pros and cons, with signature having high accuracy and low false positive but misses new attack types, whereas  anomaly tends to have slightly lower accuracy and higher false positives but makes up for this by detecting newer attack patterns.</w:t>
+      </w:r>
+    </w:p>
+    <w:p>
+      <w:pPr>
+        <w:pStyle w:val="Heading2"/>
+      </w:pPr>
+      <w:bookmarkStart w:id="8" w:name="_Toc226207032"/>
+      <w:r>
+        <w:t xml:space="preserve">Existing implementation of AI </w:t>
+      </w:r>
+      <w:r>
+        <w:t>N</w:t>
+      </w:r>
+      <w:r>
+        <w:t>IDS</w:t>
+      </w:r>
+      <w:bookmarkEnd w:id="8"/>
+    </w:p>
+    <w:p>
+      <w:r>
+        <w:t>There are a number of already existing applications that make use of AI for network intrusion detection</w:t>
+      </w:r>
+      <w:r>
+        <w:t>, and example of this usage is Suricata, Suricata makes use of isolation forest models for its threat detection, allowing it to run alongside Suricata’s signature based detection systems, allowing them to offer an easily accessible hybrid detection system.</w:t>
+      </w:r>
+    </w:p>
+    <w:p>
+      <w:r>
+        <w:t xml:space="preserve">Another example of AI usage is from snort, one of the most commonly used </w:t>
+      </w:r>
+      <w:r>
+        <w:t>open-source intrusion detection systems, that traditionally makes use of signature-based detection for its systems, has introduced Snort_ML which uses neural networks instead of the traditional rule sets.</w:t>
+      </w:r>
+    </w:p>
+    <w:p>
+      <w:r>
+        <w:t>The fact that two of the biggest open source IDS providers are shifting towards ML for detection, starts to show where the industry is starting to turn, favouring hybrid or AI systems rather than just having signature based systems.</w:t>
+      </w:r>
+    </w:p>
+    <w:p>
+      <w:pPr>
+        <w:pStyle w:val="Heading2"/>
+      </w:pPr>
+    </w:p>
+    <w:p>
+      <w:pPr>
+        <w:pStyle w:val="Heading2"/>
+      </w:pPr>
+      <w:bookmarkStart w:id="9" w:name="_Toc226207033"/>
+      <w:r>
+        <w:t>Legal, Social, Ethical, Professional(LSEP)</w:t>
+      </w:r>
+      <w:bookmarkEnd w:id="9"/>
+    </w:p>
+    <w:p>
+      <w:r>
+        <w:t>There is a number of legal problems that AI  face</w:t>
+      </w:r>
+      <w:r>
+        <w:t>s</w:t>
+      </w:r>
+      <w:r>
+        <w:t>, one of the most common is gaining proper access to the data needed to train the model, within the AI IDS field there are 2 types of data that is used to train the model, synthetic and real</w:t>
+      </w:r>
+      <w:r>
+        <w:t>, synthetic tends to be the most common type of training data available, an example of this is the UNSW NB-15, that is generally only available for usage in academic environments due to the licensing, meaning that commercially that you aren’t legally allowed to use it without direct permission from the researchers that developed it.</w:t>
+      </w:r>
+    </w:p>
+    <w:p>
       <w:r>
         <w:lastRenderedPageBreak/>
-        <w:t>identify insider threats. But this type of monitoring can be very resource intensive as it has to be deployed on every device on the network.</w:t>
-      </w:r>
-    </w:p>
-    <w:p>
-      <w:r>
-        <w:t xml:space="preserve">Despite which type of IDS is being used, they tend to fall into two types for detection, signature based which </w:t>
-      </w:r>
-      <w:r>
-        <w:t>compares traffic to known attack signatures and patterns, and anomaly-based detection which works by establishing a known baseline for activity and produces alerts on deviations from this established norm.</w:t>
-      </w:r>
-    </w:p>
-    <w:p>
-      <w:r>
-        <w:t xml:space="preserve"> It is worth noting that both have their own pros and cons, with signature having high accuracy and low false positive but misses new attack types, whereas  anomaly tends to have slightly lower accuracy and higher false positives but makes up for this by detecting newer attack patterns.</w:t>
-      </w:r>
-    </w:p>
-    <w:p>
-      <w:pPr>
-        <w:pStyle w:val="Heading2"/>
-      </w:pPr>
-      <w:bookmarkStart w:id="8" w:name="_Toc226120700"/>
-      <w:r>
-        <w:t xml:space="preserve">Existing implementation of AI </w:t>
-      </w:r>
-      <w:r>
-        <w:t>N</w:t>
-      </w:r>
-      <w:r>
-        <w:t>IDS</w:t>
-      </w:r>
-      <w:bookmarkEnd w:id="8"/>
-    </w:p>
-    <w:p>
-      <w:r>
-        <w:t>There are a number of already existing applications that make use of AI for network intrusion detection</w:t>
-      </w:r>
-      <w:r>
-        <w:t>, and example of this usage is Suricata, Suricata makes use of isolation forest models for its threat detection, allowing it to run alongside Suricata’s signature based detection systems, allowing them to offer an easily accessible hybrid detection system.</w:t>
-      </w:r>
-    </w:p>
-    <w:p>
-      <w:r>
-        <w:t xml:space="preserve">Another example of AI usage is from snort, one of the most commonly used </w:t>
-      </w:r>
-      <w:r>
-        <w:t>open-source intrusion detection systems, that traditionally makes use of signature-based detection for its systems, has introduced Snort_ML which uses neural networks instead of the traditional rule sets.</w:t>
-      </w:r>
-    </w:p>
-    <w:p>
-      <w:r>
-        <w:t>The fact that two of the biggest open source IDS providers are shifting towards ML for detection, starts to show where the industry is starting to turn, favouring hybrid or AI systems rather than just having signature based systems.</w:t>
-      </w:r>
-    </w:p>
-    <w:p>
-      <w:pPr>
-        <w:pStyle w:val="Heading2"/>
-      </w:pPr>
-    </w:p>
-    <w:p>
-      <w:pPr>
-        <w:pStyle w:val="Heading2"/>
-      </w:pPr>
-      <w:bookmarkStart w:id="9" w:name="_Toc226120701"/>
-      <w:r>
-        <w:t>Legal, Social, Ethical, Professional(LSEP)</w:t>
-      </w:r>
-      <w:bookmarkEnd w:id="9"/>
-    </w:p>
-    <w:p>
-      <w:r>
-        <w:t>There is a number of legal problems that AI  face</w:t>
-      </w:r>
-      <w:r>
-        <w:t>s</w:t>
-      </w:r>
-      <w:r>
-        <w:t>, one of the most common is gaining proper access to the data needed to train the model, within the AI IDS field there are 2 types of data that is used to train the model, synthetic and real</w:t>
-      </w:r>
-      <w:r>
-        <w:t>, synthetic tends to be the most common type of training data available, an example of this is the UNSW NB-15, that is generally only available for usage in academic environments due to the licensing, meaning that commercially that you aren’t legally allowed to use it without direct permission from the researchers that developed it.</w:t>
-      </w:r>
-    </w:p>
-    <w:p>
-      <w:r>
         <w:t>While traditionally there aren’t any social considerations relating to AI usage in intrusion detection, in the current day and age, there is a stigma around AI usage that stems from a lack of understanding of what the AI would be doing as when they hear that AI has been integrated, the mind jumps to use of Generative AI which people have a strong stance against the usage of genAI.</w:t>
       </w:r>
     </w:p>
@@ -4146,7 +4587,6 @@
     </w:p>
     <w:p>
       <w:r>
-        <w:lastRenderedPageBreak/>
         <w:t xml:space="preserve">For professional considerations, when AI is introduced into </w:t>
       </w:r>
       <w:r>
@@ -4172,7 +4612,7 @@
       <w:pPr>
         <w:pStyle w:val="Heading1"/>
       </w:pPr>
-      <w:bookmarkStart w:id="10" w:name="_Toc226120702"/>
+      <w:bookmarkStart w:id="10" w:name="_Toc226207034"/>
       <w:r>
         <w:t>Project Methodology and System Design</w:t>
       </w:r>
@@ -4182,7 +4622,7 @@
       <w:pPr>
         <w:pStyle w:val="Heading2"/>
       </w:pPr>
-      <w:bookmarkStart w:id="11" w:name="_Toc226120703"/>
+      <w:bookmarkStart w:id="11" w:name="_Toc226207035"/>
       <w:r>
         <w:t>Agile Development Methodology</w:t>
       </w:r>
@@ -4197,7 +4637,7 @@
       <w:pPr>
         <w:pStyle w:val="Heading2"/>
       </w:pPr>
-      <w:bookmarkStart w:id="12" w:name="_Toc226120704"/>
+      <w:bookmarkStart w:id="12" w:name="_Toc226207036"/>
       <w:r>
         <w:t>Implementation Method</w:t>
       </w:r>
@@ -4212,7 +4652,7 @@
       <w:pPr>
         <w:pStyle w:val="Heading2"/>
       </w:pPr>
-      <w:bookmarkStart w:id="13" w:name="_Toc226120705"/>
+      <w:bookmarkStart w:id="13" w:name="_Toc226207037"/>
       <w:r>
         <w:t>Alternative Approaches</w:t>
       </w:r>
@@ -4225,7 +4665,11 @@
     </w:p>
     <w:p>
       <w:r>
-        <w:t>Waterfall remains a choice often mentioned when asked about project methodologies, it fits best for projects where there are fixed requirements that are well defined, but its main weakness is that it is highly inflexible to change once development has started. Part of software development and use of technology is that problems will always appear, meaning that you may need to pivot and make changes which simply wouldn’t be possible with waterfall due to its linear and rigid nature.</w:t>
+        <w:t xml:space="preserve">Waterfall remains a choice often mentioned when asked about project methodologies, it fits best for projects where there are fixed requirements that are well defined, but its main </w:t>
+      </w:r>
+      <w:r>
+        <w:lastRenderedPageBreak/>
+        <w:t>weakness is that it is highly inflexible to change once development has started. Part of software development and use of technology is that problems will always appear, meaning that you may need to pivot and make changes which simply wouldn’t be possible with waterfall due to its linear and rigid nature.</w:t>
       </w:r>
     </w:p>
     <w:p>
@@ -4238,107 +4682,107 @@
     </w:p>
     <w:p>
       <w:r>
+        <w:t xml:space="preserve">The final alternative I will go into is Cleanroom software engineering, this focuses on development of software with a certifiable level of reliability, using incremental development using strong control and testing to ensure highly reliable quality code, if a piece of software fails to meet the testing requirements, testing in stopped and, you start again at the design phase. </w:t>
+      </w:r>
+    </w:p>
+    <w:p>
+      <w:r>
+        <w:t xml:space="preserve">These examples show that while there are possible alternatives to the agile methodology that </w:t>
+      </w:r>
+      <w:proofErr w:type="spellStart"/>
+      <w:r>
+        <w:t>ive</w:t>
+      </w:r>
+      <w:proofErr w:type="spellEnd"/>
+      <w:r>
+        <w:t xml:space="preserve"> chosen, they don’t fit the project as well as they all produce either a rigidness that would cripple the project if problems </w:t>
+      </w:r>
+      <w:r>
+        <w:t>occur or</w:t>
+      </w:r>
+      <w:r>
+        <w:t xml:space="preserve"> would add an unreasonable level of bloat that would slow the project down</w:t>
+      </w:r>
+      <w:r>
+        <w:t xml:space="preserve"> unnecessarily.</w:t>
+      </w:r>
+    </w:p>
+    <w:p>
+      <w:pPr>
+        <w:pStyle w:val="Heading2"/>
+      </w:pPr>
+      <w:bookmarkStart w:id="14" w:name="_Toc226207038"/>
+      <w:r>
+        <w:t>System Architecture</w:t>
+      </w:r>
+      <w:bookmarkEnd w:id="14"/>
+    </w:p>
+    <w:p>
+      <w:r>
+        <w:t xml:space="preserve">My design for the system will work along the lines of standard machine learning practice, </w:t>
+      </w:r>
+      <w:r>
+        <w:t>using the standard stages of a machine learning pipeline: loading the dataset, preprocessing, feature scaling, feed the data to the model, make predictions against the data, then send an alert regarding the information. Below is a breakdown of the stages of my ML pipeline.</w:t>
+      </w:r>
+    </w:p>
+    <w:p>
+      <w:r>
+        <w:t>The first stage is loading the dataset into the Jupyter notebook file through the use of NumPy and pandas</w:t>
+      </w:r>
+      <w:r>
+        <w:t xml:space="preserve">, before loading the dataset, checking the dataset contains all of the expected features is advised considering the number of sites where these testing datasets are available from. </w:t>
+      </w:r>
+    </w:p>
+    <w:p>
+      <w:r>
+        <w:t>Next is preprocessing the data to ensure that the model can use it to train, this can involve cleaning the data to get rid of any inaccurate, incomplete, or incorrectly formatted data from the dataset,</w:t>
+      </w:r>
+      <w:r>
+        <w:t xml:space="preserve"> encoding the data to convert categorical data such as text or any </w:t>
+      </w:r>
+      <w:r>
+        <w:t>non-numerical</w:t>
+      </w:r>
+      <w:r>
+        <w:t xml:space="preserve"> categories into numerical form so that the ML algorithms can process it properly. </w:t>
+      </w:r>
+    </w:p>
+    <w:p>
+      <w:r>
+        <w:t>Dataset splitting can be vital for ML development depending on the data set being used as some datasets come split into testing and train files, this can be done in the Jupyter notebook file if needed to provide testing and training sets from a single dataset file.</w:t>
+      </w:r>
+    </w:p>
+    <w:p>
+      <w:r>
+        <w:t>Feature s</w:t>
+      </w:r>
+      <w:r>
+        <w:t>caling helps ensure that features that have wider ranging magnitudes don’t bias the learning process by limiting the range</w:t>
+      </w:r>
+      <w:r>
+        <w:t xml:space="preserve"> between a given range for example between minus 1 and 1 to reduce bias.</w:t>
+      </w:r>
+      <w:r>
+        <w:t xml:space="preserve"> </w:t>
+      </w:r>
+    </w:p>
+    <w:p>
+      <w:r>
+        <w:t>Loading the ML involves either training the model from scratch or loading a trained model from a saved file then feeding it the data you want it to train it on or test it against, this stage needs to be done correctly or the results will not be accurate, this stage also helps to determine issues with the previous stages as the accuracies of the models can point to problems, such as if the accuracy of the models is 99.99% it is highly likely that the models are cheating via a feature leak that is showing the models what is right and wrong.</w:t>
+      </w:r>
+    </w:p>
+    <w:p>
+      <w:r>
         <w:lastRenderedPageBreak/>
-        <w:t xml:space="preserve">The final alternative I will go into is Cleanroom software engineering, this focuses on development of software with a certifiable level of reliability, using incremental development using strong control and testing to ensure highly reliable quality code, if a piece of software fails to meet the testing requirements, testing in stopped and, you start again at the design phase. </w:t>
-      </w:r>
-    </w:p>
-    <w:p>
-      <w:r>
-        <w:t xml:space="preserve">These examples show that while there are possible alternatives to the agile methodology that </w:t>
-      </w:r>
-      <w:proofErr w:type="spellStart"/>
-      <w:r>
-        <w:t>ive</w:t>
-      </w:r>
-      <w:proofErr w:type="spellEnd"/>
-      <w:r>
-        <w:t xml:space="preserve"> chosen, they don’t fit the project as well as they all produce either a rigidness that would cripple the project if problems </w:t>
-      </w:r>
-      <w:r>
-        <w:t>occur or</w:t>
-      </w:r>
-      <w:r>
-        <w:t xml:space="preserve"> would add an unreasonable level of bloat that would slow the project down</w:t>
-      </w:r>
-      <w:r>
-        <w:t xml:space="preserve"> unnecessarily.</w:t>
-      </w:r>
-    </w:p>
-    <w:p>
-      <w:pPr>
-        <w:pStyle w:val="Heading2"/>
-      </w:pPr>
-      <w:bookmarkStart w:id="14" w:name="_Toc226120706"/>
-      <w:r>
-        <w:t>System Architecture</w:t>
-      </w:r>
-      <w:bookmarkEnd w:id="14"/>
-    </w:p>
-    <w:p>
-      <w:r>
-        <w:t xml:space="preserve">My design for the system will work along the lines of standard machine learning practice, </w:t>
-      </w:r>
-      <w:r>
-        <w:t>using the standard stages of a machine learning pipeline: loading the dataset, preprocessing, feature scaling, feed the data to the model, make predictions against the data, then send an alert regarding the information. Below is a breakdown of the stages of my ML pipeline.</w:t>
-      </w:r>
-    </w:p>
-    <w:p>
-      <w:r>
-        <w:t>The first stage is loading the dataset into the Jupyter notebook file through the use of NumPy and pandas</w:t>
-      </w:r>
-      <w:r>
-        <w:t xml:space="preserve">, before loading the dataset, checking the dataset contains all of the expected features is advised considering the number of sites where these testing datasets are available from. </w:t>
-      </w:r>
-    </w:p>
-    <w:p>
-      <w:r>
-        <w:t>Next is preprocessing the data to ensure that the model can use it to train, this can involve cleaning the data to get rid of any inaccurate, incomplete, or incorrectly formatted data from the dataset,</w:t>
-      </w:r>
-      <w:r>
-        <w:t xml:space="preserve"> encoding the data to convert categorical data such as text or any </w:t>
-      </w:r>
-      <w:r>
-        <w:t>non-numerical</w:t>
-      </w:r>
-      <w:r>
-        <w:t xml:space="preserve"> categories into numerical form so that the ML algorithms can process it properly. </w:t>
-      </w:r>
-    </w:p>
-    <w:p>
-      <w:r>
-        <w:t>Dataset splitting can be vital for ML development depending on the data set being used as some datasets come split into testing and train files, this can be done in the Jupyter notebook file if needed to provide testing and training sets from a single dataset file.</w:t>
-      </w:r>
-    </w:p>
-    <w:p>
-      <w:r>
-        <w:t>Feature s</w:t>
-      </w:r>
-      <w:r>
-        <w:t>caling helps ensure that features that have wider ranging magnitudes don’t bias the learning process by limiting the range</w:t>
-      </w:r>
-      <w:r>
-        <w:t xml:space="preserve"> between a given range for example between minus 1 and 1 to reduce bias.</w:t>
-      </w:r>
+        <w:t>The prediction stage is where the data is fed to the loaded and trained model and it runs against the dataset and produces predictions that can be output to a file, and then depending on the results of the predictions can trigger alerts via multiple means such as SIEM platforms, application notifications, or emails through email API’s or smtp code.</w:t>
+      </w:r>
+    </w:p>
+    <w:p>
       <w:r>
         <w:t xml:space="preserve"> </w:t>
       </w:r>
     </w:p>
     <w:p>
-      <w:r>
-        <w:t>Loading the ML involves either training the model from scratch or loading a trained model from a saved file then feeding it the data you want it to train it on or test it against, this stage needs to be done correctly or the results will not be accurate, this stage also helps to determine issues with the previous stages as the accuracies of the models can point to problems, such as if the accuracy of the models is 99.99% it is highly likely that the models are cheating via a feature leak that is showing the models what is right and wrong.</w:t>
-      </w:r>
-    </w:p>
-    <w:p>
-      <w:r>
-        <w:t>The prediction stage is where the data is fed to the loaded and trained model and it runs against the dataset and produces predictions that can be output to a file, and then depending on the results of the predictions can trigger alerts via multiple means such as SIEM platforms, application notifications, or emails through email API’s or smtp code.</w:t>
-      </w:r>
-    </w:p>
-    <w:p>
-      <w:r>
-        <w:t xml:space="preserve"> </w:t>
-      </w:r>
-    </w:p>
-    <w:p>
       <w:pPr>
         <w:keepNext/>
       </w:pPr>
@@ -4346,7 +4790,6 @@
         <w:rPr>
           <w:noProof/>
         </w:rPr>
-        <w:lastRenderedPageBreak/>
         <w:drawing>
           <wp:inline distT="0" distB="0" distL="0" distR="0" wp14:anchorId="68021D72" wp14:editId="34308990">
             <wp:extent cx="4324954" cy="5439534"/>
@@ -4393,6 +4836,9 @@
       </w:r>
       <w:fldSimple w:instr=" SEQ Figure \* ARABIC ">
         <w:r>
+          <w:rPr>
+            <w:noProof/>
+          </w:rPr>
           <w:t>1</w:t>
         </w:r>
       </w:fldSimple>
@@ -4404,7 +4850,7 @@
       <w:pPr>
         <w:pStyle w:val="Heading2"/>
       </w:pPr>
-      <w:bookmarkStart w:id="15" w:name="_Toc226120707"/>
+      <w:bookmarkStart w:id="15" w:name="_Toc226207039"/>
       <w:r>
         <w:t>Dataset</w:t>
       </w:r>
@@ -4426,14 +4872,18 @@
         <w:t>The reason that I chose this dataset is that while it is a more modern dataset with newer types of attacks than a lot of other datasets, the hardware needed to train a model on it is much more reasonable than other modern datasets such as the CICIDS2017 dataset</w:t>
       </w:r>
       <w:r>
-        <w:t xml:space="preserve"> as part of my reason for choosing this project is to find out if AI NIDS is something that an average consumer could reasonably make use without having massive computing power to train the models.</w:t>
+        <w:t xml:space="preserve"> as part of my reason </w:t>
+      </w:r>
+      <w:r>
+        <w:lastRenderedPageBreak/>
+        <w:t>for choosing this project is to find out if AI NIDS is something that an average consumer could reasonably make use without having massive computing power to train the models.</w:t>
       </w:r>
     </w:p>
     <w:p>
       <w:pPr>
         <w:pStyle w:val="Heading2"/>
       </w:pPr>
-      <w:bookmarkStart w:id="16" w:name="_Toc226120708"/>
+      <w:bookmarkStart w:id="16" w:name="_Toc226207040"/>
       <w:r>
         <w:t>Data Preprocessing</w:t>
       </w:r>
@@ -4447,11 +4897,7 @@
         <w:t xml:space="preserve">, the data must be pre-processed, it needs to go through a number of steps to </w:t>
       </w:r>
       <w:r>
-        <w:t xml:space="preserve">that no errors occur during training and </w:t>
-      </w:r>
-      <w:r>
-        <w:lastRenderedPageBreak/>
-        <w:t>testing. One of the most important preprocessing steps is proper data encoding, this entails changing the data type of all non-numerical categorical columns to a number format such as float64 as a large number of ML models will not accept non-numerical data.</w:t>
+        <w:t>that no errors occur during training and testing. One of the most important preprocessing steps is proper data encoding, this entails changing the data type of all non-numerical categorical columns to a number format such as float64 as a large number of ML models will not accept non-numerical data.</w:t>
       </w:r>
     </w:p>
     <w:p>
@@ -4488,7 +4934,7 @@
       <w:pPr>
         <w:pStyle w:val="Heading2"/>
       </w:pPr>
-      <w:bookmarkStart w:id="17" w:name="_Toc226120709"/>
+      <w:bookmarkStart w:id="17" w:name="_Toc226207041"/>
       <w:r>
         <w:t>Machine Learning Models Used</w:t>
       </w:r>
@@ -4653,7 +5099,11 @@
         <w:t>This model works to predict the probability of a specific outcome occurring, in this case, whether or not a piece of data is malicious or not</w:t>
       </w:r>
       <w:r>
-        <w:t>, the probabilities of the outcomes are confined to between zero and one, with the probabilities determined, the results are fitted to an S curve to map the values to the probability</w:t>
+        <w:t xml:space="preserve">, the </w:t>
+      </w:r>
+      <w:r>
+        <w:lastRenderedPageBreak/>
+        <w:t>probabilities of the outcomes are confined to between zero and one, with the probabilities determined, the results are fitted to an S curve to map the values to the probability</w:t>
       </w:r>
     </w:p>
     <w:p>
@@ -4695,7 +5145,6 @@
           <w:b/>
           <w:bCs/>
         </w:rPr>
-        <w:lastRenderedPageBreak/>
         <w:t>XGBoost:</w:t>
       </w:r>
       <w:r>
@@ -4714,7 +5163,7 @@
       <w:pPr>
         <w:pStyle w:val="Heading2"/>
       </w:pPr>
-      <w:bookmarkStart w:id="18" w:name="_Toc226120710"/>
+      <w:bookmarkStart w:id="18" w:name="_Toc226207042"/>
       <w:r>
         <w:t>Detection Pipeline</w:t>
       </w:r>
@@ -4734,7 +5183,7 @@
       <w:pPr>
         <w:pStyle w:val="Heading1"/>
       </w:pPr>
-      <w:bookmarkStart w:id="19" w:name="_Toc226120711"/>
+      <w:bookmarkStart w:id="19" w:name="_Toc226207043"/>
       <w:r>
         <w:t>Tools Used and Technologies</w:t>
       </w:r>
@@ -4749,7 +5198,7 @@
       <w:pPr>
         <w:pStyle w:val="Heading3"/>
       </w:pPr>
-      <w:bookmarkStart w:id="20" w:name="_Toc226120712"/>
+      <w:bookmarkStart w:id="20" w:name="_Toc226207044"/>
       <w:r>
         <w:t>Python</w:t>
       </w:r>
@@ -4764,7 +5213,7 @@
       <w:pPr>
         <w:pStyle w:val="Heading3"/>
       </w:pPr>
-      <w:bookmarkStart w:id="21" w:name="_Toc226120713"/>
+      <w:bookmarkStart w:id="21" w:name="_Toc226207045"/>
       <w:r>
         <w:t>Jupyter Notebook</w:t>
       </w:r>
@@ -4779,7 +5228,7 @@
       <w:pPr>
         <w:pStyle w:val="Heading3"/>
       </w:pPr>
-      <w:bookmarkStart w:id="22" w:name="_Toc226120714"/>
+      <w:bookmarkStart w:id="22" w:name="_Toc226207046"/>
       <w:r>
         <w:t>Python Libraries</w:t>
       </w:r>
@@ -4811,6 +5260,7 @@
           <w:b/>
           <w:bCs/>
         </w:rPr>
+        <w:lastRenderedPageBreak/>
         <w:t>Pandas and NumPy</w:t>
       </w:r>
       <w:r>
@@ -4850,7 +5300,6 @@
           <w:b/>
           <w:bCs/>
         </w:rPr>
-        <w:lastRenderedPageBreak/>
         <w:t>JobLib</w:t>
       </w:r>
       <w:proofErr w:type="spellEnd"/>
@@ -4889,7 +5338,7 @@
       <w:pPr>
         <w:pStyle w:val="Heading3"/>
       </w:pPr>
-      <w:bookmarkStart w:id="23" w:name="_Toc226120715"/>
+      <w:bookmarkStart w:id="23" w:name="_Toc226207047"/>
       <w:r>
         <w:t>GitHub</w:t>
       </w:r>
@@ -4905,7 +5354,7 @@
       <w:pPr>
         <w:pStyle w:val="Heading1"/>
       </w:pPr>
-      <w:bookmarkStart w:id="24" w:name="_Toc226120716"/>
+      <w:bookmarkStart w:id="24" w:name="_Toc226207048"/>
       <w:r>
         <w:t>Implementation</w:t>
       </w:r>
@@ -4915,7 +5364,7 @@
       <w:pPr>
         <w:pStyle w:val="Heading2"/>
       </w:pPr>
-      <w:bookmarkStart w:id="25" w:name="_Toc226120717"/>
+      <w:bookmarkStart w:id="25" w:name="_Toc226207049"/>
       <w:r>
         <w:t>Model Training</w:t>
       </w:r>
@@ -4948,6 +5397,7 @@
         <w:rPr>
           <w:noProof/>
         </w:rPr>
+        <w:lastRenderedPageBreak/>
         <w:drawing>
           <wp:inline distT="0" distB="0" distL="0" distR="0" wp14:anchorId="614EB440" wp14:editId="325F4EA4">
             <wp:extent cx="5731510" cy="3338830"/>
@@ -4994,6 +5444,9 @@
       </w:r>
       <w:fldSimple w:instr=" SEQ Figure \* ARABIC ">
         <w:r>
+          <w:rPr>
+            <w:noProof/>
+          </w:rPr>
           <w:t>2</w:t>
         </w:r>
       </w:fldSimple>
@@ -5003,7 +5456,6 @@
     </w:p>
     <w:p>
       <w:r>
-        <w:lastRenderedPageBreak/>
         <w:t>The next step of the development pipeline was the pre-processing of the data, this proved to provide more challenge than anticipated, leading to it taking up time over two sprints as there was a feature leak that was impacting the accuracy of two of the models negatively.</w:t>
       </w:r>
     </w:p>
@@ -5066,6 +5518,9 @@
       </w:r>
       <w:fldSimple w:instr=" SEQ Figure \* ARABIC ">
         <w:r>
+          <w:rPr>
+            <w:noProof/>
+          </w:rPr>
           <w:t>3</w:t>
         </w:r>
       </w:fldSimple>
@@ -5083,7 +5538,11 @@
     </w:p>
     <w:p>
       <w:r>
-        <w:t>With the columns encoded, the next task was to align the features of the testing and training dataset, this ensures that when the model are run against the test dataset, it doesn’t throw errors, as the training dataset contains features that are not present in the test dataset, then as a last measure to ensure that the models do not break due to data being non numerical, the encoded columns datatype is set as float64.</w:t>
+        <w:t xml:space="preserve">With the columns encoded, the next task was to align the features of the testing and training dataset, this ensures that when the model are run against the test dataset, it doesn’t throw errors, as the training dataset contains features that are not present in the test dataset, then as </w:t>
+      </w:r>
+      <w:r>
+        <w:lastRenderedPageBreak/>
+        <w:t>a last measure to ensure that the models do not break due to data being non numerical, the encoded columns datatype is set as float64.</w:t>
       </w:r>
     </w:p>
     <w:p>
@@ -5099,7 +5558,6 @@
         <w:rPr>
           <w:noProof/>
         </w:rPr>
-        <w:lastRenderedPageBreak/>
         <w:drawing>
           <wp:inline distT="0" distB="0" distL="0" distR="0" wp14:anchorId="5C0EC1D9" wp14:editId="7F8A4655">
             <wp:extent cx="5731510" cy="4686300"/>
@@ -5146,6 +5604,9 @@
       </w:r>
       <w:fldSimple w:instr=" SEQ Figure \* ARABIC ">
         <w:r>
+          <w:rPr>
+            <w:noProof/>
+          </w:rPr>
           <w:t>4</w:t>
         </w:r>
       </w:fldSimple>
@@ -5667,6 +6128,9 @@
       </w:r>
       <w:fldSimple w:instr=" SEQ Figure \* ARABIC ">
         <w:r>
+          <w:rPr>
+            <w:noProof/>
+          </w:rPr>
           <w:t>5</w:t>
         </w:r>
       </w:fldSimple>
@@ -5679,7 +6143,7 @@
       <w:pPr>
         <w:pStyle w:val="Heading2"/>
       </w:pPr>
-      <w:bookmarkStart w:id="26" w:name="_Toc226120718"/>
+      <w:bookmarkStart w:id="26" w:name="_Toc226207050"/>
       <w:r>
         <w:lastRenderedPageBreak/>
         <w:t>Model Evaluation</w:t>
@@ -5711,7 +6175,7 @@
       <w:pPr>
         <w:pStyle w:val="Heading2"/>
       </w:pPr>
-      <w:bookmarkStart w:id="27" w:name="_Toc226120719"/>
+      <w:bookmarkStart w:id="27" w:name="_Toc226207051"/>
       <w:r>
         <w:t>Model Extraction and Deployment</w:t>
       </w:r>
@@ -5934,6 +6398,9 @@
       </w:r>
       <w:fldSimple w:instr=" SEQ Figure \* ARABIC ">
         <w:r>
+          <w:rPr>
+            <w:noProof/>
+          </w:rPr>
           <w:t>6</w:t>
         </w:r>
       </w:fldSimple>
@@ -5948,7 +6415,7 @@
       <w:pPr>
         <w:pStyle w:val="Heading2"/>
       </w:pPr>
-      <w:bookmarkStart w:id="28" w:name="_Toc226120720"/>
+      <w:bookmarkStart w:id="28" w:name="_Toc226207052"/>
       <w:r>
         <w:t>NIDS Output System</w:t>
       </w:r>
@@ -6018,6 +6485,9 @@
       </w:r>
       <w:fldSimple w:instr=" SEQ Figure \* ARABIC ">
         <w:r>
+          <w:rPr>
+            <w:noProof/>
+          </w:rPr>
           <w:t>7</w:t>
         </w:r>
       </w:fldSimple>
@@ -6091,6 +6561,9 @@
       </w:r>
       <w:fldSimple w:instr=" SEQ Figure \* ARABIC ">
         <w:r>
+          <w:rPr>
+            <w:noProof/>
+          </w:rPr>
           <w:t>8</w:t>
         </w:r>
       </w:fldSimple>
@@ -6103,7 +6576,7 @@
       <w:pPr>
         <w:pStyle w:val="Heading2"/>
       </w:pPr>
-      <w:bookmarkStart w:id="29" w:name="_Toc226120721"/>
+      <w:bookmarkStart w:id="29" w:name="_Toc226207053"/>
       <w:r>
         <w:t>Email Alert System</w:t>
       </w:r>
@@ -6207,6 +6680,9 @@
       </w:r>
       <w:fldSimple w:instr=" SEQ Figure \* ARABIC ">
         <w:r>
+          <w:rPr>
+            <w:noProof/>
+          </w:rPr>
           <w:t>9</w:t>
         </w:r>
       </w:fldSimple>
@@ -6287,6 +6763,9 @@
       </w:r>
       <w:fldSimple w:instr=" SEQ Figure \* ARABIC ">
         <w:r>
+          <w:rPr>
+            <w:noProof/>
+          </w:rPr>
           <w:t>10</w:t>
         </w:r>
       </w:fldSimple>
@@ -6296,15 +6775,7 @@
     </w:p>
     <w:p>
       <w:r>
-        <w:t xml:space="preserve">With the body now set, the next step of implementation is to add the code needed to send the email, this was achieved using the </w:t>
-      </w:r>
-      <w:proofErr w:type="spellStart"/>
-      <w:r>
-        <w:t>SMTPlib</w:t>
-      </w:r>
-      <w:proofErr w:type="spellEnd"/>
-      <w:r>
-        <w:t xml:space="preserve"> library and its SMTP_SSL feature, making use of googles SMTP server. Below is the code that was used to achieve this.</w:t>
+        <w:t>With the body now set, the next step of implementation is to add the code needed to send the email, this was achieved using the SMTPlib library and its SMTP_SSL feature, making use of googles SMTP server. Below is the code that was used to achieve this.</w:t>
       </w:r>
     </w:p>
     <w:p>
@@ -6361,6 +6832,9 @@
       </w:r>
       <w:fldSimple w:instr=" SEQ Figure \* ARABIC ">
         <w:r>
+          <w:rPr>
+            <w:noProof/>
+          </w:rPr>
           <w:t>11</w:t>
         </w:r>
       </w:fldSimple>
@@ -6375,14 +6849,79 @@
       <w:r>
         <w:t>system intrusion, it can only alert the analyst or user who can take action on the information.</w:t>
       </w:r>
-    </w:p>
+      <w:r>
+        <w:t xml:space="preserve"> Below is an example of the output, in real world usage, the attack_cat column wouldn’t be present but it is very useful for testing and validation.</w:t>
+      </w:r>
+    </w:p>
+    <w:p>
+      <w:pPr>
+        <w:keepNext/>
+      </w:pPr>
+      <w:r>
+        <w:lastRenderedPageBreak/>
+        <w:drawing>
+          <wp:inline distT="0" distB="0" distL="0" distR="0" wp14:anchorId="065C14AE" wp14:editId="110618B5">
+            <wp:extent cx="5731510" cy="4984750"/>
+            <wp:effectExtent l="0" t="0" r="2540" b="6350"/>
+            <wp:docPr id="1617136157" name="Picture 1"/>
+            <wp:cNvGraphicFramePr>
+              <a:graphicFrameLocks xmlns:a="http://schemas.openxmlformats.org/drawingml/2006/main" noChangeAspect="1"/>
+            </wp:cNvGraphicFramePr>
+            <a:graphic xmlns:a="http://schemas.openxmlformats.org/drawingml/2006/main">
+              <a:graphicData uri="http://schemas.openxmlformats.org/drawingml/2006/picture">
+                <pic:pic xmlns:pic="http://schemas.openxmlformats.org/drawingml/2006/picture">
+                  <pic:nvPicPr>
+                    <pic:cNvPr id="1617136157" name=""/>
+                    <pic:cNvPicPr/>
+                  </pic:nvPicPr>
+                  <pic:blipFill>
+                    <a:blip r:embed="rId19"/>
+                    <a:stretch>
+                      <a:fillRect/>
+                    </a:stretch>
+                  </pic:blipFill>
+                  <pic:spPr>
+                    <a:xfrm>
+                      <a:off x="0" y="0"/>
+                      <a:ext cx="5731510" cy="4984750"/>
+                    </a:xfrm>
+                    <a:prstGeom prst="rect">
+                      <a:avLst/>
+                    </a:prstGeom>
+                  </pic:spPr>
+                </pic:pic>
+              </a:graphicData>
+            </a:graphic>
+          </wp:inline>
+        </w:drawing>
+      </w:r>
+    </w:p>
+    <w:p>
+      <w:pPr>
+        <w:pStyle w:val="Caption"/>
+      </w:pPr>
+      <w:r>
+        <w:t xml:space="preserve">Figure </w:t>
+      </w:r>
+      <w:fldSimple w:instr=" SEQ Figure \* ARABIC ">
+        <w:r>
+          <w:rPr>
+            <w:noProof/>
+          </w:rPr>
+          <w:t>12</w:t>
+        </w:r>
+      </w:fldSimple>
+      <w:r>
+        <w:t>: Example email output from the NIDS system</w:t>
+      </w:r>
+    </w:p>
+    <w:p/>
     <w:p>
       <w:pPr>
         <w:pStyle w:val="Heading2"/>
       </w:pPr>
-      <w:bookmarkStart w:id="30" w:name="_Toc226120722"/>
-      <w:r>
-        <w:lastRenderedPageBreak/>
+      <w:bookmarkStart w:id="30" w:name="_Toc226207054"/>
+      <w:r>
         <w:t>Software Engineering Principles</w:t>
       </w:r>
       <w:bookmarkEnd w:id="30"/>
@@ -6402,7 +6941,7 @@
       <w:pPr>
         <w:pStyle w:val="Heading2"/>
       </w:pPr>
-      <w:bookmarkStart w:id="31" w:name="_Toc226120723"/>
+      <w:bookmarkStart w:id="31" w:name="_Toc226207055"/>
       <w:r>
         <w:t>Implementation sprint logs</w:t>
       </w:r>
@@ -6412,7 +6951,7 @@
       <w:pPr>
         <w:pStyle w:val="Heading3"/>
       </w:pPr>
-      <w:bookmarkStart w:id="32" w:name="_Toc226120724"/>
+      <w:bookmarkStart w:id="32" w:name="_Toc226207056"/>
       <w:r>
         <w:t>Sprint 1</w:t>
       </w:r>
@@ -6462,6 +7001,7 @@
     </w:p>
     <w:p>
       <w:r>
+        <w:lastRenderedPageBreak/>
         <w:t>A number of tools have been identified that will be key for development, these tools are Jupyter Notebook for use as the main IDE for the project, Python is to be used as the main development language for the project, SK-learn for its many modules and algorithms that make AI development so effective in python, XGBoost for its ML algorithm, Pandas and NumPy for data ingestion, and UNSW NB-15 has been chosen as the dataset for training and testing the models.</w:t>
       </w:r>
     </w:p>
@@ -6541,25 +7081,10 @@
       </w:r>
     </w:p>
     <w:p>
-      <w:r>
-        <w:t>Regression, XGBoost, Linear SVM.</w:t>
-      </w:r>
-    </w:p>
-    <w:p>
-      <w:r>
-        <w:t>Research on development tools</w:t>
-      </w:r>
-    </w:p>
-    <w:p>
-      <w:r>
-        <w:t>Beginning of Accuracy Testing</w:t>
-      </w:r>
-    </w:p>
-    <w:p>
       <w:pPr>
         <w:pStyle w:val="Heading3"/>
       </w:pPr>
-      <w:bookmarkStart w:id="33" w:name="_Toc226120725"/>
+      <w:bookmarkStart w:id="33" w:name="_Toc226207057"/>
       <w:r>
         <w:t>Sprint 2</w:t>
       </w:r>
@@ -6609,7 +7134,6 @@
     </w:p>
     <w:p>
       <w:r>
-        <w:lastRenderedPageBreak/>
         <w:t>Implementation is underway, preprocessing has been completed, models have been defined and predictions have been made but accuracies of Random Forest and XGBoost suspiciously low, around 35% – 40%, cause has not been identified yet.</w:t>
       </w:r>
     </w:p>
@@ -6683,7 +7207,7 @@
       <w:pPr>
         <w:pStyle w:val="Heading3"/>
       </w:pPr>
-      <w:bookmarkStart w:id="34" w:name="_Toc226120726"/>
+      <w:bookmarkStart w:id="34" w:name="_Toc226207058"/>
       <w:r>
         <w:t xml:space="preserve">Sprint 3 </w:t>
       </w:r>
@@ -6711,6 +7235,7 @@
     </w:p>
     <w:p>
       <w:r>
+        <w:lastRenderedPageBreak/>
         <w:t>Resolve model accuracy problem encountered during previous sprint. Identify possible feature leakage.</w:t>
       </w:r>
     </w:p>
@@ -6828,7 +7353,7 @@
       <w:pPr>
         <w:pStyle w:val="Heading3"/>
       </w:pPr>
-      <w:bookmarkStart w:id="35" w:name="_Toc226120727"/>
+      <w:bookmarkStart w:id="35" w:name="_Toc226207059"/>
       <w:r>
         <w:t>Sprint 4</w:t>
       </w:r>
@@ -6881,7 +7406,6 @@
     </w:p>
     <w:p>
       <w:r>
-        <w:lastRenderedPageBreak/>
         <w:t>A new Jupyter Notebook file was made for this task to allow for easier training in the future, the same parameters were used for training the random forest model which was then saved in a .PKL file, the feature schema was also saved to be used in the development of the output and alert systems.</w:t>
       </w:r>
     </w:p>
@@ -6957,16 +7481,12 @@
       </w:r>
     </w:p>
     <w:p>
-      <w:r>
-        <w:t>Extraction of Trained model</w:t>
-      </w:r>
-    </w:p>
-    <w:p>
       <w:pPr>
         <w:pStyle w:val="Heading3"/>
       </w:pPr>
-      <w:bookmarkStart w:id="36" w:name="_Toc226120728"/>
-      <w:r>
+      <w:bookmarkStart w:id="36" w:name="_Toc226207060"/>
+      <w:r>
+        <w:lastRenderedPageBreak/>
         <w:t>Sprint 5</w:t>
       </w:r>
       <w:r>
@@ -6998,6 +7518,9 @@
       <w:r>
         <w:t>.</w:t>
       </w:r>
+      <w:r>
+        <w:t xml:space="preserve"> Results to be filtered for output by the probability gauged by the model with records over a certain percentage being included in the output.</w:t>
+      </w:r>
     </w:p>
     <w:p>
       <w:pPr>
@@ -7017,6 +7540,33 @@
       </w:r>
     </w:p>
     <w:p>
+      <w:r>
+        <w:t>A new notebook file was created for this system to make the system more modular and make it easier to maintain, the model that was saved last sprint was loaded into the notebook and preprocessing was done similar to previous sprint but issues occurred since I was not making use of the training dataset</w:t>
+      </w:r>
+      <w:r>
+        <w:t>.</w:t>
+      </w:r>
+      <w:r>
+        <w:t xml:space="preserve"> </w:t>
+      </w:r>
+    </w:p>
+    <w:p>
+      <w:r>
+        <w:t>T</w:t>
+      </w:r>
+      <w:r>
+        <w:t xml:space="preserve">here were more steps to feature alignment this time as the system started throwing errors due to column mismatch so I had to find a work around to make the system happy enough to work. </w:t>
+      </w:r>
+    </w:p>
+    <w:p>
+      <w:r>
+        <w:t>The model assigns probabilities to each record based on the risk it poses according to the model, these results are range between 0 and 1 and any record with a score of over 0.9 gets stored within the results output TXT file.</w:t>
+      </w:r>
+      <w:r>
+        <w:t xml:space="preserve"> </w:t>
+      </w:r>
+    </w:p>
+    <w:p>
       <w:pPr>
         <w:rPr>
           <w:b/>
@@ -7034,6 +7584,11 @@
       </w:r>
     </w:p>
     <w:p>
+      <w:r>
+        <w:t>The system threw errors relating to feature mismatch between what the was expecting from the columns and what it got, this is due to the columns of test and train for UNSW NB-15 being slightly different, an example of this is the srcip and dstip columns which the train set has while the test does not.</w:t>
+      </w:r>
+    </w:p>
+    <w:p>
       <w:pPr>
         <w:rPr>
           <w:b/>
@@ -7051,6 +7606,11 @@
       </w:r>
     </w:p>
     <w:p>
+      <w:r>
+        <w:t>The solution for this was to double down on feature alignment using the feature cols file that was saved from the previous sprint.</w:t>
+      </w:r>
+    </w:p>
+    <w:p>
       <w:pPr>
         <w:rPr>
           <w:b/>
@@ -7067,24 +7627,18 @@
         <w:t>Reflection and Next steps</w:t>
       </w:r>
     </w:p>
-    <w:p/>
-    <w:p>
-      <w:r>
-        <w:t>Output for IDS</w:t>
-      </w:r>
-    </w:p>
-    <w:p>
-      <w:pPr>
-        <w:pStyle w:val="Heading3"/>
-      </w:pPr>
-      <w:bookmarkStart w:id="37" w:name="_Toc226120729"/>
-      <w:r>
-        <w:t>Sprint 6</w:t>
-      </w:r>
-      <w:r>
-        <w:t xml:space="preserve"> – Email Alert System</w:t>
-      </w:r>
-      <w:bookmarkEnd w:id="37"/>
+    <w:p>
+      <w:r>
+        <w:t>This sprint highlighted the importance of ensuring that the columns of a dataset stay consistent between the split used to train and the split used to test</w:t>
+      </w:r>
+      <w:r>
+        <w:t xml:space="preserve">, especially if they are separated into separate files from the start such is the case with the UNSW-NB15 dataset. </w:t>
+      </w:r>
+    </w:p>
+    <w:p>
+      <w:r>
+        <w:t>The next step is to implement and alert system as without a way to generate alerts, an IDS poses little help, as it cant stop intrusion only detect it.</w:t>
+      </w:r>
     </w:p>
     <w:p>
       <w:pPr>
@@ -7094,234 +7648,921 @@
           <w:u w:val="single"/>
         </w:rPr>
       </w:pPr>
-      <w:r>
+    </w:p>
+    <w:p/>
+    <w:p>
+      <w:pPr>
+        <w:pStyle w:val="Heading3"/>
+      </w:pPr>
+      <w:bookmarkStart w:id="37" w:name="_Toc226207061"/>
+      <w:r>
+        <w:t>Sprint 6</w:t>
+      </w:r>
+      <w:r>
+        <w:t xml:space="preserve"> – Email Alert System</w:t>
+      </w:r>
+      <w:bookmarkEnd w:id="37"/>
+    </w:p>
+    <w:p>
+      <w:pPr>
         <w:rPr>
           <w:b/>
           <w:bCs/>
           <w:u w:val="single"/>
         </w:rPr>
-        <w:t>Objectives</w:t>
-      </w:r>
-    </w:p>
-    <w:p/>
-    <w:p>
-      <w:pPr>
+      </w:pPr>
+      <w:r>
         <w:rPr>
           <w:b/>
           <w:bCs/>
           <w:u w:val="single"/>
         </w:rPr>
-      </w:pPr>
-      <w:r>
+        <w:t>Objectives</w:t>
+      </w:r>
+    </w:p>
+    <w:p>
+      <w:r>
+        <w:t>The main objective of this sprint is to implement an email alert system that will run when predictions are made against the dataset, this is to be done through the use of smtp</w:t>
+      </w:r>
+      <w:r>
+        <w:t>.</w:t>
+      </w:r>
+    </w:p>
+    <w:p>
+      <w:pPr>
         <w:rPr>
           <w:b/>
           <w:bCs/>
           <w:u w:val="single"/>
         </w:rPr>
-        <w:t>Work done</w:t>
-      </w:r>
-    </w:p>
-    <w:p>
-      <w:pPr>
+      </w:pPr>
+      <w:r>
         <w:rPr>
           <w:b/>
           <w:bCs/>
           <w:u w:val="single"/>
         </w:rPr>
-      </w:pPr>
-      <w:r>
+        <w:t>Work done</w:t>
+      </w:r>
+    </w:p>
+    <w:p>
+      <w:r>
+        <w:lastRenderedPageBreak/>
+        <w:t>Email alert system has been implemented and tested, implemented using the SMTPlib library and through the use of googles smtp servers using an email address created for this purpose and an app password for credentials to avoid leaking the real account password.</w:t>
+      </w:r>
+    </w:p>
+    <w:p>
+      <w:pPr>
         <w:rPr>
           <w:b/>
           <w:bCs/>
           <w:u w:val="single"/>
         </w:rPr>
-        <w:t>Issues Encountered</w:t>
-      </w:r>
-    </w:p>
-    <w:p>
-      <w:pPr>
+      </w:pPr>
+      <w:r>
         <w:rPr>
           <w:b/>
           <w:bCs/>
           <w:u w:val="single"/>
         </w:rPr>
-      </w:pPr>
-      <w:r>
+        <w:t>Issues Encountered</w:t>
+      </w:r>
+    </w:p>
+    <w:p>
+      <w:r>
+        <w:t>No issues were encountered during this sprint</w:t>
+      </w:r>
+    </w:p>
+    <w:p>
+      <w:pPr>
         <w:rPr>
           <w:b/>
           <w:bCs/>
           <w:u w:val="single"/>
         </w:rPr>
-        <w:t>Solutions</w:t>
-      </w:r>
-    </w:p>
-    <w:p>
-      <w:pPr>
+      </w:pPr>
+      <w:r>
         <w:rPr>
           <w:b/>
           <w:bCs/>
           <w:u w:val="single"/>
         </w:rPr>
-      </w:pPr>
-      <w:r>
+        <w:t>Solutions</w:t>
+      </w:r>
+    </w:p>
+    <w:p>
+      <w:r>
+        <w:t>N/A</w:t>
+      </w:r>
+    </w:p>
+    <w:p>
+      <w:pPr>
         <w:rPr>
           <w:b/>
           <w:bCs/>
           <w:u w:val="single"/>
         </w:rPr>
-        <w:t>Reflection and Next steps</w:t>
-      </w:r>
-    </w:p>
-    <w:p/>
-    <w:p>
-      <w:r>
-        <w:lastRenderedPageBreak/>
-        <w:t>Email Alerts</w:t>
-      </w:r>
-    </w:p>
-    <w:p>
-      <w:pPr>
-        <w:pStyle w:val="Heading3"/>
-      </w:pPr>
-      <w:bookmarkStart w:id="38" w:name="_Toc226120730"/>
-      <w:r>
-        <w:t>Sprint 7</w:t>
-      </w:r>
-      <w:r>
-        <w:t xml:space="preserve"> – Wrap up of development</w:t>
-      </w:r>
-      <w:bookmarkEnd w:id="38"/>
-    </w:p>
-    <w:p>
-      <w:pPr>
+      </w:pPr>
+      <w:r>
         <w:rPr>
           <w:b/>
           <w:bCs/>
           <w:u w:val="single"/>
         </w:rPr>
-      </w:pPr>
-      <w:r>
+        <w:t>Reflection and Next steps</w:t>
+      </w:r>
+    </w:p>
+    <w:p>
+      <w:r>
+        <w:t>This sprint showed me how reasonable it is to code an email function and taught me how obtuse google is about allowing the creation of app passwords. The next step of implementation is to wrap up development, I have implemented all features that I consider key for the NIDS system and am happy with the state of the prototype system, Supervisor approves of winding down development.</w:t>
+      </w:r>
+    </w:p>
+    <w:p/>
+    <w:p>
+      <w:pPr>
+        <w:pStyle w:val="Heading3"/>
+      </w:pPr>
+      <w:bookmarkStart w:id="38" w:name="_Toc226207062"/>
+      <w:r>
+        <w:t>Sprint 7</w:t>
+      </w:r>
+      <w:r>
+        <w:t xml:space="preserve"> – Wrap up of development</w:t>
+      </w:r>
+      <w:bookmarkEnd w:id="38"/>
+    </w:p>
+    <w:p>
+      <w:pPr>
         <w:rPr>
           <w:b/>
           <w:bCs/>
           <w:u w:val="single"/>
         </w:rPr>
-        <w:t>Objectives</w:t>
-      </w:r>
-    </w:p>
-    <w:p>
-      <w:pPr>
+      </w:pPr>
+      <w:r>
         <w:rPr>
           <w:b/>
           <w:bCs/>
           <w:u w:val="single"/>
         </w:rPr>
-      </w:pPr>
-      <w:r>
+        <w:t>Objectives</w:t>
+      </w:r>
+    </w:p>
+    <w:p>
+      <w:r>
+        <w:t>The main objective of this sprint is to clean up as development winds to a close, another round of testing is to be completed to double check that all accuracies are accurate, and the output both through text and email are valid. Clean up comments to ensure they are easy to read and make sense.</w:t>
+      </w:r>
+    </w:p>
+    <w:p>
+      <w:pPr>
         <w:rPr>
           <w:b/>
           <w:bCs/>
           <w:u w:val="single"/>
         </w:rPr>
-        <w:t>Work done</w:t>
-      </w:r>
-    </w:p>
-    <w:p>
-      <w:pPr>
+      </w:pPr>
+      <w:r>
         <w:rPr>
           <w:b/>
           <w:bCs/>
           <w:u w:val="single"/>
         </w:rPr>
-      </w:pPr>
-      <w:r>
+        <w:t>Work done</w:t>
+      </w:r>
+    </w:p>
+    <w:p>
+      <w:r>
+        <w:t xml:space="preserve">Testing has been completed, all systems produce the expected outputs, the accuracies from model accuracy testing </w:t>
+      </w:r>
+      <w:r>
+        <w:t>are within expectations, both outputs systems output the expected outputs, there are some false positives within output but that is within expectations.</w:t>
+      </w:r>
+    </w:p>
+    <w:p>
+      <w:pPr>
         <w:rPr>
           <w:b/>
           <w:bCs/>
           <w:u w:val="single"/>
         </w:rPr>
-        <w:t>Issues Encountered</w:t>
-      </w:r>
-    </w:p>
-    <w:p>
-      <w:pPr>
+      </w:pPr>
+      <w:r>
         <w:rPr>
           <w:b/>
           <w:bCs/>
           <w:u w:val="single"/>
         </w:rPr>
-      </w:pPr>
-      <w:r>
+        <w:t>Issues Encountered</w:t>
+      </w:r>
+    </w:p>
+    <w:p>
+      <w:r>
+        <w:t>No issues were encountered during testing and validation.</w:t>
+      </w:r>
+    </w:p>
+    <w:p>
+      <w:pPr>
         <w:rPr>
           <w:b/>
           <w:bCs/>
           <w:u w:val="single"/>
         </w:rPr>
-        <w:t>Solutions</w:t>
-      </w:r>
-    </w:p>
-    <w:p>
-      <w:pPr>
+      </w:pPr>
+      <w:r>
         <w:rPr>
           <w:b/>
           <w:bCs/>
           <w:u w:val="single"/>
         </w:rPr>
-      </w:pPr>
-      <w:r>
+        <w:t>Solutions</w:t>
+      </w:r>
+    </w:p>
+    <w:p>
+      <w:r>
+        <w:t>N/A</w:t>
+      </w:r>
+    </w:p>
+    <w:p>
+      <w:pPr>
         <w:rPr>
           <w:b/>
           <w:bCs/>
           <w:u w:val="single"/>
         </w:rPr>
+      </w:pPr>
+      <w:r>
+        <w:rPr>
+          <w:b/>
+          <w:bCs/>
+          <w:u w:val="single"/>
+        </w:rPr>
         <w:t>Reflection and Next steps</w:t>
       </w:r>
     </w:p>
+    <w:p>
+      <w:r>
+        <w:t>With development coming to a close, it has allowed me to reflect on the whole of development and the interesting journey it has been especially as I had little prior experience with AI development outside of the AI module during 2</w:t>
+      </w:r>
+      <w:r>
+        <w:rPr>
+          <w:vertAlign w:val="superscript"/>
+        </w:rPr>
+        <w:t>nd</w:t>
+      </w:r>
+      <w:r>
+        <w:t xml:space="preserve"> year. </w:t>
+      </w:r>
+    </w:p>
+    <w:p>
+      <w:r>
+        <w:t>The next steps of the project as a whole are to continue work outside of development, poster and report and the other tasks yet to be completed.</w:t>
+      </w:r>
+    </w:p>
     <w:p/>
     <w:p>
-      <w:r>
-        <w:t>End of Development</w:t>
-      </w:r>
-    </w:p>
-    <w:p>
       <w:pPr>
         <w:pStyle w:val="Heading1"/>
       </w:pPr>
-      <w:bookmarkStart w:id="39" w:name="_Toc226120731"/>
-      <w:r>
-        <w:t>End of Project Report</w:t>
+      <w:bookmarkStart w:id="39" w:name="_Toc226207063"/>
+      <w:r>
+        <w:lastRenderedPageBreak/>
+        <w:t>Testing and Validation</w:t>
       </w:r>
       <w:bookmarkEnd w:id="39"/>
     </w:p>
     <w:p>
       <w:pPr>
+        <w:pStyle w:val="Heading2"/>
+      </w:pPr>
+      <w:bookmarkStart w:id="40" w:name="_Toc226207064"/>
+      <w:r>
+        <w:t>Testing</w:t>
+      </w:r>
+      <w:bookmarkEnd w:id="40"/>
+    </w:p>
+    <w:p>
+      <w:r>
+        <w:t>Testing during implementation was done as each notebook was developed, this was made easier through the use of Jupyter notebooks cells as each cell can be run individually making testing simpler</w:t>
+      </w:r>
+      <w:r>
+        <w:t>, allowing for incremental component testing throughout development</w:t>
+      </w:r>
+      <w:r>
+        <w:t>.</w:t>
+      </w:r>
+    </w:p>
+    <w:p>
+      <w:r>
+        <w:t xml:space="preserve">During the implementation of the model accuracy testing notebook, testing discovered the accuracy problem that was described during the implementation section of this report. </w:t>
+      </w:r>
+    </w:p>
+    <w:p>
+      <w:r>
+        <w:t xml:space="preserve">Due to the ongoing nature of testing during the implementation, </w:t>
+      </w:r>
+      <w:r>
+        <w:t>at the end of development, a round of system wide testing was conducted testing all systems including the model accuracy, model training and extraction, and the output and alert systems.</w:t>
+      </w:r>
+    </w:p>
+    <w:p/>
+    <w:p>
+      <w:pPr>
+        <w:pStyle w:val="Heading2"/>
+      </w:pPr>
+      <w:bookmarkStart w:id="41" w:name="_Toc226207065"/>
+      <w:r>
+        <w:t>Output Validation</w:t>
+      </w:r>
+      <w:bookmarkEnd w:id="41"/>
+    </w:p>
+    <w:p>
+      <w:r>
+        <w:t>With how key the output is for a NIDS, making sure that the information outputted by the system is valid was key, the results were validated by including the attack_cat column in the output, the use of this column allowed analysis to see if the predictions made by the system were accurate and while there were a number of false positives within the output which while unfortunate was expected due to the nature of machine learning, the output was accurate to expectation with a high levels of true positives within the output.</w:t>
+      </w:r>
+      <w:r>
+        <w:t xml:space="preserve"> </w:t>
+      </w:r>
+    </w:p>
+    <w:p>
+      <w:r>
+        <w:t>While this validation process has shown the model is effective against this dataset, its performance in live settings may vary due to the variance in traffic patterns between the dataset it was trained against and the real world traffic data.</w:t>
+      </w:r>
+    </w:p>
+    <w:p>
+      <w:pPr>
         <w:pStyle w:val="Heading1"/>
       </w:pPr>
-      <w:bookmarkStart w:id="40" w:name="_Toc226120732"/>
-      <w:r>
-        <w:t>Project Post-Mortem</w:t>
-      </w:r>
-      <w:bookmarkEnd w:id="40"/>
+      <w:bookmarkStart w:id="42" w:name="_Toc226207066"/>
+      <w:r>
+        <w:t>Discussion and Critical Evaluation</w:t>
+      </w:r>
+      <w:bookmarkEnd w:id="42"/>
+    </w:p>
+    <w:p>
+      <w:pPr>
+        <w:pStyle w:val="Heading2"/>
+      </w:pPr>
+      <w:bookmarkStart w:id="43" w:name="_Toc226207067"/>
+      <w:r>
+        <w:t>System Performance</w:t>
+      </w:r>
+      <w:bookmarkEnd w:id="43"/>
+    </w:p>
+    <w:p>
+      <w:r>
+        <w:t>The performance of the system has met the expectations that were set when this project with two models hitting 90% accuracy during accuracy testing providing a strong base to move onto implementation of the rest of this project, this allowed for strong predictions to be used in the output and alert systems</w:t>
+      </w:r>
+      <w:r>
+        <w:t>. Below are a copy of the results to refresh the memory of the readers</w:t>
+      </w:r>
+    </w:p>
+    <w:tbl>
+      <w:tblPr>
+        <w:tblStyle w:val="TableGrid"/>
+        <w:tblW w:w="0" w:type="auto"/>
+        <w:tblLook w:val="04A0" w:firstRow="1" w:lastRow="0" w:firstColumn="1" w:lastColumn="0" w:noHBand="0" w:noVBand="1"/>
+      </w:tblPr>
+      <w:tblGrid>
+        <w:gridCol w:w="1803"/>
+        <w:gridCol w:w="1803"/>
+        <w:gridCol w:w="1803"/>
+        <w:gridCol w:w="1803"/>
+        <w:gridCol w:w="1804"/>
+      </w:tblGrid>
+      <w:tr>
+        <w:tc>
+          <w:tcPr>
+            <w:tcW w:w="1803" w:type="dxa"/>
+          </w:tcPr>
+          <w:p>
+            <w:pPr>
+              <w:rPr>
+                <w:b/>
+                <w:bCs/>
+                <w:u w:val="single"/>
+              </w:rPr>
+            </w:pPr>
+            <w:r>
+              <w:rPr>
+                <w:b/>
+                <w:bCs/>
+                <w:u w:val="single"/>
+              </w:rPr>
+              <w:t>Model</w:t>
+            </w:r>
+          </w:p>
+        </w:tc>
+        <w:tc>
+          <w:tcPr>
+            <w:tcW w:w="1803" w:type="dxa"/>
+          </w:tcPr>
+          <w:p>
+            <w:pPr>
+              <w:rPr>
+                <w:b/>
+                <w:bCs/>
+                <w:u w:val="single"/>
+              </w:rPr>
+            </w:pPr>
+            <w:r>
+              <w:rPr>
+                <w:b/>
+                <w:bCs/>
+                <w:u w:val="single"/>
+              </w:rPr>
+              <w:t>Accuracy</w:t>
+            </w:r>
+          </w:p>
+        </w:tc>
+        <w:tc>
+          <w:tcPr>
+            <w:tcW w:w="1803" w:type="dxa"/>
+          </w:tcPr>
+          <w:p>
+            <w:pPr>
+              <w:rPr>
+                <w:b/>
+                <w:bCs/>
+                <w:u w:val="single"/>
+              </w:rPr>
+            </w:pPr>
+            <w:r>
+              <w:rPr>
+                <w:b/>
+                <w:bCs/>
+                <w:u w:val="single"/>
+              </w:rPr>
+              <w:t>Recall</w:t>
+            </w:r>
+          </w:p>
+        </w:tc>
+        <w:tc>
+          <w:tcPr>
+            <w:tcW w:w="1803" w:type="dxa"/>
+          </w:tcPr>
+          <w:p>
+            <w:pPr>
+              <w:rPr>
+                <w:b/>
+                <w:bCs/>
+                <w:u w:val="single"/>
+              </w:rPr>
+            </w:pPr>
+            <w:r>
+              <w:rPr>
+                <w:b/>
+                <w:bCs/>
+                <w:u w:val="single"/>
+              </w:rPr>
+              <w:t>Precision</w:t>
+            </w:r>
+          </w:p>
+        </w:tc>
+        <w:tc>
+          <w:tcPr>
+            <w:tcW w:w="1804" w:type="dxa"/>
+          </w:tcPr>
+          <w:p>
+            <w:pPr>
+              <w:rPr>
+                <w:b/>
+                <w:bCs/>
+                <w:u w:val="single"/>
+              </w:rPr>
+            </w:pPr>
+            <w:r>
+              <w:rPr>
+                <w:b/>
+                <w:bCs/>
+                <w:u w:val="single"/>
+              </w:rPr>
+              <w:t>F1</w:t>
+            </w:r>
+          </w:p>
+        </w:tc>
+      </w:tr>
+      <w:tr>
+        <w:tc>
+          <w:tcPr>
+            <w:tcW w:w="1803" w:type="dxa"/>
+          </w:tcPr>
+          <w:p>
+            <w:r>
+              <w:t>Random Forest</w:t>
+            </w:r>
+          </w:p>
+        </w:tc>
+        <w:tc>
+          <w:tcPr>
+            <w:tcW w:w="1803" w:type="dxa"/>
+          </w:tcPr>
+          <w:p>
+            <w:r>
+              <w:t>0.9099</w:t>
+            </w:r>
+          </w:p>
+        </w:tc>
+        <w:tc>
+          <w:tcPr>
+            <w:tcW w:w="1803" w:type="dxa"/>
+          </w:tcPr>
+          <w:p>
+            <w:r>
+              <w:t>0.9683</w:t>
+            </w:r>
+          </w:p>
+        </w:tc>
+        <w:tc>
+          <w:tcPr>
+            <w:tcW w:w="1803" w:type="dxa"/>
+          </w:tcPr>
+          <w:p>
+            <w:r>
+              <w:t>0.8801</w:t>
+            </w:r>
+          </w:p>
+        </w:tc>
+        <w:tc>
+          <w:tcPr>
+            <w:tcW w:w="1804" w:type="dxa"/>
+          </w:tcPr>
+          <w:p>
+            <w:r>
+              <w:t>0.9221</w:t>
+            </w:r>
+          </w:p>
+        </w:tc>
+      </w:tr>
+      <w:tr>
+        <w:tc>
+          <w:tcPr>
+            <w:tcW w:w="1803" w:type="dxa"/>
+          </w:tcPr>
+          <w:p>
+            <w:r>
+              <w:t>XGBoost</w:t>
+            </w:r>
+          </w:p>
+        </w:tc>
+        <w:tc>
+          <w:tcPr>
+            <w:tcW w:w="1803" w:type="dxa"/>
+          </w:tcPr>
+          <w:p>
+            <w:r>
+              <w:t>0.9081</w:t>
+            </w:r>
+          </w:p>
+        </w:tc>
+        <w:tc>
+          <w:tcPr>
+            <w:tcW w:w="1803" w:type="dxa"/>
+          </w:tcPr>
+          <w:p>
+            <w:r>
+              <w:t>0.9646</w:t>
+            </w:r>
+          </w:p>
+        </w:tc>
+        <w:tc>
+          <w:tcPr>
+            <w:tcW w:w="1803" w:type="dxa"/>
+          </w:tcPr>
+          <w:p>
+            <w:r>
+              <w:t>0.8800</w:t>
+            </w:r>
+          </w:p>
+        </w:tc>
+        <w:tc>
+          <w:tcPr>
+            <w:tcW w:w="1804" w:type="dxa"/>
+          </w:tcPr>
+          <w:p>
+            <w:r>
+              <w:t>0.9203</w:t>
+            </w:r>
+          </w:p>
+        </w:tc>
+      </w:tr>
+      <w:tr>
+        <w:tc>
+          <w:tcPr>
+            <w:tcW w:w="1803" w:type="dxa"/>
+          </w:tcPr>
+          <w:p>
+            <w:r>
+              <w:t>KNN</w:t>
+            </w:r>
+          </w:p>
+        </w:tc>
+        <w:tc>
+          <w:tcPr>
+            <w:tcW w:w="1803" w:type="dxa"/>
+          </w:tcPr>
+          <w:p>
+            <w:r>
+              <w:t>0.7855</w:t>
+            </w:r>
+          </w:p>
+        </w:tc>
+        <w:tc>
+          <w:tcPr>
+            <w:tcW w:w="1803" w:type="dxa"/>
+          </w:tcPr>
+          <w:p>
+            <w:r>
+              <w:t>0.9423</w:t>
+            </w:r>
+          </w:p>
+        </w:tc>
+        <w:tc>
+          <w:tcPr>
+            <w:tcW w:w="1803" w:type="dxa"/>
+          </w:tcPr>
+          <w:p>
+            <w:r>
+              <w:t>0.7395</w:t>
+            </w:r>
+          </w:p>
+        </w:tc>
+        <w:tc>
+          <w:tcPr>
+            <w:tcW w:w="1804" w:type="dxa"/>
+          </w:tcPr>
+          <w:p>
+            <w:r>
+              <w:t>0.8287</w:t>
+            </w:r>
+          </w:p>
+        </w:tc>
+      </w:tr>
+      <w:tr>
+        <w:tc>
+          <w:tcPr>
+            <w:tcW w:w="1803" w:type="dxa"/>
+          </w:tcPr>
+          <w:p>
+            <w:r>
+              <w:t>Logistic Regression</w:t>
+            </w:r>
+          </w:p>
+        </w:tc>
+        <w:tc>
+          <w:tcPr>
+            <w:tcW w:w="1803" w:type="dxa"/>
+          </w:tcPr>
+          <w:p>
+            <w:r>
+              <w:t>0.7277</w:t>
+            </w:r>
+          </w:p>
+        </w:tc>
+        <w:tc>
+          <w:tcPr>
+            <w:tcW w:w="1803" w:type="dxa"/>
+          </w:tcPr>
+          <w:p>
+            <w:r>
+              <w:t>0.7556</w:t>
+            </w:r>
+          </w:p>
+        </w:tc>
+        <w:tc>
+          <w:tcPr>
+            <w:tcW w:w="1803" w:type="dxa"/>
+          </w:tcPr>
+          <w:p>
+            <w:r>
+              <w:t>0.7513</w:t>
+            </w:r>
+          </w:p>
+        </w:tc>
+        <w:tc>
+          <w:tcPr>
+            <w:tcW w:w="1804" w:type="dxa"/>
+          </w:tcPr>
+          <w:p>
+            <w:r>
+              <w:t>0.7534</w:t>
+            </w:r>
+          </w:p>
+        </w:tc>
+      </w:tr>
+      <w:tr>
+        <w:tc>
+          <w:tcPr>
+            <w:tcW w:w="1803" w:type="dxa"/>
+          </w:tcPr>
+          <w:p>
+            <w:r>
+              <w:t>Linear SVM</w:t>
+            </w:r>
+          </w:p>
+        </w:tc>
+        <w:tc>
+          <w:tcPr>
+            <w:tcW w:w="1803" w:type="dxa"/>
+          </w:tcPr>
+          <w:p>
+            <w:r>
+              <w:t>0.7184</w:t>
+            </w:r>
+          </w:p>
+        </w:tc>
+        <w:tc>
+          <w:tcPr>
+            <w:tcW w:w="1803" w:type="dxa"/>
+          </w:tcPr>
+          <w:p>
+            <w:r>
+              <w:t>0.8712</w:t>
+            </w:r>
+          </w:p>
+        </w:tc>
+        <w:tc>
+          <w:tcPr>
+            <w:tcW w:w="1803" w:type="dxa"/>
+          </w:tcPr>
+          <w:p>
+            <w:r>
+              <w:t>0.6948</w:t>
+            </w:r>
+          </w:p>
+        </w:tc>
+        <w:tc>
+          <w:tcPr>
+            <w:tcW w:w="1804" w:type="dxa"/>
+          </w:tcPr>
+          <w:p>
+            <w:r>
+              <w:t>0.7731</w:t>
+            </w:r>
+          </w:p>
+        </w:tc>
+      </w:tr>
+    </w:tbl>
+    <w:p/>
+    <w:p>
+      <w:r>
+        <w:t>The output of the prototype have met expectations and both function fully in both text based output and email alert output with both passing testing and output validation.</w:t>
+      </w:r>
+    </w:p>
+    <w:p>
+      <w:pPr>
+        <w:pStyle w:val="Heading2"/>
+      </w:pPr>
+      <w:bookmarkStart w:id="44" w:name="_Toc226207068"/>
+      <w:r>
+        <w:lastRenderedPageBreak/>
+        <w:t>Strengths of System</w:t>
+      </w:r>
+      <w:bookmarkEnd w:id="44"/>
+    </w:p>
+    <w:p>
+      <w:r>
+        <w:t>What does the system do well</w:t>
+      </w:r>
+    </w:p>
+    <w:p>
+      <w:r>
+        <w:t xml:space="preserve">There are a number of strengths of this system, one of the main being its modularity, this allows for easy customization of models and allows for quick retraining and extraction based on the changes made, the contents of the results and alerts are also easily altered, allowing for changes in what columns are included for context, or how strict the output filtering is by changing the threshold. </w:t>
+      </w:r>
+    </w:p>
+    <w:p>
+      <w:r>
+        <w:t>Another strength of the system are its reasonable training requirements compared to some other systems which use over tuned models that use more computational power than required</w:t>
+      </w:r>
+      <w:r>
+        <w:t>. T</w:t>
+      </w:r>
+      <w:r>
+        <w:t xml:space="preserve">he computation power needed to run this system is reduced again due to extraction of a </w:t>
+      </w:r>
+      <w:r>
+        <w:t>pre-trained model meaning that you can run predictions on multiple devices while only needing to train the model once by saving it to a PKL file.</w:t>
+      </w:r>
+    </w:p>
+    <w:p>
+      <w:pPr>
+        <w:pStyle w:val="Heading2"/>
+      </w:pPr>
+      <w:bookmarkStart w:id="45" w:name="_Toc226207069"/>
+      <w:r>
+        <w:t>Limitations</w:t>
+      </w:r>
+      <w:bookmarkEnd w:id="45"/>
+    </w:p>
+    <w:p>
+      <w:r>
+        <w:t>Where could it be improved</w:t>
+      </w:r>
+    </w:p>
+    <w:p>
+      <w:pPr>
+        <w:pStyle w:val="Heading2"/>
+      </w:pPr>
+      <w:bookmarkStart w:id="46" w:name="_Toc226207070"/>
+      <w:r>
+        <w:t>Comparison against existing systems</w:t>
+      </w:r>
+      <w:bookmarkEnd w:id="46"/>
+    </w:p>
+    <w:p>
+      <w:r>
+        <w:t>How does my system compare to traditional systems</w:t>
+      </w:r>
+    </w:p>
+    <w:p>
+      <w:pPr>
+        <w:pStyle w:val="Heading2"/>
+      </w:pPr>
+      <w:bookmarkStart w:id="47" w:name="_Toc226207071"/>
+      <w:r>
+        <w:t>Evaluation against aims and objectives.</w:t>
+      </w:r>
+      <w:bookmarkEnd w:id="47"/>
+    </w:p>
+    <w:p>
+      <w:r>
+        <w:t>How well have I met my aims and objectives</w:t>
+      </w:r>
     </w:p>
     <w:p>
       <w:pPr>
         <w:pStyle w:val="Heading1"/>
       </w:pPr>
-      <w:bookmarkStart w:id="41" w:name="_Toc226120733"/>
-      <w:r>
-        <w:t>Conclusions</w:t>
-      </w:r>
-      <w:bookmarkEnd w:id="41"/>
+      <w:bookmarkStart w:id="48" w:name="_Toc226207072"/>
+      <w:r>
+        <w:t>Conclusion</w:t>
+      </w:r>
+      <w:bookmarkEnd w:id="48"/>
+    </w:p>
+    <w:p>
+      <w:r>
+        <w:t>What I built</w:t>
+      </w:r>
+    </w:p>
+    <w:p>
+      <w:r>
+        <w:t>What have I achieved</w:t>
+      </w:r>
+    </w:p>
+    <w:p>
+      <w:r>
+        <w:t>What are my findings</w:t>
+      </w:r>
+    </w:p>
+    <w:p>
+      <w:r>
+        <w:t>Overall successes</w:t>
+      </w:r>
     </w:p>
     <w:p>
       <w:pPr>
         <w:pStyle w:val="Heading1"/>
       </w:pPr>
-      <w:bookmarkStart w:id="42" w:name="_Toc226120734"/>
-      <w:r>
+      <w:bookmarkStart w:id="49" w:name="_Toc226207073"/>
+      <w:r>
+        <w:t>Future work</w:t>
+      </w:r>
+      <w:bookmarkEnd w:id="49"/>
+    </w:p>
+    <w:p>
+      <w:r>
+        <w:t>Features that could be added in future</w:t>
+      </w:r>
+    </w:p>
+    <w:p>
+      <w:r>
+        <w:t>24/7 running</w:t>
+      </w:r>
+    </w:p>
+    <w:p>
+      <w:r>
+        <w:t>Move it from Jupyter to python</w:t>
+      </w:r>
+    </w:p>
+    <w:p>
+      <w:r>
+        <w:t>Increase accuracy</w:t>
+      </w:r>
+    </w:p>
+    <w:p>
+      <w:r>
+        <w:t>Possible use of deep learning</w:t>
+      </w:r>
+    </w:p>
+    <w:p>
+      <w:pPr>
+        <w:pStyle w:val="Heading1"/>
+      </w:pPr>
+      <w:bookmarkStart w:id="50" w:name="_Toc226207074"/>
+      <w:r>
+        <w:lastRenderedPageBreak/>
         <w:t>References</w:t>
       </w:r>
-      <w:bookmarkEnd w:id="42"/>
+      <w:bookmarkEnd w:id="50"/>
     </w:p>
     <w:p>
       <w:r>
@@ -7336,7 +8577,7 @@
       <w:r>
         <w:t xml:space="preserve">. Available at </w:t>
       </w:r>
-      <w:hyperlink r:id="rId19" w:history="1">
+      <w:hyperlink r:id="rId20" w:history="1">
         <w:r>
           <w:rPr>
             <w:rStyle w:val="Hyperlink"/>
@@ -7352,7 +8593,7 @@
       <w:r>
         <w:t xml:space="preserve">UK Public Cyber Crime Incidents Rise 37% Over Five Years. Available at: </w:t>
       </w:r>
-      <w:hyperlink r:id="rId20" w:history="1">
+      <w:hyperlink r:id="rId21" w:history="1">
         <w:r>
           <w:rPr>
             <w:rStyle w:val="Hyperlink"/>
@@ -7378,26 +8619,6 @@
       <w:r>
         <w:t>, 15(7), p. 243. Available at: https://www.mdpi.com/1999-5903/15/7/243</w:t>
       </w:r>
-    </w:p>
-    <w:p>
-      <w:pPr>
-        <w:pStyle w:val="Heading1"/>
-      </w:pPr>
-      <w:bookmarkStart w:id="43" w:name="_Toc226120735"/>
-      <w:r>
-        <w:t>Appendix</w:t>
-      </w:r>
-      <w:bookmarkEnd w:id="43"/>
-    </w:p>
-    <w:p>
-      <w:pPr>
-        <w:pStyle w:val="Heading2"/>
-      </w:pPr>
-      <w:bookmarkStart w:id="44" w:name="_Toc226120736"/>
-      <w:r>
-        <w:t>Sprint Logs</w:t>
-      </w:r>
-      <w:bookmarkEnd w:id="44"/>
     </w:p>
     <w:p/>
     <w:p/>
@@ -8253,7 +9474,7 @@
   <w:style w:type="paragraph" w:default="1" w:styleId="Normal">
     <w:name w:val="Normal"/>
     <w:qFormat/>
-    <w:rsid w:val="00FB1E2E"/>
+    <w:rsid w:val="0045708F"/>
   </w:style>
   <w:style w:type="paragraph" w:styleId="Heading1">
     <w:name w:val="heading 1"/>

</xml_diff>

<commit_message>
Limitations and comparison to traditional systems completed, evaluation against  aims and objectives next then conclusion and future work
</commit_message>
<xml_diff>
--- a/COMP 3000.docx
+++ b/COMP 3000.docx
@@ -4183,15 +4183,7 @@
     </w:p>
     <w:p>
       <w:r>
-        <w:t xml:space="preserve">As cybercrime grows ever more profitable and with the incident rate of </w:t>
-      </w:r>
-      <w:proofErr w:type="spellStart"/>
-      <w:r>
-        <w:t>cyber crime</w:t>
-      </w:r>
-      <w:proofErr w:type="spellEnd"/>
-      <w:r>
-        <w:t xml:space="preserve"> rising by 37% over the past five years (Bridewell, 2026), the different attack types and vectors continue to evolve, with attackers modifying previously used techniques or developing new attacks using exploits not commonly known, meaning that the signature-based system can’t be updated to detect these attacks. This creates big problems for signature-based systems as attacks that haven’t yet been seen may bypass the detection systems.</w:t>
+        <w:t>As cybercrime grows ever more profitable and with the incident rate of cyber crime rising by 37% over the past five years (Bridewell, 2026), the different attack types and vectors continue to evolve, with attackers modifying previously used techniques or developing new attacks using exploits not commonly known, meaning that the signature-based system can’t be updated to detect these attacks. This creates big problems for signature-based systems as attacks that haven’t yet been seen may bypass the detection systems.</w:t>
       </w:r>
     </w:p>
     <w:p>
@@ -4571,15 +4563,7 @@
     </w:p>
     <w:p>
       <w:r>
-        <w:t xml:space="preserve">The only ethical consideration for this project that I can think is how the data for training has been obtained, have I gathered it in a shady manner, </w:t>
-      </w:r>
-      <w:proofErr w:type="spellStart"/>
-      <w:r>
-        <w:t>through</w:t>
-      </w:r>
-      <w:proofErr w:type="spellEnd"/>
-      <w:r>
-        <w:t xml:space="preserve"> not being clear on my intentions</w:t>
+        <w:t>The only ethical consideration for this project that I can think is how the data for training has been obtained, have I gathered it in a shady manner, through not being clear on my intentions</w:t>
       </w:r>
       <w:r>
         <w:t xml:space="preserve"> in the gathering of data. No, in this project the data has been ethically sourced through the University of New South Wales as they provide the UNSW NB-15 dataset for free for academic usage which this project falls under.</w:t>
@@ -4595,15 +4579,7 @@
     </w:p>
     <w:p>
       <w:r>
-        <w:t xml:space="preserve">This is doubly so due to its nature as </w:t>
-      </w:r>
-      <w:proofErr w:type="spellStart"/>
-      <w:r>
-        <w:t>a</w:t>
-      </w:r>
-      <w:proofErr w:type="spellEnd"/>
-      <w:r>
-        <w:t xml:space="preserve"> Intrusion Detection system, rather than an Intrusion Prevention System, as by itself, an IDS system can do nothing about the intrusion attempts but alert an analyst or user.</w:t>
+        <w:t>This is doubly so due to its nature as a Intrusion Detection system, rather than an Intrusion Prevention System, as by itself, an IDS system can do nothing about the intrusion attempts but alert an analyst or user.</w:t>
       </w:r>
     </w:p>
     <w:p/>
@@ -4687,15 +4663,7 @@
     </w:p>
     <w:p>
       <w:r>
-        <w:t xml:space="preserve">These examples show that while there are possible alternatives to the agile methodology that </w:t>
-      </w:r>
-      <w:proofErr w:type="spellStart"/>
-      <w:r>
-        <w:t>ive</w:t>
-      </w:r>
-      <w:proofErr w:type="spellEnd"/>
-      <w:r>
-        <w:t xml:space="preserve"> chosen, they don’t fit the project as well as they all produce either a rigidness that would cripple the project if problems </w:t>
+        <w:t xml:space="preserve">These examples show that while there are possible alternatives to the agile methodology that ive chosen, they don’t fit the project as well as they all produce either a rigidness that would cripple the project if problems </w:t>
       </w:r>
       <w:r>
         <w:t>occur or</w:t>
@@ -4834,14 +4802,27 @@
       <w:r>
         <w:t xml:space="preserve">Figure </w:t>
       </w:r>
-      <w:fldSimple w:instr=" SEQ Figure \* ARABIC ">
-        <w:r>
-          <w:rPr>
-            <w:noProof/>
-          </w:rPr>
-          <w:t>1</w:t>
-        </w:r>
-      </w:fldSimple>
+      <w:r>
+        <w:fldChar w:fldCharType="begin"/>
+      </w:r>
+      <w:r>
+        <w:instrText xml:space="preserve"> SEQ Figure \* ARABIC </w:instrText>
+      </w:r>
+      <w:r>
+        <w:fldChar w:fldCharType="separate"/>
+      </w:r>
+      <w:r>
+        <w:rPr>
+          <w:noProof/>
+        </w:rPr>
+        <w:t>1</w:t>
+      </w:r>
+      <w:r>
+        <w:rPr>
+          <w:noProof/>
+        </w:rPr>
+        <w:fldChar w:fldCharType="end"/>
+      </w:r>
       <w:r>
         <w:t>: Pipeline diagram for the ML system</w:t>
       </w:r>
@@ -5236,15 +5217,7 @@
     </w:p>
     <w:p>
       <w:r>
-        <w:t xml:space="preserve">For this project, a range of python libraries were use to implement the features set out in the aims and objectives earlier in the report, in the bullet points below, I will </w:t>
-      </w:r>
-      <w:proofErr w:type="spellStart"/>
-      <w:r>
-        <w:t>layout</w:t>
-      </w:r>
-      <w:proofErr w:type="spellEnd"/>
-      <w:r>
-        <w:t xml:space="preserve"> how and why each library was used.</w:t>
+        <w:t>For this project, a range of python libraries were use to implement the features set out in the aims and objectives earlier in the report, in the bullet points below, I will layout how and why each library was used.</w:t>
       </w:r>
     </w:p>
     <w:p>
@@ -5294,7 +5267,6 @@
           <w:numId w:val="2"/>
         </w:numPr>
       </w:pPr>
-      <w:proofErr w:type="spellStart"/>
       <w:r>
         <w:rPr>
           <w:b/>
@@ -5302,7 +5274,6 @@
         </w:rPr>
         <w:t>JobLib</w:t>
       </w:r>
-      <w:proofErr w:type="spellEnd"/>
       <w:r>
         <w:t>: This was used in order to dump the model and feature columns from python to  a PKL file to allow for usage within other Jupyter notebook files without having to retrain the model, saving a considerable amount of time.</w:t>
       </w:r>
@@ -5315,7 +5286,6 @@
           <w:numId w:val="2"/>
         </w:numPr>
       </w:pPr>
-      <w:proofErr w:type="spellStart"/>
       <w:r>
         <w:rPr>
           <w:b/>
@@ -5323,7 +5293,6 @@
         </w:rPr>
         <w:t>SMTPLib</w:t>
       </w:r>
-      <w:proofErr w:type="spellEnd"/>
       <w:r>
         <w:t>: This was used in order to implement email alerts, allowing the users to be informed if suspicious behaviour has been detected within the traffic log files.</w:t>
       </w:r>
@@ -5442,14 +5411,27 @@
       <w:r>
         <w:t xml:space="preserve">Figure </w:t>
       </w:r>
-      <w:fldSimple w:instr=" SEQ Figure \* ARABIC ">
-        <w:r>
-          <w:rPr>
-            <w:noProof/>
-          </w:rPr>
-          <w:t>2</w:t>
-        </w:r>
-      </w:fldSimple>
+      <w:r>
+        <w:fldChar w:fldCharType="begin"/>
+      </w:r>
+      <w:r>
+        <w:instrText xml:space="preserve"> SEQ Figure \* ARABIC </w:instrText>
+      </w:r>
+      <w:r>
+        <w:fldChar w:fldCharType="separate"/>
+      </w:r>
+      <w:r>
+        <w:rPr>
+          <w:noProof/>
+        </w:rPr>
+        <w:t>2</w:t>
+      </w:r>
+      <w:r>
+        <w:rPr>
+          <w:noProof/>
+        </w:rPr>
+        <w:fldChar w:fldCharType="end"/>
+      </w:r>
       <w:r>
         <w:t>:Dependency Imports and Dataset Loading for Accuracy Testing</w:t>
       </w:r>
@@ -5516,14 +5498,27 @@
       <w:r>
         <w:t xml:space="preserve">Figure </w:t>
       </w:r>
-      <w:fldSimple w:instr=" SEQ Figure \* ARABIC ">
-        <w:r>
-          <w:rPr>
-            <w:noProof/>
-          </w:rPr>
-          <w:t>3</w:t>
-        </w:r>
-      </w:fldSimple>
+      <w:r>
+        <w:fldChar w:fldCharType="begin"/>
+      </w:r>
+      <w:r>
+        <w:instrText xml:space="preserve"> SEQ Figure \* ARABIC </w:instrText>
+      </w:r>
+      <w:r>
+        <w:fldChar w:fldCharType="separate"/>
+      </w:r>
+      <w:r>
+        <w:rPr>
+          <w:noProof/>
+        </w:rPr>
+        <w:t>3</w:t>
+      </w:r>
+      <w:r>
+        <w:rPr>
+          <w:noProof/>
+        </w:rPr>
+        <w:fldChar w:fldCharType="end"/>
+      </w:r>
       <w:r>
         <w:t>:Dropping features to prevent leaks</w:t>
       </w:r>
@@ -5602,14 +5597,27 @@
       <w:r>
         <w:t xml:space="preserve">Figure </w:t>
       </w:r>
-      <w:fldSimple w:instr=" SEQ Figure \* ARABIC ">
-        <w:r>
-          <w:rPr>
-            <w:noProof/>
-          </w:rPr>
-          <w:t>4</w:t>
-        </w:r>
-      </w:fldSimple>
+      <w:r>
+        <w:fldChar w:fldCharType="begin"/>
+      </w:r>
+      <w:r>
+        <w:instrText xml:space="preserve"> SEQ Figure \* ARABIC </w:instrText>
+      </w:r>
+      <w:r>
+        <w:fldChar w:fldCharType="separate"/>
+      </w:r>
+      <w:r>
+        <w:rPr>
+          <w:noProof/>
+        </w:rPr>
+        <w:t>4</w:t>
+      </w:r>
+      <w:r>
+        <w:rPr>
+          <w:noProof/>
+        </w:rPr>
+        <w:fldChar w:fldCharType="end"/>
+      </w:r>
       <w:r>
         <w:t xml:space="preserve">: Data Pre-processing and feature </w:t>
       </w:r>
@@ -6126,14 +6134,27 @@
       <w:r>
         <w:t xml:space="preserve">Figure </w:t>
       </w:r>
-      <w:fldSimple w:instr=" SEQ Figure \* ARABIC ">
-        <w:r>
-          <w:rPr>
-            <w:noProof/>
-          </w:rPr>
-          <w:t>5</w:t>
-        </w:r>
-      </w:fldSimple>
+      <w:r>
+        <w:fldChar w:fldCharType="begin"/>
+      </w:r>
+      <w:r>
+        <w:instrText xml:space="preserve"> SEQ Figure \* ARABIC </w:instrText>
+      </w:r>
+      <w:r>
+        <w:fldChar w:fldCharType="separate"/>
+      </w:r>
+      <w:r>
+        <w:rPr>
+          <w:noProof/>
+        </w:rPr>
+        <w:t>5</w:t>
+      </w:r>
+      <w:r>
+        <w:rPr>
+          <w:noProof/>
+        </w:rPr>
+        <w:fldChar w:fldCharType="end"/>
+      </w:r>
       <w:r>
         <w:t>: Results code and Results from predictions against testing split</w:t>
       </w:r>
@@ -6207,13 +6228,8 @@
       <w:r>
         <w:t xml:space="preserve">For use in the next step of implementation, I saved the feature columns to a list to be saved and extracted with the model. As detailed previously, the model was trained again using the same parameters, then making use of the </w:t>
       </w:r>
-      <w:proofErr w:type="spellStart"/>
-      <w:r>
-        <w:t>JobLib</w:t>
-      </w:r>
-      <w:proofErr w:type="spellEnd"/>
-      <w:r>
-        <w:t xml:space="preserve"> </w:t>
+      <w:r>
+        <w:t xml:space="preserve">JobLib </w:t>
       </w:r>
       <w:r>
         <w:t>library, the model and feature columns were dumped into two separate PKL files and saved to my PC</w:t>
@@ -6305,27 +6321,11 @@
     <w:p/>
     <w:p>
       <w:r>
-        <w:t xml:space="preserve">With the model and feature schema saved to a </w:t>
-      </w:r>
-      <w:proofErr w:type="spellStart"/>
-      <w:r>
-        <w:t>pkl</w:t>
-      </w:r>
-      <w:proofErr w:type="spellEnd"/>
-      <w:r>
-        <w:t xml:space="preserve"> file, the implementation of an output system for the NIDS could begin. To start, I made a new Jupyter notebook file, my reasoning for splitting the code for this project into three different files is that it makes the code easier to process mentally since all the code is in documents that describe what its purpose is clearly, it also </w:t>
+        <w:t xml:space="preserve">With the model and feature schema saved to a pkl file, the implementation of an output system for the NIDS could begin. To start, I made a new Jupyter notebook file, my reasoning for splitting the code for this project into three different files is that it makes the code easier to process mentally since all the code is in documents that describe what its purpose is clearly, it also </w:t>
       </w:r>
       <w:r>
         <w:lastRenderedPageBreak/>
-        <w:t xml:space="preserve">reduces the computational overhead if the python kernel that it is running on needs to be reset for </w:t>
-      </w:r>
-      <w:proofErr w:type="spellStart"/>
-      <w:r>
-        <w:t>what ever</w:t>
-      </w:r>
-      <w:proofErr w:type="spellEnd"/>
-      <w:r>
-        <w:t xml:space="preserve"> reason, which would require me to run all cells of the notebook again, taking both time and computational resources.</w:t>
+        <w:t>reduces the computational overhead if the python kernel that it is running on needs to be reset for what ever reason, which would require me to run all cells of the notebook again, taking both time and computational resources.</w:t>
       </w:r>
     </w:p>
     <w:p>
@@ -6396,14 +6396,27 @@
       <w:r>
         <w:t xml:space="preserve">Figure </w:t>
       </w:r>
-      <w:fldSimple w:instr=" SEQ Figure \* ARABIC ">
-        <w:r>
-          <w:rPr>
-            <w:noProof/>
-          </w:rPr>
-          <w:t>6</w:t>
-        </w:r>
-      </w:fldSimple>
+      <w:r>
+        <w:fldChar w:fldCharType="begin"/>
+      </w:r>
+      <w:r>
+        <w:instrText xml:space="preserve"> SEQ Figure \* ARABIC </w:instrText>
+      </w:r>
+      <w:r>
+        <w:fldChar w:fldCharType="separate"/>
+      </w:r>
+      <w:r>
+        <w:rPr>
+          <w:noProof/>
+        </w:rPr>
+        <w:t>6</w:t>
+      </w:r>
+      <w:r>
+        <w:rPr>
+          <w:noProof/>
+        </w:rPr>
+        <w:fldChar w:fldCharType="end"/>
+      </w:r>
       <w:r>
         <w:t>: Implementation of Feature Alignment</w:t>
       </w:r>
@@ -6483,14 +6496,27 @@
       <w:r>
         <w:t xml:space="preserve">Figure </w:t>
       </w:r>
-      <w:fldSimple w:instr=" SEQ Figure \* ARABIC ">
-        <w:r>
-          <w:rPr>
-            <w:noProof/>
-          </w:rPr>
-          <w:t>7</w:t>
-        </w:r>
-      </w:fldSimple>
+      <w:r>
+        <w:fldChar w:fldCharType="begin"/>
+      </w:r>
+      <w:r>
+        <w:instrText xml:space="preserve"> SEQ Figure \* ARABIC </w:instrText>
+      </w:r>
+      <w:r>
+        <w:fldChar w:fldCharType="separate"/>
+      </w:r>
+      <w:r>
+        <w:rPr>
+          <w:noProof/>
+        </w:rPr>
+        <w:t>7</w:t>
+      </w:r>
+      <w:r>
+        <w:rPr>
+          <w:noProof/>
+        </w:rPr>
+        <w:fldChar w:fldCharType="end"/>
+      </w:r>
       <w:r>
         <w:t>: Columns preserved for context for output.</w:t>
       </w:r>
@@ -6559,14 +6585,27 @@
       <w:r>
         <w:t xml:space="preserve">Figure </w:t>
       </w:r>
-      <w:fldSimple w:instr=" SEQ Figure \* ARABIC ">
-        <w:r>
-          <w:rPr>
-            <w:noProof/>
-          </w:rPr>
-          <w:t>8</w:t>
-        </w:r>
-      </w:fldSimple>
+      <w:r>
+        <w:fldChar w:fldCharType="begin"/>
+      </w:r>
+      <w:r>
+        <w:instrText xml:space="preserve"> SEQ Figure \* ARABIC </w:instrText>
+      </w:r>
+      <w:r>
+        <w:fldChar w:fldCharType="separate"/>
+      </w:r>
+      <w:r>
+        <w:rPr>
+          <w:noProof/>
+        </w:rPr>
+        <w:t>8</w:t>
+      </w:r>
+      <w:r>
+        <w:rPr>
+          <w:noProof/>
+        </w:rPr>
+        <w:fldChar w:fldCharType="end"/>
+      </w:r>
       <w:r>
         <w:t>: Code for outputting suspicious code to a .TXT file.</w:t>
       </w:r>
@@ -6587,15 +6626,7 @@
         <w:t xml:space="preserve">The email alert system makes use of the same backbone that the TXT output system makes use of, namely the risk score, but instead </w:t>
       </w:r>
       <w:r>
-        <w:t xml:space="preserve">of outputting through text, this system makes use of the </w:t>
-      </w:r>
-      <w:proofErr w:type="spellStart"/>
-      <w:r>
-        <w:t>SMTPLib</w:t>
-      </w:r>
-      <w:proofErr w:type="spellEnd"/>
-      <w:r>
-        <w:t xml:space="preserve"> library to function and googles smtp server to </w:t>
+        <w:t xml:space="preserve">of outputting through text, this system makes use of the SMTPLib library to function and googles smtp server to </w:t>
       </w:r>
       <w:r>
         <w:t>send</w:t>
@@ -6678,14 +6709,27 @@
       <w:r>
         <w:t xml:space="preserve">Figure </w:t>
       </w:r>
-      <w:fldSimple w:instr=" SEQ Figure \* ARABIC ">
-        <w:r>
-          <w:rPr>
-            <w:noProof/>
-          </w:rPr>
-          <w:t>9</w:t>
-        </w:r>
-      </w:fldSimple>
+      <w:r>
+        <w:fldChar w:fldCharType="begin"/>
+      </w:r>
+      <w:r>
+        <w:instrText xml:space="preserve"> SEQ Figure \* ARABIC </w:instrText>
+      </w:r>
+      <w:r>
+        <w:fldChar w:fldCharType="separate"/>
+      </w:r>
+      <w:r>
+        <w:rPr>
+          <w:noProof/>
+        </w:rPr>
+        <w:t>9</w:t>
+      </w:r>
+      <w:r>
+        <w:rPr>
+          <w:noProof/>
+        </w:rPr>
+        <w:fldChar w:fldCharType="end"/>
+      </w:r>
       <w:r>
         <w:t>: Code to configure credentials and basic contents [Password hidden for security purposes]</w:t>
       </w:r>
@@ -6693,15 +6737,7 @@
     <w:p>
       <w:r>
         <w:lastRenderedPageBreak/>
-        <w:t xml:space="preserve">After this was to implement the proper body of the email, this started by establishing an alert summary variable that would display a few rows of the data in the email , to show the analyst an example of the scores the data has achieved to inspire urgent action. This was done as the test data set contains no </w:t>
-      </w:r>
-      <w:proofErr w:type="spellStart"/>
-      <w:r>
-        <w:t>ip</w:t>
-      </w:r>
-      <w:proofErr w:type="spellEnd"/>
-      <w:r>
-        <w:t xml:space="preserve"> addresses limiting the sensitivity of the information of the dataset while this can be helpful in this setting, it is a definite limitation of the dataset. </w:t>
+        <w:t xml:space="preserve">After this was to implement the proper body of the email, this started by establishing an alert summary variable that would display a few rows of the data in the email , to show the analyst an example of the scores the data has achieved to inspire urgent action. This was done as the test data set contains no ip addresses limiting the sensitivity of the information of the dataset while this can be helpful in this setting, it is a definite limitation of the dataset. </w:t>
       </w:r>
     </w:p>
     <w:p>
@@ -6761,14 +6797,27 @@
       <w:r>
         <w:t xml:space="preserve">Figure </w:t>
       </w:r>
-      <w:fldSimple w:instr=" SEQ Figure \* ARABIC ">
-        <w:r>
-          <w:rPr>
-            <w:noProof/>
-          </w:rPr>
-          <w:t>10</w:t>
-        </w:r>
-      </w:fldSimple>
+      <w:r>
+        <w:fldChar w:fldCharType="begin"/>
+      </w:r>
+      <w:r>
+        <w:instrText xml:space="preserve"> SEQ Figure \* ARABIC </w:instrText>
+      </w:r>
+      <w:r>
+        <w:fldChar w:fldCharType="separate"/>
+      </w:r>
+      <w:r>
+        <w:rPr>
+          <w:noProof/>
+        </w:rPr>
+        <w:t>10</w:t>
+      </w:r>
+      <w:r>
+        <w:rPr>
+          <w:noProof/>
+        </w:rPr>
+        <w:fldChar w:fldCharType="end"/>
+      </w:r>
       <w:r>
         <w:t>: Content of Email body code.</w:t>
       </w:r>
@@ -6830,14 +6879,27 @@
       <w:r>
         <w:t xml:space="preserve">Figure </w:t>
       </w:r>
-      <w:fldSimple w:instr=" SEQ Figure \* ARABIC ">
-        <w:r>
-          <w:rPr>
-            <w:noProof/>
-          </w:rPr>
-          <w:t>11</w:t>
-        </w:r>
-      </w:fldSimple>
+      <w:r>
+        <w:fldChar w:fldCharType="begin"/>
+      </w:r>
+      <w:r>
+        <w:instrText xml:space="preserve"> SEQ Figure \* ARABIC </w:instrText>
+      </w:r>
+      <w:r>
+        <w:fldChar w:fldCharType="separate"/>
+      </w:r>
+      <w:r>
+        <w:rPr>
+          <w:noProof/>
+        </w:rPr>
+        <w:t>11</w:t>
+      </w:r>
+      <w:r>
+        <w:rPr>
+          <w:noProof/>
+        </w:rPr>
+        <w:fldChar w:fldCharType="end"/>
+      </w:r>
       <w:r>
         <w:t>: Code for sending an automated email through SMTP.</w:t>
       </w:r>
@@ -6858,6 +6920,9 @@
         <w:keepNext/>
       </w:pPr>
       <w:r>
+        <w:rPr>
+          <w:noProof/>
+        </w:rPr>
         <w:lastRenderedPageBreak/>
         <w:drawing>
           <wp:inline distT="0" distB="0" distL="0" distR="0" wp14:anchorId="065C14AE" wp14:editId="110618B5">
@@ -6903,14 +6968,27 @@
       <w:r>
         <w:t xml:space="preserve">Figure </w:t>
       </w:r>
-      <w:fldSimple w:instr=" SEQ Figure \* ARABIC ">
-        <w:r>
-          <w:rPr>
-            <w:noProof/>
-          </w:rPr>
-          <w:t>12</w:t>
-        </w:r>
-      </w:fldSimple>
+      <w:r>
+        <w:fldChar w:fldCharType="begin"/>
+      </w:r>
+      <w:r>
+        <w:instrText xml:space="preserve"> SEQ Figure \* ARABIC </w:instrText>
+      </w:r>
+      <w:r>
+        <w:fldChar w:fldCharType="separate"/>
+      </w:r>
+      <w:r>
+        <w:rPr>
+          <w:noProof/>
+        </w:rPr>
+        <w:t>12</w:t>
+      </w:r>
+      <w:r>
+        <w:rPr>
+          <w:noProof/>
+        </w:rPr>
+        <w:fldChar w:fldCharType="end"/>
+      </w:r>
       <w:r>
         <w:t>: Example email output from the NIDS system</w:t>
       </w:r>
@@ -8013,7 +8091,23 @@
         <w:t>The performance of the system has met the expectations that were set when this project with two models hitting 90% accuracy during accuracy testing providing a strong base to move onto implementation of the rest of this project, this allowed for strong predictions to be used in the output and alert systems</w:t>
       </w:r>
       <w:r>
-        <w:t>. Below are a copy of the results to refresh the memory of the readers</w:t>
+        <w:t>.</w:t>
+      </w:r>
+    </w:p>
+    <w:p>
+      <w:r>
+        <w:t>Random forest was chosen as the main model to be used for predictions due to its higher recall rate compared to XGBoost, this is due to recall being very important in intrusion detection systems as failing to identify malicious traffic can result in attacks going undetected</w:t>
+      </w:r>
+      <w:r>
+        <w:t>, a high recall score indicates strong detection performance, with random forest scoring 0.9683 and xgboost scoring 0.9646, making Random Forest the stronger choice for this system.</w:t>
+      </w:r>
+    </w:p>
+    <w:p>
+      <w:r>
+        <w:t>Below are a copy of the results to refresh the memory of the readers</w:t>
+      </w:r>
+      <w:r>
+        <w:t>.</w:t>
       </w:r>
     </w:p>
     <w:tbl>
@@ -8304,6 +8398,7 @@
           </w:tcPr>
           <w:p>
             <w:r>
+              <w:lastRenderedPageBreak/>
               <w:t>Logistic Regression</w:t>
             </w:r>
           </w:p>
@@ -8414,69 +8509,117 @@
       </w:pPr>
       <w:bookmarkStart w:id="44" w:name="_Toc226207068"/>
       <w:r>
+        <w:t>Strengths of System</w:t>
+      </w:r>
+      <w:bookmarkEnd w:id="44"/>
+    </w:p>
+    <w:p>
+      <w:r>
+        <w:t xml:space="preserve">There are a number of strengths of this system, one of the main being its modularity, this allows for easy customization of models and allows for quick retraining and extraction based on the changes made, the contents of the results and alerts are also easily altered, allowing for changes in what columns are included for context, or how strict the output filtering is by changing the threshold. </w:t>
+      </w:r>
+    </w:p>
+    <w:p>
+      <w:r>
+        <w:t>Another strength of the system are its reasonable training requirements compared to some other systems which use over tuned models that use more computational power than required</w:t>
+      </w:r>
+      <w:r>
+        <w:t>. T</w:t>
+      </w:r>
+      <w:r>
+        <w:t xml:space="preserve">he computation power needed to run this system is reduced again due to extraction of a </w:t>
+      </w:r>
+      <w:r>
+        <w:t>pre-trained model meaning that you can run predictions on multiple devices while only needing to train the model once by saving it to a PKL file.</w:t>
+      </w:r>
+    </w:p>
+    <w:p>
+      <w:pPr>
+        <w:pStyle w:val="Heading2"/>
+      </w:pPr>
+      <w:bookmarkStart w:id="45" w:name="_Toc226207069"/>
+      <w:r>
+        <w:t>Limitations</w:t>
+      </w:r>
+      <w:bookmarkEnd w:id="45"/>
+    </w:p>
+    <w:p>
+      <w:r>
+        <w:t>While the system operates at the level matching the original expectations set at the start of this project and all features set out in the objectives have been implemented successfully, there is room for improvement in the system, one of the key examples of this is that it in its current form as a set of Jupyter notebook files, it isn’t able to continuously run which in the real world would be a serious detriment but isn’t too serious in the context of this project due to its academic nature but is a area for future improvement.</w:t>
+      </w:r>
+    </w:p>
+    <w:p>
+      <w:r>
+        <w:t>The system is also unable to capture real time traffic to work against which can be key to real  world systems, this was left out intentionally due to possibility that it could be used to monitor network traffic unlawfully, while this can be achieved using publicly available tools such as Wireshark, I felt it was best to leave it out of this system.</w:t>
+      </w:r>
+    </w:p>
+    <w:p>
+      <w:r>
+        <w:t>Then there is one of the key limitations for this project, the dataset, this is described as a limitation due to its nature as a synthetic dataset, along with some feature issues I encountered during the implementation of this projects system</w:t>
+      </w:r>
+      <w:r>
+        <w:t>.</w:t>
+      </w:r>
+    </w:p>
+    <w:p>
+      <w:r>
+        <w:t>Synthetic datasets while can be very useful in training in models such as its use in this project, if there is real world data available it is better to use the real data due to increased amount of edge cases that assist anomaly detections which NIDS tends to makes use of</w:t>
+      </w:r>
+      <w:r>
+        <w:t xml:space="preserve">. </w:t>
+      </w:r>
+    </w:p>
+    <w:p>
+      <w:r>
+        <w:t>The specific dataset used is this project has its own limitations the main limitation that I noticed during the development was the lack of IP fields in the pre-prepared testing split, though it is possible this was done to avoid bias due to IP.</w:t>
+      </w:r>
+    </w:p>
+    <w:p>
+      <w:r>
+        <w:t xml:space="preserve">The final limitation that will be mentioned applies to all ML models but can have more critical effect in the area of intrusion detection, the limitation is false results, both positive and negative results can have disastrous results in intrusion detection, with false negatives not catching </w:t>
+      </w:r>
+      <w:r>
         <w:lastRenderedPageBreak/>
-        <w:t>Strengths of System</w:t>
-      </w:r>
-      <w:bookmarkEnd w:id="44"/>
-    </w:p>
-    <w:p>
-      <w:r>
-        <w:t>What does the system do well</w:t>
-      </w:r>
-    </w:p>
-    <w:p>
-      <w:r>
-        <w:t xml:space="preserve">There are a number of strengths of this system, one of the main being its modularity, this allows for easy customization of models and allows for quick retraining and extraction based on the changes made, the contents of the results and alerts are also easily altered, allowing for changes in what columns are included for context, or how strict the output filtering is by changing the threshold. </w:t>
-      </w:r>
-    </w:p>
-    <w:p>
-      <w:r>
-        <w:t>Another strength of the system are its reasonable training requirements compared to some other systems which use over tuned models that use more computational power than required</w:t>
-      </w:r>
-      <w:r>
-        <w:t>. T</w:t>
-      </w:r>
-      <w:r>
-        <w:t xml:space="preserve">he computation power needed to run this system is reduced again due to extraction of a </w:t>
-      </w:r>
-      <w:r>
-        <w:t>pre-trained model meaning that you can run predictions on multiple devices while only needing to train the model once by saving it to a PKL file.</w:t>
+        <w:t>malicious traffic and false positives creating more work for the analysts managing the system, leading them down a rabbit hole that distracts from actual malicious traffic.</w:t>
       </w:r>
     </w:p>
     <w:p>
       <w:pPr>
         <w:pStyle w:val="Heading2"/>
       </w:pPr>
-      <w:bookmarkStart w:id="45" w:name="_Toc226207069"/>
-      <w:r>
-        <w:t>Limitations</w:t>
-      </w:r>
-      <w:bookmarkEnd w:id="45"/>
-    </w:p>
-    <w:p>
-      <w:r>
-        <w:t>Where could it be improved</w:t>
+      <w:bookmarkStart w:id="46" w:name="_Toc226207070"/>
+      <w:r>
+        <w:t>Comparison against existing systems</w:t>
+      </w:r>
+      <w:bookmarkEnd w:id="46"/>
+    </w:p>
+    <w:p>
+      <w:r>
+        <w:t>The issue that arises when trying to compare AI NIDS to traditional versions is that they operate</w:t>
+      </w:r>
+      <w:r>
+        <w:t xml:space="preserve"> with completely different detection methods,</w:t>
+      </w:r>
+      <w:r>
+        <w:t xml:space="preserve"> with the AI systems working through traffic pattern anomaly detection, and the traditional systems working by detecting known signatures in the traffic patterns as has been mentioned previously in this report. </w:t>
+      </w:r>
+      <w:r>
+        <w:t xml:space="preserve">Tradition systems tend to have higher overall true positives with reduced false positives due to their expansive signature databases but struggle heavily with new attacks that hasn’t been added to the systems yet. </w:t>
+      </w:r>
+    </w:p>
+    <w:p>
+      <w:r>
+        <w:t>Whereas the AI systems can deal with new attacks due to their anomaly based detection methods have, but tend to have higher false positive rates which increases the work load on analysts and shows one of the main limitations of only using ML based detection.</w:t>
+      </w:r>
+    </w:p>
+    <w:p>
+      <w:r>
+        <w:t>As a result of the drawbacks of both version, the most effective method of intrusion detection tends to be a hybrid approach making use of both signature-based and anomaly-based, which is what I would consider the most likely use of my system would be if it went into a live system, with its high recall, it would make a strong component of a hybrid detection system.</w:t>
       </w:r>
     </w:p>
     <w:p>
       <w:pPr>
         <w:pStyle w:val="Heading2"/>
       </w:pPr>
-      <w:bookmarkStart w:id="46" w:name="_Toc226207070"/>
-      <w:r>
-        <w:t>Comparison against existing systems</w:t>
-      </w:r>
-      <w:bookmarkEnd w:id="46"/>
-    </w:p>
-    <w:p>
-      <w:r>
-        <w:t>How does my system compare to traditional systems</w:t>
-      </w:r>
-    </w:p>
-    <w:p>
-      <w:pPr>
-        <w:pStyle w:val="Heading2"/>
-      </w:pPr>
       <w:bookmarkStart w:id="47" w:name="_Toc226207071"/>
       <w:r>
         <w:t>Evaluation against aims and objectives.</w:t>
@@ -8488,6 +8631,7 @@
         <w:t>How well have I met my aims and objectives</w:t>
       </w:r>
     </w:p>
+    <w:p/>
     <w:p>
       <w:pPr>
         <w:pStyle w:val="Heading1"/>
@@ -8537,10 +8681,8 @@
       <w:r>
         <w:t>24/7 running</w:t>
       </w:r>
-    </w:p>
-    <w:p>
-      <w:r>
-        <w:t>Move it from Jupyter to python</w:t>
+      <w:r>
+        <w:t xml:space="preserve"> / Move it from Jupyter to python</w:t>
       </w:r>
     </w:p>
     <w:p>
@@ -8559,7 +8701,6 @@
       </w:pPr>
       <w:bookmarkStart w:id="50" w:name="_Toc226207074"/>
       <w:r>
-        <w:lastRenderedPageBreak/>
         <w:t>References</w:t>
       </w:r>
       <w:bookmarkEnd w:id="50"/>
@@ -8591,6 +8732,7 @@
     </w:p>
     <w:p>
       <w:r>
+        <w:lastRenderedPageBreak/>
         <w:t xml:space="preserve">UK Public Cyber Crime Incidents Rise 37% Over Five Years. Available at: </w:t>
       </w:r>
       <w:hyperlink r:id="rId21" w:history="1">

</xml_diff>

<commit_message>
Report mostly completed, abstract and acknowledgement to be completed along with a final check for sanity and spelling
</commit_message>
<xml_diff>
--- a/COMP 3000.docx
+++ b/COMP 3000.docx
@@ -268,7 +268,7 @@
           <w:r>
             <w:fldChar w:fldCharType="separate"/>
           </w:r>
-          <w:hyperlink w:anchor="_Toc226207024" w:history="1">
+          <w:hyperlink w:anchor="_Toc226373358" w:history="1">
             <w:r>
               <w:rPr>
                 <w:rStyle w:val="Hyperlink"/>
@@ -295,7 +295,7 @@
                 <w:noProof/>
                 <w:webHidden/>
               </w:rPr>
-              <w:instrText xml:space="preserve"> PAGEREF _Toc226207024 \h </w:instrText>
+              <w:instrText xml:space="preserve"> PAGEREF _Toc226373358 \h </w:instrText>
             </w:r>
             <w:r>
               <w:rPr>
@@ -342,7 +342,7 @@
               <w14:ligatures w14:val="standardContextual"/>
             </w:rPr>
           </w:pPr>
-          <w:hyperlink w:anchor="_Toc226207025" w:history="1">
+          <w:hyperlink w:anchor="_Toc226373359" w:history="1">
             <w:r>
               <w:rPr>
                 <w:rStyle w:val="Hyperlink"/>
@@ -369,7 +369,7 @@
                 <w:noProof/>
                 <w:webHidden/>
               </w:rPr>
-              <w:instrText xml:space="preserve"> PAGEREF _Toc226207025 \h </w:instrText>
+              <w:instrText xml:space="preserve"> PAGEREF _Toc226373359 \h </w:instrText>
             </w:r>
             <w:r>
               <w:rPr>
@@ -416,7 +416,7 @@
               <w14:ligatures w14:val="standardContextual"/>
             </w:rPr>
           </w:pPr>
-          <w:hyperlink w:anchor="_Toc226207026" w:history="1">
+          <w:hyperlink w:anchor="_Toc226373360" w:history="1">
             <w:r>
               <w:rPr>
                 <w:rStyle w:val="Hyperlink"/>
@@ -443,7 +443,7 @@
                 <w:noProof/>
                 <w:webHidden/>
               </w:rPr>
-              <w:instrText xml:space="preserve"> PAGEREF _Toc226207026 \h </w:instrText>
+              <w:instrText xml:space="preserve"> PAGEREF _Toc226373360 \h </w:instrText>
             </w:r>
             <w:r>
               <w:rPr>
@@ -490,7 +490,7 @@
               <w14:ligatures w14:val="standardContextual"/>
             </w:rPr>
           </w:pPr>
-          <w:hyperlink w:anchor="_Toc226207027" w:history="1">
+          <w:hyperlink w:anchor="_Toc226373361" w:history="1">
             <w:r>
               <w:rPr>
                 <w:rStyle w:val="Hyperlink"/>
@@ -517,7 +517,7 @@
                 <w:noProof/>
                 <w:webHidden/>
               </w:rPr>
-              <w:instrText xml:space="preserve"> PAGEREF _Toc226207027 \h </w:instrText>
+              <w:instrText xml:space="preserve"> PAGEREF _Toc226373361 \h </w:instrText>
             </w:r>
             <w:r>
               <w:rPr>
@@ -564,7 +564,7 @@
               <w14:ligatures w14:val="standardContextual"/>
             </w:rPr>
           </w:pPr>
-          <w:hyperlink w:anchor="_Toc226207028" w:history="1">
+          <w:hyperlink w:anchor="_Toc226373362" w:history="1">
             <w:r>
               <w:rPr>
                 <w:rStyle w:val="Hyperlink"/>
@@ -591,7 +591,7 @@
                 <w:noProof/>
                 <w:webHidden/>
               </w:rPr>
-              <w:instrText xml:space="preserve"> PAGEREF _Toc226207028 \h </w:instrText>
+              <w:instrText xml:space="preserve"> PAGEREF _Toc226373362 \h </w:instrText>
             </w:r>
             <w:r>
               <w:rPr>
@@ -638,7 +638,7 @@
               <w14:ligatures w14:val="standardContextual"/>
             </w:rPr>
           </w:pPr>
-          <w:hyperlink w:anchor="_Toc226207029" w:history="1">
+          <w:hyperlink w:anchor="_Toc226373363" w:history="1">
             <w:r>
               <w:rPr>
                 <w:rStyle w:val="Hyperlink"/>
@@ -665,7 +665,7 @@
                 <w:noProof/>
                 <w:webHidden/>
               </w:rPr>
-              <w:instrText xml:space="preserve"> PAGEREF _Toc226207029 \h </w:instrText>
+              <w:instrText xml:space="preserve"> PAGEREF _Toc226373363 \h </w:instrText>
             </w:r>
             <w:r>
               <w:rPr>
@@ -712,7 +712,7 @@
               <w14:ligatures w14:val="standardContextual"/>
             </w:rPr>
           </w:pPr>
-          <w:hyperlink w:anchor="_Toc226207030" w:history="1">
+          <w:hyperlink w:anchor="_Toc226373364" w:history="1">
             <w:r>
               <w:rPr>
                 <w:rStyle w:val="Hyperlink"/>
@@ -739,7 +739,7 @@
                 <w:noProof/>
                 <w:webHidden/>
               </w:rPr>
-              <w:instrText xml:space="preserve"> PAGEREF _Toc226207030 \h </w:instrText>
+              <w:instrText xml:space="preserve"> PAGEREF _Toc226373364 \h </w:instrText>
             </w:r>
             <w:r>
               <w:rPr>
@@ -786,7 +786,7 @@
               <w14:ligatures w14:val="standardContextual"/>
             </w:rPr>
           </w:pPr>
-          <w:hyperlink w:anchor="_Toc226207031" w:history="1">
+          <w:hyperlink w:anchor="_Toc226373365" w:history="1">
             <w:r>
               <w:rPr>
                 <w:rStyle w:val="Hyperlink"/>
@@ -813,7 +813,7 @@
                 <w:noProof/>
                 <w:webHidden/>
               </w:rPr>
-              <w:instrText xml:space="preserve"> PAGEREF _Toc226207031 \h </w:instrText>
+              <w:instrText xml:space="preserve"> PAGEREF _Toc226373365 \h </w:instrText>
             </w:r>
             <w:r>
               <w:rPr>
@@ -860,7 +860,7 @@
               <w14:ligatures w14:val="standardContextual"/>
             </w:rPr>
           </w:pPr>
-          <w:hyperlink w:anchor="_Toc226207032" w:history="1">
+          <w:hyperlink w:anchor="_Toc226373366" w:history="1">
             <w:r>
               <w:rPr>
                 <w:rStyle w:val="Hyperlink"/>
@@ -887,7 +887,7 @@
                 <w:noProof/>
                 <w:webHidden/>
               </w:rPr>
-              <w:instrText xml:space="preserve"> PAGEREF _Toc226207032 \h </w:instrText>
+              <w:instrText xml:space="preserve"> PAGEREF _Toc226373366 \h </w:instrText>
             </w:r>
             <w:r>
               <w:rPr>
@@ -934,7 +934,7 @@
               <w14:ligatures w14:val="standardContextual"/>
             </w:rPr>
           </w:pPr>
-          <w:hyperlink w:anchor="_Toc226207033" w:history="1">
+          <w:hyperlink w:anchor="_Toc226373367" w:history="1">
             <w:r>
               <w:rPr>
                 <w:rStyle w:val="Hyperlink"/>
@@ -961,7 +961,7 @@
                 <w:noProof/>
                 <w:webHidden/>
               </w:rPr>
-              <w:instrText xml:space="preserve"> PAGEREF _Toc226207033 \h </w:instrText>
+              <w:instrText xml:space="preserve"> PAGEREF _Toc226373367 \h </w:instrText>
             </w:r>
             <w:r>
               <w:rPr>
@@ -1008,7 +1008,7 @@
               <w14:ligatures w14:val="standardContextual"/>
             </w:rPr>
           </w:pPr>
-          <w:hyperlink w:anchor="_Toc226207034" w:history="1">
+          <w:hyperlink w:anchor="_Toc226373368" w:history="1">
             <w:r>
               <w:rPr>
                 <w:rStyle w:val="Hyperlink"/>
@@ -1035,7 +1035,7 @@
                 <w:noProof/>
                 <w:webHidden/>
               </w:rPr>
-              <w:instrText xml:space="preserve"> PAGEREF _Toc226207034 \h </w:instrText>
+              <w:instrText xml:space="preserve"> PAGEREF _Toc226373368 \h </w:instrText>
             </w:r>
             <w:r>
               <w:rPr>
@@ -1082,7 +1082,7 @@
               <w14:ligatures w14:val="standardContextual"/>
             </w:rPr>
           </w:pPr>
-          <w:hyperlink w:anchor="_Toc226207035" w:history="1">
+          <w:hyperlink w:anchor="_Toc226373369" w:history="1">
             <w:r>
               <w:rPr>
                 <w:rStyle w:val="Hyperlink"/>
@@ -1109,7 +1109,7 @@
                 <w:noProof/>
                 <w:webHidden/>
               </w:rPr>
-              <w:instrText xml:space="preserve"> PAGEREF _Toc226207035 \h </w:instrText>
+              <w:instrText xml:space="preserve"> PAGEREF _Toc226373369 \h </w:instrText>
             </w:r>
             <w:r>
               <w:rPr>
@@ -1156,7 +1156,7 @@
               <w14:ligatures w14:val="standardContextual"/>
             </w:rPr>
           </w:pPr>
-          <w:hyperlink w:anchor="_Toc226207036" w:history="1">
+          <w:hyperlink w:anchor="_Toc226373370" w:history="1">
             <w:r>
               <w:rPr>
                 <w:rStyle w:val="Hyperlink"/>
@@ -1183,7 +1183,7 @@
                 <w:noProof/>
                 <w:webHidden/>
               </w:rPr>
-              <w:instrText xml:space="preserve"> PAGEREF _Toc226207036 \h </w:instrText>
+              <w:instrText xml:space="preserve"> PAGEREF _Toc226373370 \h </w:instrText>
             </w:r>
             <w:r>
               <w:rPr>
@@ -1230,7 +1230,7 @@
               <w14:ligatures w14:val="standardContextual"/>
             </w:rPr>
           </w:pPr>
-          <w:hyperlink w:anchor="_Toc226207037" w:history="1">
+          <w:hyperlink w:anchor="_Toc226373371" w:history="1">
             <w:r>
               <w:rPr>
                 <w:rStyle w:val="Hyperlink"/>
@@ -1257,7 +1257,7 @@
                 <w:noProof/>
                 <w:webHidden/>
               </w:rPr>
-              <w:instrText xml:space="preserve"> PAGEREF _Toc226207037 \h </w:instrText>
+              <w:instrText xml:space="preserve"> PAGEREF _Toc226373371 \h </w:instrText>
             </w:r>
             <w:r>
               <w:rPr>
@@ -1304,7 +1304,7 @@
               <w14:ligatures w14:val="standardContextual"/>
             </w:rPr>
           </w:pPr>
-          <w:hyperlink w:anchor="_Toc226207038" w:history="1">
+          <w:hyperlink w:anchor="_Toc226373372" w:history="1">
             <w:r>
               <w:rPr>
                 <w:rStyle w:val="Hyperlink"/>
@@ -1331,7 +1331,7 @@
                 <w:noProof/>
                 <w:webHidden/>
               </w:rPr>
-              <w:instrText xml:space="preserve"> PAGEREF _Toc226207038 \h </w:instrText>
+              <w:instrText xml:space="preserve"> PAGEREF _Toc226373372 \h </w:instrText>
             </w:r>
             <w:r>
               <w:rPr>
@@ -1378,7 +1378,7 @@
               <w14:ligatures w14:val="standardContextual"/>
             </w:rPr>
           </w:pPr>
-          <w:hyperlink w:anchor="_Toc226207039" w:history="1">
+          <w:hyperlink w:anchor="_Toc226373373" w:history="1">
             <w:r>
               <w:rPr>
                 <w:rStyle w:val="Hyperlink"/>
@@ -1405,7 +1405,7 @@
                 <w:noProof/>
                 <w:webHidden/>
               </w:rPr>
-              <w:instrText xml:space="preserve"> PAGEREF _Toc226207039 \h </w:instrText>
+              <w:instrText xml:space="preserve"> PAGEREF _Toc226373373 \h </w:instrText>
             </w:r>
             <w:r>
               <w:rPr>
@@ -1452,7 +1452,7 @@
               <w14:ligatures w14:val="standardContextual"/>
             </w:rPr>
           </w:pPr>
-          <w:hyperlink w:anchor="_Toc226207040" w:history="1">
+          <w:hyperlink w:anchor="_Toc226373374" w:history="1">
             <w:r>
               <w:rPr>
                 <w:rStyle w:val="Hyperlink"/>
@@ -1479,7 +1479,7 @@
                 <w:noProof/>
                 <w:webHidden/>
               </w:rPr>
-              <w:instrText xml:space="preserve"> PAGEREF _Toc226207040 \h </w:instrText>
+              <w:instrText xml:space="preserve"> PAGEREF _Toc226373374 \h </w:instrText>
             </w:r>
             <w:r>
               <w:rPr>
@@ -1526,7 +1526,7 @@
               <w14:ligatures w14:val="standardContextual"/>
             </w:rPr>
           </w:pPr>
-          <w:hyperlink w:anchor="_Toc226207041" w:history="1">
+          <w:hyperlink w:anchor="_Toc226373375" w:history="1">
             <w:r>
               <w:rPr>
                 <w:rStyle w:val="Hyperlink"/>
@@ -1553,7 +1553,7 @@
                 <w:noProof/>
                 <w:webHidden/>
               </w:rPr>
-              <w:instrText xml:space="preserve"> PAGEREF _Toc226207041 \h </w:instrText>
+              <w:instrText xml:space="preserve"> PAGEREF _Toc226373375 \h </w:instrText>
             </w:r>
             <w:r>
               <w:rPr>
@@ -1600,7 +1600,7 @@
               <w14:ligatures w14:val="standardContextual"/>
             </w:rPr>
           </w:pPr>
-          <w:hyperlink w:anchor="_Toc226207042" w:history="1">
+          <w:hyperlink w:anchor="_Toc226373376" w:history="1">
             <w:r>
               <w:rPr>
                 <w:rStyle w:val="Hyperlink"/>
@@ -1627,7 +1627,7 @@
                 <w:noProof/>
                 <w:webHidden/>
               </w:rPr>
-              <w:instrText xml:space="preserve"> PAGEREF _Toc226207042 \h </w:instrText>
+              <w:instrText xml:space="preserve"> PAGEREF _Toc226373376 \h </w:instrText>
             </w:r>
             <w:r>
               <w:rPr>
@@ -1674,7 +1674,7 @@
               <w14:ligatures w14:val="standardContextual"/>
             </w:rPr>
           </w:pPr>
-          <w:hyperlink w:anchor="_Toc226207043" w:history="1">
+          <w:hyperlink w:anchor="_Toc226373377" w:history="1">
             <w:r>
               <w:rPr>
                 <w:rStyle w:val="Hyperlink"/>
@@ -1701,7 +1701,7 @@
                 <w:noProof/>
                 <w:webHidden/>
               </w:rPr>
-              <w:instrText xml:space="preserve"> PAGEREF _Toc226207043 \h </w:instrText>
+              <w:instrText xml:space="preserve"> PAGEREF _Toc226373377 \h </w:instrText>
             </w:r>
             <w:r>
               <w:rPr>
@@ -1748,7 +1748,7 @@
               <w14:ligatures w14:val="standardContextual"/>
             </w:rPr>
           </w:pPr>
-          <w:hyperlink w:anchor="_Toc226207044" w:history="1">
+          <w:hyperlink w:anchor="_Toc226373378" w:history="1">
             <w:r>
               <w:rPr>
                 <w:rStyle w:val="Hyperlink"/>
@@ -1775,7 +1775,7 @@
                 <w:noProof/>
                 <w:webHidden/>
               </w:rPr>
-              <w:instrText xml:space="preserve"> PAGEREF _Toc226207044 \h </w:instrText>
+              <w:instrText xml:space="preserve"> PAGEREF _Toc226373378 \h </w:instrText>
             </w:r>
             <w:r>
               <w:rPr>
@@ -1822,7 +1822,7 @@
               <w14:ligatures w14:val="standardContextual"/>
             </w:rPr>
           </w:pPr>
-          <w:hyperlink w:anchor="_Toc226207045" w:history="1">
+          <w:hyperlink w:anchor="_Toc226373379" w:history="1">
             <w:r>
               <w:rPr>
                 <w:rStyle w:val="Hyperlink"/>
@@ -1849,7 +1849,7 @@
                 <w:noProof/>
                 <w:webHidden/>
               </w:rPr>
-              <w:instrText xml:space="preserve"> PAGEREF _Toc226207045 \h </w:instrText>
+              <w:instrText xml:space="preserve"> PAGEREF _Toc226373379 \h </w:instrText>
             </w:r>
             <w:r>
               <w:rPr>
@@ -1896,7 +1896,7 @@
               <w14:ligatures w14:val="standardContextual"/>
             </w:rPr>
           </w:pPr>
-          <w:hyperlink w:anchor="_Toc226207046" w:history="1">
+          <w:hyperlink w:anchor="_Toc226373380" w:history="1">
             <w:r>
               <w:rPr>
                 <w:rStyle w:val="Hyperlink"/>
@@ -1923,7 +1923,7 @@
                 <w:noProof/>
                 <w:webHidden/>
               </w:rPr>
-              <w:instrText xml:space="preserve"> PAGEREF _Toc226207046 \h </w:instrText>
+              <w:instrText xml:space="preserve"> PAGEREF _Toc226373380 \h </w:instrText>
             </w:r>
             <w:r>
               <w:rPr>
@@ -1970,7 +1970,7 @@
               <w14:ligatures w14:val="standardContextual"/>
             </w:rPr>
           </w:pPr>
-          <w:hyperlink w:anchor="_Toc226207047" w:history="1">
+          <w:hyperlink w:anchor="_Toc226373381" w:history="1">
             <w:r>
               <w:rPr>
                 <w:rStyle w:val="Hyperlink"/>
@@ -1997,7 +1997,7 @@
                 <w:noProof/>
                 <w:webHidden/>
               </w:rPr>
-              <w:instrText xml:space="preserve"> PAGEREF _Toc226207047 \h </w:instrText>
+              <w:instrText xml:space="preserve"> PAGEREF _Toc226373381 \h </w:instrText>
             </w:r>
             <w:r>
               <w:rPr>
@@ -2044,7 +2044,7 @@
               <w14:ligatures w14:val="standardContextual"/>
             </w:rPr>
           </w:pPr>
-          <w:hyperlink w:anchor="_Toc226207048" w:history="1">
+          <w:hyperlink w:anchor="_Toc226373382" w:history="1">
             <w:r>
               <w:rPr>
                 <w:rStyle w:val="Hyperlink"/>
@@ -2071,7 +2071,7 @@
                 <w:noProof/>
                 <w:webHidden/>
               </w:rPr>
-              <w:instrText xml:space="preserve"> PAGEREF _Toc226207048 \h </w:instrText>
+              <w:instrText xml:space="preserve"> PAGEREF _Toc226373382 \h </w:instrText>
             </w:r>
             <w:r>
               <w:rPr>
@@ -2118,7 +2118,7 @@
               <w14:ligatures w14:val="standardContextual"/>
             </w:rPr>
           </w:pPr>
-          <w:hyperlink w:anchor="_Toc226207049" w:history="1">
+          <w:hyperlink w:anchor="_Toc226373383" w:history="1">
             <w:r>
               <w:rPr>
                 <w:rStyle w:val="Hyperlink"/>
@@ -2145,7 +2145,7 @@
                 <w:noProof/>
                 <w:webHidden/>
               </w:rPr>
-              <w:instrText xml:space="preserve"> PAGEREF _Toc226207049 \h </w:instrText>
+              <w:instrText xml:space="preserve"> PAGEREF _Toc226373383 \h </w:instrText>
             </w:r>
             <w:r>
               <w:rPr>
@@ -2192,7 +2192,7 @@
               <w14:ligatures w14:val="standardContextual"/>
             </w:rPr>
           </w:pPr>
-          <w:hyperlink w:anchor="_Toc226207050" w:history="1">
+          <w:hyperlink w:anchor="_Toc226373384" w:history="1">
             <w:r>
               <w:rPr>
                 <w:rStyle w:val="Hyperlink"/>
@@ -2219,7 +2219,7 @@
                 <w:noProof/>
                 <w:webHidden/>
               </w:rPr>
-              <w:instrText xml:space="preserve"> PAGEREF _Toc226207050 \h </w:instrText>
+              <w:instrText xml:space="preserve"> PAGEREF _Toc226373384 \h </w:instrText>
             </w:r>
             <w:r>
               <w:rPr>
@@ -2266,7 +2266,7 @@
               <w14:ligatures w14:val="standardContextual"/>
             </w:rPr>
           </w:pPr>
-          <w:hyperlink w:anchor="_Toc226207051" w:history="1">
+          <w:hyperlink w:anchor="_Toc226373385" w:history="1">
             <w:r>
               <w:rPr>
                 <w:rStyle w:val="Hyperlink"/>
@@ -2293,7 +2293,7 @@
                 <w:noProof/>
                 <w:webHidden/>
               </w:rPr>
-              <w:instrText xml:space="preserve"> PAGEREF _Toc226207051 \h </w:instrText>
+              <w:instrText xml:space="preserve"> PAGEREF _Toc226373385 \h </w:instrText>
             </w:r>
             <w:r>
               <w:rPr>
@@ -2340,7 +2340,7 @@
               <w14:ligatures w14:val="standardContextual"/>
             </w:rPr>
           </w:pPr>
-          <w:hyperlink w:anchor="_Toc226207052" w:history="1">
+          <w:hyperlink w:anchor="_Toc226373386" w:history="1">
             <w:r>
               <w:rPr>
                 <w:rStyle w:val="Hyperlink"/>
@@ -2367,7 +2367,7 @@
                 <w:noProof/>
                 <w:webHidden/>
               </w:rPr>
-              <w:instrText xml:space="preserve"> PAGEREF _Toc226207052 \h </w:instrText>
+              <w:instrText xml:space="preserve"> PAGEREF _Toc226373386 \h </w:instrText>
             </w:r>
             <w:r>
               <w:rPr>
@@ -2414,7 +2414,7 @@
               <w14:ligatures w14:val="standardContextual"/>
             </w:rPr>
           </w:pPr>
-          <w:hyperlink w:anchor="_Toc226207053" w:history="1">
+          <w:hyperlink w:anchor="_Toc226373387" w:history="1">
             <w:r>
               <w:rPr>
                 <w:rStyle w:val="Hyperlink"/>
@@ -2441,7 +2441,7 @@
                 <w:noProof/>
                 <w:webHidden/>
               </w:rPr>
-              <w:instrText xml:space="preserve"> PAGEREF _Toc226207053 \h </w:instrText>
+              <w:instrText xml:space="preserve"> PAGEREF _Toc226373387 \h </w:instrText>
             </w:r>
             <w:r>
               <w:rPr>
@@ -2488,7 +2488,7 @@
               <w14:ligatures w14:val="standardContextual"/>
             </w:rPr>
           </w:pPr>
-          <w:hyperlink w:anchor="_Toc226207054" w:history="1">
+          <w:hyperlink w:anchor="_Toc226373388" w:history="1">
             <w:r>
               <w:rPr>
                 <w:rStyle w:val="Hyperlink"/>
@@ -2515,7 +2515,7 @@
                 <w:noProof/>
                 <w:webHidden/>
               </w:rPr>
-              <w:instrText xml:space="preserve"> PAGEREF _Toc226207054 \h </w:instrText>
+              <w:instrText xml:space="preserve"> PAGEREF _Toc226373388 \h </w:instrText>
             </w:r>
             <w:r>
               <w:rPr>
@@ -2562,7 +2562,7 @@
               <w14:ligatures w14:val="standardContextual"/>
             </w:rPr>
           </w:pPr>
-          <w:hyperlink w:anchor="_Toc226207055" w:history="1">
+          <w:hyperlink w:anchor="_Toc226373389" w:history="1">
             <w:r>
               <w:rPr>
                 <w:rStyle w:val="Hyperlink"/>
@@ -2589,7 +2589,7 @@
                 <w:noProof/>
                 <w:webHidden/>
               </w:rPr>
-              <w:instrText xml:space="preserve"> PAGEREF _Toc226207055 \h </w:instrText>
+              <w:instrText xml:space="preserve"> PAGEREF _Toc226373389 \h </w:instrText>
             </w:r>
             <w:r>
               <w:rPr>
@@ -2636,7 +2636,7 @@
               <w14:ligatures w14:val="standardContextual"/>
             </w:rPr>
           </w:pPr>
-          <w:hyperlink w:anchor="_Toc226207056" w:history="1">
+          <w:hyperlink w:anchor="_Toc226373390" w:history="1">
             <w:r>
               <w:rPr>
                 <w:rStyle w:val="Hyperlink"/>
@@ -2663,7 +2663,7 @@
                 <w:noProof/>
                 <w:webHidden/>
               </w:rPr>
-              <w:instrText xml:space="preserve"> PAGEREF _Toc226207056 \h </w:instrText>
+              <w:instrText xml:space="preserve"> PAGEREF _Toc226373390 \h </w:instrText>
             </w:r>
             <w:r>
               <w:rPr>
@@ -2710,7 +2710,7 @@
               <w14:ligatures w14:val="standardContextual"/>
             </w:rPr>
           </w:pPr>
-          <w:hyperlink w:anchor="_Toc226207057" w:history="1">
+          <w:hyperlink w:anchor="_Toc226373391" w:history="1">
             <w:r>
               <w:rPr>
                 <w:rStyle w:val="Hyperlink"/>
@@ -2737,7 +2737,7 @@
                 <w:noProof/>
                 <w:webHidden/>
               </w:rPr>
-              <w:instrText xml:space="preserve"> PAGEREF _Toc226207057 \h </w:instrText>
+              <w:instrText xml:space="preserve"> PAGEREF _Toc226373391 \h </w:instrText>
             </w:r>
             <w:r>
               <w:rPr>
@@ -2784,7 +2784,7 @@
               <w14:ligatures w14:val="standardContextual"/>
             </w:rPr>
           </w:pPr>
-          <w:hyperlink w:anchor="_Toc226207058" w:history="1">
+          <w:hyperlink w:anchor="_Toc226373392" w:history="1">
             <w:r>
               <w:rPr>
                 <w:rStyle w:val="Hyperlink"/>
@@ -2811,7 +2811,7 @@
                 <w:noProof/>
                 <w:webHidden/>
               </w:rPr>
-              <w:instrText xml:space="preserve"> PAGEREF _Toc226207058 \h </w:instrText>
+              <w:instrText xml:space="preserve"> PAGEREF _Toc226373392 \h </w:instrText>
             </w:r>
             <w:r>
               <w:rPr>
@@ -2858,7 +2858,7 @@
               <w14:ligatures w14:val="standardContextual"/>
             </w:rPr>
           </w:pPr>
-          <w:hyperlink w:anchor="_Toc226207059" w:history="1">
+          <w:hyperlink w:anchor="_Toc226373393" w:history="1">
             <w:r>
               <w:rPr>
                 <w:rStyle w:val="Hyperlink"/>
@@ -2885,7 +2885,7 @@
                 <w:noProof/>
                 <w:webHidden/>
               </w:rPr>
-              <w:instrText xml:space="preserve"> PAGEREF _Toc226207059 \h </w:instrText>
+              <w:instrText xml:space="preserve"> PAGEREF _Toc226373393 \h </w:instrText>
             </w:r>
             <w:r>
               <w:rPr>
@@ -2932,7 +2932,7 @@
               <w14:ligatures w14:val="standardContextual"/>
             </w:rPr>
           </w:pPr>
-          <w:hyperlink w:anchor="_Toc226207060" w:history="1">
+          <w:hyperlink w:anchor="_Toc226373394" w:history="1">
             <w:r>
               <w:rPr>
                 <w:rStyle w:val="Hyperlink"/>
@@ -2959,7 +2959,7 @@
                 <w:noProof/>
                 <w:webHidden/>
               </w:rPr>
-              <w:instrText xml:space="preserve"> PAGEREF _Toc226207060 \h </w:instrText>
+              <w:instrText xml:space="preserve"> PAGEREF _Toc226373394 \h </w:instrText>
             </w:r>
             <w:r>
               <w:rPr>
@@ -3006,7 +3006,7 @@
               <w14:ligatures w14:val="standardContextual"/>
             </w:rPr>
           </w:pPr>
-          <w:hyperlink w:anchor="_Toc226207061" w:history="1">
+          <w:hyperlink w:anchor="_Toc226373395" w:history="1">
             <w:r>
               <w:rPr>
                 <w:rStyle w:val="Hyperlink"/>
@@ -3033,7 +3033,7 @@
                 <w:noProof/>
                 <w:webHidden/>
               </w:rPr>
-              <w:instrText xml:space="preserve"> PAGEREF _Toc226207061 \h </w:instrText>
+              <w:instrText xml:space="preserve"> PAGEREF _Toc226373395 \h </w:instrText>
             </w:r>
             <w:r>
               <w:rPr>
@@ -3080,7 +3080,7 @@
               <w14:ligatures w14:val="standardContextual"/>
             </w:rPr>
           </w:pPr>
-          <w:hyperlink w:anchor="_Toc226207062" w:history="1">
+          <w:hyperlink w:anchor="_Toc226373396" w:history="1">
             <w:r>
               <w:rPr>
                 <w:rStyle w:val="Hyperlink"/>
@@ -3107,7 +3107,7 @@
                 <w:noProof/>
                 <w:webHidden/>
               </w:rPr>
-              <w:instrText xml:space="preserve"> PAGEREF _Toc226207062 \h </w:instrText>
+              <w:instrText xml:space="preserve"> PAGEREF _Toc226373396 \h </w:instrText>
             </w:r>
             <w:r>
               <w:rPr>
@@ -3154,7 +3154,7 @@
               <w14:ligatures w14:val="standardContextual"/>
             </w:rPr>
           </w:pPr>
-          <w:hyperlink w:anchor="_Toc226207063" w:history="1">
+          <w:hyperlink w:anchor="_Toc226373397" w:history="1">
             <w:r>
               <w:rPr>
                 <w:rStyle w:val="Hyperlink"/>
@@ -3181,7 +3181,7 @@
                 <w:noProof/>
                 <w:webHidden/>
               </w:rPr>
-              <w:instrText xml:space="preserve"> PAGEREF _Toc226207063 \h </w:instrText>
+              <w:instrText xml:space="preserve"> PAGEREF _Toc226373397 \h </w:instrText>
             </w:r>
             <w:r>
               <w:rPr>
@@ -3228,7 +3228,7 @@
               <w14:ligatures w14:val="standardContextual"/>
             </w:rPr>
           </w:pPr>
-          <w:hyperlink w:anchor="_Toc226207064" w:history="1">
+          <w:hyperlink w:anchor="_Toc226373398" w:history="1">
             <w:r>
               <w:rPr>
                 <w:rStyle w:val="Hyperlink"/>
@@ -3255,7 +3255,7 @@
                 <w:noProof/>
                 <w:webHidden/>
               </w:rPr>
-              <w:instrText xml:space="preserve"> PAGEREF _Toc226207064 \h </w:instrText>
+              <w:instrText xml:space="preserve"> PAGEREF _Toc226373398 \h </w:instrText>
             </w:r>
             <w:r>
               <w:rPr>
@@ -3302,7 +3302,7 @@
               <w14:ligatures w14:val="standardContextual"/>
             </w:rPr>
           </w:pPr>
-          <w:hyperlink w:anchor="_Toc226207065" w:history="1">
+          <w:hyperlink w:anchor="_Toc226373399" w:history="1">
             <w:r>
               <w:rPr>
                 <w:rStyle w:val="Hyperlink"/>
@@ -3329,7 +3329,7 @@
                 <w:noProof/>
                 <w:webHidden/>
               </w:rPr>
-              <w:instrText xml:space="preserve"> PAGEREF _Toc226207065 \h </w:instrText>
+              <w:instrText xml:space="preserve"> PAGEREF _Toc226373399 \h </w:instrText>
             </w:r>
             <w:r>
               <w:rPr>
@@ -3376,7 +3376,7 @@
               <w14:ligatures w14:val="standardContextual"/>
             </w:rPr>
           </w:pPr>
-          <w:hyperlink w:anchor="_Toc226207066" w:history="1">
+          <w:hyperlink w:anchor="_Toc226373400" w:history="1">
             <w:r>
               <w:rPr>
                 <w:rStyle w:val="Hyperlink"/>
@@ -3403,7 +3403,7 @@
                 <w:noProof/>
                 <w:webHidden/>
               </w:rPr>
-              <w:instrText xml:space="preserve"> PAGEREF _Toc226207066 \h </w:instrText>
+              <w:instrText xml:space="preserve"> PAGEREF _Toc226373400 \h </w:instrText>
             </w:r>
             <w:r>
               <w:rPr>
@@ -3450,7 +3450,7 @@
               <w14:ligatures w14:val="standardContextual"/>
             </w:rPr>
           </w:pPr>
-          <w:hyperlink w:anchor="_Toc226207067" w:history="1">
+          <w:hyperlink w:anchor="_Toc226373401" w:history="1">
             <w:r>
               <w:rPr>
                 <w:rStyle w:val="Hyperlink"/>
@@ -3477,7 +3477,7 @@
                 <w:noProof/>
                 <w:webHidden/>
               </w:rPr>
-              <w:instrText xml:space="preserve"> PAGEREF _Toc226207067 \h </w:instrText>
+              <w:instrText xml:space="preserve"> PAGEREF _Toc226373401 \h </w:instrText>
             </w:r>
             <w:r>
               <w:rPr>
@@ -3524,7 +3524,7 @@
               <w14:ligatures w14:val="standardContextual"/>
             </w:rPr>
           </w:pPr>
-          <w:hyperlink w:anchor="_Toc226207068" w:history="1">
+          <w:hyperlink w:anchor="_Toc226373402" w:history="1">
             <w:r>
               <w:rPr>
                 <w:rStyle w:val="Hyperlink"/>
@@ -3551,7 +3551,7 @@
                 <w:noProof/>
                 <w:webHidden/>
               </w:rPr>
-              <w:instrText xml:space="preserve"> PAGEREF _Toc226207068 \h </w:instrText>
+              <w:instrText xml:space="preserve"> PAGEREF _Toc226373402 \h </w:instrText>
             </w:r>
             <w:r>
               <w:rPr>
@@ -3598,7 +3598,7 @@
               <w14:ligatures w14:val="standardContextual"/>
             </w:rPr>
           </w:pPr>
-          <w:hyperlink w:anchor="_Toc226207069" w:history="1">
+          <w:hyperlink w:anchor="_Toc226373403" w:history="1">
             <w:r>
               <w:rPr>
                 <w:rStyle w:val="Hyperlink"/>
@@ -3625,7 +3625,7 @@
                 <w:noProof/>
                 <w:webHidden/>
               </w:rPr>
-              <w:instrText xml:space="preserve"> PAGEREF _Toc226207069 \h </w:instrText>
+              <w:instrText xml:space="preserve"> PAGEREF _Toc226373403 \h </w:instrText>
             </w:r>
             <w:r>
               <w:rPr>
@@ -3672,7 +3672,7 @@
               <w14:ligatures w14:val="standardContextual"/>
             </w:rPr>
           </w:pPr>
-          <w:hyperlink w:anchor="_Toc226207070" w:history="1">
+          <w:hyperlink w:anchor="_Toc226373404" w:history="1">
             <w:r>
               <w:rPr>
                 <w:rStyle w:val="Hyperlink"/>
@@ -3699,7 +3699,7 @@
                 <w:noProof/>
                 <w:webHidden/>
               </w:rPr>
-              <w:instrText xml:space="preserve"> PAGEREF _Toc226207070 \h </w:instrText>
+              <w:instrText xml:space="preserve"> PAGEREF _Toc226373404 \h </w:instrText>
             </w:r>
             <w:r>
               <w:rPr>
@@ -3719,7 +3719,7 @@
                 <w:noProof/>
                 <w:webHidden/>
               </w:rPr>
-              <w:t>26</w:t>
+              <w:t>27</w:t>
             </w:r>
             <w:r>
               <w:rPr>
@@ -3746,12 +3746,86 @@
               <w14:ligatures w14:val="standardContextual"/>
             </w:rPr>
           </w:pPr>
-          <w:hyperlink w:anchor="_Toc226207071" w:history="1">
+          <w:hyperlink w:anchor="_Toc226373405" w:history="1">
             <w:r>
               <w:rPr>
                 <w:rStyle w:val="Hyperlink"/>
                 <w:noProof/>
               </w:rPr>
+              <w:t>Future work</w:t>
+            </w:r>
+            <w:r>
+              <w:rPr>
+                <w:noProof/>
+                <w:webHidden/>
+              </w:rPr>
+              <w:tab/>
+            </w:r>
+            <w:r>
+              <w:rPr>
+                <w:noProof/>
+                <w:webHidden/>
+              </w:rPr>
+              <w:fldChar w:fldCharType="begin"/>
+            </w:r>
+            <w:r>
+              <w:rPr>
+                <w:noProof/>
+                <w:webHidden/>
+              </w:rPr>
+              <w:instrText xml:space="preserve"> PAGEREF _Toc226373405 \h </w:instrText>
+            </w:r>
+            <w:r>
+              <w:rPr>
+                <w:noProof/>
+                <w:webHidden/>
+              </w:rPr>
+            </w:r>
+            <w:r>
+              <w:rPr>
+                <w:noProof/>
+                <w:webHidden/>
+              </w:rPr>
+              <w:fldChar w:fldCharType="separate"/>
+            </w:r>
+            <w:r>
+              <w:rPr>
+                <w:noProof/>
+                <w:webHidden/>
+              </w:rPr>
+              <w:t>27</w:t>
+            </w:r>
+            <w:r>
+              <w:rPr>
+                <w:noProof/>
+                <w:webHidden/>
+              </w:rPr>
+              <w:fldChar w:fldCharType="end"/>
+            </w:r>
+          </w:hyperlink>
+        </w:p>
+        <w:p>
+          <w:pPr>
+            <w:pStyle w:val="TOC2"/>
+            <w:tabs>
+              <w:tab w:val="right" w:leader="dot" w:pos="9016"/>
+            </w:tabs>
+            <w:rPr>
+              <w:rFonts w:eastAsiaTheme="minorEastAsia"/>
+              <w:noProof/>
+              <w:kern w:val="2"/>
+              <w:sz w:val="24"/>
+              <w:szCs w:val="24"/>
+              <w:lang w:eastAsia="en-GB"/>
+              <w14:ligatures w14:val="standardContextual"/>
+            </w:rPr>
+          </w:pPr>
+          <w:hyperlink w:anchor="_Toc226373406" w:history="1">
+            <w:r>
+              <w:rPr>
+                <w:rStyle w:val="Hyperlink"/>
+                <w:noProof/>
+              </w:rPr>
               <w:t>Evaluation against aims and objectives.</w:t>
             </w:r>
             <w:r>
@@ -3773,7 +3847,7 @@
                 <w:noProof/>
                 <w:webHidden/>
               </w:rPr>
-              <w:instrText xml:space="preserve"> PAGEREF _Toc226207071 \h </w:instrText>
+              <w:instrText xml:space="preserve"> PAGEREF _Toc226373406 \h </w:instrText>
             </w:r>
             <w:r>
               <w:rPr>
@@ -3793,7 +3867,7 @@
                 <w:noProof/>
                 <w:webHidden/>
               </w:rPr>
-              <w:t>26</w:t>
+              <w:t>27</w:t>
             </w:r>
             <w:r>
               <w:rPr>
@@ -3820,7 +3894,7 @@
               <w14:ligatures w14:val="standardContextual"/>
             </w:rPr>
           </w:pPr>
-          <w:hyperlink w:anchor="_Toc226207072" w:history="1">
+          <w:hyperlink w:anchor="_Toc226373407" w:history="1">
             <w:r>
               <w:rPr>
                 <w:rStyle w:val="Hyperlink"/>
@@ -3847,7 +3921,7 @@
                 <w:noProof/>
                 <w:webHidden/>
               </w:rPr>
-              <w:instrText xml:space="preserve"> PAGEREF _Toc226207072 \h </w:instrText>
+              <w:instrText xml:space="preserve"> PAGEREF _Toc226373407 \h </w:instrText>
             </w:r>
             <w:r>
               <w:rPr>
@@ -3867,7 +3941,7 @@
                 <w:noProof/>
                 <w:webHidden/>
               </w:rPr>
-              <w:t>26</w:t>
+              <w:t>28</w:t>
             </w:r>
             <w:r>
               <w:rPr>
@@ -3894,13 +3968,13 @@
               <w14:ligatures w14:val="standardContextual"/>
             </w:rPr>
           </w:pPr>
-          <w:hyperlink w:anchor="_Toc226207073" w:history="1">
+          <w:hyperlink w:anchor="_Toc226373408" w:history="1">
             <w:r>
               <w:rPr>
                 <w:rStyle w:val="Hyperlink"/>
                 <w:noProof/>
               </w:rPr>
-              <w:t>Future work</w:t>
+              <w:t>References</w:t>
             </w:r>
             <w:r>
               <w:rPr>
@@ -3921,7 +3995,7 @@
                 <w:noProof/>
                 <w:webHidden/>
               </w:rPr>
-              <w:instrText xml:space="preserve"> PAGEREF _Toc226207073 \h </w:instrText>
+              <w:instrText xml:space="preserve"> PAGEREF _Toc226373408 \h </w:instrText>
             </w:r>
             <w:r>
               <w:rPr>
@@ -3941,81 +4015,7 @@
                 <w:noProof/>
                 <w:webHidden/>
               </w:rPr>
-              <w:t>26</w:t>
-            </w:r>
-            <w:r>
-              <w:rPr>
-                <w:noProof/>
-                <w:webHidden/>
-              </w:rPr>
-              <w:fldChar w:fldCharType="end"/>
-            </w:r>
-          </w:hyperlink>
-        </w:p>
-        <w:p>
-          <w:pPr>
-            <w:pStyle w:val="TOC1"/>
-            <w:tabs>
-              <w:tab w:val="right" w:leader="dot" w:pos="9016"/>
-            </w:tabs>
-            <w:rPr>
-              <w:rFonts w:eastAsiaTheme="minorEastAsia"/>
-              <w:noProof/>
-              <w:kern w:val="2"/>
-              <w:sz w:val="24"/>
-              <w:szCs w:val="24"/>
-              <w:lang w:eastAsia="en-GB"/>
-              <w14:ligatures w14:val="standardContextual"/>
-            </w:rPr>
-          </w:pPr>
-          <w:hyperlink w:anchor="_Toc226207074" w:history="1">
-            <w:r>
-              <w:rPr>
-                <w:rStyle w:val="Hyperlink"/>
-                <w:noProof/>
-              </w:rPr>
-              <w:t>References</w:t>
-            </w:r>
-            <w:r>
-              <w:rPr>
-                <w:noProof/>
-                <w:webHidden/>
-              </w:rPr>
-              <w:tab/>
-            </w:r>
-            <w:r>
-              <w:rPr>
-                <w:noProof/>
-                <w:webHidden/>
-              </w:rPr>
-              <w:fldChar w:fldCharType="begin"/>
-            </w:r>
-            <w:r>
-              <w:rPr>
-                <w:noProof/>
-                <w:webHidden/>
-              </w:rPr>
-              <w:instrText xml:space="preserve"> PAGEREF _Toc226207074 \h </w:instrText>
-            </w:r>
-            <w:r>
-              <w:rPr>
-                <w:noProof/>
-                <w:webHidden/>
-              </w:rPr>
-            </w:r>
-            <w:r>
-              <w:rPr>
-                <w:noProof/>
-                <w:webHidden/>
-              </w:rPr>
-              <w:fldChar w:fldCharType="separate"/>
-            </w:r>
-            <w:r>
-              <w:rPr>
-                <w:noProof/>
-                <w:webHidden/>
-              </w:rPr>
-              <w:t>27</w:t>
+              <w:t>28</w:t>
             </w:r>
             <w:r>
               <w:rPr>
@@ -4051,7 +4051,7 @@
       <w:pPr>
         <w:pStyle w:val="Heading1"/>
       </w:pPr>
-      <w:bookmarkStart w:id="0" w:name="_Toc226207024"/>
+      <w:bookmarkStart w:id="0" w:name="_Toc226373358"/>
       <w:r>
         <w:t>Acknowledgement</w:t>
       </w:r>
@@ -4066,7 +4066,7 @@
       <w:pPr>
         <w:pStyle w:val="Heading1"/>
       </w:pPr>
-      <w:bookmarkStart w:id="1" w:name="_Toc226207025"/>
+      <w:bookmarkStart w:id="1" w:name="_Toc226373359"/>
       <w:r>
         <w:t>Abstract</w:t>
       </w:r>
@@ -4081,7 +4081,7 @@
       <w:pPr>
         <w:pStyle w:val="Heading1"/>
       </w:pPr>
-      <w:bookmarkStart w:id="2" w:name="_Toc226207026"/>
+      <w:bookmarkStart w:id="2" w:name="_Toc226373360"/>
       <w:r>
         <w:t>Introduction</w:t>
       </w:r>
@@ -4091,7 +4091,7 @@
       <w:pPr>
         <w:pStyle w:val="Heading2"/>
       </w:pPr>
-      <w:bookmarkStart w:id="3" w:name="_Toc226207027"/>
+      <w:bookmarkStart w:id="3" w:name="_Toc226373361"/>
       <w:r>
         <w:t>Project background</w:t>
       </w:r>
@@ -4147,7 +4147,7 @@
       <w:pPr>
         <w:pStyle w:val="Heading2"/>
       </w:pPr>
-      <w:bookmarkStart w:id="4" w:name="_Toc226207028"/>
+      <w:bookmarkStart w:id="4" w:name="_Toc226373362"/>
       <w:r>
         <w:t>Context</w:t>
       </w:r>
@@ -4219,7 +4219,7 @@
       <w:pPr>
         <w:pStyle w:val="Heading2"/>
       </w:pPr>
-      <w:bookmarkStart w:id="5" w:name="_Toc226207029"/>
+      <w:bookmarkStart w:id="5" w:name="_Toc226373363"/>
       <w:r>
         <w:t>Aims and Objectives</w:t>
       </w:r>
@@ -4414,7 +4414,7 @@
       <w:pPr>
         <w:pStyle w:val="Heading1"/>
       </w:pPr>
-      <w:bookmarkStart w:id="6" w:name="_Toc226207030"/>
+      <w:bookmarkStart w:id="6" w:name="_Toc226373364"/>
       <w:r>
         <w:t>Literature Review</w:t>
       </w:r>
@@ -4424,7 +4424,7 @@
       <w:pPr>
         <w:pStyle w:val="Heading2"/>
       </w:pPr>
-      <w:bookmarkStart w:id="7" w:name="_Toc226207031"/>
+      <w:bookmarkStart w:id="7" w:name="_Toc226373365"/>
       <w:r>
         <w:t>What is a</w:t>
       </w:r>
@@ -4493,7 +4493,7 @@
       <w:pPr>
         <w:pStyle w:val="Heading2"/>
       </w:pPr>
-      <w:bookmarkStart w:id="8" w:name="_Toc226207032"/>
+      <w:bookmarkStart w:id="8" w:name="_Toc226373366"/>
       <w:r>
         <w:t xml:space="preserve">Existing implementation of AI </w:t>
       </w:r>
@@ -4535,7 +4535,7 @@
       <w:pPr>
         <w:pStyle w:val="Heading2"/>
       </w:pPr>
-      <w:bookmarkStart w:id="9" w:name="_Toc226207033"/>
+      <w:bookmarkStart w:id="9" w:name="_Toc226373367"/>
       <w:r>
         <w:t>Legal, Social, Ethical, Professional(LSEP)</w:t>
       </w:r>
@@ -4588,7 +4588,7 @@
       <w:pPr>
         <w:pStyle w:val="Heading1"/>
       </w:pPr>
-      <w:bookmarkStart w:id="10" w:name="_Toc226207034"/>
+      <w:bookmarkStart w:id="10" w:name="_Toc226373368"/>
       <w:r>
         <w:t>Project Methodology and System Design</w:t>
       </w:r>
@@ -4598,7 +4598,7 @@
       <w:pPr>
         <w:pStyle w:val="Heading2"/>
       </w:pPr>
-      <w:bookmarkStart w:id="11" w:name="_Toc226207035"/>
+      <w:bookmarkStart w:id="11" w:name="_Toc226373369"/>
       <w:r>
         <w:t>Agile Development Methodology</w:t>
       </w:r>
@@ -4613,7 +4613,7 @@
       <w:pPr>
         <w:pStyle w:val="Heading2"/>
       </w:pPr>
-      <w:bookmarkStart w:id="12" w:name="_Toc226207036"/>
+      <w:bookmarkStart w:id="12" w:name="_Toc226373370"/>
       <w:r>
         <w:t>Implementation Method</w:t>
       </w:r>
@@ -4628,7 +4628,7 @@
       <w:pPr>
         <w:pStyle w:val="Heading2"/>
       </w:pPr>
-      <w:bookmarkStart w:id="13" w:name="_Toc226207037"/>
+      <w:bookmarkStart w:id="13" w:name="_Toc226373371"/>
       <w:r>
         <w:t>Alternative Approaches</w:t>
       </w:r>
@@ -4679,7 +4679,7 @@
       <w:pPr>
         <w:pStyle w:val="Heading2"/>
       </w:pPr>
-      <w:bookmarkStart w:id="14" w:name="_Toc226207038"/>
+      <w:bookmarkStart w:id="14" w:name="_Toc226373372"/>
       <w:r>
         <w:t>System Architecture</w:t>
       </w:r>
@@ -4802,27 +4802,14 @@
       <w:r>
         <w:t xml:space="preserve">Figure </w:t>
       </w:r>
-      <w:r>
-        <w:fldChar w:fldCharType="begin"/>
-      </w:r>
-      <w:r>
-        <w:instrText xml:space="preserve"> SEQ Figure \* ARABIC </w:instrText>
-      </w:r>
-      <w:r>
-        <w:fldChar w:fldCharType="separate"/>
-      </w:r>
-      <w:r>
-        <w:rPr>
-          <w:noProof/>
-        </w:rPr>
-        <w:t>1</w:t>
-      </w:r>
-      <w:r>
-        <w:rPr>
-          <w:noProof/>
-        </w:rPr>
-        <w:fldChar w:fldCharType="end"/>
-      </w:r>
+      <w:fldSimple w:instr=" SEQ Figure \* ARABIC ">
+        <w:r>
+          <w:rPr>
+            <w:noProof/>
+          </w:rPr>
+          <w:t>1</w:t>
+        </w:r>
+      </w:fldSimple>
       <w:r>
         <w:t>: Pipeline diagram for the ML system</w:t>
       </w:r>
@@ -4831,7 +4818,7 @@
       <w:pPr>
         <w:pStyle w:val="Heading2"/>
       </w:pPr>
-      <w:bookmarkStart w:id="15" w:name="_Toc226207039"/>
+      <w:bookmarkStart w:id="15" w:name="_Toc226373373"/>
       <w:r>
         <w:t>Dataset</w:t>
       </w:r>
@@ -4864,7 +4851,7 @@
       <w:pPr>
         <w:pStyle w:val="Heading2"/>
       </w:pPr>
-      <w:bookmarkStart w:id="16" w:name="_Toc226207040"/>
+      <w:bookmarkStart w:id="16" w:name="_Toc226373374"/>
       <w:r>
         <w:t>Data Preprocessing</w:t>
       </w:r>
@@ -4915,7 +4902,7 @@
       <w:pPr>
         <w:pStyle w:val="Heading2"/>
       </w:pPr>
-      <w:bookmarkStart w:id="17" w:name="_Toc226207041"/>
+      <w:bookmarkStart w:id="17" w:name="_Toc226373375"/>
       <w:r>
         <w:t>Machine Learning Models Used</w:t>
       </w:r>
@@ -5144,7 +5131,7 @@
       <w:pPr>
         <w:pStyle w:val="Heading2"/>
       </w:pPr>
-      <w:bookmarkStart w:id="18" w:name="_Toc226207042"/>
+      <w:bookmarkStart w:id="18" w:name="_Toc226373376"/>
       <w:r>
         <w:t>Detection Pipeline</w:t>
       </w:r>
@@ -5164,7 +5151,7 @@
       <w:pPr>
         <w:pStyle w:val="Heading1"/>
       </w:pPr>
-      <w:bookmarkStart w:id="19" w:name="_Toc226207043"/>
+      <w:bookmarkStart w:id="19" w:name="_Toc226373377"/>
       <w:r>
         <w:t>Tools Used and Technologies</w:t>
       </w:r>
@@ -5179,7 +5166,7 @@
       <w:pPr>
         <w:pStyle w:val="Heading3"/>
       </w:pPr>
-      <w:bookmarkStart w:id="20" w:name="_Toc226207044"/>
+      <w:bookmarkStart w:id="20" w:name="_Toc226373378"/>
       <w:r>
         <w:t>Python</w:t>
       </w:r>
@@ -5194,7 +5181,7 @@
       <w:pPr>
         <w:pStyle w:val="Heading3"/>
       </w:pPr>
-      <w:bookmarkStart w:id="21" w:name="_Toc226207045"/>
+      <w:bookmarkStart w:id="21" w:name="_Toc226373379"/>
       <w:r>
         <w:t>Jupyter Notebook</w:t>
       </w:r>
@@ -5209,7 +5196,7 @@
       <w:pPr>
         <w:pStyle w:val="Heading3"/>
       </w:pPr>
-      <w:bookmarkStart w:id="22" w:name="_Toc226207046"/>
+      <w:bookmarkStart w:id="22" w:name="_Toc226373380"/>
       <w:r>
         <w:t>Python Libraries</w:t>
       </w:r>
@@ -5307,7 +5294,7 @@
       <w:pPr>
         <w:pStyle w:val="Heading3"/>
       </w:pPr>
-      <w:bookmarkStart w:id="23" w:name="_Toc226207047"/>
+      <w:bookmarkStart w:id="23" w:name="_Toc226373381"/>
       <w:r>
         <w:t>GitHub</w:t>
       </w:r>
@@ -5323,7 +5310,7 @@
       <w:pPr>
         <w:pStyle w:val="Heading1"/>
       </w:pPr>
-      <w:bookmarkStart w:id="24" w:name="_Toc226207048"/>
+      <w:bookmarkStart w:id="24" w:name="_Toc226373382"/>
       <w:r>
         <w:t>Implementation</w:t>
       </w:r>
@@ -5333,7 +5320,7 @@
       <w:pPr>
         <w:pStyle w:val="Heading2"/>
       </w:pPr>
-      <w:bookmarkStart w:id="25" w:name="_Toc226207049"/>
+      <w:bookmarkStart w:id="25" w:name="_Toc226373383"/>
       <w:r>
         <w:t>Model Training</w:t>
       </w:r>
@@ -5411,27 +5398,14 @@
       <w:r>
         <w:t xml:space="preserve">Figure </w:t>
       </w:r>
-      <w:r>
-        <w:fldChar w:fldCharType="begin"/>
-      </w:r>
-      <w:r>
-        <w:instrText xml:space="preserve"> SEQ Figure \* ARABIC </w:instrText>
-      </w:r>
-      <w:r>
-        <w:fldChar w:fldCharType="separate"/>
-      </w:r>
-      <w:r>
-        <w:rPr>
-          <w:noProof/>
-        </w:rPr>
-        <w:t>2</w:t>
-      </w:r>
-      <w:r>
-        <w:rPr>
-          <w:noProof/>
-        </w:rPr>
-        <w:fldChar w:fldCharType="end"/>
-      </w:r>
+      <w:fldSimple w:instr=" SEQ Figure \* ARABIC ">
+        <w:r>
+          <w:rPr>
+            <w:noProof/>
+          </w:rPr>
+          <w:t>2</w:t>
+        </w:r>
+      </w:fldSimple>
       <w:r>
         <w:t>:Dependency Imports and Dataset Loading for Accuracy Testing</w:t>
       </w:r>
@@ -5498,27 +5472,14 @@
       <w:r>
         <w:t xml:space="preserve">Figure </w:t>
       </w:r>
-      <w:r>
-        <w:fldChar w:fldCharType="begin"/>
-      </w:r>
-      <w:r>
-        <w:instrText xml:space="preserve"> SEQ Figure \* ARABIC </w:instrText>
-      </w:r>
-      <w:r>
-        <w:fldChar w:fldCharType="separate"/>
-      </w:r>
-      <w:r>
-        <w:rPr>
-          <w:noProof/>
-        </w:rPr>
-        <w:t>3</w:t>
-      </w:r>
-      <w:r>
-        <w:rPr>
-          <w:noProof/>
-        </w:rPr>
-        <w:fldChar w:fldCharType="end"/>
-      </w:r>
+      <w:fldSimple w:instr=" SEQ Figure \* ARABIC ">
+        <w:r>
+          <w:rPr>
+            <w:noProof/>
+          </w:rPr>
+          <w:t>3</w:t>
+        </w:r>
+      </w:fldSimple>
       <w:r>
         <w:t>:Dropping features to prevent leaks</w:t>
       </w:r>
@@ -5597,27 +5558,14 @@
       <w:r>
         <w:t xml:space="preserve">Figure </w:t>
       </w:r>
-      <w:r>
-        <w:fldChar w:fldCharType="begin"/>
-      </w:r>
-      <w:r>
-        <w:instrText xml:space="preserve"> SEQ Figure \* ARABIC </w:instrText>
-      </w:r>
-      <w:r>
-        <w:fldChar w:fldCharType="separate"/>
-      </w:r>
-      <w:r>
-        <w:rPr>
-          <w:noProof/>
-        </w:rPr>
-        <w:t>4</w:t>
-      </w:r>
-      <w:r>
-        <w:rPr>
-          <w:noProof/>
-        </w:rPr>
-        <w:fldChar w:fldCharType="end"/>
-      </w:r>
+      <w:fldSimple w:instr=" SEQ Figure \* ARABIC ">
+        <w:r>
+          <w:rPr>
+            <w:noProof/>
+          </w:rPr>
+          <w:t>4</w:t>
+        </w:r>
+      </w:fldSimple>
       <w:r>
         <w:t xml:space="preserve">: Data Pre-processing and feature </w:t>
       </w:r>
@@ -6134,27 +6082,14 @@
       <w:r>
         <w:t xml:space="preserve">Figure </w:t>
       </w:r>
-      <w:r>
-        <w:fldChar w:fldCharType="begin"/>
-      </w:r>
-      <w:r>
-        <w:instrText xml:space="preserve"> SEQ Figure \* ARABIC </w:instrText>
-      </w:r>
-      <w:r>
-        <w:fldChar w:fldCharType="separate"/>
-      </w:r>
-      <w:r>
-        <w:rPr>
-          <w:noProof/>
-        </w:rPr>
-        <w:t>5</w:t>
-      </w:r>
-      <w:r>
-        <w:rPr>
-          <w:noProof/>
-        </w:rPr>
-        <w:fldChar w:fldCharType="end"/>
-      </w:r>
+      <w:fldSimple w:instr=" SEQ Figure \* ARABIC ">
+        <w:r>
+          <w:rPr>
+            <w:noProof/>
+          </w:rPr>
+          <w:t>5</w:t>
+        </w:r>
+      </w:fldSimple>
       <w:r>
         <w:t>: Results code and Results from predictions against testing split</w:t>
       </w:r>
@@ -6164,7 +6099,7 @@
       <w:pPr>
         <w:pStyle w:val="Heading2"/>
       </w:pPr>
-      <w:bookmarkStart w:id="26" w:name="_Toc226207050"/>
+      <w:bookmarkStart w:id="26" w:name="_Toc226373384"/>
       <w:r>
         <w:lastRenderedPageBreak/>
         <w:t>Model Evaluation</w:t>
@@ -6196,7 +6131,7 @@
       <w:pPr>
         <w:pStyle w:val="Heading2"/>
       </w:pPr>
-      <w:bookmarkStart w:id="27" w:name="_Toc226207051"/>
+      <w:bookmarkStart w:id="27" w:name="_Toc226373385"/>
       <w:r>
         <w:t>Model Extraction and Deployment</w:t>
       </w:r>
@@ -6396,27 +6331,14 @@
       <w:r>
         <w:t xml:space="preserve">Figure </w:t>
       </w:r>
-      <w:r>
-        <w:fldChar w:fldCharType="begin"/>
-      </w:r>
-      <w:r>
-        <w:instrText xml:space="preserve"> SEQ Figure \* ARABIC </w:instrText>
-      </w:r>
-      <w:r>
-        <w:fldChar w:fldCharType="separate"/>
-      </w:r>
-      <w:r>
-        <w:rPr>
-          <w:noProof/>
-        </w:rPr>
-        <w:t>6</w:t>
-      </w:r>
-      <w:r>
-        <w:rPr>
-          <w:noProof/>
-        </w:rPr>
-        <w:fldChar w:fldCharType="end"/>
-      </w:r>
+      <w:fldSimple w:instr=" SEQ Figure \* ARABIC ">
+        <w:r>
+          <w:rPr>
+            <w:noProof/>
+          </w:rPr>
+          <w:t>6</w:t>
+        </w:r>
+      </w:fldSimple>
       <w:r>
         <w:t>: Implementation of Feature Alignment</w:t>
       </w:r>
@@ -6428,7 +6350,7 @@
       <w:pPr>
         <w:pStyle w:val="Heading2"/>
       </w:pPr>
-      <w:bookmarkStart w:id="28" w:name="_Toc226207052"/>
+      <w:bookmarkStart w:id="28" w:name="_Toc226373386"/>
       <w:r>
         <w:t>NIDS Output System</w:t>
       </w:r>
@@ -6496,27 +6418,14 @@
       <w:r>
         <w:t xml:space="preserve">Figure </w:t>
       </w:r>
-      <w:r>
-        <w:fldChar w:fldCharType="begin"/>
-      </w:r>
-      <w:r>
-        <w:instrText xml:space="preserve"> SEQ Figure \* ARABIC </w:instrText>
-      </w:r>
-      <w:r>
-        <w:fldChar w:fldCharType="separate"/>
-      </w:r>
-      <w:r>
-        <w:rPr>
-          <w:noProof/>
-        </w:rPr>
-        <w:t>7</w:t>
-      </w:r>
-      <w:r>
-        <w:rPr>
-          <w:noProof/>
-        </w:rPr>
-        <w:fldChar w:fldCharType="end"/>
-      </w:r>
+      <w:fldSimple w:instr=" SEQ Figure \* ARABIC ">
+        <w:r>
+          <w:rPr>
+            <w:noProof/>
+          </w:rPr>
+          <w:t>7</w:t>
+        </w:r>
+      </w:fldSimple>
       <w:r>
         <w:t>: Columns preserved for context for output.</w:t>
       </w:r>
@@ -6585,27 +6494,14 @@
       <w:r>
         <w:t xml:space="preserve">Figure </w:t>
       </w:r>
-      <w:r>
-        <w:fldChar w:fldCharType="begin"/>
-      </w:r>
-      <w:r>
-        <w:instrText xml:space="preserve"> SEQ Figure \* ARABIC </w:instrText>
-      </w:r>
-      <w:r>
-        <w:fldChar w:fldCharType="separate"/>
-      </w:r>
-      <w:r>
-        <w:rPr>
-          <w:noProof/>
-        </w:rPr>
-        <w:t>8</w:t>
-      </w:r>
-      <w:r>
-        <w:rPr>
-          <w:noProof/>
-        </w:rPr>
-        <w:fldChar w:fldCharType="end"/>
-      </w:r>
+      <w:fldSimple w:instr=" SEQ Figure \* ARABIC ">
+        <w:r>
+          <w:rPr>
+            <w:noProof/>
+          </w:rPr>
+          <w:t>8</w:t>
+        </w:r>
+      </w:fldSimple>
       <w:r>
         <w:t>: Code for outputting suspicious code to a .TXT file.</w:t>
       </w:r>
@@ -6615,7 +6511,7 @@
       <w:pPr>
         <w:pStyle w:val="Heading2"/>
       </w:pPr>
-      <w:bookmarkStart w:id="29" w:name="_Toc226207053"/>
+      <w:bookmarkStart w:id="29" w:name="_Toc226373387"/>
       <w:r>
         <w:t>Email Alert System</w:t>
       </w:r>
@@ -6709,27 +6605,14 @@
       <w:r>
         <w:t xml:space="preserve">Figure </w:t>
       </w:r>
-      <w:r>
-        <w:fldChar w:fldCharType="begin"/>
-      </w:r>
-      <w:r>
-        <w:instrText xml:space="preserve"> SEQ Figure \* ARABIC </w:instrText>
-      </w:r>
-      <w:r>
-        <w:fldChar w:fldCharType="separate"/>
-      </w:r>
-      <w:r>
-        <w:rPr>
-          <w:noProof/>
-        </w:rPr>
-        <w:t>9</w:t>
-      </w:r>
-      <w:r>
-        <w:rPr>
-          <w:noProof/>
-        </w:rPr>
-        <w:fldChar w:fldCharType="end"/>
-      </w:r>
+      <w:fldSimple w:instr=" SEQ Figure \* ARABIC ">
+        <w:r>
+          <w:rPr>
+            <w:noProof/>
+          </w:rPr>
+          <w:t>9</w:t>
+        </w:r>
+      </w:fldSimple>
       <w:r>
         <w:t>: Code to configure credentials and basic contents [Password hidden for security purposes]</w:t>
       </w:r>
@@ -6797,27 +6680,14 @@
       <w:r>
         <w:t xml:space="preserve">Figure </w:t>
       </w:r>
-      <w:r>
-        <w:fldChar w:fldCharType="begin"/>
-      </w:r>
-      <w:r>
-        <w:instrText xml:space="preserve"> SEQ Figure \* ARABIC </w:instrText>
-      </w:r>
-      <w:r>
-        <w:fldChar w:fldCharType="separate"/>
-      </w:r>
-      <w:r>
-        <w:rPr>
-          <w:noProof/>
-        </w:rPr>
-        <w:t>10</w:t>
-      </w:r>
-      <w:r>
-        <w:rPr>
-          <w:noProof/>
-        </w:rPr>
-        <w:fldChar w:fldCharType="end"/>
-      </w:r>
+      <w:fldSimple w:instr=" SEQ Figure \* ARABIC ">
+        <w:r>
+          <w:rPr>
+            <w:noProof/>
+          </w:rPr>
+          <w:t>10</w:t>
+        </w:r>
+      </w:fldSimple>
       <w:r>
         <w:t>: Content of Email body code.</w:t>
       </w:r>
@@ -6879,27 +6749,14 @@
       <w:r>
         <w:t xml:space="preserve">Figure </w:t>
       </w:r>
-      <w:r>
-        <w:fldChar w:fldCharType="begin"/>
-      </w:r>
-      <w:r>
-        <w:instrText xml:space="preserve"> SEQ Figure \* ARABIC </w:instrText>
-      </w:r>
-      <w:r>
-        <w:fldChar w:fldCharType="separate"/>
-      </w:r>
-      <w:r>
-        <w:rPr>
-          <w:noProof/>
-        </w:rPr>
-        <w:t>11</w:t>
-      </w:r>
-      <w:r>
-        <w:rPr>
-          <w:noProof/>
-        </w:rPr>
-        <w:fldChar w:fldCharType="end"/>
-      </w:r>
+      <w:fldSimple w:instr=" SEQ Figure \* ARABIC ">
+        <w:r>
+          <w:rPr>
+            <w:noProof/>
+          </w:rPr>
+          <w:t>11</w:t>
+        </w:r>
+      </w:fldSimple>
       <w:r>
         <w:t>: Code for sending an automated email through SMTP.</w:t>
       </w:r>
@@ -6968,27 +6825,14 @@
       <w:r>
         <w:t xml:space="preserve">Figure </w:t>
       </w:r>
-      <w:r>
-        <w:fldChar w:fldCharType="begin"/>
-      </w:r>
-      <w:r>
-        <w:instrText xml:space="preserve"> SEQ Figure \* ARABIC </w:instrText>
-      </w:r>
-      <w:r>
-        <w:fldChar w:fldCharType="separate"/>
-      </w:r>
-      <w:r>
-        <w:rPr>
-          <w:noProof/>
-        </w:rPr>
-        <w:t>12</w:t>
-      </w:r>
-      <w:r>
-        <w:rPr>
-          <w:noProof/>
-        </w:rPr>
-        <w:fldChar w:fldCharType="end"/>
-      </w:r>
+      <w:fldSimple w:instr=" SEQ Figure \* ARABIC ">
+        <w:r>
+          <w:rPr>
+            <w:noProof/>
+          </w:rPr>
+          <w:t>12</w:t>
+        </w:r>
+      </w:fldSimple>
       <w:r>
         <w:t>: Example email output from the NIDS system</w:t>
       </w:r>
@@ -6998,7 +6842,7 @@
       <w:pPr>
         <w:pStyle w:val="Heading2"/>
       </w:pPr>
-      <w:bookmarkStart w:id="30" w:name="_Toc226207054"/>
+      <w:bookmarkStart w:id="30" w:name="_Toc226373388"/>
       <w:r>
         <w:t>Software Engineering Principles</w:t>
       </w:r>
@@ -7019,7 +6863,7 @@
       <w:pPr>
         <w:pStyle w:val="Heading2"/>
       </w:pPr>
-      <w:bookmarkStart w:id="31" w:name="_Toc226207055"/>
+      <w:bookmarkStart w:id="31" w:name="_Toc226373389"/>
       <w:r>
         <w:t>Implementation sprint logs</w:t>
       </w:r>
@@ -7029,7 +6873,7 @@
       <w:pPr>
         <w:pStyle w:val="Heading3"/>
       </w:pPr>
-      <w:bookmarkStart w:id="32" w:name="_Toc226207056"/>
+      <w:bookmarkStart w:id="32" w:name="_Toc226373390"/>
       <w:r>
         <w:t>Sprint 1</w:t>
       </w:r>
@@ -7162,7 +7006,7 @@
       <w:pPr>
         <w:pStyle w:val="Heading3"/>
       </w:pPr>
-      <w:bookmarkStart w:id="33" w:name="_Toc226207057"/>
+      <w:bookmarkStart w:id="33" w:name="_Toc226373391"/>
       <w:r>
         <w:t>Sprint 2</w:t>
       </w:r>
@@ -7285,7 +7129,7 @@
       <w:pPr>
         <w:pStyle w:val="Heading3"/>
       </w:pPr>
-      <w:bookmarkStart w:id="34" w:name="_Toc226207058"/>
+      <w:bookmarkStart w:id="34" w:name="_Toc226373392"/>
       <w:r>
         <w:t xml:space="preserve">Sprint 3 </w:t>
       </w:r>
@@ -7431,7 +7275,7 @@
       <w:pPr>
         <w:pStyle w:val="Heading3"/>
       </w:pPr>
-      <w:bookmarkStart w:id="35" w:name="_Toc226207059"/>
+      <w:bookmarkStart w:id="35" w:name="_Toc226373393"/>
       <w:r>
         <w:t>Sprint 4</w:t>
       </w:r>
@@ -7562,7 +7406,7 @@
       <w:pPr>
         <w:pStyle w:val="Heading3"/>
       </w:pPr>
-      <w:bookmarkStart w:id="36" w:name="_Toc226207060"/>
+      <w:bookmarkStart w:id="36" w:name="_Toc226373394"/>
       <w:r>
         <w:lastRenderedPageBreak/>
         <w:t>Sprint 5</w:t>
@@ -7732,7 +7576,7 @@
       <w:pPr>
         <w:pStyle w:val="Heading3"/>
       </w:pPr>
-      <w:bookmarkStart w:id="37" w:name="_Toc226207061"/>
+      <w:bookmarkStart w:id="37" w:name="_Toc226373395"/>
       <w:r>
         <w:t>Sprint 6</w:t>
       </w:r>
@@ -7860,7 +7704,7 @@
       <w:pPr>
         <w:pStyle w:val="Heading3"/>
       </w:pPr>
-      <w:bookmarkStart w:id="38" w:name="_Toc226207062"/>
+      <w:bookmarkStart w:id="38" w:name="_Toc226373396"/>
       <w:r>
         <w:t>Sprint 7</w:t>
       </w:r>
@@ -8001,7 +7845,7 @@
       <w:pPr>
         <w:pStyle w:val="Heading1"/>
       </w:pPr>
-      <w:bookmarkStart w:id="39" w:name="_Toc226207063"/>
+      <w:bookmarkStart w:id="39" w:name="_Toc226373397"/>
       <w:r>
         <w:lastRenderedPageBreak/>
         <w:t>Testing and Validation</w:t>
@@ -8012,7 +7856,7 @@
       <w:pPr>
         <w:pStyle w:val="Heading2"/>
       </w:pPr>
-      <w:bookmarkStart w:id="40" w:name="_Toc226207064"/>
+      <w:bookmarkStart w:id="40" w:name="_Toc226373398"/>
       <w:r>
         <w:t>Testing</w:t>
       </w:r>
@@ -8047,7 +7891,7 @@
       <w:pPr>
         <w:pStyle w:val="Heading2"/>
       </w:pPr>
-      <w:bookmarkStart w:id="41" w:name="_Toc226207065"/>
+      <w:bookmarkStart w:id="41" w:name="_Toc226373399"/>
       <w:r>
         <w:t>Output Validation</w:t>
       </w:r>
@@ -8070,7 +7914,7 @@
       <w:pPr>
         <w:pStyle w:val="Heading1"/>
       </w:pPr>
-      <w:bookmarkStart w:id="42" w:name="_Toc226207066"/>
+      <w:bookmarkStart w:id="42" w:name="_Toc226373400"/>
       <w:r>
         <w:t>Discussion and Critical Evaluation</w:t>
       </w:r>
@@ -8080,7 +7924,7 @@
       <w:pPr>
         <w:pStyle w:val="Heading2"/>
       </w:pPr>
-      <w:bookmarkStart w:id="43" w:name="_Toc226207067"/>
+      <w:bookmarkStart w:id="43" w:name="_Toc226373401"/>
       <w:r>
         <w:t>System Performance</w:t>
       </w:r>
@@ -8507,7 +8351,7 @@
       <w:pPr>
         <w:pStyle w:val="Heading2"/>
       </w:pPr>
-      <w:bookmarkStart w:id="44" w:name="_Toc226207068"/>
+      <w:bookmarkStart w:id="44" w:name="_Toc226373402"/>
       <w:r>
         <w:t>Strengths of System</w:t>
       </w:r>
@@ -8536,7 +8380,7 @@
       <w:pPr>
         <w:pStyle w:val="Heading2"/>
       </w:pPr>
-      <w:bookmarkStart w:id="45" w:name="_Toc226207069"/>
+      <w:bookmarkStart w:id="45" w:name="_Toc226373403"/>
       <w:r>
         <w:t>Limitations</w:t>
       </w:r>
@@ -8586,7 +8430,7 @@
       <w:pPr>
         <w:pStyle w:val="Heading2"/>
       </w:pPr>
-      <w:bookmarkStart w:id="46" w:name="_Toc226207070"/>
+      <w:bookmarkStart w:id="46" w:name="_Toc226373404"/>
       <w:r>
         <w:t>Comparison against existing systems</w:t>
       </w:r>
@@ -8620,86 +8464,175 @@
       <w:pPr>
         <w:pStyle w:val="Heading2"/>
       </w:pPr>
-      <w:bookmarkStart w:id="47" w:name="_Toc226207071"/>
+      <w:bookmarkStart w:id="47" w:name="_Toc226373405"/>
+      <w:r>
+        <w:t>Future work</w:t>
+      </w:r>
+      <w:bookmarkEnd w:id="47"/>
+    </w:p>
+    <w:p>
+      <w:r>
+        <w:t>While the system has met all set objectives relating to its development, there are some features or improvements that could be made if work were to continue into the future but fell beyond the original scope of this project or would make it more suitable for a live running environment or weren’t key due to the academic nature of this project.</w:t>
+      </w:r>
+    </w:p>
+    <w:p>
+      <w:r>
+        <w:t xml:space="preserve">One of the easiest improvements that could be made for this system would be to move it </w:t>
+      </w:r>
+      <w:r>
+        <w:t>out of Jupyter notebook and into a more standard python file, this would allow for the system to run 24/7 provided the system it is running on doesn’t go down, this would be fairly simple to implement as it could be done by designing a piece of python code to run the prediction/output file after a certain time, this would bring the system more in line with NIDS used in live environments.</w:t>
+      </w:r>
+    </w:p>
+    <w:p>
+      <w:r>
+        <w:t>Another feature would possibly enhance the system would be the addition of a deep learning model</w:t>
+      </w:r>
+      <w:r>
+        <w:t xml:space="preserve"> to produce another set of predictions, though accuracy testing would be required to gauge whether or not it addition to the system would help or hinder accurate predictions.</w:t>
+      </w:r>
+    </w:p>
+    <w:p>
+      <w:r>
+        <w:t>A piece of future work that would that would allow for more thorough testing of the system would be the use of a real world dataset but the issue is obtaining them due to the sensitive nature of the real world traffic data.</w:t>
+      </w:r>
+    </w:p>
+    <w:p>
+      <w:r>
+        <w:t>The final piece of future work to be introduced is further work to increase the accuracy of the model, there are a couple of ways this can be done, use a more expansive dataset allowing for more thorough training, and to increase the training parameters and use more powerful hardware for training, as by increasing the parameters allows the models to explore more options, it allows random forest more trees with more depth and branches.</w:t>
+      </w:r>
+    </w:p>
+    <w:p>
+      <w:pPr>
+        <w:pStyle w:val="Heading2"/>
+      </w:pPr>
+      <w:bookmarkStart w:id="48" w:name="_Toc226373406"/>
       <w:r>
         <w:t>Evaluation against aims and objectives.</w:t>
       </w:r>
-      <w:bookmarkEnd w:id="47"/>
+      <w:bookmarkEnd w:id="48"/>
     </w:p>
     <w:p>
       <w:r>
         <w:t>How well have I met my aims and objectives</w:t>
       </w:r>
     </w:p>
+    <w:p>
+      <w:r>
+        <w:lastRenderedPageBreak/>
+        <w:t>Over the duration of the project, the aims and objectives set out in the beginning of the project have been successfully completed through continuous work covering a combination of research, design, and implementation.</w:t>
+      </w:r>
+    </w:p>
+    <w:p>
+      <w:r>
+        <w:t>The initial objectives that covered background research and context relating to the usage of AI in intrusion detection were completed during the literature review, which covered both traditional and AI based intrusion detection in detail. This provided a strong backbone for the decisions relating to design and implementation later in the project.</w:t>
+      </w:r>
+    </w:p>
+    <w:p>
+      <w:r>
+        <w:t>The technical objectives set out in the beginning have been completed successfully, with all features designed and implemented, including the training and accuracy testing of multiple AI algorithms, these models where then tested using appropriate metrics namely, precision, accuracy, recall, and f1. The alert system detailed in the objectives was successfully implemented through the use of SMTPlib and googles smtp server.</w:t>
+      </w:r>
+    </w:p>
+    <w:p>
+      <w:r>
+        <w:t>Objective eight and nine have both been met successfully with eig</w:t>
+      </w:r>
+      <w:r>
+        <w:t>ht comprising a majority of this section of the report, and nine located just above this sub-section mentioning improvements such as moving the code out of Jupyter notebook to allow for continuous running of the system to better match real world systems.</w:t>
+      </w:r>
+    </w:p>
+    <w:p>
+      <w:r>
+        <w:t>The objective of evaluating the systems performance was completed through component and system testing during development, the chosen model achieved high score overall with a notable recall score, showing its effectiveness in detection.</w:t>
+      </w:r>
+    </w:p>
+    <w:p>
+      <w:r>
+        <w:t>Finally, the objectives relating to the critical evaluation of the system and the future work to improve the system has been covered in the discussion section of this report, with key limitations of the system being identified and reasonable improvements being proposed.</w:t>
+      </w:r>
+    </w:p>
+    <w:p>
+      <w:r>
+        <w:t>Overall, the aims and objectives of the project have been met through the development of an AI-based Network Intrusion Detection system, while also taking into consideration its practicality in real world deployment.</w:t>
+      </w:r>
+    </w:p>
+    <w:p>
+      <w:r>
+        <w:drawing>
+          <wp:inline distT="0" distB="0" distL="0" distR="0" wp14:anchorId="7883D928" wp14:editId="37D580A3">
+            <wp:extent cx="5731510" cy="3455035"/>
+            <wp:effectExtent l="0" t="0" r="2540" b="0"/>
+            <wp:docPr id="524586370" name="Picture 1"/>
+            <wp:cNvGraphicFramePr>
+              <a:graphicFrameLocks xmlns:a="http://schemas.openxmlformats.org/drawingml/2006/main" noChangeAspect="1"/>
+            </wp:cNvGraphicFramePr>
+            <a:graphic xmlns:a="http://schemas.openxmlformats.org/drawingml/2006/main">
+              <a:graphicData uri="http://schemas.openxmlformats.org/drawingml/2006/picture">
+                <pic:pic xmlns:pic="http://schemas.openxmlformats.org/drawingml/2006/picture">
+                  <pic:nvPicPr>
+                    <pic:cNvPr id="524586370" name=""/>
+                    <pic:cNvPicPr/>
+                  </pic:nvPicPr>
+                  <pic:blipFill>
+                    <a:blip r:embed="rId20"/>
+                    <a:stretch>
+                      <a:fillRect/>
+                    </a:stretch>
+                  </pic:blipFill>
+                  <pic:spPr>
+                    <a:xfrm>
+                      <a:off x="0" y="0"/>
+                      <a:ext cx="5731510" cy="3455035"/>
+                    </a:xfrm>
+                    <a:prstGeom prst="rect">
+                      <a:avLst/>
+                    </a:prstGeom>
+                  </pic:spPr>
+                </pic:pic>
+              </a:graphicData>
+            </a:graphic>
+          </wp:inline>
+        </w:drawing>
+      </w:r>
+    </w:p>
     <w:p/>
     <w:p>
       <w:pPr>
         <w:pStyle w:val="Heading1"/>
       </w:pPr>
-      <w:bookmarkStart w:id="48" w:name="_Toc226207072"/>
+      <w:bookmarkStart w:id="49" w:name="_Toc226373407"/>
       <w:r>
         <w:t>Conclusion</w:t>
       </w:r>
-      <w:bookmarkEnd w:id="48"/>
-    </w:p>
-    <w:p>
-      <w:r>
-        <w:t>What I built</w:t>
-      </w:r>
-    </w:p>
-    <w:p>
-      <w:r>
-        <w:t>What have I achieved</w:t>
-      </w:r>
-    </w:p>
-    <w:p>
-      <w:r>
-        <w:t>What are my findings</w:t>
-      </w:r>
-    </w:p>
-    <w:p>
-      <w:r>
-        <w:t>Overall successes</w:t>
+      <w:bookmarkEnd w:id="49"/>
+    </w:p>
+    <w:p>
+      <w:r>
+        <w:t>Over the course of this project, I have developed an AI-based intrusion detection system that is able to classify and score the probability of network traffic being malicious or benign, and developed supporting systems such as text output that allows for analysis of the data by analysts, and an email alert system that sends out email alerts when high-risk behaviour has been identified.</w:t>
+      </w:r>
+    </w:p>
+    <w:p>
+      <w:r>
+        <w:t>All aims and objectives set out during the beginning of this project have been successfully fulfilled, with all nine objectives being achieved, including the critical evaluation of the system as a whole, including its strengths and limitations, and its performance.</w:t>
+      </w:r>
+    </w:p>
+    <w:p>
+      <w:r>
+        <w:t>I found during this project that the way forward for intrusion detection is not to focus on either traditional systems or AI-systems but to introduce a hybrid systems as the two types cover the weaknesses of other with signature based having the overall higher accuracy while the AI-systems handle unknown attacks much better than the traditional systems, this allows for a much more comprehensive detection system compared to only focusing on one or the other.</w:t>
+      </w:r>
+    </w:p>
+    <w:p>
+      <w:r>
+        <w:t xml:space="preserve">Overall, this project has been a success with all goals that were established at the start of the project being met and </w:t>
+      </w:r>
+      <w:r>
+        <w:t>all features fully implemented and tested with the outputs validated, the limitations identified and with areas for future improvement identified as well, makes this project an overall success.</w:t>
       </w:r>
     </w:p>
     <w:p>
       <w:pPr>
         <w:pStyle w:val="Heading1"/>
       </w:pPr>
-      <w:bookmarkStart w:id="49" w:name="_Toc226207073"/>
-      <w:r>
-        <w:t>Future work</w:t>
-      </w:r>
-      <w:bookmarkEnd w:id="49"/>
-    </w:p>
-    <w:p>
-      <w:r>
-        <w:t>Features that could be added in future</w:t>
-      </w:r>
-    </w:p>
-    <w:p>
-      <w:r>
-        <w:t>24/7 running</w:t>
-      </w:r>
-      <w:r>
-        <w:t xml:space="preserve"> / Move it from Jupyter to python</w:t>
-      </w:r>
-    </w:p>
-    <w:p>
-      <w:r>
-        <w:t>Increase accuracy</w:t>
-      </w:r>
-    </w:p>
-    <w:p>
-      <w:r>
-        <w:t>Possible use of deep learning</w:t>
-      </w:r>
-    </w:p>
-    <w:p>
-      <w:pPr>
-        <w:pStyle w:val="Heading1"/>
-      </w:pPr>
-      <w:bookmarkStart w:id="50" w:name="_Toc226207074"/>
+      <w:bookmarkStart w:id="50" w:name="_Toc226373408"/>
       <w:r>
         <w:t>References</w:t>
       </w:r>
@@ -8718,7 +8651,7 @@
       <w:r>
         <w:t xml:space="preserve">. Available at </w:t>
       </w:r>
-      <w:hyperlink r:id="rId20" w:history="1">
+      <w:hyperlink r:id="rId21" w:history="1">
         <w:r>
           <w:rPr>
             <w:rStyle w:val="Hyperlink"/>
@@ -8732,10 +8665,9 @@
     </w:p>
     <w:p>
       <w:r>
-        <w:lastRenderedPageBreak/>
         <w:t xml:space="preserve">UK Public Cyber Crime Incidents Rise 37% Over Five Years. Available at: </w:t>
       </w:r>
-      <w:hyperlink r:id="rId21" w:history="1">
+      <w:hyperlink r:id="rId22" w:history="1">
         <w:r>
           <w:rPr>
             <w:rStyle w:val="Hyperlink"/>

</xml_diff>

<commit_message>
Small Update- update table of content page numbers
</commit_message>
<xml_diff>
--- a/COMP 3000.docx
+++ b/COMP 3000.docx
@@ -3941,7 +3941,7 @@
                 <w:noProof/>
                 <w:webHidden/>
               </w:rPr>
-              <w:t>28</w:t>
+              <w:t>29</w:t>
             </w:r>
             <w:r>
               <w:rPr>
@@ -4015,7 +4015,7 @@
                 <w:noProof/>
                 <w:webHidden/>
               </w:rPr>
-              <w:t>28</w:t>
+              <w:t>29</w:t>
             </w:r>
             <w:r>
               <w:rPr>
@@ -4183,7 +4183,15 @@
     </w:p>
     <w:p>
       <w:r>
-        <w:t>As cybercrime grows ever more profitable and with the incident rate of cyber crime rising by 37% over the past five years (Bridewell, 2026), the different attack types and vectors continue to evolve, with attackers modifying previously used techniques or developing new attacks using exploits not commonly known, meaning that the signature-based system can’t be updated to detect these attacks. This creates big problems for signature-based systems as attacks that haven’t yet been seen may bypass the detection systems.</w:t>
+        <w:t xml:space="preserve">As cybercrime grows ever more profitable and with the incident rate of </w:t>
+      </w:r>
+      <w:proofErr w:type="spellStart"/>
+      <w:r>
+        <w:t>cyber crime</w:t>
+      </w:r>
+      <w:proofErr w:type="spellEnd"/>
+      <w:r>
+        <w:t xml:space="preserve"> rising by 37% over the past five years (Bridewell, 2026), the different attack types and vectors continue to evolve, with attackers modifying previously used techniques or developing new attacks using exploits not commonly known, meaning that the signature-based system can’t be updated to detect these attacks. This creates big problems for signature-based systems as attacks that haven’t yet been seen may bypass the detection systems.</w:t>
       </w:r>
     </w:p>
     <w:p>
@@ -4563,7 +4571,15 @@
     </w:p>
     <w:p>
       <w:r>
-        <w:t>The only ethical consideration for this project that I can think is how the data for training has been obtained, have I gathered it in a shady manner, through not being clear on my intentions</w:t>
+        <w:t xml:space="preserve">The only ethical consideration for this project that I can think is how the data for training has been obtained, have I gathered it in a shady manner, </w:t>
+      </w:r>
+      <w:proofErr w:type="spellStart"/>
+      <w:r>
+        <w:t>through</w:t>
+      </w:r>
+      <w:proofErr w:type="spellEnd"/>
+      <w:r>
+        <w:t xml:space="preserve"> not being clear on my intentions</w:t>
       </w:r>
       <w:r>
         <w:t xml:space="preserve"> in the gathering of data. No, in this project the data has been ethically sourced through the University of New South Wales as they provide the UNSW NB-15 dataset for free for academic usage which this project falls under.</w:t>
@@ -4579,7 +4595,15 @@
     </w:p>
     <w:p>
       <w:r>
-        <w:t>This is doubly so due to its nature as a Intrusion Detection system, rather than an Intrusion Prevention System, as by itself, an IDS system can do nothing about the intrusion attempts but alert an analyst or user.</w:t>
+        <w:t xml:space="preserve">This is doubly so due to its nature as </w:t>
+      </w:r>
+      <w:proofErr w:type="spellStart"/>
+      <w:r>
+        <w:t>a</w:t>
+      </w:r>
+      <w:proofErr w:type="spellEnd"/>
+      <w:r>
+        <w:t xml:space="preserve"> Intrusion Detection system, rather than an Intrusion Prevention System, as by itself, an IDS system can do nothing about the intrusion attempts but alert an analyst or user.</w:t>
       </w:r>
     </w:p>
     <w:p/>
@@ -4663,7 +4687,15 @@
     </w:p>
     <w:p>
       <w:r>
-        <w:t xml:space="preserve">These examples show that while there are possible alternatives to the agile methodology that ive chosen, they don’t fit the project as well as they all produce either a rigidness that would cripple the project if problems </w:t>
+        <w:t xml:space="preserve">These examples show that while there are possible alternatives to the agile methodology that </w:t>
+      </w:r>
+      <w:proofErr w:type="spellStart"/>
+      <w:r>
+        <w:t>ive</w:t>
+      </w:r>
+      <w:proofErr w:type="spellEnd"/>
+      <w:r>
+        <w:t xml:space="preserve"> chosen, they don’t fit the project as well as they all produce either a rigidness that would cripple the project if problems </w:t>
       </w:r>
       <w:r>
         <w:t>occur or</w:t>
@@ -5204,7 +5236,15 @@
     </w:p>
     <w:p>
       <w:r>
-        <w:t>For this project, a range of python libraries were use to implement the features set out in the aims and objectives earlier in the report, in the bullet points below, I will layout how and why each library was used.</w:t>
+        <w:t xml:space="preserve">For this project, a range of python libraries were use to implement the features set out in the aims and objectives earlier in the report, in the bullet points below, I will </w:t>
+      </w:r>
+      <w:proofErr w:type="spellStart"/>
+      <w:r>
+        <w:t>layout</w:t>
+      </w:r>
+      <w:proofErr w:type="spellEnd"/>
+      <w:r>
+        <w:t xml:space="preserve"> how and why each library was used.</w:t>
       </w:r>
     </w:p>
     <w:p>
@@ -5254,6 +5294,7 @@
           <w:numId w:val="2"/>
         </w:numPr>
       </w:pPr>
+      <w:proofErr w:type="spellStart"/>
       <w:r>
         <w:rPr>
           <w:b/>
@@ -5261,6 +5302,7 @@
         </w:rPr>
         <w:t>JobLib</w:t>
       </w:r>
+      <w:proofErr w:type="spellEnd"/>
       <w:r>
         <w:t>: This was used in order to dump the model and feature columns from python to  a PKL file to allow for usage within other Jupyter notebook files without having to retrain the model, saving a considerable amount of time.</w:t>
       </w:r>
@@ -5273,6 +5315,7 @@
           <w:numId w:val="2"/>
         </w:numPr>
       </w:pPr>
+      <w:proofErr w:type="spellStart"/>
       <w:r>
         <w:rPr>
           <w:b/>
@@ -5280,6 +5323,7 @@
         </w:rPr>
         <w:t>SMTPLib</w:t>
       </w:r>
+      <w:proofErr w:type="spellEnd"/>
       <w:r>
         <w:t>: This was used in order to implement email alerts, allowing the users to be informed if suspicious behaviour has been detected within the traffic log files.</w:t>
       </w:r>
@@ -6163,8 +6207,13 @@
       <w:r>
         <w:t xml:space="preserve">For use in the next step of implementation, I saved the feature columns to a list to be saved and extracted with the model. As detailed previously, the model was trained again using the same parameters, then making use of the </w:t>
       </w:r>
-      <w:r>
-        <w:t xml:space="preserve">JobLib </w:t>
+      <w:proofErr w:type="spellStart"/>
+      <w:r>
+        <w:t>JobLib</w:t>
+      </w:r>
+      <w:proofErr w:type="spellEnd"/>
+      <w:r>
+        <w:t xml:space="preserve"> </w:t>
       </w:r>
       <w:r>
         <w:t>library, the model and feature columns were dumped into two separate PKL files and saved to my PC</w:t>
@@ -6256,11 +6305,27 @@
     <w:p/>
     <w:p>
       <w:r>
-        <w:t xml:space="preserve">With the model and feature schema saved to a pkl file, the implementation of an output system for the NIDS could begin. To start, I made a new Jupyter notebook file, my reasoning for splitting the code for this project into three different files is that it makes the code easier to process mentally since all the code is in documents that describe what its purpose is clearly, it also </w:t>
+        <w:t xml:space="preserve">With the model and feature schema saved to a </w:t>
+      </w:r>
+      <w:proofErr w:type="spellStart"/>
+      <w:r>
+        <w:t>pkl</w:t>
+      </w:r>
+      <w:proofErr w:type="spellEnd"/>
+      <w:r>
+        <w:t xml:space="preserve"> file, the implementation of an output system for the NIDS could begin. To start, I made a new Jupyter notebook file, my reasoning for splitting the code for this project into three different files is that it makes the code easier to process mentally since all the code is in documents that describe what its purpose is clearly, it also </w:t>
       </w:r>
       <w:r>
         <w:lastRenderedPageBreak/>
-        <w:t>reduces the computational overhead if the python kernel that it is running on needs to be reset for what ever reason, which would require me to run all cells of the notebook again, taking both time and computational resources.</w:t>
+        <w:t xml:space="preserve">reduces the computational overhead if the python kernel that it is running on needs to be reset for </w:t>
+      </w:r>
+      <w:proofErr w:type="spellStart"/>
+      <w:r>
+        <w:t>what ever</w:t>
+      </w:r>
+      <w:proofErr w:type="spellEnd"/>
+      <w:r>
+        <w:t xml:space="preserve"> reason, which would require me to run all cells of the notebook again, taking both time and computational resources.</w:t>
       </w:r>
     </w:p>
     <w:p>
@@ -6522,7 +6587,15 @@
         <w:t xml:space="preserve">The email alert system makes use of the same backbone that the TXT output system makes use of, namely the risk score, but instead </w:t>
       </w:r>
       <w:r>
-        <w:t xml:space="preserve">of outputting through text, this system makes use of the SMTPLib library to function and googles smtp server to </w:t>
+        <w:t xml:space="preserve">of outputting through text, this system makes use of the </w:t>
+      </w:r>
+      <w:proofErr w:type="spellStart"/>
+      <w:r>
+        <w:t>SMTPLib</w:t>
+      </w:r>
+      <w:proofErr w:type="spellEnd"/>
+      <w:r>
+        <w:t xml:space="preserve"> library to function and googles smtp server to </w:t>
       </w:r>
       <w:r>
         <w:t>send</w:t>
@@ -6620,7 +6693,15 @@
     <w:p>
       <w:r>
         <w:lastRenderedPageBreak/>
-        <w:t xml:space="preserve">After this was to implement the proper body of the email, this started by establishing an alert summary variable that would display a few rows of the data in the email , to show the analyst an example of the scores the data has achieved to inspire urgent action. This was done as the test data set contains no ip addresses limiting the sensitivity of the information of the dataset while this can be helpful in this setting, it is a definite limitation of the dataset. </w:t>
+        <w:t xml:space="preserve">After this was to implement the proper body of the email, this started by establishing an alert summary variable that would display a few rows of the data in the email , to show the analyst an example of the scores the data has achieved to inspire urgent action. This was done as the test data set contains no </w:t>
+      </w:r>
+      <w:proofErr w:type="spellStart"/>
+      <w:r>
+        <w:t>ip</w:t>
+      </w:r>
+      <w:proofErr w:type="spellEnd"/>
+      <w:r>
+        <w:t xml:space="preserve"> addresses limiting the sensitivity of the information of the dataset while this can be helpful in this setting, it is a definite limitation of the dataset. </w:t>
       </w:r>
     </w:p>
     <w:p>
@@ -6694,7 +6775,15 @@
     </w:p>
     <w:p>
       <w:r>
-        <w:t>With the body now set, the next step of implementation is to add the code needed to send the email, this was achieved using the SMTPlib library and its SMTP_SSL feature, making use of googles SMTP server. Below is the code that was used to achieve this.</w:t>
+        <w:t xml:space="preserve">With the body now set, the next step of implementation is to add the code needed to send the email, this was achieved using the </w:t>
+      </w:r>
+      <w:proofErr w:type="spellStart"/>
+      <w:r>
+        <w:t>SMTPlib</w:t>
+      </w:r>
+      <w:proofErr w:type="spellEnd"/>
+      <w:r>
+        <w:t xml:space="preserve"> library and its SMTP_SSL feature, making use of googles SMTP server. Below is the code that was used to achieve this.</w:t>
       </w:r>
     </w:p>
     <w:p>
@@ -7559,7 +7648,15 @@
     </w:p>
     <w:p>
       <w:r>
-        <w:t>The next step is to implement and alert system as without a way to generate alerts, an IDS poses little help, as it cant stop intrusion only detect it.</w:t>
+        <w:t xml:space="preserve">The next step is to implement and alert system as without a way to generate alerts, an IDS poses little help, as it </w:t>
+      </w:r>
+      <w:proofErr w:type="spellStart"/>
+      <w:r>
+        <w:t>cant</w:t>
+      </w:r>
+      <w:proofErr w:type="spellEnd"/>
+      <w:r>
+        <w:t xml:space="preserve"> stop intrusion only detect it.</w:t>
       </w:r>
     </w:p>
     <w:p>
@@ -7630,7 +7727,15 @@
     <w:p>
       <w:r>
         <w:lastRenderedPageBreak/>
-        <w:t>Email alert system has been implemented and tested, implemented using the SMTPlib library and through the use of googles smtp servers using an email address created for this purpose and an app password for credentials to avoid leaking the real account password.</w:t>
+        <w:t xml:space="preserve">Email alert system has been implemented and tested, implemented using the </w:t>
+      </w:r>
+      <w:proofErr w:type="spellStart"/>
+      <w:r>
+        <w:t>SMTPlib</w:t>
+      </w:r>
+      <w:proofErr w:type="spellEnd"/>
+      <w:r>
+        <w:t xml:space="preserve"> library and through the use of googles smtp servers using an email address created for this purpose and an app password for credentials to avoid leaking the real account password.</w:t>
       </w:r>
     </w:p>
     <w:p>
@@ -7943,7 +8048,15 @@
         <w:t>Random forest was chosen as the main model to be used for predictions due to its higher recall rate compared to XGBoost, this is due to recall being very important in intrusion detection systems as failing to identify malicious traffic can result in attacks going undetected</w:t>
       </w:r>
       <w:r>
-        <w:t>, a high recall score indicates strong detection performance, with random forest scoring 0.9683 and xgboost scoring 0.9646, making Random Forest the stronger choice for this system.</w:t>
+        <w:t xml:space="preserve">, a high recall score indicates strong detection performance, with random forest scoring 0.9683 and </w:t>
+      </w:r>
+      <w:proofErr w:type="spellStart"/>
+      <w:r>
+        <w:t>xgboost</w:t>
+      </w:r>
+      <w:proofErr w:type="spellEnd"/>
+      <w:r>
+        <w:t xml:space="preserve"> scoring 0.9646, making Random Forest the stronger choice for this system.</w:t>
       </w:r>
     </w:p>
     <w:p>
@@ -8388,7 +8501,15 @@
     </w:p>
     <w:p>
       <w:r>
-        <w:t>While the system operates at the level matching the original expectations set at the start of this project and all features set out in the objectives have been implemented successfully, there is room for improvement in the system, one of the key examples of this is that it in its current form as a set of Jupyter notebook files, it isn’t able to continuously run which in the real world would be a serious detriment but isn’t too serious in the context of this project due to its academic nature but is a area for future improvement.</w:t>
+        <w:t xml:space="preserve">While the system operates at the level matching the original expectations set at the start of this project and all features set out in the objectives have been implemented successfully, there is room for improvement in the system, one of the key examples of this is that it in its current form as a set of Jupyter notebook files, it isn’t able to continuously run which in the real world would be a serious detriment but isn’t too serious in the context of this project due to its academic nature but is </w:t>
+      </w:r>
+      <w:proofErr w:type="spellStart"/>
+      <w:r>
+        <w:t>a</w:t>
+      </w:r>
+      <w:proofErr w:type="spellEnd"/>
+      <w:r>
+        <w:t xml:space="preserve"> area for future improvement.</w:t>
       </w:r>
     </w:p>
     <w:p>
@@ -8529,7 +8650,15 @@
     </w:p>
     <w:p>
       <w:r>
-        <w:t>The technical objectives set out in the beginning have been completed successfully, with all features designed and implemented, including the training and accuracy testing of multiple AI algorithms, these models where then tested using appropriate metrics namely, precision, accuracy, recall, and f1. The alert system detailed in the objectives was successfully implemented through the use of SMTPlib and googles smtp server.</w:t>
+        <w:t xml:space="preserve">The technical objectives set out in the beginning have been completed successfully, with all features designed and implemented, including the training and accuracy testing of multiple AI algorithms, these models where then tested using appropriate metrics namely, precision, accuracy, recall, and f1. The alert system detailed in the objectives was successfully implemented through the use of </w:t>
+      </w:r>
+      <w:proofErr w:type="spellStart"/>
+      <w:r>
+        <w:t>SMTPlib</w:t>
+      </w:r>
+      <w:proofErr w:type="spellEnd"/>
+      <w:r>
+        <w:t xml:space="preserve"> and googles smtp server.</w:t>
       </w:r>
     </w:p>
     <w:p>
@@ -8557,6 +8686,9 @@
     </w:p>
     <w:p>
       <w:r>
+        <w:rPr>
+          <w:noProof/>
+        </w:rPr>
         <w:drawing>
           <wp:inline distT="0" distB="0" distL="0" distR="0" wp14:anchorId="7883D928" wp14:editId="37D580A3">
             <wp:extent cx="5731510" cy="3455035"/>

</xml_diff>

<commit_message>
Completion of report, and addition of the model and feature columns pkl files, and removal of temp files from word
</commit_message>
<xml_diff>
--- a/COMP 3000.docx
+++ b/COMP 3000.docx
@@ -186,25 +186,45 @@
           <w:u w:val="single"/>
         </w:rPr>
       </w:pPr>
-    </w:p>
-    <w:p>
-      <w:pPr>
-        <w:jc w:val="center"/>
+      <w:r>
         <w:rPr>
           <w:b/>
           <w:sz w:val="48"/>
           <w:szCs w:val="48"/>
           <w:u w:val="single"/>
         </w:rPr>
-      </w:pPr>
-      <w:r>
-        <w:rPr>
-          <w:b/>
-          <w:sz w:val="48"/>
-          <w:szCs w:val="48"/>
+        <w:t>By Samuel Stevens</w:t>
+      </w:r>
+    </w:p>
+    <w:p>
+      <w:pPr>
+        <w:jc w:val="center"/>
+        <w:rPr>
+          <w:b/>
+          <w:sz w:val="28"/>
+          <w:szCs w:val="28"/>
           <w:u w:val="single"/>
         </w:rPr>
-        <w:t>By Samuel Stevens</w:t>
+      </w:pPr>
+      <w:r>
+        <w:rPr>
+          <w:b/>
+          <w:sz w:val="28"/>
+          <w:szCs w:val="28"/>
+          <w:u w:val="single"/>
+        </w:rPr>
+        <w:t>GitHub:</w:t>
+      </w:r>
+      <w:r>
+        <w:t xml:space="preserve"> </w:t>
+      </w:r>
+      <w:r>
+        <w:rPr>
+          <w:bCs/>
+          <w:sz w:val="28"/>
+          <w:szCs w:val="28"/>
+        </w:rPr>
+        <w:t>https://github.com/Samuel-Stevens/COMP3000-Project/tree/main</w:t>
       </w:r>
     </w:p>
     <w:sdt>
@@ -4059,7 +4079,15 @@
     </w:p>
     <w:p>
       <w:r>
-        <w:t>To be Done at end of project</w:t>
+        <w:t>Thank you to Shaymaa Al-Jubouri for constant support throughout my three years of study.</w:t>
+      </w:r>
+    </w:p>
+    <w:p>
+      <w:r>
+        <w:t xml:space="preserve">Thank you to Vivian Hocking, for his </w:t>
+      </w:r>
+      <w:r>
+        <w:t>infectious laugh and surprisingly interesting policy lectures.</w:t>
       </w:r>
     </w:p>
     <w:p>
@@ -4074,7 +4102,50 @@
     </w:p>
     <w:p>
       <w:r>
-        <w:t>To be done at end of project</w:t>
+        <w:t xml:space="preserve">With the global continuous increase in network traffic, the amount of data a network must handle as spiked significantly with Cloudflare reporting an 19% increase in traffic in 2025, as the amount of traffic grows, the rate of cyber-crime rises as well. </w:t>
+      </w:r>
+    </w:p>
+    <w:p>
+      <w:r>
+        <w:t xml:space="preserve">One of the tools often used to help detect cyber-crime is the Network Intrusion Detection System (NIDS), this is traditionally done through the use of signature recognition, matching attack signatures to network traffic. </w:t>
+      </w:r>
+    </w:p>
+    <w:p>
+      <w:r>
+        <w:t xml:space="preserve">The main down fall of this method is its inability to detect attacks it hasn’t got signatures </w:t>
+      </w:r>
+      <w:r>
+        <w:t>for;</w:t>
+      </w:r>
+      <w:r>
+        <w:t xml:space="preserve"> </w:t>
+      </w:r>
+      <w:r>
+        <w:t>therefore,</w:t>
+      </w:r>
+      <w:r>
+        <w:t xml:space="preserve"> this report sets out to determine if Machine Learning (ML) can be used to detect attacks that the signature-based systems would miss. In this project, several ML algorithms were trained against a dataset that contains modern attack </w:t>
+      </w:r>
+      <w:r>
+        <w:t>types,</w:t>
+      </w:r>
+      <w:r>
+        <w:t xml:space="preserve"> and the results were evaluated to determine which model would best fit use in a NIDS</w:t>
+      </w:r>
+      <w:r>
+        <w:t xml:space="preserve">. </w:t>
+      </w:r>
+    </w:p>
+    <w:p>
+      <w:r>
+        <w:lastRenderedPageBreak/>
+        <w:t>A prototype system was developed to determine its effectiveness as a tool</w:t>
+      </w:r>
+      <w:r>
+        <w:t xml:space="preserve"> with the tool covering data ingestion, prediction, and output to both text file and email alerts</w:t>
+      </w:r>
+      <w:r>
+        <w:t>. The results of the testing showed that the Random Forest model achieved the highest score with an accuracy of 90%, this shows that ML shows promise in intrusion detection with high detection rates, which would allow for the creation of an effective NIDS.</w:t>
       </w:r>
     </w:p>
     <w:p>
@@ -4107,152 +4178,173 @@
     </w:p>
     <w:p>
       <w:r>
+        <w:t>The more traditional form of a N</w:t>
+      </w:r>
+      <w:r>
+        <w:t>etwork Intrusion Detection System (N</w:t>
+      </w:r>
+      <w:r>
+        <w:t>IDS</w:t>
+      </w:r>
+      <w:r>
+        <w:t>)</w:t>
+      </w:r>
+      <w:r>
+        <w:t xml:space="preserve"> is signature-based where traffic is compared against a database of rules or signatures which makes it an effective tool against established threats. This gives them a high precision against known threats and has a low false positive </w:t>
+      </w:r>
+      <w:r>
+        <w:t>rate but</w:t>
+      </w:r>
+      <w:r>
+        <w:t xml:space="preserve"> suffers against new types of attacks as the database needs to be manually updated to deal with new threats.</w:t>
+      </w:r>
+    </w:p>
+    <w:p>
+      <w:r>
+        <w:t xml:space="preserve">To help deal with this, this project </w:t>
+      </w:r>
+      <w:r>
+        <w:t>centres</w:t>
+      </w:r>
+      <w:r>
+        <w:t xml:space="preserve"> around the development of a Network intrusion detection system that makes use of machine learning to identify suspicious patterns within network traffic, by training against features from network traffic data</w:t>
+      </w:r>
+      <w:r>
+        <w:t>sets</w:t>
+      </w:r>
+      <w:r>
+        <w:t xml:space="preserve">, it can learn behaviour patterns </w:t>
+      </w:r>
+      <w:r>
+        <w:t>from both normal and malicious traffic and can improve overall detection capabilities allowing the system to identify anomalies or threats that would be captured by the rule based systems.</w:t>
+      </w:r>
+    </w:p>
+    <w:p>
+      <w:pPr>
+        <w:pStyle w:val="Heading2"/>
+      </w:pPr>
+      <w:bookmarkStart w:id="4" w:name="_Toc226373362"/>
+      <w:r>
+        <w:t>Context</w:t>
+      </w:r>
+      <w:bookmarkEnd w:id="4"/>
+    </w:p>
+    <w:p>
+      <w:r>
+        <w:t>Within the current cybersecurity landscape, intrusion detection play a vital role by identifying potentially malicious traffic within a network</w:t>
+      </w:r>
+      <w:r>
+        <w:t xml:space="preserve">. Network Intrusion </w:t>
+      </w:r>
+      <w:r>
+        <w:t>D</w:t>
+      </w:r>
+      <w:r>
+        <w:t>etection Systems</w:t>
+      </w:r>
+      <w:r>
+        <w:t xml:space="preserve"> (NIDS)</w:t>
+      </w:r>
+      <w:r>
+        <w:t xml:space="preserve"> monitor network traffic and analyses and learns patterns to help detect unauthorized access or suspicious activity. </w:t>
+      </w:r>
+      <w:r>
+        <w:t>Many of</w:t>
+      </w:r>
+      <w:r>
+        <w:t xml:space="preserve"> these systems rely on signature-based detection, with the traffic being compared against a list of known attack signatures. </w:t>
+      </w:r>
+    </w:p>
+    <w:p>
+      <w:r>
+        <w:t xml:space="preserve">Some of the most widely used tools make use of </w:t>
+      </w:r>
+      <w:r>
+        <w:t>signature-based</w:t>
+      </w:r>
+      <w:r>
+        <w:t xml:space="preserve"> detection, examples of these being Snort and Suricata, both of which are open source and widely used by private users and organizations. These tools are very good at detecting attacks that have been previously </w:t>
+      </w:r>
+      <w:r>
+        <w:t>documented,</w:t>
+      </w:r>
+      <w:r>
+        <w:t xml:space="preserve"> and the system has been updated to detect</w:t>
+      </w:r>
+      <w:r>
+        <w:t xml:space="preserve">. </w:t>
+      </w:r>
+    </w:p>
+    <w:p>
+      <w:r>
+        <w:t xml:space="preserve">As cybercrime grows ever more profitable and with the incident rate of </w:t>
+      </w:r>
+      <w:r>
+        <w:t>cyber-crime</w:t>
+      </w:r>
+      <w:r>
+        <w:t xml:space="preserve"> rising by 37% over the past five years (Bridewell, 2026), the different attack types and vectors continue to evolve, with attackers modifying previously used techniques or developing new attacks using exploits not commonly known, meaning that the signature-based system can’t be updated to detect these attacks. This creates big problems for signature-based systems as attacks that haven’t yet been seen may bypass the detection systems.</w:t>
+      </w:r>
+    </w:p>
+    <w:p>
+      <w:r>
         <w:lastRenderedPageBreak/>
-        <w:t>The more traditional form of a N</w:t>
-      </w:r>
-      <w:r>
-        <w:t>etwork Intrusion Detection System (N</w:t>
-      </w:r>
-      <w:r>
-        <w:t>IDS</w:t>
-      </w:r>
-      <w:r>
-        <w:t>)</w:t>
-      </w:r>
-      <w:r>
-        <w:t xml:space="preserve"> is signature-based where traffic is compared against a database of rules or signatures which makes it an effective tool against established threats. This gives them a high precision against known threats and has a low false positive </w:t>
-      </w:r>
-      <w:r>
-        <w:t>rate but</w:t>
-      </w:r>
-      <w:r>
-        <w:t xml:space="preserve"> suffers against new types of attacks as the database needs to be manually updated to deal with new threats.</w:t>
-      </w:r>
-    </w:p>
-    <w:p>
-      <w:r>
-        <w:t xml:space="preserve">To help deal with this, this project </w:t>
-      </w:r>
-      <w:r>
-        <w:t>centres</w:t>
-      </w:r>
-      <w:r>
-        <w:t xml:space="preserve"> around the development of a Network intrusion detection system that makes use of machine learning to identify suspicious patterns within network traffic, by training against features from a networks traffic data, it can learn behaviour patterns </w:t>
-      </w:r>
-      <w:r>
-        <w:t>from both normal and malicious traffic and can  improve overall detection capabilities allowing the system to identify anomalies or threats that would be captured by the rule based systems.</w:t>
-      </w:r>
-    </w:p>
+        <w:t>Alongside the new and changing threats, modern networks generate and receive immensely large volumes of traffic due to the recent growth in cloud services, online services, and personal devices. Monitoring such a large amount of traffic data is unfeasible for an analyst to manage in</w:t>
+      </w:r>
+      <w:r>
+        <w:t xml:space="preserve"> a timely manner that would allow them to respond to an attack and the signature-based systems may also struggle with the highly complex and widely differing traffic patterns.</w:t>
+      </w:r>
+    </w:p>
+    <w:p>
+      <w:r>
+        <w:t>Recent research studies have explored the use of ma</w:t>
+      </w:r>
+      <w:r>
+        <w:t xml:space="preserve">chine learning in order to enhance security detection such as the article Machine Learning for Network Intrusion Detection-A Comparative Study (Al Lail, Garcia and Olivo, 2023) in the study they implemented and evaluated a number of machine learning algorithms against the CICIDS-2017 dataset and were able to achieve detection rates of 97%. This article helps to demonstrate that machine learning models can analyse large datasets of network traffic and identify both normal and malicious traffic with very high accuracy. And unlike </w:t>
+      </w:r>
+      <w:r>
+        <w:t>pure signature-based detection, has the potential to identify new attacks by recognising anomalous patterns of network activity.</w:t>
+      </w:r>
+    </w:p>
+    <w:p>
+      <w:r>
+        <w:t>With this context established, this project focuses on the development of a machine learning based Network Intrusion Detection System that can analyse network traffic data and identify and score suspicious behaviour based on its perceived risk. This aims to demonstrate the use of machine learning in network security and test the effectiveness of it when trained on a machine with modern day middle ground specifications.</w:t>
+      </w:r>
+    </w:p>
+    <w:p/>
     <w:p>
       <w:pPr>
         <w:pStyle w:val="Heading2"/>
       </w:pPr>
-      <w:bookmarkStart w:id="4" w:name="_Toc226373362"/>
-      <w:r>
-        <w:t>Context</w:t>
-      </w:r>
-      <w:bookmarkEnd w:id="4"/>
-    </w:p>
-    <w:p>
-      <w:r>
-        <w:t>Within the current cybersecurity landscape, intrusion detection play a vital role by identifying potentially malicious traffic within a network</w:t>
-      </w:r>
-      <w:r>
-        <w:t xml:space="preserve">. Network Intrusion detection Systems monitor network traffic and analyses and learns patterns to help detect unauthorized access or suspicious activity. A majority of these systems rely on signature-based detection, with the traffic being compared against a list of known attack signatures. </w:t>
-      </w:r>
-    </w:p>
-    <w:p>
-      <w:r>
-        <w:t xml:space="preserve">Some of the most widely used tools make use of </w:t>
+      <w:bookmarkStart w:id="5" w:name="_Toc226373363"/>
+      <w:r>
+        <w:t>Aims and Objectives</w:t>
+      </w:r>
+      <w:bookmarkEnd w:id="5"/>
+    </w:p>
+    <w:p>
+      <w:r>
+        <w:t xml:space="preserve">My aim for this project is to develop a machine learning based network intrusion detection system that </w:t>
+      </w:r>
+      <w:r>
+        <w:t>can analyse</w:t>
+      </w:r>
+      <w:r>
+        <w:t xml:space="preserve"> network traffic logs to identify and classify activity that it classifies as suspicious. The aim of developing this tool is to offer improvement over the more traditional </w:t>
       </w:r>
       <w:r>
         <w:t>signature-based</w:t>
       </w:r>
       <w:r>
-        <w:t xml:space="preserve"> detection, examples of these being Snort and Suricata, both of which are open source and widely used by private users and organizations. These tools are very good at detecting attacks that have been previously </w:t>
-      </w:r>
-      <w:r>
-        <w:t>documented,</w:t>
-      </w:r>
-      <w:r>
-        <w:t xml:space="preserve"> and the system has been updated to detect</w:t>
-      </w:r>
-      <w:r>
-        <w:t xml:space="preserve">. </w:t>
-      </w:r>
-    </w:p>
-    <w:p>
-      <w:r>
-        <w:t xml:space="preserve">As cybercrime grows ever more profitable and with the incident rate of </w:t>
-      </w:r>
-      <w:proofErr w:type="spellStart"/>
-      <w:r>
-        <w:t>cyber crime</w:t>
-      </w:r>
-      <w:proofErr w:type="spellEnd"/>
-      <w:r>
-        <w:t xml:space="preserve"> rising by 37% over the past five years (Bridewell, 2026), the different attack types and vectors continue to evolve, with attackers modifying previously used techniques or developing new attacks using exploits not commonly known, meaning that the signature-based system can’t be updated to detect these attacks. This creates big problems for signature-based systems as attacks that haven’t yet been seen may bypass the detection systems.</w:t>
-      </w:r>
-    </w:p>
-    <w:p>
-      <w:r>
-        <w:t>Alongside the new and changing threats, modern networks generate and receive immensely large volumes of traffic due to the recent growth in cloud services, online services, and personal devices. Monitoring such a large amount of traffic data is unfeasible for an analyst to manage in</w:t>
-      </w:r>
-      <w:r>
-        <w:t xml:space="preserve"> a timely manner that would allow them to respond to an attack and the signature-based systems may also struggle with the highly complex and widely differing traffic patterns.</w:t>
-      </w:r>
-    </w:p>
-    <w:p>
-      <w:r>
-        <w:t>Recent research studies have explored the use of ma</w:t>
-      </w:r>
-      <w:r>
-        <w:t xml:space="preserve">chine learning in order to enhance security detection such as the article Machine Learning for Network Intrusion Detection-A Comparative Study (Al Lail, Garcia and Olivo, 2023) in the study they implemented and evaluated a number of machine learning algorithms against the CICIDS-2017 dataset and were able to achieve detection rates of 97%. This article helps to demonstrate that machine learning models can analyse large datasets of network traffic and identify both normal and malicious traffic with very high accuracy. And unlike </w:t>
-      </w:r>
-      <w:r>
-        <w:t>pure signature-based detection, has the potential to identify new attacks by recognising anomalous patterns of network activity.</w:t>
-      </w:r>
-    </w:p>
-    <w:p>
-      <w:r>
-        <w:t xml:space="preserve">With this context established, this project focuses on the development of a machine learning based Network Intrusion Detection System that can analyse network traffic data and identify and score suspicious behaviour based on its perceived risk. This aims to demonstrate the use </w:t>
-      </w:r>
-      <w:r>
-        <w:lastRenderedPageBreak/>
-        <w:t>of machine learning in network security and test the effectiveness of it when trained on a machine with modern day middle ground specifications.</w:t>
-      </w:r>
-    </w:p>
-    <w:p/>
-    <w:p>
-      <w:pPr>
-        <w:pStyle w:val="Heading2"/>
-      </w:pPr>
-      <w:bookmarkStart w:id="5" w:name="_Toc226373363"/>
-      <w:r>
-        <w:t>Aims and Objectives</w:t>
-      </w:r>
-      <w:bookmarkEnd w:id="5"/>
-    </w:p>
-    <w:p>
-      <w:r>
-        <w:t xml:space="preserve">My aim for this project is to develop a machine learning based network intrusion detection system that </w:t>
-      </w:r>
-      <w:r>
-        <w:t>can analyse</w:t>
-      </w:r>
-      <w:r>
-        <w:t xml:space="preserve"> network traffic logs to identify and classify activity that it classifies as suspicious. The aim of developing this tool is to offer improvement over the more traditional </w:t>
-      </w:r>
-      <w:r>
-        <w:t>signature-based</w:t>
-      </w:r>
-      <w:r>
         <w:t xml:space="preserve"> systems by making use of machine learning to detect patterns and anomalies within the network traffic.</w:t>
       </w:r>
     </w:p>
     <w:p>
       <w:r>
-        <w:t>In order to achieve my aim, my project will tackle the following objectives</w:t>
+        <w:t xml:space="preserve">In order to achieve my aim, my project will tackle the following </w:t>
+      </w:r>
+      <w:r>
+        <w:t>objectives.</w:t>
       </w:r>
     </w:p>
     <w:p>
@@ -4271,7 +4363,13 @@
         <w:t>Investigate pre-existing intrusion detection approaches,</w:t>
       </w:r>
       <w:r>
-        <w:t xml:space="preserve"> notably signature-based and anomaly-based intrusion detection systems, and discuss the strengths and weaknesses.</w:t>
+        <w:t xml:space="preserve"> notably signature-based and anomaly-based intrusion detection </w:t>
+      </w:r>
+      <w:r>
+        <w:t>systems and</w:t>
+      </w:r>
+      <w:r>
+        <w:t xml:space="preserve"> discuss the strengths and weaknesses.</w:t>
       </w:r>
     </w:p>
     <w:p>
@@ -4309,7 +4407,10 @@
         <w:t xml:space="preserve">Select an appropriate NIDS training and testing dataset and preprocess as needed, </w:t>
       </w:r>
       <w:r>
-        <w:t>To ensure features aren’t leaked to bias the machine learning models</w:t>
+        <w:t>to</w:t>
+      </w:r>
+      <w:r>
+        <w:t xml:space="preserve"> ensure features aren’t leaked to bias the machine learning models</w:t>
       </w:r>
       <w:r>
         <w:t>.</w:t>
@@ -4415,7 +4516,14 @@
           <w:b/>
           <w:bCs/>
         </w:rPr>
-        <w:t>To propose recommendations on how it could be improved in future</w:t>
+        <w:t xml:space="preserve">To propose recommendations on how it could be improved in </w:t>
+      </w:r>
+      <w:r>
+        <w:rPr>
+          <w:b/>
+          <w:bCs/>
+        </w:rPr>
+        <w:t>future.</w:t>
       </w:r>
     </w:p>
     <w:p>
@@ -4424,6 +4532,7 @@
       </w:pPr>
       <w:bookmarkStart w:id="6" w:name="_Toc226373364"/>
       <w:r>
+        <w:lastRenderedPageBreak/>
         <w:t>Literature Review</w:t>
       </w:r>
       <w:bookmarkEnd w:id="6"/>
@@ -4470,79 +4579,127 @@
     </w:p>
     <w:p>
       <w:r>
+        <w:t xml:space="preserve">By monitoring inbound and outbound packets, it allows the system to observe and identify traffic patterns and anomalies across all devices on the network, making it best for identifying external attacks, large network scans, and attempts at unauthorized access. </w:t>
+      </w:r>
+    </w:p>
+    <w:p>
+      <w:r>
+        <w:t>But while it has the strength of being able to cover many hosts with a single installation, it struggles against encrypted traffic as it cannot scan for payloads and signatures within the packet.</w:t>
+      </w:r>
+    </w:p>
+    <w:p>
+      <w:r>
+        <w:t xml:space="preserve">This contrasts to Host-based which sits on individual devices and monitors system logs, file system integrity, any running processes, and changes to registry and any system calls made. By sitting directly on the device, it can detect changes to files and attempts at privilege escalation, making it very good at protecting critical devices and tracking user activity, which can help identify insider threats. But this type of monitoring can be very resource intensive as it </w:t>
+      </w:r>
+      <w:r>
+        <w:t>must</w:t>
+      </w:r>
+      <w:r>
+        <w:t xml:space="preserve"> be deployed on every device on the network.</w:t>
+      </w:r>
+    </w:p>
+    <w:p>
+      <w:r>
+        <w:t xml:space="preserve">Despite which type of IDS is being used, they tend to fall into two types for detection, signature based which </w:t>
+      </w:r>
+      <w:r>
+        <w:t>compares traffic to known attack signatures and patterns, and anomaly-based detection which works by establishing a known baseline for activity and produces alerts on deviations from this established norm.</w:t>
+      </w:r>
+    </w:p>
+    <w:p>
+      <w:r>
+        <w:t xml:space="preserve"> It is worth noting that both have their own pros and cons, with signature</w:t>
+      </w:r>
+      <w:r>
+        <w:t>-based</w:t>
+      </w:r>
+      <w:r>
+        <w:t xml:space="preserve"> having high accuracy and low false positive but misses new attack types, whereas anomaly</w:t>
+      </w:r>
+      <w:r>
+        <w:t>-based</w:t>
+      </w:r>
+      <w:r>
+        <w:t xml:space="preserve"> tends to have slightly lower accuracy and higher false positives but makes up for this by detecting newer attack patterns.</w:t>
+      </w:r>
+    </w:p>
+    <w:p>
+      <w:pPr>
+        <w:pStyle w:val="Heading2"/>
+      </w:pPr>
+      <w:bookmarkStart w:id="8" w:name="_Toc226373366"/>
+      <w:r>
+        <w:t xml:space="preserve">Existing implementation of AI </w:t>
+      </w:r>
+      <w:r>
+        <w:t>N</w:t>
+      </w:r>
+      <w:r>
+        <w:t>IDS</w:t>
+      </w:r>
+      <w:bookmarkEnd w:id="8"/>
+    </w:p>
+    <w:p>
+      <w:r>
+        <w:t xml:space="preserve">There are </w:t>
+      </w:r>
+      <w:r>
+        <w:t>several</w:t>
+      </w:r>
+      <w:r>
+        <w:t xml:space="preserve"> already existing applications that make use of AI for network intrusion detection</w:t>
+      </w:r>
+      <w:r>
+        <w:t xml:space="preserve">, and example of this usage is Suricata, Suricata makes use of isolation forest models for its threat detection, allowing it to run alongside Suricata’s </w:t>
+      </w:r>
+      <w:r>
+        <w:t>signature-based</w:t>
+      </w:r>
+      <w:r>
+        <w:t xml:space="preserve"> detection systems, allowing them to offer an easily accessible hybrid detection system.</w:t>
+      </w:r>
+    </w:p>
+    <w:p>
+      <w:r>
+        <w:t xml:space="preserve">Another example of AI usage is from snort, one of the </w:t>
+      </w:r>
+      <w:r>
+        <w:t>most used</w:t>
+      </w:r>
+      <w:r>
+        <w:t xml:space="preserve"> </w:t>
+      </w:r>
+      <w:r>
+        <w:t>open-source intrusion detection systems, that traditionally makes use of signature-based detection for its systems, has introduced Snort_ML which uses neural networks instead of the traditional rule sets.</w:t>
+      </w:r>
+    </w:p>
+    <w:p>
+      <w:r>
         <w:lastRenderedPageBreak/>
-        <w:t xml:space="preserve">By monitoring inbound and outbound packets, it allows the system to observe and identify traffic patterns and anomalies across all devices on the network, making it best for identifying external attacks, large network scans, and attempts at unauthorized access. </w:t>
-      </w:r>
-    </w:p>
-    <w:p>
-      <w:r>
-        <w:t>But while it has the strength of being able to cover many hosts with a single installation, it struggles against encrypted traffic as it cannot scan for payloads and signatures within the packet.</w:t>
-      </w:r>
-    </w:p>
-    <w:p>
-      <w:r>
-        <w:t>This contrasts to Host-based which sits on individual devices and monitors system logs, file system integrity, any running processes, and changes to registry and any system calls made. By sitting directly on the device, it can detect changes to files and attempts at privilege escalation, making it very good at protecting critical devices and tracking user activity, which can help identify insider threats. But this type of monitoring can be very resource intensive as it has to be deployed on every device on the network.</w:t>
-      </w:r>
-    </w:p>
-    <w:p>
-      <w:r>
-        <w:t xml:space="preserve">Despite which type of IDS is being used, they tend to fall into two types for detection, signature based which </w:t>
-      </w:r>
-      <w:r>
-        <w:t>compares traffic to known attack signatures and patterns, and anomaly-based detection which works by establishing a known baseline for activity and produces alerts on deviations from this established norm.</w:t>
-      </w:r>
-    </w:p>
-    <w:p>
-      <w:r>
-        <w:t xml:space="preserve"> It is worth noting that both have their own pros and cons, with signature having high accuracy and low false positive but misses new attack types, whereas  anomaly tends to have slightly lower accuracy and higher false positives but makes up for this by detecting newer attack patterns.</w:t>
+        <w:t xml:space="preserve">The fact that two of the biggest </w:t>
+      </w:r>
+      <w:r>
+        <w:t>open-source</w:t>
+      </w:r>
+      <w:r>
+        <w:t xml:space="preserve"> IDS providers are shifting towards ML for detection, starts to show where the industry is starting to turn, favouring hybrid or AI systems rather than just having </w:t>
+      </w:r>
+      <w:r>
+        <w:t>signature-based</w:t>
+      </w:r>
+      <w:r>
+        <w:t xml:space="preserve"> systems.</w:t>
       </w:r>
     </w:p>
     <w:p>
       <w:pPr>
         <w:pStyle w:val="Heading2"/>
       </w:pPr>
-      <w:bookmarkStart w:id="8" w:name="_Toc226373366"/>
-      <w:r>
-        <w:t xml:space="preserve">Existing implementation of AI </w:t>
-      </w:r>
-      <w:r>
-        <w:t>N</w:t>
-      </w:r>
-      <w:r>
-        <w:t>IDS</w:t>
-      </w:r>
-      <w:bookmarkEnd w:id="8"/>
-    </w:p>
-    <w:p>
-      <w:r>
-        <w:t>There are a number of already existing applications that make use of AI for network intrusion detection</w:t>
-      </w:r>
-      <w:r>
-        <w:t>, and example of this usage is Suricata, Suricata makes use of isolation forest models for its threat detection, allowing it to run alongside Suricata’s signature based detection systems, allowing them to offer an easily accessible hybrid detection system.</w:t>
-      </w:r>
-    </w:p>
-    <w:p>
-      <w:r>
-        <w:t xml:space="preserve">Another example of AI usage is from snort, one of the most commonly used </w:t>
-      </w:r>
-      <w:r>
-        <w:t>open-source intrusion detection systems, that traditionally makes use of signature-based detection for its systems, has introduced Snort_ML which uses neural networks instead of the traditional rule sets.</w:t>
-      </w:r>
-    </w:p>
-    <w:p>
-      <w:r>
-        <w:t>The fact that two of the biggest open source IDS providers are shifting towards ML for detection, starts to show where the industry is starting to turn, favouring hybrid or AI systems rather than just having signature based systems.</w:t>
-      </w:r>
     </w:p>
     <w:p>
       <w:pPr>
         <w:pStyle w:val="Heading2"/>
       </w:pPr>
-    </w:p>
-    <w:p>
-      <w:pPr>
-        <w:pStyle w:val="Heading2"/>
-      </w:pPr>
       <w:bookmarkStart w:id="9" w:name="_Toc226373367"/>
       <w:r>
         <w:t>Legal, Social, Ethical, Professional(LSEP)</w:t>
@@ -4565,21 +4722,15 @@
     </w:p>
     <w:p>
       <w:r>
-        <w:lastRenderedPageBreak/>
-        <w:t>While traditionally there aren’t any social considerations relating to AI usage in intrusion detection, in the current day and age, there is a stigma around AI usage that stems from a lack of understanding of what the AI would be doing as when they hear that AI has been integrated, the mind jumps to use of Generative AI which people have a strong stance against the usage of genAI.</w:t>
-      </w:r>
-    </w:p>
-    <w:p>
-      <w:r>
-        <w:t xml:space="preserve">The only ethical consideration for this project that I can think is how the data for training has been obtained, have I gathered it in a shady manner, </w:t>
-      </w:r>
-      <w:proofErr w:type="spellStart"/>
-      <w:r>
-        <w:t>through</w:t>
-      </w:r>
-      <w:proofErr w:type="spellEnd"/>
-      <w:r>
-        <w:t xml:space="preserve"> not being clear on my intentions</w:t>
+        <w:t>While traditionally there aren’t any social considerations relating to AI usage in intrusion detection, in the current day and age, there is a stigma around AI usage that stems from a lack of understanding of what the AI would be doing as when they hear that AI has been integrated, the mind jumps to use of Generative AI which people have a strong stance against the usage of</w:t>
+      </w:r>
+      <w:r>
+        <w:t>.</w:t>
+      </w:r>
+    </w:p>
+    <w:p>
+      <w:r>
+        <w:t>The only ethical consideration for this project that I can think is how the data for training has been obtained, have I gathered it in a shady manner, through not being clear on my intentions</w:t>
       </w:r>
       <w:r>
         <w:t xml:space="preserve"> in the gathering of data. No, in this project the data has been ethically sourced through the University of New South Wales as they provide the UNSW NB-15 dataset for free for academic usage which this project falls under.</w:t>
@@ -4597,11 +4748,9 @@
       <w:r>
         <w:t xml:space="preserve">This is doubly so due to its nature as </w:t>
       </w:r>
-      <w:proofErr w:type="spellStart"/>
-      <w:r>
-        <w:t>a</w:t>
-      </w:r>
-      <w:proofErr w:type="spellEnd"/>
+      <w:r>
+        <w:t>an</w:t>
+      </w:r>
       <w:r>
         <w:t xml:space="preserve"> Intrusion Detection system, rather than an Intrusion Prevention System, as by itself, an IDS system can do nothing about the intrusion attempts but alert an analyst or user.</w:t>
       </w:r>
@@ -4639,6 +4788,7 @@
       </w:pPr>
       <w:bookmarkStart w:id="12" w:name="_Toc226373370"/>
       <w:r>
+        <w:lastRenderedPageBreak/>
         <w:t>Implementation Method</w:t>
       </w:r>
       <w:bookmarkEnd w:id="12"/>
@@ -4665,77 +4815,81 @@
     </w:p>
     <w:p>
       <w:r>
-        <w:t xml:space="preserve">Waterfall remains a choice often mentioned when asked about project methodologies, it fits best for projects where there are fixed requirements that are well defined, but its main </w:t>
+        <w:t>Waterfall remains a choice often mentioned when asked about project methodologies, it fits best for projects where there are fixed requirements that are well defined, but its main weakness is that it is highly inflexible to change once development has started. Part of software development and use of technology is that problems will always appear, meaning that you may need to pivot and make changes which simply wouldn’t be possible with waterfall due to its linear and rigid nature.</w:t>
+      </w:r>
+    </w:p>
+    <w:p>
+      <w:r>
+        <w:t>Spiral is a project methodology that sits in the middle between linear and iterative development, which provides it the flexibility that waterfall lacks but it still shows downsides for the type of project that I’m running as that it focuses heavily on risk management and analysis on each stage</w:t>
+      </w:r>
+      <w:r>
+        <w:t xml:space="preserve"> and with what I am developing, is simply not necessary, as it would only serve to bloat the development process.</w:t>
+      </w:r>
+    </w:p>
+    <w:p>
+      <w:r>
+        <w:t xml:space="preserve">The final alternative I will go into is Cleanroom software engineering, this focuses on development of software with a certifiable level of reliability, using incremental development using strong control and testing to ensure highly reliable quality code, if a piece of software fails to meet the testing requirements, testing in stopped and, you start again at the design phase. </w:t>
+      </w:r>
+    </w:p>
+    <w:p>
+      <w:r>
+        <w:t xml:space="preserve">These examples show that while there are possible alternatives to the agile methodology that ive chosen, they don’t fit the project as well as they all produce either a rigidness that </w:t>
+      </w:r>
+      <w:r>
+        <w:t>will</w:t>
+      </w:r>
+      <w:r>
+        <w:t xml:space="preserve"> cripple the project if problems </w:t>
+      </w:r>
+      <w:r>
+        <w:t>occur or</w:t>
+      </w:r>
+      <w:r>
+        <w:t xml:space="preserve"> would add an unreasonable level of bloat that would slow the project down</w:t>
+      </w:r>
+      <w:r>
+        <w:t xml:space="preserve"> unnecessarily.</w:t>
+      </w:r>
+    </w:p>
+    <w:p>
+      <w:pPr>
+        <w:pStyle w:val="Heading2"/>
+      </w:pPr>
+      <w:bookmarkStart w:id="14" w:name="_Toc226373372"/>
+      <w:r>
+        <w:t>System Architecture</w:t>
+      </w:r>
+      <w:bookmarkEnd w:id="14"/>
+    </w:p>
+    <w:p>
+      <w:r>
+        <w:t xml:space="preserve">My design for the system will work along the lines of standard machine learning practice, </w:t>
+      </w:r>
+      <w:r>
+        <w:t>using the standard stages of a machine learning pipeline: loading the dataset, preprocessing, feature scaling, feed the data to the model, make predictions against the data, then send an alert regarding the information. Below is a breakdown of the stages of my ML pipeline.</w:t>
+      </w:r>
+    </w:p>
+    <w:p>
+      <w:r>
+        <w:t xml:space="preserve">The first stage is loading the dataset into the Jupyter notebook file </w:t>
+      </w:r>
+      <w:r>
+        <w:t>with</w:t>
+      </w:r>
+      <w:r>
+        <w:t xml:space="preserve"> NumPy and pandas</w:t>
+      </w:r>
+      <w:r>
+        <w:t xml:space="preserve">, before loading the dataset, checking the dataset contains all of the expected features is advised considering the number of sites where these testing datasets are available from. </w:t>
+      </w:r>
+    </w:p>
+    <w:p>
+      <w:r>
+        <w:t xml:space="preserve">Next is preprocessing the data to ensure that the model can use it to train, this can involve cleaning the data to get rid of any inaccurate, incomplete, or incorrectly formatted data from </w:t>
       </w:r>
       <w:r>
         <w:lastRenderedPageBreak/>
-        <w:t>weakness is that it is highly inflexible to change once development has started. Part of software development and use of technology is that problems will always appear, meaning that you may need to pivot and make changes which simply wouldn’t be possible with waterfall due to its linear and rigid nature.</w:t>
-      </w:r>
-    </w:p>
-    <w:p>
-      <w:r>
-        <w:t>Spiral is a project methodology that sits in the middle between linear and iterative development, which provides it the flexibility that waterfall lacks but it still shows downsides for the type of project that I’m running as that it focuses heavily on risk management and analysis on each stage</w:t>
-      </w:r>
-      <w:r>
-        <w:t xml:space="preserve"> and with what I am developing, is simply not necessary, as it would only serve to bloat the development process.</w:t>
-      </w:r>
-    </w:p>
-    <w:p>
-      <w:r>
-        <w:t xml:space="preserve">The final alternative I will go into is Cleanroom software engineering, this focuses on development of software with a certifiable level of reliability, using incremental development using strong control and testing to ensure highly reliable quality code, if a piece of software fails to meet the testing requirements, testing in stopped and, you start again at the design phase. </w:t>
-      </w:r>
-    </w:p>
-    <w:p>
-      <w:r>
-        <w:t xml:space="preserve">These examples show that while there are possible alternatives to the agile methodology that </w:t>
-      </w:r>
-      <w:proofErr w:type="spellStart"/>
-      <w:r>
-        <w:t>ive</w:t>
-      </w:r>
-      <w:proofErr w:type="spellEnd"/>
-      <w:r>
-        <w:t xml:space="preserve"> chosen, they don’t fit the project as well as they all produce either a rigidness that would cripple the project if problems </w:t>
-      </w:r>
-      <w:r>
-        <w:t>occur or</w:t>
-      </w:r>
-      <w:r>
-        <w:t xml:space="preserve"> would add an unreasonable level of bloat that would slow the project down</w:t>
-      </w:r>
-      <w:r>
-        <w:t xml:space="preserve"> unnecessarily.</w:t>
-      </w:r>
-    </w:p>
-    <w:p>
-      <w:pPr>
-        <w:pStyle w:val="Heading2"/>
-      </w:pPr>
-      <w:bookmarkStart w:id="14" w:name="_Toc226373372"/>
-      <w:r>
-        <w:t>System Architecture</w:t>
-      </w:r>
-      <w:bookmarkEnd w:id="14"/>
-    </w:p>
-    <w:p>
-      <w:r>
-        <w:t xml:space="preserve">My design for the system will work along the lines of standard machine learning practice, </w:t>
-      </w:r>
-      <w:r>
-        <w:t>using the standard stages of a machine learning pipeline: loading the dataset, preprocessing, feature scaling, feed the data to the model, make predictions against the data, then send an alert regarding the information. Below is a breakdown of the stages of my ML pipeline.</w:t>
-      </w:r>
-    </w:p>
-    <w:p>
-      <w:r>
-        <w:t>The first stage is loading the dataset into the Jupyter notebook file through the use of NumPy and pandas</w:t>
-      </w:r>
-      <w:r>
-        <w:t xml:space="preserve">, before loading the dataset, checking the dataset contains all of the expected features is advised considering the number of sites where these testing datasets are available from. </w:t>
-      </w:r>
-    </w:p>
-    <w:p>
-      <w:r>
-        <w:t>Next is preprocessing the data to ensure that the model can use it to train, this can involve cleaning the data to get rid of any inaccurate, incomplete, or incorrectly formatted data from the dataset,</w:t>
+        <w:t>the dataset,</w:t>
       </w:r>
       <w:r>
         <w:t xml:space="preserve"> encoding the data to convert categorical data such as text or any </w:t>
@@ -4773,23 +4927,23 @@
     </w:p>
     <w:p>
       <w:r>
+        <w:t>The prediction stage is where the data is fed to the loaded and trained model and it runs against the dataset and produces predictions that can be output to a file, and then depending on the results of the predictions can trigger alerts via multiple means such as SIEM platforms, application notifications, or emails through email API’s or smtp code.</w:t>
+      </w:r>
+    </w:p>
+    <w:p>
+      <w:r>
+        <w:t xml:space="preserve"> </w:t>
+      </w:r>
+    </w:p>
+    <w:p>
+      <w:pPr>
+        <w:keepNext/>
+      </w:pPr>
+      <w:r>
+        <w:rPr>
+          <w:noProof/>
+        </w:rPr>
         <w:lastRenderedPageBreak/>
-        <w:t>The prediction stage is where the data is fed to the loaded and trained model and it runs against the dataset and produces predictions that can be output to a file, and then depending on the results of the predictions can trigger alerts via multiple means such as SIEM platforms, application notifications, or emails through email API’s or smtp code.</w:t>
-      </w:r>
-    </w:p>
-    <w:p>
-      <w:r>
-        <w:t xml:space="preserve"> </w:t>
-      </w:r>
-    </w:p>
-    <w:p>
-      <w:pPr>
-        <w:keepNext/>
-      </w:pPr>
-      <w:r>
-        <w:rPr>
-          <w:noProof/>
-        </w:rPr>
         <w:drawing>
           <wp:inline distT="0" distB="0" distL="0" distR="0" wp14:anchorId="68021D72" wp14:editId="34308990">
             <wp:extent cx="4324954" cy="5439534"/>
@@ -4843,7 +4997,10 @@
         </w:r>
       </w:fldSimple>
       <w:r>
-        <w:t>: Pipeline diagram for the ML system</w:t>
+        <w:t xml:space="preserve">: Pipeline diagram for the ML </w:t>
+      </w:r>
+      <w:r>
+        <w:t>system.</w:t>
       </w:r>
     </w:p>
     <w:p>
@@ -4864,7 +5021,19 @@
         <w:t>.</w:t>
       </w:r>
       <w:r>
-        <w:t xml:space="preserve"> This data set has 49 features to give the model a range of different data points to train against and learn the patterns of. It contains 9 different types of attacks, these attacks are Fuzzers, Analysis, Backdoors, DoS, Exploits, Generic, Reconnaissance, Shellcode and Worms. </w:t>
+        <w:t xml:space="preserve"> This data set has </w:t>
+      </w:r>
+      <w:r>
+        <w:t>forty-nine</w:t>
+      </w:r>
+      <w:r>
+        <w:t xml:space="preserve"> features to give the model a range of different data points to train against and learn the patterns of. It contains </w:t>
+      </w:r>
+      <w:r>
+        <w:t>nine</w:t>
+      </w:r>
+      <w:r>
+        <w:t xml:space="preserve"> different types of attacks, these attacks are Fuzzers, Analysis, Backdoors, DoS, Exploits, Generic, Reconnaissance, Shellcode and Worms. </w:t>
       </w:r>
     </w:p>
     <w:p>
@@ -4872,68 +5041,80 @@
         <w:t>The reason that I chose this dataset is that while it is a more modern dataset with newer types of attacks than a lot of other datasets, the hardware needed to train a model on it is much more reasonable than other modern datasets such as the CICIDS2017 dataset</w:t>
       </w:r>
       <w:r>
-        <w:t xml:space="preserve"> as part of my reason </w:t>
+        <w:t xml:space="preserve"> as part of my reason for choosing this project is to find out if AI NIDS is something that an average consumer could reasonably make use without having massive computing power to train the models.</w:t>
+      </w:r>
+    </w:p>
+    <w:p>
+      <w:pPr>
+        <w:pStyle w:val="Heading2"/>
+      </w:pPr>
+      <w:bookmarkStart w:id="16" w:name="_Toc226373374"/>
+      <w:r>
+        <w:t>Data Preprocessing</w:t>
+      </w:r>
+      <w:bookmarkEnd w:id="16"/>
+    </w:p>
+    <w:p>
+      <w:r>
+        <w:t>In order to ensure that the ML model to accept and process the data</w:t>
+      </w:r>
+      <w:r>
+        <w:t xml:space="preserve">, the data must be pre-processed, it needs to go through a number of steps to </w:t>
+      </w:r>
+      <w:r>
+        <w:t xml:space="preserve">that no errors occur during training and </w:t>
       </w:r>
       <w:r>
         <w:lastRenderedPageBreak/>
-        <w:t>for choosing this project is to find out if AI NIDS is something that an average consumer could reasonably make use without having massive computing power to train the models.</w:t>
+        <w:t xml:space="preserve">testing. One of the most important preprocessing steps is proper data encoding, this entails changing the data type of all non-numerical categorical columns to a number format such as float64 as </w:t>
+      </w:r>
+      <w:r>
+        <w:t>many</w:t>
+      </w:r>
+      <w:r>
+        <w:t xml:space="preserve"> ML models will not accept non-numerical data.</w:t>
+      </w:r>
+    </w:p>
+    <w:p>
+      <w:r>
+        <w:t xml:space="preserve">During preprocessing, it </w:t>
+      </w:r>
+      <w:r>
+        <w:t>is</w:t>
+      </w:r>
+      <w:r>
+        <w:t xml:space="preserve"> key to drop columns that could poison training, for the UNSW NB15, this would be the label, id, and attack_cat as label and attack_cat denote whether a line of traffic is an attack or not, while the id column</w:t>
+      </w:r>
+      <w:r>
+        <w:t xml:space="preserve"> can cause models to f</w:t>
+      </w:r>
+      <w:r>
+        <w:t>ocus on it and decrease the accuracy heavily.</w:t>
+      </w:r>
+    </w:p>
+    <w:p>
+      <w:r>
+        <w:t>A key step of preprocessing is cleaning and scaling the data, cleaning matters as it gets rid of any incomplete, incorrect, or corrupt data so that the model doesn’t try to learn or make predictions based on bad data.</w:t>
+      </w:r>
+      <w:r>
+        <w:t xml:space="preserve"> </w:t>
+      </w:r>
+    </w:p>
+    <w:p>
+      <w:r>
+        <w:t xml:space="preserve">Scaling is used to ensure that features with large ranges don’t dominate learning due to their magnitude, scaling limits to the range of </w:t>
+      </w:r>
+      <w:r>
+        <w:t>numbers of</w:t>
+      </w:r>
+      <w:r>
+        <w:t xml:space="preserve"> features can contain, traditionally this centres around zero with a difference of one either side so minus one and positive one.</w:t>
       </w:r>
     </w:p>
     <w:p>
       <w:pPr>
         <w:pStyle w:val="Heading2"/>
       </w:pPr>
-      <w:bookmarkStart w:id="16" w:name="_Toc226373374"/>
-      <w:r>
-        <w:t>Data Preprocessing</w:t>
-      </w:r>
-      <w:bookmarkEnd w:id="16"/>
-    </w:p>
-    <w:p>
-      <w:r>
-        <w:t>In order to ensure that the ML model to accept and process the data</w:t>
-      </w:r>
-      <w:r>
-        <w:t xml:space="preserve">, the data must be pre-processed, it needs to go through a number of steps to </w:t>
-      </w:r>
-      <w:r>
-        <w:t>that no errors occur during training and testing. One of the most important preprocessing steps is proper data encoding, this entails changing the data type of all non-numerical categorical columns to a number format such as float64 as a large number of ML models will not accept non-numerical data.</w:t>
-      </w:r>
-    </w:p>
-    <w:p>
-      <w:r>
-        <w:t xml:space="preserve">During preprocessing, it </w:t>
-      </w:r>
-      <w:r>
-        <w:t>is</w:t>
-      </w:r>
-      <w:r>
-        <w:t xml:space="preserve"> key to drop columns that could poison training, for the UNSW NB15, this would be the label, id, and attack_cat as label and attack_cat denote whether a line of traffic is an attack or not, while the id column</w:t>
-      </w:r>
-      <w:r>
-        <w:t xml:space="preserve"> can cause models to f</w:t>
-      </w:r>
-      <w:r>
-        <w:t>ocus on it and decrease the accuracy heavily going.</w:t>
-      </w:r>
-    </w:p>
-    <w:p>
-      <w:r>
-        <w:t>A key step of preprocessing is cleaning and scaling the data, cleaning matters as it gets rid of any incomplete, incorrect, or corrupt data so that the model doesn’t try to learn or make predictions based on bad data.</w:t>
-      </w:r>
-      <w:r>
-        <w:t xml:space="preserve"> </w:t>
-      </w:r>
-    </w:p>
-    <w:p>
-      <w:r>
-        <w:t>Scaling is used to ensure that features with large ranges don’t dominate learning due to their magnitude, scaling limits to the range of numbers features can contain, traditionally this centres around zero with a difference of one either side so minus one and positive one.</w:t>
-      </w:r>
-    </w:p>
-    <w:p>
-      <w:pPr>
-        <w:pStyle w:val="Heading2"/>
-      </w:pPr>
       <w:bookmarkStart w:id="17" w:name="_Toc226373375"/>
       <w:r>
         <w:t>Machine Learning Models Used</w:t>
@@ -4942,10 +5123,22 @@
     </w:p>
     <w:p>
       <w:r>
-        <w:t>In order to ensure that the model with the highest accuracy is used for final predictions, I will train and test 5 different ML models to determine which has the highest accuracy</w:t>
-      </w:r>
-      <w:r>
-        <w:t>, this will be determined by 4 different metrics, the accuracy, the recall, the precision, and the f1. To clarify the metrics to help interpretation of the results further on, below are bullet points that explain what each metric is.</w:t>
+        <w:t xml:space="preserve">In order to ensure that the model with the highest accuracy is used for final predictions, I will train and test </w:t>
+      </w:r>
+      <w:r>
+        <w:t>five</w:t>
+      </w:r>
+      <w:r>
+        <w:t xml:space="preserve"> different ML models to determine which has the highest accuracy</w:t>
+      </w:r>
+      <w:r>
+        <w:t xml:space="preserve">, this will be determined by </w:t>
+      </w:r>
+      <w:r>
+        <w:t>four</w:t>
+      </w:r>
+      <w:r>
+        <w:t xml:space="preserve"> different metrics, the accuracy, the recall, the precision, and the f1. To clarify the metrics to help interpretation of the results further on, below are bullet points that explain what each metric is.</w:t>
       </w:r>
     </w:p>
     <w:p>
@@ -5002,7 +5195,13 @@
         <w:t>Recall:</w:t>
       </w:r>
       <w:r>
-        <w:t xml:space="preserve"> How many of the data points that should be predicted as positive did we actually predict as positive.</w:t>
+        <w:t xml:space="preserve"> How many of the data points that should be predicted as positive did we </w:t>
+      </w:r>
+      <w:r>
+        <w:t>predict</w:t>
+      </w:r>
+      <w:r>
+        <w:t xml:space="preserve"> as positive.</w:t>
       </w:r>
     </w:p>
     <w:p>
@@ -5021,12 +5220,24 @@
         <w:t>F1:</w:t>
       </w:r>
       <w:r>
-        <w:t xml:space="preserve"> This metric combines Precision and Recall to help determine the balance between the two, and punishes heavily for heavily negative results from either metric.</w:t>
-      </w:r>
-    </w:p>
-    <w:p>
-      <w:r>
-        <w:t>The models that will be used are: Random forest, KNN, Logistic Regression, Linear SVM, and XGBoost, these models were chosen to ensure a wider range of results by using a range of models.</w:t>
+        <w:t xml:space="preserve"> This metric combines Precision and Recall to help determine the balance between the </w:t>
+      </w:r>
+      <w:r>
+        <w:t>two and</w:t>
+      </w:r>
+      <w:r>
+        <w:t xml:space="preserve"> punishes heavily for heavily negative results from either metric.</w:t>
+      </w:r>
+    </w:p>
+    <w:p>
+      <w:r>
+        <w:t xml:space="preserve">The models that will be used are: </w:t>
+      </w:r>
+      <w:r>
+        <w:t>Random Forest</w:t>
+      </w:r>
+      <w:r>
+        <w:t>, KNN, Logistic Regression, Linear SVM, and XGBoost, these models were chosen to ensure a wider range of results by using a range of models.</w:t>
       </w:r>
       <w:r>
         <w:t xml:space="preserve"> Below is a set of bullet points to introduce with more detail the models that will be used.</w:t>
@@ -5070,7 +5281,13 @@
         <w:t>KNN:</w:t>
       </w:r>
       <w:r>
-        <w:t xml:space="preserve"> This algorithm works on the principle that data points that have similar traits to each other sit near each other, this is done by calculating the distances between different data points compared to unlabelled data points.</w:t>
+        <w:t xml:space="preserve"> This algorithm works on the principle that data points that have similar traits to each other sit near </w:t>
+      </w:r>
+      <w:r>
+        <w:t>each other;</w:t>
+      </w:r>
+      <w:r>
+        <w:t xml:space="preserve"> this is done by calculating the distances between different data points compared to unlabelled data points.</w:t>
       </w:r>
     </w:p>
     <w:p>
@@ -5099,11 +5316,7 @@
         <w:t>This model works to predict the probability of a specific outcome occurring, in this case, whether or not a piece of data is malicious or not</w:t>
       </w:r>
       <w:r>
-        <w:t xml:space="preserve">, the </w:t>
-      </w:r>
-      <w:r>
-        <w:lastRenderedPageBreak/>
-        <w:t>probabilities of the outcomes are confined to between zero and one, with the probabilities determined, the results are fitted to an S curve to map the values to the probability</w:t>
+        <w:t>, the probabilities of the outcomes are confined to between zero and one, with the probabilities determined, the results are fitted to an S curve to map the values to the probability</w:t>
       </w:r>
     </w:p>
     <w:p>
@@ -5145,6 +5358,7 @@
           <w:b/>
           <w:bCs/>
         </w:rPr>
+        <w:lastRenderedPageBreak/>
         <w:t>XGBoost:</w:t>
       </w:r>
       <w:r>
@@ -5206,7 +5420,7 @@
     </w:p>
     <w:p>
       <w:r>
-        <w:t>Python is one of the main building blocks for this project as without it, none of it would work due to the availability of some key libraries that allow me to fulfil my aims, for this project, I used Python 3 due to its previously mentioned libraries for machine learning that aren’t available in other languages. All of my code written for this project has been done in python as the language is massively versatile.</w:t>
+        <w:t>Python is one of the main building blocks for this project as without it, none of it would work due to the availability of some key libraries that allow me to fulfil my aims, for this project, I used Python 3 due to its previously mentioned libraries for machine learning that aren’t available in other languages. All code written for this project has been done in python as the language is massively versatile.</w:t>
       </w:r>
     </w:p>
     <w:p>
@@ -5236,13 +5450,17 @@
     </w:p>
     <w:p>
       <w:r>
-        <w:t xml:space="preserve">For this project, a range of python libraries were use to implement the features set out in the aims and objectives earlier in the report, in the bullet points below, I will </w:t>
-      </w:r>
-      <w:proofErr w:type="spellStart"/>
-      <w:r>
-        <w:t>layout</w:t>
-      </w:r>
-      <w:proofErr w:type="spellEnd"/>
+        <w:t xml:space="preserve">For this project, a range of python libraries were </w:t>
+      </w:r>
+      <w:r>
+        <w:t>used</w:t>
+      </w:r>
+      <w:r>
+        <w:t xml:space="preserve"> to implement the features set out in the aims and objectives earlier in the report, in the bullet points below, I will </w:t>
+      </w:r>
+      <w:r>
+        <w:t>lay out</w:t>
+      </w:r>
       <w:r>
         <w:t xml:space="preserve"> how and why each library was used.</w:t>
       </w:r>
@@ -5260,7 +5478,6 @@
           <w:b/>
           <w:bCs/>
         </w:rPr>
-        <w:lastRenderedPageBreak/>
         <w:t>Pandas and NumPy</w:t>
       </w:r>
       <w:r>
@@ -5294,15 +5511,14 @@
           <w:numId w:val="2"/>
         </w:numPr>
       </w:pPr>
-      <w:proofErr w:type="spellStart"/>
       <w:r>
         <w:rPr>
           <w:b/>
           <w:bCs/>
         </w:rPr>
+        <w:lastRenderedPageBreak/>
         <w:t>JobLib</w:t>
       </w:r>
-      <w:proofErr w:type="spellEnd"/>
       <w:r>
         <w:t>: This was used in order to dump the model and feature columns from python to  a PKL file to allow for usage within other Jupyter notebook files without having to retrain the model, saving a considerable amount of time.</w:t>
       </w:r>
@@ -5315,7 +5531,6 @@
           <w:numId w:val="2"/>
         </w:numPr>
       </w:pPr>
-      <w:proofErr w:type="spellStart"/>
       <w:r>
         <w:rPr>
           <w:b/>
@@ -5323,7 +5538,6 @@
         </w:rPr>
         <w:t>SMTPLib</w:t>
       </w:r>
-      <w:proofErr w:type="spellEnd"/>
       <w:r>
         <w:t>: This was used in order to implement email alerts, allowing the users to be informed if suspicious behaviour has been detected within the traffic log files.</w:t>
       </w:r>
@@ -5397,7 +5611,6 @@
         <w:rPr>
           <w:noProof/>
         </w:rPr>
-        <w:lastRenderedPageBreak/>
         <w:drawing>
           <wp:inline distT="0" distB="0" distL="0" distR="0" wp14:anchorId="614EB440" wp14:editId="325F4EA4">
             <wp:extent cx="5731510" cy="3338830"/>
@@ -5456,12 +5669,19 @@
     </w:p>
     <w:p>
       <w:r>
+        <w:lastRenderedPageBreak/>
         <w:t>The next step of the development pipeline was the pre-processing of the data, this proved to provide more challenge than anticipated, leading to it taking up time over two sprints as there was a feature leak that was impacting the accuracy of two of the models negatively.</w:t>
       </w:r>
     </w:p>
     <w:p>
       <w:r>
-        <w:t>I started by removing the non-feature columns and any columns that could produce leaks that would poison the training and testing by either allowing the models to cheat using columns like attack_cat which contains the type of attack the line was, or poison it and reduce the accuracy like the id column did during the development of this section.</w:t>
+        <w:t xml:space="preserve">I started by removing the non-feature columns and any columns that could produce leaks that would poison the training and testing by either allowing the models to cheat using columns like attack_cat which contains the type of attack the line </w:t>
+      </w:r>
+      <w:r>
+        <w:t>was or</w:t>
+      </w:r>
+      <w:r>
+        <w:t xml:space="preserve"> poison it and reduce the accuracy like the id column did during the development of this section.</w:t>
       </w:r>
     </w:p>
     <w:p>
@@ -5525,7 +5745,10 @@
         </w:r>
       </w:fldSimple>
       <w:r>
-        <w:t>:Dropping features to prevent leaks</w:t>
+        <w:t xml:space="preserve">:Dropping features to prevent </w:t>
+      </w:r>
+      <w:r>
+        <w:t>leaks.</w:t>
       </w:r>
     </w:p>
     <w:p>
@@ -5538,26 +5761,23 @@
     </w:p>
     <w:p>
       <w:r>
-        <w:t xml:space="preserve">With the columns encoded, the next task was to align the features of the testing and training dataset, this ensures that when the model are run against the test dataset, it doesn’t throw errors, as the training dataset contains features that are not present in the test dataset, then as </w:t>
-      </w:r>
-      <w:r>
+        <w:t>With the columns encoded, the next task was to align the features of the testing and training dataset, this ensures that when the model are run against the test dataset, it doesn’t throw errors, as the training dataset contains features that are not present in the test dataset, then as a last measure to ensure that the models do not break due to data being non numerical, the encoded columns datatype is set as float64.</w:t>
+      </w:r>
+    </w:p>
+    <w:p>
+      <w:r>
+        <w:t>The final step was to assign class weights to the training columns, this is due to XGBoost making use of class weights, so to ensure best results, I have included it.</w:t>
+      </w:r>
+    </w:p>
+    <w:p>
+      <w:pPr>
+        <w:keepNext/>
+      </w:pPr>
+      <w:r>
+        <w:rPr>
+          <w:noProof/>
+        </w:rPr>
         <w:lastRenderedPageBreak/>
-        <w:t>a last measure to ensure that the models do not break due to data being non numerical, the encoded columns datatype is set as float64.</w:t>
-      </w:r>
-    </w:p>
-    <w:p>
-      <w:r>
-        <w:t>The final step was to assign class weights to the training columns, this is due to XGBoost making use of class weights, so to ensure best results, I have included it.</w:t>
-      </w:r>
-    </w:p>
-    <w:p>
-      <w:pPr>
-        <w:keepNext/>
-      </w:pPr>
-      <w:r>
-        <w:rPr>
-          <w:noProof/>
-        </w:rPr>
         <w:drawing>
           <wp:inline distT="0" distB="0" distL="0" distR="0" wp14:anchorId="5C0EC1D9" wp14:editId="7F8A4655">
             <wp:extent cx="5731510" cy="4686300"/>
@@ -5614,7 +5834,7 @@
         <w:t xml:space="preserve">: Data Pre-processing and feature </w:t>
       </w:r>
       <w:r>
-        <w:t>alignment</w:t>
+        <w:t>alignment.</w:t>
       </w:r>
     </w:p>
     <w:p>
@@ -5681,10 +5901,31 @@
     </w:p>
     <w:p>
       <w:r>
-        <w:t xml:space="preserve">Now with the models setup with proper parameters, the models are fit against the training split of the dataset and the </w:t>
-      </w:r>
-      <w:r>
-        <w:t>various metrics can be gathered using the results of the models running predictions against the testing split of the dataset. Below is a table containing the results of the predictions made by the five models</w:t>
+        <w:t xml:space="preserve">Now with the </w:t>
+      </w:r>
+      <w:r>
+        <w:t>model’s</w:t>
+      </w:r>
+      <w:r>
+        <w:t xml:space="preserve"> setup with proper parameters, the models are fit against the training split of the </w:t>
+      </w:r>
+      <w:r>
+        <w:t>dataset,</w:t>
+      </w:r>
+      <w:r>
+        <w:t xml:space="preserve"> and the </w:t>
+      </w:r>
+      <w:r>
+        <w:t xml:space="preserve">various metrics can be gathered using the results of the </w:t>
+      </w:r>
+      <w:r>
+        <w:t>model’s</w:t>
+      </w:r>
+      <w:r>
+        <w:t xml:space="preserve"> running predictions against the testing split of the dataset. Below is a table containing the results of the predictions made by the five models</w:t>
+      </w:r>
+      <w:r>
+        <w:t>.</w:t>
       </w:r>
     </w:p>
     <w:tbl>
@@ -6135,7 +6376,10 @@
         </w:r>
       </w:fldSimple>
       <w:r>
-        <w:t>: Results code and Results from predictions against testing split</w:t>
+        <w:t xml:space="preserve">: Results code and Results from predictions against testing </w:t>
+      </w:r>
+      <w:r>
+        <w:t>split.</w:t>
       </w:r>
     </w:p>
     <w:p/>
@@ -6207,13 +6451,8 @@
       <w:r>
         <w:t xml:space="preserve">For use in the next step of implementation, I saved the feature columns to a list to be saved and extracted with the model. As detailed previously, the model was trained again using the same parameters, then making use of the </w:t>
       </w:r>
-      <w:proofErr w:type="spellStart"/>
-      <w:r>
-        <w:t>JobLib</w:t>
-      </w:r>
-      <w:proofErr w:type="spellEnd"/>
-      <w:r>
-        <w:t xml:space="preserve"> </w:t>
+      <w:r>
+        <w:t xml:space="preserve">JobLib </w:t>
       </w:r>
       <w:r>
         <w:t>library, the model and feature columns were dumped into two separate PKL files and saved to my PC</w:t>
@@ -6305,27 +6544,29 @@
     <w:p/>
     <w:p>
       <w:r>
-        <w:t xml:space="preserve">With the model and feature schema saved to a </w:t>
-      </w:r>
-      <w:proofErr w:type="spellStart"/>
-      <w:r>
-        <w:t>pkl</w:t>
-      </w:r>
-      <w:proofErr w:type="spellEnd"/>
-      <w:r>
-        <w:t xml:space="preserve"> file, the implementation of an output system for the NIDS could begin. To start, I made a new Jupyter notebook file, my reasoning for splitting the code for this project into three different files is that it makes the code easier to process mentally since all the code is in documents that describe what its purpose is clearly, it also </w:t>
+        <w:t>With the model and feature schema saved to a pkl file, the implementation of an output system for the NIDS could begin. To start, I made a new Jupyter notebook file, my reasoning for splitting the code for this project into three different files is that it makes the code easier to process</w:t>
+      </w:r>
+      <w:r>
+        <w:t>,</w:t>
+      </w:r>
+      <w:r>
+        <w:t xml:space="preserve"> since all the code is in documents that describe what its purpose is clearly, it also reduces the </w:t>
       </w:r>
       <w:r>
         <w:lastRenderedPageBreak/>
-        <w:t xml:space="preserve">reduces the computational overhead if the python kernel that it is running on needs to be reset for </w:t>
-      </w:r>
-      <w:proofErr w:type="spellStart"/>
-      <w:r>
-        <w:t>what ever</w:t>
-      </w:r>
-      <w:proofErr w:type="spellEnd"/>
-      <w:r>
-        <w:t xml:space="preserve"> reason, which would require me to run all cells of the notebook again, taking both time and computational resources.</w:t>
+        <w:t xml:space="preserve">computational overhead if the python kernel that it is running on needs to be reset for </w:t>
+      </w:r>
+      <w:r>
+        <w:t>whatever</w:t>
+      </w:r>
+      <w:r>
+        <w:t xml:space="preserve"> reason, which would require all cells of the notebook </w:t>
+      </w:r>
+      <w:r>
+        <w:t xml:space="preserve">to be run </w:t>
+      </w:r>
+      <w:r>
+        <w:t>again, taking both time and computational resources.</w:t>
       </w:r>
     </w:p>
     <w:p>
@@ -6423,12 +6664,33 @@
     </w:p>
     <w:p>
       <w:r>
-        <w:t>The predictions ran by the model mark the rows of network traffic with a risk score between zero and one, this is the back bone of both the alert system and output system, this is because the results are filtered based on a threshold that can be adjusted manually to any number between zero and one. This dictates how strict the results are filtered, the threshold level I used during testing was 0.9, this means that any rows of data that were ranked below 0.9 risk score aren’t included in output.</w:t>
-      </w:r>
-    </w:p>
-    <w:p>
-      <w:r>
-        <w:t>In order to establish context for output, during pre-processing, I preserved certain columns that would provide the most insight during output. The columns saved and the code used to do so can be seen below.</w:t>
+        <w:t xml:space="preserve">The predictions ran by the model mark the rows of network traffic with a risk score between zero and one, this is the </w:t>
+      </w:r>
+      <w:r>
+        <w:t>backbone</w:t>
+      </w:r>
+      <w:r>
+        <w:t xml:space="preserve"> of both the alert system and output system, this is because the results are filtered based on a threshold that can be adjusted manually to any number between zero and one. This dictates how strict the results are filtered, the threshold level I used during testing was 0.9, this means that any rows of data that were ranked below 0.9 risk score aren’t included in output.</w:t>
+      </w:r>
+    </w:p>
+    <w:p>
+      <w:r>
+        <w:t>To</w:t>
+      </w:r>
+      <w:r>
+        <w:t xml:space="preserve"> establish context for output, during pre-processing,</w:t>
+      </w:r>
+      <w:r>
+        <w:t xml:space="preserve"> </w:t>
+      </w:r>
+      <w:r>
+        <w:t>certain columns</w:t>
+      </w:r>
+      <w:r>
+        <w:t xml:space="preserve"> were preserved</w:t>
+      </w:r>
+      <w:r>
+        <w:t xml:space="preserve"> that would provide the most insight during output. The columns saved and the code used to do so can be seen below.</w:t>
       </w:r>
     </w:p>
     <w:p>
@@ -6587,15 +6849,7 @@
         <w:t xml:space="preserve">The email alert system makes use of the same backbone that the TXT output system makes use of, namely the risk score, but instead </w:t>
       </w:r>
       <w:r>
-        <w:t xml:space="preserve">of outputting through text, this system makes use of the </w:t>
-      </w:r>
-      <w:proofErr w:type="spellStart"/>
-      <w:r>
-        <w:t>SMTPLib</w:t>
-      </w:r>
-      <w:proofErr w:type="spellEnd"/>
-      <w:r>
-        <w:t xml:space="preserve"> library to function and googles smtp server to </w:t>
+        <w:t xml:space="preserve">of outputting through text, this system makes use of the SMTPLib library to function and googles smtp server to </w:t>
       </w:r>
       <w:r>
         <w:t>send</w:t>
@@ -6624,6 +6878,9 @@
       </w:r>
       <w:r>
         <w:t xml:space="preserve"> the results, compose the email, and send the alert. This started by setting up the basic email content, its subject, it’s “To”, and its “From”, with the “To” set as my personal email for the purposes of testing the prototype</w:t>
+      </w:r>
+      <w:r>
+        <w:t>.</w:t>
       </w:r>
     </w:p>
     <w:p>
@@ -6695,11 +6952,9 @@
         <w:lastRenderedPageBreak/>
         <w:t xml:space="preserve">After this was to implement the proper body of the email, this started by establishing an alert summary variable that would display a few rows of the data in the email , to show the analyst an example of the scores the data has achieved to inspire urgent action. This was done as the test data set contains no </w:t>
       </w:r>
-      <w:proofErr w:type="spellStart"/>
-      <w:r>
-        <w:t>ip</w:t>
-      </w:r>
-      <w:proofErr w:type="spellEnd"/>
+      <w:r>
+        <w:t>Ip</w:t>
+      </w:r>
       <w:r>
         <w:t xml:space="preserve"> addresses limiting the sensitivity of the information of the dataset while this can be helpful in this setting, it is a definite limitation of the dataset. </w:t>
       </w:r>
@@ -6775,15 +7030,7 @@
     </w:p>
     <w:p>
       <w:r>
-        <w:t xml:space="preserve">With the body now set, the next step of implementation is to add the code needed to send the email, this was achieved using the </w:t>
-      </w:r>
-      <w:proofErr w:type="spellStart"/>
-      <w:r>
-        <w:t>SMTPlib</w:t>
-      </w:r>
-      <w:proofErr w:type="spellEnd"/>
-      <w:r>
-        <w:t xml:space="preserve"> library and its SMTP_SSL feature, making use of googles SMTP server. Below is the code that was used to achieve this.</w:t>
+        <w:t>With the body now set, the next step of implementation is to add the code needed to send the email, this was achieved using the SMTPlib library and its SMTP_SSL feature, making use of googles SMTP server. Below is the code that was used to achieve this.</w:t>
       </w:r>
     </w:p>
     <w:p>
@@ -6852,13 +7099,25 @@
     </w:p>
     <w:p>
       <w:r>
-        <w:t xml:space="preserve">The main reason for implementing alerts into this system is due to its nature as an Intrusion Detection System rather than an Intrusion Prevention System, and IDS cannot take action on its own to prevent </w:t>
+        <w:t xml:space="preserve">The main reason for implementing alerts into this system is due to its nature as an Intrusion Detection System rather than an Intrusion Prevention System, and IDS cannot </w:t>
+      </w:r>
+      <w:r>
+        <w:t>act</w:t>
+      </w:r>
+      <w:r>
+        <w:t xml:space="preserve"> on its own to prevent </w:t>
       </w:r>
       <w:r>
         <w:t>system intrusion, it can only alert the analyst or user who can take action on the information.</w:t>
       </w:r>
       <w:r>
-        <w:t xml:space="preserve"> Below is an example of the output, in real world usage, the attack_cat column wouldn’t be present but it is very useful for testing and validation.</w:t>
+        <w:t xml:space="preserve"> Below is an example of the output, in real world usage, the attack_cat column wouldn’t be </w:t>
+      </w:r>
+      <w:r>
+        <w:t>present,</w:t>
+      </w:r>
+      <w:r>
+        <w:t xml:space="preserve"> but it is very useful for testing and validation.</w:t>
       </w:r>
     </w:p>
     <w:p>
@@ -6923,7 +7182,10 @@
         </w:r>
       </w:fldSimple>
       <w:r>
-        <w:t>: Example email output from the NIDS system</w:t>
+        <w:t xml:space="preserve">: Example email output from the NIDS </w:t>
+      </w:r>
+      <w:r>
+        <w:t>system.</w:t>
       </w:r>
     </w:p>
     <w:p/>
@@ -7007,7 +7269,15 @@
           <w:bCs/>
           <w:u w:val="single"/>
         </w:rPr>
-        <w:t>Work done</w:t>
+        <w:t xml:space="preserve">Work </w:t>
+      </w:r>
+      <w:r>
+        <w:rPr>
+          <w:b/>
+          <w:bCs/>
+          <w:u w:val="single"/>
+        </w:rPr>
+        <w:t>done</w:t>
       </w:r>
     </w:p>
     <w:p>
@@ -7088,7 +7358,16 @@
     </w:p>
     <w:p>
       <w:r>
-        <w:t>This sprint has been key for identifying the tools and technologies that will be key for this projects development. The next steps are to start implementing model accuracy testing</w:t>
+        <w:t xml:space="preserve">This sprint has been key for identifying the tools and technologies that will be key for this </w:t>
+      </w:r>
+      <w:r>
+        <w:t>project’s</w:t>
+      </w:r>
+      <w:r>
+        <w:t xml:space="preserve"> development. The next steps are to start implementing model accuracy </w:t>
+      </w:r>
+      <w:r>
+        <w:t>testing.</w:t>
       </w:r>
     </w:p>
     <w:p>
@@ -7123,7 +7402,10 @@
     </w:p>
     <w:p>
       <w:r>
-        <w:t>Develop a Jupyter notebook file to test the accuracy of the five ML algorithms</w:t>
+        <w:t xml:space="preserve">Develop a Jupyter notebook file to test the accuracy of the five ML </w:t>
+      </w:r>
+      <w:r>
+        <w:t>algorithms.</w:t>
       </w:r>
     </w:p>
     <w:p>
@@ -7167,7 +7449,13 @@
     </w:p>
     <w:p>
       <w:r>
-        <w:t xml:space="preserve"> Very low accuracies of certain models compared to other model such as KNN which achieved an accuracy for roughly 80% </w:t>
+        <w:t xml:space="preserve"> Very low accuracies of certain models compared to other model such as KNN which achieved an accuracy for roughly </w:t>
+      </w:r>
+      <w:r>
+        <w:t>80%.</w:t>
+      </w:r>
+      <w:r>
+        <w:t xml:space="preserve"> </w:t>
       </w:r>
     </w:p>
     <w:p>
@@ -7350,7 +7638,13 @@
         <w:t>then</w:t>
       </w:r>
       <w:r>
-        <w:t xml:space="preserve"> extract the model with the highest accuracy, in this case it is Random Forest</w:t>
+        <w:t xml:space="preserve"> extract the model with the highest </w:t>
+      </w:r>
+      <w:r>
+        <w:t>accuracy;</w:t>
+      </w:r>
+      <w:r>
+        <w:t xml:space="preserve"> in this case it is Random Forest</w:t>
       </w:r>
       <w:r>
         <w:t xml:space="preserve"> to be used for predictions for output and alerts</w:t>
@@ -7439,7 +7733,10 @@
     </w:p>
     <w:p>
       <w:r>
-        <w:t>No issues were encountered during this sprint</w:t>
+        <w:t xml:space="preserve">No issues were encountered during this </w:t>
+      </w:r>
+      <w:r>
+        <w:t>sprint.</w:t>
       </w:r>
     </w:p>
     <w:p>
@@ -7483,7 +7780,13 @@
     </w:p>
     <w:p>
       <w:r>
-        <w:t xml:space="preserve">Extracting the model once it has been trained makes a lot of sense, and wasn’t something I had considered before starting this project the fact that you don’t need to retrain it makes it worth it in the amount of computational power you end up saving. </w:t>
+        <w:t xml:space="preserve">Extracting the model once it has been trained makes a lot of </w:t>
+      </w:r>
+      <w:r>
+        <w:t>sense and</w:t>
+      </w:r>
+      <w:r>
+        <w:t xml:space="preserve"> wasn’t something I had considered before starting this project the fact that you don’t need to retrain it makes it worth it in the amount of computational power you end up saving. </w:t>
       </w:r>
     </w:p>
     <w:p>
@@ -7552,7 +7855,19 @@
     </w:p>
     <w:p>
       <w:r>
-        <w:t>A new notebook file was created for this system to make the system more modular and make it easier to maintain, the model that was saved last sprint was loaded into the notebook and preprocessing was done similar to previous sprint but issues occurred since I was not making use of the training dataset</w:t>
+        <w:t xml:space="preserve">A new notebook file was created for this system to make the system more modular and make it easier to maintain, the model that was saved last sprint was loaded into the notebook and preprocessing was done </w:t>
+      </w:r>
+      <w:r>
+        <w:t>like</w:t>
+      </w:r>
+      <w:r>
+        <w:t xml:space="preserve"> </w:t>
+      </w:r>
+      <w:r>
+        <w:t xml:space="preserve">the </w:t>
+      </w:r>
+      <w:r>
+        <w:t>previous sprint but issues occurred since I was not making use of the training dataset</w:t>
       </w:r>
       <w:r>
         <w:t>.</w:t>
@@ -7566,7 +7881,25 @@
         <w:t>T</w:t>
       </w:r>
       <w:r>
-        <w:t xml:space="preserve">here were more steps to feature alignment this time as the system started throwing errors due to column mismatch so I had to find a work around to make the system happy enough to work. </w:t>
+        <w:t xml:space="preserve">here were more steps to feature alignment this time as the system started throwing errors due to column </w:t>
+      </w:r>
+      <w:r>
+        <w:t>mismatch,</w:t>
+      </w:r>
+      <w:r>
+        <w:t xml:space="preserve"> so I had to find a work around to </w:t>
+      </w:r>
+      <w:r>
+        <w:t>satisfy the requirements</w:t>
+      </w:r>
+      <w:r>
+        <w:t xml:space="preserve"> enough </w:t>
+      </w:r>
+      <w:r>
+        <w:t xml:space="preserve">for it </w:t>
+      </w:r>
+      <w:r>
+        <w:t xml:space="preserve">to work. </w:t>
       </w:r>
     </w:p>
     <w:p>
@@ -7650,11 +7983,9 @@
       <w:r>
         <w:t xml:space="preserve">The next step is to implement and alert system as without a way to generate alerts, an IDS poses little help, as it </w:t>
       </w:r>
-      <w:proofErr w:type="spellStart"/>
-      <w:r>
-        <w:t>cant</w:t>
-      </w:r>
-      <w:proofErr w:type="spellEnd"/>
+      <w:r>
+        <w:t>can’t</w:t>
+      </w:r>
       <w:r>
         <w:t xml:space="preserve"> stop intrusion only detect it.</w:t>
       </w:r>
@@ -7701,7 +8032,13 @@
     </w:p>
     <w:p>
       <w:r>
-        <w:t>The main objective of this sprint is to implement an email alert system that will run when predictions are made against the dataset, this is to be done through the use of smtp</w:t>
+        <w:t xml:space="preserve">The main objective of this sprint is to implement an email alert system that will run when predictions are made against the dataset, this is to be done </w:t>
+      </w:r>
+      <w:r>
+        <w:t>using</w:t>
+      </w:r>
+      <w:r>
+        <w:t xml:space="preserve"> smtp</w:t>
       </w:r>
       <w:r>
         <w:t>.</w:t>
@@ -7721,21 +8058,19 @@
           <w:bCs/>
           <w:u w:val="single"/>
         </w:rPr>
+        <w:lastRenderedPageBreak/>
         <w:t>Work done</w:t>
       </w:r>
     </w:p>
     <w:p>
       <w:r>
-        <w:lastRenderedPageBreak/>
-        <w:t xml:space="preserve">Email alert system has been implemented and tested, implemented using the </w:t>
-      </w:r>
-      <w:proofErr w:type="spellStart"/>
-      <w:r>
-        <w:t>SMTPlib</w:t>
-      </w:r>
-      <w:proofErr w:type="spellEnd"/>
-      <w:r>
-        <w:t xml:space="preserve"> library and through the use of googles smtp servers using an email address created for this purpose and an app password for credentials to avoid leaking the real account password.</w:t>
+        <w:t xml:space="preserve">Email alert system has been implemented and tested, implemented using the SMTPlib library and </w:t>
+      </w:r>
+      <w:r>
+        <w:t>using</w:t>
+      </w:r>
+      <w:r>
+        <w:t xml:space="preserve"> googles smtp servers using an email address created for this purpose and an app password for credentials to avoid leaking the real account password.</w:t>
       </w:r>
     </w:p>
     <w:p>
@@ -7757,7 +8092,10 @@
     </w:p>
     <w:p>
       <w:r>
-        <w:t>No issues were encountered during this sprint</w:t>
+        <w:t xml:space="preserve">No issues were encountered during this </w:t>
+      </w:r>
+      <w:r>
+        <w:t>sprint.</w:t>
       </w:r>
     </w:p>
     <w:p>
@@ -7814,9 +8152,12 @@
         <w:t>Sprint 7</w:t>
       </w:r>
       <w:r>
-        <w:t xml:space="preserve"> – Wrap up of development</w:t>
+        <w:t xml:space="preserve"> – Wrap up of </w:t>
       </w:r>
       <w:bookmarkEnd w:id="38"/>
+      <w:r>
+        <w:t>development</w:t>
+      </w:r>
     </w:p>
     <w:p>
       <w:pPr>
@@ -7928,13 +8269,16 @@
     </w:p>
     <w:p>
       <w:r>
-        <w:t>With development coming to a close, it has allowed me to reflect on the whole of development and the interesting journey it has been especially as I had little prior experience with AI development outside of the AI module during 2</w:t>
-      </w:r>
-      <w:r>
-        <w:rPr>
-          <w:vertAlign w:val="superscript"/>
-        </w:rPr>
-        <w:t>nd</w:t>
+        <w:t xml:space="preserve">With development </w:t>
+      </w:r>
+      <w:r>
+        <w:t>ending</w:t>
+      </w:r>
+      <w:r>
+        <w:t xml:space="preserve">, it has allowed me to reflect on the whole of development and the interesting journey it has been especially as I had little prior experience with AI development outside of the AI module during </w:t>
+      </w:r>
+      <w:r>
+        <w:t>second</w:t>
       </w:r>
       <w:r>
         <w:t xml:space="preserve"> year. </w:t>
@@ -7942,7 +8286,13 @@
     </w:p>
     <w:p>
       <w:r>
-        <w:t>The next steps of the project as a whole are to continue work outside of development, poster and report and the other tasks yet to be completed.</w:t>
+        <w:t xml:space="preserve">The next steps of the project </w:t>
+      </w:r>
+      <w:r>
+        <w:t>are</w:t>
+      </w:r>
+      <w:r>
+        <w:t xml:space="preserve"> to continue work outside of development, poster and report and the other tasks yet to be completed.</w:t>
       </w:r>
     </w:p>
     <w:p/>
@@ -7969,7 +8319,13 @@
     </w:p>
     <w:p>
       <w:r>
-        <w:t>Testing during implementation was done as each notebook was developed, this was made easier through the use of Jupyter notebooks cells as each cell can be run individually making testing simpler</w:t>
+        <w:t xml:space="preserve">Testing during implementation was done as each notebook was developed, this was made easier </w:t>
+      </w:r>
+      <w:r>
+        <w:t>using</w:t>
+      </w:r>
+      <w:r>
+        <w:t xml:space="preserve"> Jupyter notebooks cells as each cell can be run individually making testing simpler</w:t>
       </w:r>
       <w:r>
         <w:t>, allowing for incremental component testing throughout development</w:t>
@@ -8012,7 +8368,13 @@
     </w:p>
     <w:p>
       <w:r>
-        <w:t>While this validation process has shown the model is effective against this dataset, its performance in live settings may vary due to the variance in traffic patterns between the dataset it was trained against and the real world traffic data.</w:t>
+        <w:t xml:space="preserve">While this validation process has shown the model is effective against this dataset, its performance in live settings may vary due to the variance in traffic patterns between the dataset it was trained against and the </w:t>
+      </w:r>
+      <w:r>
+        <w:t>real-world</w:t>
+      </w:r>
+      <w:r>
+        <w:t xml:space="preserve"> traffic data.</w:t>
       </w:r>
     </w:p>
     <w:p>
@@ -8050,11 +8412,9 @@
       <w:r>
         <w:t xml:space="preserve">, a high recall score indicates strong detection performance, with random forest scoring 0.9683 and </w:t>
       </w:r>
-      <w:proofErr w:type="spellStart"/>
-      <w:r>
-        <w:t>xgboost</w:t>
-      </w:r>
-      <w:proofErr w:type="spellEnd"/>
+      <w:r>
+        <w:t>XGBoost</w:t>
+      </w:r>
       <w:r>
         <w:t xml:space="preserve"> scoring 0.9646, making Random Forest the stronger choice for this system.</w:t>
       </w:r>
@@ -8457,7 +8817,16 @@
     <w:p/>
     <w:p>
       <w:r>
-        <w:t>The output of the prototype have met expectations and both function fully in both text based output and email alert output with both passing testing and output validation.</w:t>
+        <w:t xml:space="preserve">The output of the prototype </w:t>
+      </w:r>
+      <w:r>
+        <w:t>has</w:t>
+      </w:r>
+      <w:r>
+        <w:t xml:space="preserve"> met expectations </w:t>
+      </w:r>
+      <w:r>
+        <w:t>with both text based and email output passing testing and validation,</w:t>
       </w:r>
     </w:p>
     <w:p>
@@ -8501,15 +8870,7 @@
     </w:p>
     <w:p>
       <w:r>
-        <w:t xml:space="preserve">While the system operates at the level matching the original expectations set at the start of this project and all features set out in the objectives have been implemented successfully, there is room for improvement in the system, one of the key examples of this is that it in its current form as a set of Jupyter notebook files, it isn’t able to continuously run which in the real world would be a serious detriment but isn’t too serious in the context of this project due to its academic nature but is </w:t>
-      </w:r>
-      <w:proofErr w:type="spellStart"/>
-      <w:r>
-        <w:t>a</w:t>
-      </w:r>
-      <w:proofErr w:type="spellEnd"/>
-      <w:r>
-        <w:t xml:space="preserve"> area for future improvement.</w:t>
+        <w:t>While the system operates at the level matching the original expectations set at the start of this project and all features set out in the objectives have been implemented successfully, there is room for improvement in the system, one of the key examples of this is that it in its current form as a set of Jupyter notebook files, it isn’t able to continuously run which in the real world would be a serious detriment but isn’t too serious in the context of this project due to its academic nature but is a area for future improvement.</w:t>
       </w:r>
     </w:p>
     <w:p>
@@ -8527,7 +8888,13 @@
     </w:p>
     <w:p>
       <w:r>
-        <w:t>Synthetic datasets while can be very useful in training in models such as its use in this project, if there is real world data available it is better to use the real data due to increased amount of edge cases that assist anomaly detections which NIDS tends to makes use of</w:t>
+        <w:t xml:space="preserve">Synthetic datasets while can be very useful in training in models such as its use in this project, if there is real world data available it is better to use the real data due to increased amount of edge cases that assist anomaly detections which NIDS tends to </w:t>
+      </w:r>
+      <w:r>
+        <w:t>make</w:t>
+      </w:r>
+      <w:r>
+        <w:t xml:space="preserve"> use of</w:t>
       </w:r>
       <w:r>
         <w:t xml:space="preserve">. </w:t>
@@ -8573,7 +8940,13 @@
     </w:p>
     <w:p>
       <w:r>
-        <w:t>Whereas the AI systems can deal with new attacks due to their anomaly based detection methods have, but tend to have higher false positive rates which increases the work load on analysts and shows one of the main limitations of only using ML based detection.</w:t>
+        <w:t xml:space="preserve">Whereas the AI systems can deal with new attacks due to their </w:t>
+      </w:r>
+      <w:r>
+        <w:t>anomaly-based</w:t>
+      </w:r>
+      <w:r>
+        <w:t xml:space="preserve"> detection methods have, but tend to have higher false positive rates which increases the work load on analysts and shows one of the main limitations of only using ML based detection.</w:t>
       </w:r>
     </w:p>
     <w:p>
@@ -8609,12 +8982,42 @@
         <w:t>Another feature would possibly enhance the system would be the addition of a deep learning model</w:t>
       </w:r>
       <w:r>
-        <w:t xml:space="preserve"> to produce another set of predictions, though accuracy testing would be required to gauge whether or not it addition to the system would help or hinder accurate predictions.</w:t>
-      </w:r>
-    </w:p>
-    <w:p>
-      <w:r>
-        <w:t>A piece of future work that would that would allow for more thorough testing of the system would be the use of a real world dataset but the issue is obtaining them due to the sensitive nature of the real world traffic data.</w:t>
+        <w:t xml:space="preserve"> to produce another set of predictions, though accuracy testing would be required to gauge </w:t>
+      </w:r>
+      <w:r>
+        <w:t>whether</w:t>
+      </w:r>
+      <w:r>
+        <w:t xml:space="preserve"> it</w:t>
+      </w:r>
+      <w:r>
+        <w:t>s</w:t>
+      </w:r>
+      <w:r>
+        <w:t xml:space="preserve"> addition to the system would help or hinder accurate predictions.</w:t>
+      </w:r>
+    </w:p>
+    <w:p>
+      <w:r>
+        <w:t xml:space="preserve">A piece of future work </w:t>
+      </w:r>
+      <w:r>
+        <w:t>that would</w:t>
+      </w:r>
+      <w:r>
+        <w:t xml:space="preserve"> allow for more thorough testing of the system would be the use of a real</w:t>
+      </w:r>
+      <w:r>
+        <w:t>-</w:t>
+      </w:r>
+      <w:r>
+        <w:t xml:space="preserve">world dataset but the issue is obtaining them due to the sensitive nature of the </w:t>
+      </w:r>
+      <w:r>
+        <w:t>real-world</w:t>
+      </w:r>
+      <w:r>
+        <w:t xml:space="preserve"> traffic data.</w:t>
       </w:r>
     </w:p>
     <w:p>
@@ -8628,142 +9031,87 @@
       </w:pPr>
       <w:bookmarkStart w:id="48" w:name="_Toc226373406"/>
       <w:r>
+        <w:lastRenderedPageBreak/>
         <w:t>Evaluation against aims and objectives.</w:t>
       </w:r>
       <w:bookmarkEnd w:id="48"/>
     </w:p>
     <w:p>
       <w:r>
-        <w:t>How well have I met my aims and objectives</w:t>
+        <w:t>Over the duration of the project, the aims and objectives set out in the beginning of the project have been successfully completed through continuous work covering a combination of research, design, and implementation.</w:t>
+      </w:r>
+    </w:p>
+    <w:p>
+      <w:r>
+        <w:t>The initial objectives that covered background research and context relating to the usage of AI in intrusion detection were completed during the literature review, which covered both traditional and AI based intrusion detection in detail. This provided a strong backbone for the decisions relating to design and implementation later in the project.</w:t>
+      </w:r>
+    </w:p>
+    <w:p>
+      <w:r>
+        <w:t>The technical objectives set out in the beginning have been completed successfully, with all features designed and implemented, including the training and accuracy testing of multiple AI algorithms, these models where then tested using appropriate metrics namely, precision, accuracy, recall, and f1. The alert system detailed in the objectives was successfully implemented through the use of SMTPlib and googles smtp server.</w:t>
+      </w:r>
+    </w:p>
+    <w:p>
+      <w:r>
+        <w:t>The objective of evaluating the systems performance was completed through component and system testing during development, the chosen model achieved high score overall with a notable recall score, showing its effectiveness in detection.</w:t>
+      </w:r>
+    </w:p>
+    <w:p>
+      <w:r>
+        <w:t>Finally, the objectives relating to the critical evaluation of the system and the future work to improve the system has been covered in the discussion section of this report, with key limitations of the system being identified and reasonable improvements being proposed.</w:t>
+      </w:r>
+    </w:p>
+    <w:p>
+      <w:r>
+        <w:t>Overall, the aims and objectives of the project have been met through the development of an AI-based Network Intrusion Detection system, while also taking into consideration its practicality in real world deployment.</w:t>
+      </w:r>
+    </w:p>
+    <w:p/>
+    <w:p/>
+    <w:p>
+      <w:pPr>
+        <w:pStyle w:val="Heading1"/>
+      </w:pPr>
+      <w:bookmarkStart w:id="49" w:name="_Toc226373407"/>
+      <w:r>
+        <w:t>Conclusion</w:t>
+      </w:r>
+      <w:bookmarkEnd w:id="49"/>
+    </w:p>
+    <w:p>
+      <w:r>
+        <w:t>Over the course of this project, I have developed an AI-based intrusion detection system that is able to classify and score the probability of network traffic being malicious or benign, and developed supporting systems such as text output that allows for analysis of the data by analysts, and an email alert system that sends out email alerts when high-risk behaviour has been identified.</w:t>
+      </w:r>
+    </w:p>
+    <w:p>
+      <w:r>
+        <w:t xml:space="preserve">All aims and objectives set out during the beginning of this project have been successfully fulfilled, with all nine objectives being achieved, including the critical evaluation of the </w:t>
+      </w:r>
+      <w:r>
+        <w:t>system, including</w:t>
+      </w:r>
+      <w:r>
+        <w:t xml:space="preserve"> its strengths and limitations, and its performance.</w:t>
+      </w:r>
+    </w:p>
+    <w:p>
+      <w:r>
+        <w:t>I found during this project that the way forward for intrusion detection is not to focus on either traditional systems or AI-systems but to introduce a hybrid systems as the two types cover the weaknesses of other with signature based having the overall higher accuracy while the AI-systems handle unknown attacks much better than the traditional systems, this allows for a much more comprehensive detection system compared to only focusing on one or the other.</w:t>
       </w:r>
     </w:p>
     <w:p>
       <w:r>
         <w:lastRenderedPageBreak/>
-        <w:t>Over the duration of the project, the aims and objectives set out in the beginning of the project have been successfully completed through continuous work covering a combination of research, design, and implementation.</w:t>
-      </w:r>
-    </w:p>
-    <w:p>
-      <w:r>
-        <w:t>The initial objectives that covered background research and context relating to the usage of AI in intrusion detection were completed during the literature review, which covered both traditional and AI based intrusion detection in detail. This provided a strong backbone for the decisions relating to design and implementation later in the project.</w:t>
-      </w:r>
-    </w:p>
-    <w:p>
-      <w:r>
-        <w:t xml:space="preserve">The technical objectives set out in the beginning have been completed successfully, with all features designed and implemented, including the training and accuracy testing of multiple AI algorithms, these models where then tested using appropriate metrics namely, precision, accuracy, recall, and f1. The alert system detailed in the objectives was successfully implemented through the use of </w:t>
-      </w:r>
-      <w:proofErr w:type="spellStart"/>
-      <w:r>
-        <w:t>SMTPlib</w:t>
-      </w:r>
-      <w:proofErr w:type="spellEnd"/>
-      <w:r>
-        <w:t xml:space="preserve"> and googles smtp server.</w:t>
-      </w:r>
-    </w:p>
-    <w:p>
-      <w:r>
-        <w:t>Objective eight and nine have both been met successfully with eig</w:t>
-      </w:r>
-      <w:r>
-        <w:t>ht comprising a majority of this section of the report, and nine located just above this sub-section mentioning improvements such as moving the code out of Jupyter notebook to allow for continuous running of the system to better match real world systems.</w:t>
-      </w:r>
-    </w:p>
-    <w:p>
-      <w:r>
-        <w:t>The objective of evaluating the systems performance was completed through component and system testing during development, the chosen model achieved high score overall with a notable recall score, showing its effectiveness in detection.</w:t>
-      </w:r>
-    </w:p>
-    <w:p>
-      <w:r>
-        <w:t>Finally, the objectives relating to the critical evaluation of the system and the future work to improve the system has been covered in the discussion section of this report, with key limitations of the system being identified and reasonable improvements being proposed.</w:t>
-      </w:r>
-    </w:p>
-    <w:p>
-      <w:r>
-        <w:t>Overall, the aims and objectives of the project have been met through the development of an AI-based Network Intrusion Detection system, while also taking into consideration its practicality in real world deployment.</w:t>
-      </w:r>
-    </w:p>
-    <w:p>
-      <w:r>
-        <w:rPr>
-          <w:noProof/>
-        </w:rPr>
-        <w:drawing>
-          <wp:inline distT="0" distB="0" distL="0" distR="0" wp14:anchorId="7883D928" wp14:editId="37D580A3">
-            <wp:extent cx="5731510" cy="3455035"/>
-            <wp:effectExtent l="0" t="0" r="2540" b="0"/>
-            <wp:docPr id="524586370" name="Picture 1"/>
-            <wp:cNvGraphicFramePr>
-              <a:graphicFrameLocks xmlns:a="http://schemas.openxmlformats.org/drawingml/2006/main" noChangeAspect="1"/>
-            </wp:cNvGraphicFramePr>
-            <a:graphic xmlns:a="http://schemas.openxmlformats.org/drawingml/2006/main">
-              <a:graphicData uri="http://schemas.openxmlformats.org/drawingml/2006/picture">
-                <pic:pic xmlns:pic="http://schemas.openxmlformats.org/drawingml/2006/picture">
-                  <pic:nvPicPr>
-                    <pic:cNvPr id="524586370" name=""/>
-                    <pic:cNvPicPr/>
-                  </pic:nvPicPr>
-                  <pic:blipFill>
-                    <a:blip r:embed="rId20"/>
-                    <a:stretch>
-                      <a:fillRect/>
-                    </a:stretch>
-                  </pic:blipFill>
-                  <pic:spPr>
-                    <a:xfrm>
-                      <a:off x="0" y="0"/>
-                      <a:ext cx="5731510" cy="3455035"/>
-                    </a:xfrm>
-                    <a:prstGeom prst="rect">
-                      <a:avLst/>
-                    </a:prstGeom>
-                  </pic:spPr>
-                </pic:pic>
-              </a:graphicData>
-            </a:graphic>
-          </wp:inline>
-        </w:drawing>
-      </w:r>
-    </w:p>
-    <w:p/>
+        <w:t xml:space="preserve">Overall, this project has been a success with all goals that were established at the start of the project being met and </w:t>
+      </w:r>
+      <w:r>
+        <w:t>all features fully implemented and tested with the outputs validated, the limitations identified and with areas for future improvement identified as well, makes this project an overall success.</w:t>
+      </w:r>
+    </w:p>
     <w:p>
       <w:pPr>
         <w:pStyle w:val="Heading1"/>
       </w:pPr>
-      <w:bookmarkStart w:id="49" w:name="_Toc226373407"/>
-      <w:r>
-        <w:t>Conclusion</w:t>
-      </w:r>
-      <w:bookmarkEnd w:id="49"/>
-    </w:p>
-    <w:p>
-      <w:r>
-        <w:t>Over the course of this project, I have developed an AI-based intrusion detection system that is able to classify and score the probability of network traffic being malicious or benign, and developed supporting systems such as text output that allows for analysis of the data by analysts, and an email alert system that sends out email alerts when high-risk behaviour has been identified.</w:t>
-      </w:r>
-    </w:p>
-    <w:p>
-      <w:r>
-        <w:t>All aims and objectives set out during the beginning of this project have been successfully fulfilled, with all nine objectives being achieved, including the critical evaluation of the system as a whole, including its strengths and limitations, and its performance.</w:t>
-      </w:r>
-    </w:p>
-    <w:p>
-      <w:r>
-        <w:t>I found during this project that the way forward for intrusion detection is not to focus on either traditional systems or AI-systems but to introduce a hybrid systems as the two types cover the weaknesses of other with signature based having the overall higher accuracy while the AI-systems handle unknown attacks much better than the traditional systems, this allows for a much more comprehensive detection system compared to only focusing on one or the other.</w:t>
-      </w:r>
-    </w:p>
-    <w:p>
-      <w:r>
-        <w:t xml:space="preserve">Overall, this project has been a success with all goals that were established at the start of the project being met and </w:t>
-      </w:r>
-      <w:r>
-        <w:t>all features fully implemented and tested with the outputs validated, the limitations identified and with areas for future improvement identified as well, makes this project an overall success.</w:t>
-      </w:r>
-    </w:p>
-    <w:p>
-      <w:pPr>
-        <w:pStyle w:val="Heading1"/>
-      </w:pPr>
       <w:bookmarkStart w:id="50" w:name="_Toc226373408"/>
       <w:r>
         <w:t>References</w:t>
@@ -8783,7 +9131,7 @@
       <w:r>
         <w:t xml:space="preserve">. Available at </w:t>
       </w:r>
-      <w:hyperlink r:id="rId21" w:history="1">
+      <w:hyperlink r:id="rId20" w:history="1">
         <w:r>
           <w:rPr>
             <w:rStyle w:val="Hyperlink"/>
@@ -8796,10 +9144,15 @@
       </w:r>
     </w:p>
     <w:p>
-      <w:r>
-        <w:t xml:space="preserve">UK Public Cyber Crime Incidents Rise 37% Over Five Years. Available at: </w:t>
-      </w:r>
-      <w:hyperlink r:id="rId22" w:history="1">
+      <w:bookmarkStart w:id="51" w:name="_Int_5doGsUUY"/>
+      <w:r>
+        <w:t>UK Public Cyber Crime Incidents Rise 37% Over Five Years.</w:t>
+      </w:r>
+      <w:bookmarkEnd w:id="51"/>
+      <w:r>
+        <w:t xml:space="preserve"> Available at: </w:t>
+      </w:r>
+      <w:hyperlink r:id="rId21" w:history="1">
         <w:r>
           <w:rPr>
             <w:rStyle w:val="Hyperlink"/>
@@ -8838,6 +9191,18 @@
     </w:sectPr>
   </w:body>
 </w:document>
+</file>
+
+<file path=word/intelligence2.xml><?xml version="1.0" encoding="utf-8"?>
+<int2:intelligence xmlns:int2="http://schemas.microsoft.com/office/intelligence/2020/intelligence" xmlns:oel="http://schemas.microsoft.com/office/2019/extlst">
+  <int2:observations>
+    <int2:bookmark int2:bookmarkName="_Int_5doGsUUY" int2:invalidationBookmarkName="" int2:hashCode="5D98krim5GE6Fa" int2:id="vpMyDVlo">
+      <int2:state int2:value="Reviewed" int2:type="similarity"/>
+    </int2:bookmark>
+  </int2:observations>
+  <int2:intelligenceSettings/>
+  <int2:onDemandWorkflows/>
+</int2:intelligence>
 </file>
 
 <file path=word/numbering.xml><?xml version="1.0" encoding="utf-8"?>

</xml_diff>

<commit_message>
update to content table numbers
</commit_message>
<xml_diff>
--- a/COMP 3000.docx
+++ b/COMP 3000.docx
@@ -483,7 +483,7 @@
                 <w:noProof/>
                 <w:webHidden/>
               </w:rPr>
-              <w:t>3</w:t>
+              <w:t>4</w:t>
             </w:r>
             <w:r>
               <w:rPr>
@@ -557,7 +557,7 @@
                 <w:noProof/>
                 <w:webHidden/>
               </w:rPr>
-              <w:t>3</w:t>
+              <w:t>4</w:t>
             </w:r>
             <w:r>
               <w:rPr>
@@ -779,7 +779,7 @@
                 <w:noProof/>
                 <w:webHidden/>
               </w:rPr>
-              <w:t>5</w:t>
+              <w:t>6</w:t>
             </w:r>
             <w:r>
               <w:rPr>
@@ -853,7 +853,7 @@
                 <w:noProof/>
                 <w:webHidden/>
               </w:rPr>
-              <w:t>5</w:t>
+              <w:t>6</w:t>
             </w:r>
             <w:r>
               <w:rPr>
@@ -1001,7 +1001,7 @@
                 <w:noProof/>
                 <w:webHidden/>
               </w:rPr>
-              <w:t>6</w:t>
+              <w:t>7</w:t>
             </w:r>
             <w:r>
               <w:rPr>
@@ -1223,7 +1223,7 @@
                 <w:noProof/>
                 <w:webHidden/>
               </w:rPr>
-              <w:t>7</w:t>
+              <w:t>8</w:t>
             </w:r>
             <w:r>
               <w:rPr>
@@ -1297,7 +1297,7 @@
                 <w:noProof/>
                 <w:webHidden/>
               </w:rPr>
-              <w:t>7</w:t>
+              <w:t>8</w:t>
             </w:r>
             <w:r>
               <w:rPr>
@@ -1445,7 +1445,7 @@
                 <w:noProof/>
                 <w:webHidden/>
               </w:rPr>
-              <w:t>9</w:t>
+              <w:t>10</w:t>
             </w:r>
             <w:r>
               <w:rPr>
@@ -1593,7 +1593,7 @@
                 <w:noProof/>
                 <w:webHidden/>
               </w:rPr>
-              <w:t>10</w:t>
+              <w:t>11</w:t>
             </w:r>
             <w:r>
               <w:rPr>
@@ -1667,7 +1667,7 @@
                 <w:noProof/>
                 <w:webHidden/>
               </w:rPr>
-              <w:t>11</w:t>
+              <w:t>12</w:t>
             </w:r>
             <w:r>
               <w:rPr>
@@ -1741,7 +1741,7 @@
                 <w:noProof/>
                 <w:webHidden/>
               </w:rPr>
-              <w:t>11</w:t>
+              <w:t>12</w:t>
             </w:r>
             <w:r>
               <w:rPr>
@@ -1815,7 +1815,7 @@
                 <w:noProof/>
                 <w:webHidden/>
               </w:rPr>
-              <w:t>11</w:t>
+              <w:t>12</w:t>
             </w:r>
             <w:r>
               <w:rPr>
@@ -1889,7 +1889,7 @@
                 <w:noProof/>
                 <w:webHidden/>
               </w:rPr>
-              <w:t>11</w:t>
+              <w:t>12</w:t>
             </w:r>
             <w:r>
               <w:rPr>
@@ -1963,7 +1963,7 @@
                 <w:noProof/>
                 <w:webHidden/>
               </w:rPr>
-              <w:t>11</w:t>
+              <w:t>12</w:t>
             </w:r>
             <w:r>
               <w:rPr>
@@ -2037,7 +2037,7 @@
                 <w:noProof/>
                 <w:webHidden/>
               </w:rPr>
-              <w:t>12</w:t>
+              <w:t>13</w:t>
             </w:r>
             <w:r>
               <w:rPr>
@@ -2111,7 +2111,7 @@
                 <w:noProof/>
                 <w:webHidden/>
               </w:rPr>
-              <w:t>12</w:t>
+              <w:t>13</w:t>
             </w:r>
             <w:r>
               <w:rPr>
@@ -2185,7 +2185,7 @@
                 <w:noProof/>
                 <w:webHidden/>
               </w:rPr>
-              <w:t>12</w:t>
+              <w:t>13</w:t>
             </w:r>
             <w:r>
               <w:rPr>
@@ -2259,7 +2259,7 @@
                 <w:noProof/>
                 <w:webHidden/>
               </w:rPr>
-              <w:t>16</w:t>
+              <w:t>17</w:t>
             </w:r>
             <w:r>
               <w:rPr>
@@ -2333,7 +2333,7 @@
                 <w:noProof/>
                 <w:webHidden/>
               </w:rPr>
-              <w:t>16</w:t>
+              <w:t>17</w:t>
             </w:r>
             <w:r>
               <w:rPr>
@@ -2407,7 +2407,7 @@
                 <w:noProof/>
                 <w:webHidden/>
               </w:rPr>
-              <w:t>17</w:t>
+              <w:t>18</w:t>
             </w:r>
             <w:r>
               <w:rPr>
@@ -2481,7 +2481,7 @@
                 <w:noProof/>
                 <w:webHidden/>
               </w:rPr>
-              <w:t>18</w:t>
+              <w:t>19</w:t>
             </w:r>
             <w:r>
               <w:rPr>
@@ -2555,7 +2555,7 @@
                 <w:noProof/>
                 <w:webHidden/>
               </w:rPr>
-              <w:t>20</w:t>
+              <w:t>21</w:t>
             </w:r>
             <w:r>
               <w:rPr>
@@ -2629,7 +2629,7 @@
                 <w:noProof/>
                 <w:webHidden/>
               </w:rPr>
-              <w:t>20</w:t>
+              <w:t>21</w:t>
             </w:r>
             <w:r>
               <w:rPr>
@@ -2703,7 +2703,7 @@
                 <w:noProof/>
                 <w:webHidden/>
               </w:rPr>
-              <w:t>20</w:t>
+              <w:t>21</w:t>
             </w:r>
             <w:r>
               <w:rPr>
@@ -2777,7 +2777,7 @@
                 <w:noProof/>
                 <w:webHidden/>
               </w:rPr>
-              <w:t>21</w:t>
+              <w:t>22</w:t>
             </w:r>
             <w:r>
               <w:rPr>
@@ -2851,7 +2851,7 @@
                 <w:noProof/>
                 <w:webHidden/>
               </w:rPr>
-              <w:t>21</w:t>
+              <w:t>22</w:t>
             </w:r>
             <w:r>
               <w:rPr>
@@ -2925,7 +2925,7 @@
                 <w:noProof/>
                 <w:webHidden/>
               </w:rPr>
-              <w:t>22</w:t>
+              <w:t>23</w:t>
             </w:r>
             <w:r>
               <w:rPr>
@@ -2999,7 +2999,7 @@
                 <w:noProof/>
                 <w:webHidden/>
               </w:rPr>
-              <w:t>23</w:t>
+              <w:t>24</w:t>
             </w:r>
             <w:r>
               <w:rPr>
@@ -3073,7 +3073,7 @@
                 <w:noProof/>
                 <w:webHidden/>
               </w:rPr>
-              <w:t>23</w:t>
+              <w:t>24</w:t>
             </w:r>
             <w:r>
               <w:rPr>
@@ -3147,7 +3147,7 @@
                 <w:noProof/>
                 <w:webHidden/>
               </w:rPr>
-              <w:t>24</w:t>
+              <w:t>25</w:t>
             </w:r>
             <w:r>
               <w:rPr>
@@ -3221,7 +3221,7 @@
                 <w:noProof/>
                 <w:webHidden/>
               </w:rPr>
-              <w:t>25</w:t>
+              <w:t>26</w:t>
             </w:r>
             <w:r>
               <w:rPr>
@@ -3295,7 +3295,7 @@
                 <w:noProof/>
                 <w:webHidden/>
               </w:rPr>
-              <w:t>25</w:t>
+              <w:t>26</w:t>
             </w:r>
             <w:r>
               <w:rPr>
@@ -3369,7 +3369,7 @@
                 <w:noProof/>
                 <w:webHidden/>
               </w:rPr>
-              <w:t>25</w:t>
+              <w:t>26</w:t>
             </w:r>
             <w:r>
               <w:rPr>
@@ -3443,7 +3443,7 @@
                 <w:noProof/>
                 <w:webHidden/>
               </w:rPr>
-              <w:t>25</w:t>
+              <w:t>26</w:t>
             </w:r>
             <w:r>
               <w:rPr>
@@ -3517,7 +3517,7 @@
                 <w:noProof/>
                 <w:webHidden/>
               </w:rPr>
-              <w:t>25</w:t>
+              <w:t>26</w:t>
             </w:r>
             <w:r>
               <w:rPr>
@@ -3591,7 +3591,7 @@
                 <w:noProof/>
                 <w:webHidden/>
               </w:rPr>
-              <w:t>26</w:t>
+              <w:t>27</w:t>
             </w:r>
             <w:r>
               <w:rPr>
@@ -3665,7 +3665,7 @@
                 <w:noProof/>
                 <w:webHidden/>
               </w:rPr>
-              <w:t>26</w:t>
+              <w:t>27</w:t>
             </w:r>
             <w:r>
               <w:rPr>
@@ -3739,7 +3739,7 @@
                 <w:noProof/>
                 <w:webHidden/>
               </w:rPr>
-              <w:t>27</w:t>
+              <w:t>28</w:t>
             </w:r>
             <w:r>
               <w:rPr>
@@ -3813,7 +3813,7 @@
                 <w:noProof/>
                 <w:webHidden/>
               </w:rPr>
-              <w:t>27</w:t>
+              <w:t>28</w:t>
             </w:r>
             <w:r>
               <w:rPr>
@@ -3887,7 +3887,7 @@
                 <w:noProof/>
                 <w:webHidden/>
               </w:rPr>
-              <w:t>27</w:t>
+              <w:t>29</w:t>
             </w:r>
             <w:r>
               <w:rPr>
@@ -4035,7 +4035,7 @@
                 <w:noProof/>
                 <w:webHidden/>
               </w:rPr>
-              <w:t>29</w:t>
+              <w:t>30</w:t>
             </w:r>
             <w:r>
               <w:rPr>
@@ -4107,7 +4107,15 @@
     </w:p>
     <w:p>
       <w:r>
-        <w:t xml:space="preserve">One of the tools often used to help detect cyber-crime is the Network Intrusion Detection System (NIDS), this is traditionally done through the use of signature recognition, matching attack signatures to network traffic. </w:t>
+        <w:t xml:space="preserve">One of the tools often used to help detect cyber-crime is the Network Intrusion Detection System (NIDS), this is traditionally done </w:t>
+      </w:r>
+      <w:proofErr w:type="gramStart"/>
+      <w:r>
+        <w:t>through the use of</w:t>
+      </w:r>
+      <w:proofErr w:type="gramEnd"/>
+      <w:r>
+        <w:t xml:space="preserve"> signature recognition, matching attack signatures to network traffic. </w:t>
       </w:r>
     </w:p>
     <w:p>
@@ -4340,8 +4348,13 @@
       </w:r>
     </w:p>
     <w:p>
-      <w:r>
-        <w:t xml:space="preserve">In order to achieve my aim, my project will tackle the following </w:t>
+      <w:proofErr w:type="gramStart"/>
+      <w:r>
+        <w:t>In order to</w:t>
+      </w:r>
+      <w:proofErr w:type="gramEnd"/>
+      <w:r>
+        <w:t xml:space="preserve"> achieve my aim, my project will tackle the following </w:t>
       </w:r>
       <w:r>
         <w:t>objectives.</w:t>
@@ -4670,7 +4683,15 @@
         <w:t xml:space="preserve"> </w:t>
       </w:r>
       <w:r>
-        <w:t>open-source intrusion detection systems, that traditionally makes use of signature-based detection for its systems, has introduced Snort_ML which uses neural networks instead of the traditional rule sets.</w:t>
+        <w:t xml:space="preserve">open-source intrusion detection systems, that traditionally makes use of signature-based detection for its systems, has introduced </w:t>
+      </w:r>
+      <w:proofErr w:type="spellStart"/>
+      <w:r>
+        <w:t>Snort_ML</w:t>
+      </w:r>
+      <w:proofErr w:type="spellEnd"/>
+      <w:r>
+        <w:t xml:space="preserve"> which uses neural networks instead of the traditional rule sets.</w:t>
       </w:r>
     </w:p>
     <w:p>
@@ -4730,7 +4751,15 @@
     </w:p>
     <w:p>
       <w:r>
-        <w:t>The only ethical consideration for this project that I can think is how the data for training has been obtained, have I gathered it in a shady manner, through not being clear on my intentions</w:t>
+        <w:t xml:space="preserve">The only ethical consideration for this project that I can think is how the data for training has been obtained, have I gathered it in a shady manner, </w:t>
+      </w:r>
+      <w:proofErr w:type="spellStart"/>
+      <w:r>
+        <w:t>through</w:t>
+      </w:r>
+      <w:proofErr w:type="spellEnd"/>
+      <w:r>
+        <w:t xml:space="preserve"> not being clear on my intentions</w:t>
       </w:r>
       <w:r>
         <w:t xml:space="preserve"> in the gathering of data. No, in this project the data has been ethically sourced through the University of New South Wales as they provide the UNSW NB-15 dataset for free for academic usage which this project falls under.</w:t>
@@ -4880,7 +4909,15 @@
         <w:t xml:space="preserve"> NumPy and pandas</w:t>
       </w:r>
       <w:r>
-        <w:t xml:space="preserve">, before loading the dataset, checking the dataset contains all of the expected features is advised considering the number of sites where these testing datasets are available from. </w:t>
+        <w:t xml:space="preserve">, before loading the dataset, checking the dataset contains </w:t>
+      </w:r>
+      <w:proofErr w:type="gramStart"/>
+      <w:r>
+        <w:t>all of</w:t>
+      </w:r>
+      <w:proofErr w:type="gramEnd"/>
+      <w:r>
+        <w:t xml:space="preserve"> the expected features is advised considering the number of sites where these testing datasets are available from. </w:t>
       </w:r>
     </w:p>
     <w:p>
@@ -5033,7 +5070,15 @@
         <w:t>nine</w:t>
       </w:r>
       <w:r>
-        <w:t xml:space="preserve"> different types of attacks, these attacks are Fuzzers, Analysis, Backdoors, DoS, Exploits, Generic, Reconnaissance, Shellcode and Worms. </w:t>
+        <w:t xml:space="preserve"> different types of attacks, these attacks are </w:t>
+      </w:r>
+      <w:proofErr w:type="spellStart"/>
+      <w:r>
+        <w:t>Fuzzers</w:t>
+      </w:r>
+      <w:proofErr w:type="spellEnd"/>
+      <w:r>
+        <w:t xml:space="preserve">, Analysis, Backdoors, DoS, Exploits, Generic, Reconnaissance, Shellcode and Worms. </w:t>
       </w:r>
     </w:p>
     <w:p>
@@ -5055,11 +5100,24 @@
       <w:bookmarkEnd w:id="16"/>
     </w:p>
     <w:p>
-      <w:r>
-        <w:t>In order to ensure that the ML model to accept and process the data</w:t>
-      </w:r>
-      <w:r>
-        <w:t xml:space="preserve">, the data must be pre-processed, it needs to go through a number of steps to </w:t>
+      <w:proofErr w:type="gramStart"/>
+      <w:r>
+        <w:t>In order to</w:t>
+      </w:r>
+      <w:proofErr w:type="gramEnd"/>
+      <w:r>
+        <w:t xml:space="preserve"> ensure that the ML model to accept and process the data</w:t>
+      </w:r>
+      <w:r>
+        <w:t xml:space="preserve">, the data must be pre-processed, it needs to go through </w:t>
+      </w:r>
+      <w:proofErr w:type="gramStart"/>
+      <w:r>
+        <w:t>a number of</w:t>
+      </w:r>
+      <w:proofErr w:type="gramEnd"/>
+      <w:r>
+        <w:t xml:space="preserve"> steps to </w:t>
       </w:r>
       <w:r>
         <w:t xml:space="preserve">that no errors occur during training and </w:t>
@@ -5083,7 +5141,23 @@
         <w:t>is</w:t>
       </w:r>
       <w:r>
-        <w:t xml:space="preserve"> key to drop columns that could poison training, for the UNSW NB15, this would be the label, id, and attack_cat as label and attack_cat denote whether a line of traffic is an attack or not, while the id column</w:t>
+        <w:t xml:space="preserve"> key to drop columns that could poison training, for the UNSW NB15, this would be the label, id, and </w:t>
+      </w:r>
+      <w:proofErr w:type="spellStart"/>
+      <w:r>
+        <w:t>attack_cat</w:t>
+      </w:r>
+      <w:proofErr w:type="spellEnd"/>
+      <w:r>
+        <w:t xml:space="preserve"> as label and </w:t>
+      </w:r>
+      <w:proofErr w:type="spellStart"/>
+      <w:r>
+        <w:t>attack_cat</w:t>
+      </w:r>
+      <w:proofErr w:type="spellEnd"/>
+      <w:r>
+        <w:t xml:space="preserve"> denote whether a line of traffic is an attack or not, while the id column</w:t>
       </w:r>
       <w:r>
         <w:t xml:space="preserve"> can cause models to f</w:t>
@@ -5122,8 +5196,13 @@
       <w:bookmarkEnd w:id="17"/>
     </w:p>
     <w:p>
-      <w:r>
-        <w:t xml:space="preserve">In order to ensure that the model with the highest accuracy is used for final predictions, I will train and test </w:t>
+      <w:proofErr w:type="gramStart"/>
+      <w:r>
+        <w:t>In order to</w:t>
+      </w:r>
+      <w:proofErr w:type="gramEnd"/>
+      <w:r>
+        <w:t xml:space="preserve"> ensure that the model with the highest accuracy is used for final predictions, I will train and test </w:t>
       </w:r>
       <w:r>
         <w:t>five</w:t>
@@ -5220,7 +5299,15 @@
         <w:t>F1:</w:t>
       </w:r>
       <w:r>
-        <w:t xml:space="preserve"> This metric combines Precision and Recall to help determine the balance between the </w:t>
+        <w:t xml:space="preserve"> This metric combines Precision and Recall </w:t>
+      </w:r>
+      <w:proofErr w:type="gramStart"/>
+      <w:r>
+        <w:t>to help</w:t>
+      </w:r>
+      <w:proofErr w:type="gramEnd"/>
+      <w:r>
+        <w:t xml:space="preserve"> determine the balance between the </w:t>
       </w:r>
       <w:r>
         <w:t>two and</w:t>
@@ -5266,7 +5353,23 @@
         <w:t xml:space="preserve"> </w:t>
       </w:r>
       <w:r>
-        <w:t>Random Forest makes predictions through the use of multiple decision trees in order to determine a single result, making use of feature randomness to ensure low levels of correlation between the different trees.</w:t>
+        <w:t xml:space="preserve">Random Forest makes predictions </w:t>
+      </w:r>
+      <w:proofErr w:type="gramStart"/>
+      <w:r>
+        <w:t>through the use of</w:t>
+      </w:r>
+      <w:proofErr w:type="gramEnd"/>
+      <w:r>
+        <w:t xml:space="preserve"> multiple decision trees </w:t>
+      </w:r>
+      <w:proofErr w:type="gramStart"/>
+      <w:r>
+        <w:t>in order to</w:t>
+      </w:r>
+      <w:proofErr w:type="gramEnd"/>
+      <w:r>
+        <w:t xml:space="preserve"> determine a single result, making use of feature randomness to ensure low levels of correlation between the different trees.</w:t>
       </w:r>
     </w:p>
     <w:p>
@@ -5313,7 +5416,15 @@
         <w:t xml:space="preserve"> </w:t>
       </w:r>
       <w:r>
-        <w:t>This model works to predict the probability of a specific outcome occurring, in this case, whether or not a piece of data is malicious or not</w:t>
+        <w:t xml:space="preserve">This model works to predict the probability of a specific outcome occurring, in this case, </w:t>
+      </w:r>
+      <w:proofErr w:type="gramStart"/>
+      <w:r>
+        <w:t>whether or not</w:t>
+      </w:r>
+      <w:proofErr w:type="gramEnd"/>
+      <w:r>
+        <w:t xml:space="preserve"> a piece of data is malicious or not</w:t>
       </w:r>
       <w:r>
         <w:t>, the probabilities of the outcomes are confined to between zero and one, with the probabilities determined, the results are fitted to an S curve to map the values to the probability</w:t>
@@ -5435,7 +5546,15 @@
     </w:p>
     <w:p>
       <w:r>
-        <w:t>Jupyter notebook was used as the main IDE for this project, due to how well it complements machine learning development with its use of cells, as the cells allow you to run individual segments of code without rerunning the entire code file, which is critical for machine learning due to how long it can take to run certain code blocks, such as model training, which for very demanding models, can take many hours to run. It also stores results in the file so you can view the information gained at a later date without rerunning the code.</w:t>
+        <w:t xml:space="preserve">Jupyter notebook was used as the main IDE for this project, due to how well it complements machine learning development with its use of cells, as the cells allow you to run individual segments of code without rerunning the entire code file, which is critical for machine learning due to how long it can take to run certain code blocks, such as model training, which for very demanding models, can take many hours to run. It also stores results in the file so you can view the information gained </w:t>
+      </w:r>
+      <w:proofErr w:type="gramStart"/>
+      <w:r>
+        <w:t>at a later date</w:t>
+      </w:r>
+      <w:proofErr w:type="gramEnd"/>
+      <w:r>
+        <w:t xml:space="preserve"> without rerunning the code.</w:t>
       </w:r>
     </w:p>
     <w:p>
@@ -5500,7 +5619,15 @@
         <w:t>Scikit-Learn + XGBoost</w:t>
       </w:r>
       <w:r>
-        <w:t>: These two libraries make up a large portion of the backbone of machine leaning development in python, with Scikit-Learn encompassing many different types of models, algorithms, preprocessing and a number of other features, this allows implementation of AI models to run much smoother than it would without it.</w:t>
+        <w:t xml:space="preserve">: These two libraries make up a large portion of the backbone of machine leaning development in python, with Scikit-Learn encompassing many different types of models, algorithms, preprocessing and </w:t>
+      </w:r>
+      <w:proofErr w:type="gramStart"/>
+      <w:r>
+        <w:t>a number of</w:t>
+      </w:r>
+      <w:proofErr w:type="gramEnd"/>
+      <w:r>
+        <w:t xml:space="preserve"> other features, this allows implementation of AI models to run much smoother than it would without it.</w:t>
       </w:r>
     </w:p>
     <w:p>
@@ -5520,7 +5647,15 @@
         <w:t>JobLib</w:t>
       </w:r>
       <w:r>
-        <w:t>: This was used in order to dump the model and feature columns from python to  a PKL file to allow for usage within other Jupyter notebook files without having to retrain the model, saving a considerable amount of time.</w:t>
+        <w:t xml:space="preserve">: This was used </w:t>
+      </w:r>
+      <w:proofErr w:type="gramStart"/>
+      <w:r>
+        <w:t>in order to</w:t>
+      </w:r>
+      <w:proofErr w:type="gramEnd"/>
+      <w:r>
+        <w:t xml:space="preserve"> dump the model and feature columns from python to  a PKL file to allow for usage within other Jupyter notebook files without having to retrain the model, saving a considerable amount of time.</w:t>
       </w:r>
     </w:p>
     <w:p>
@@ -5539,7 +5674,15 @@
         <w:t>SMTPLib</w:t>
       </w:r>
       <w:r>
-        <w:t>: This was used in order to implement email alerts, allowing the users to be informed if suspicious behaviour has been detected within the traffic log files.</w:t>
+        <w:t xml:space="preserve">: This was used </w:t>
+      </w:r>
+      <w:proofErr w:type="gramStart"/>
+      <w:r>
+        <w:t>in order to</w:t>
+      </w:r>
+      <w:proofErr w:type="gramEnd"/>
+      <w:r>
+        <w:t xml:space="preserve"> implement email alerts, allowing the users to be informed if suspicious behaviour has been detected within the traffic log files.</w:t>
       </w:r>
     </w:p>
     <w:p>
@@ -5593,6 +5736,7 @@
       <w:r>
         <w:t xml:space="preserve">The first steps taken were to import the required dependencies, including Pandas, </w:t>
       </w:r>
+      <w:proofErr w:type="spellStart"/>
       <w:r>
         <w:t>SK</w:t>
       </w:r>
@@ -5600,7 +5744,11 @@
         <w:t>lear</w:t>
       </w:r>
       <w:r>
-        <w:t>n and its numerous modules, NumPy, and XGBoost, then moved to establish the file path to the test and train files of the dataset and loading it into the notebook using pandas.</w:t>
+        <w:t>n</w:t>
+      </w:r>
+      <w:proofErr w:type="spellEnd"/>
+      <w:r>
+        <w:t xml:space="preserve"> and its numerous modules, NumPy, and XGBoost, then moved to establish the file path to the test and train files of the dataset and loading it into the notebook using pandas.</w:t>
       </w:r>
     </w:p>
     <w:p>
@@ -5675,7 +5823,15 @@
     </w:p>
     <w:p>
       <w:r>
-        <w:t xml:space="preserve">I started by removing the non-feature columns and any columns that could produce leaks that would poison the training and testing by either allowing the models to cheat using columns like attack_cat which contains the type of attack the line </w:t>
+        <w:t xml:space="preserve">I started by removing the non-feature columns and any columns that could produce leaks that would poison the training and testing by either allowing the models to cheat using columns like </w:t>
+      </w:r>
+      <w:proofErr w:type="spellStart"/>
+      <w:r>
+        <w:t>attack_cat</w:t>
+      </w:r>
+      <w:proofErr w:type="spellEnd"/>
+      <w:r>
+        <w:t xml:space="preserve"> which contains the type of attack the line </w:t>
       </w:r>
       <w:r>
         <w:t>was or</w:t>
@@ -5850,7 +6006,15 @@
     </w:p>
     <w:p>
       <w:r>
-        <w:t>As previously mentioned, the models I trained during this stage of development are Random Forest, KNN, Logistic Regression, Linear SVM, and XGBoost, I chose these models due to the range of techniques used by the different models in order to determine which would best suit and perform the best against the UNSW NB-15 dataset</w:t>
+        <w:t xml:space="preserve">As previously mentioned, the models I trained during this stage of development are Random Forest, KNN, Logistic Regression, Linear SVM, and XGBoost, I chose these models due to the range of techniques used by the different models </w:t>
+      </w:r>
+      <w:proofErr w:type="gramStart"/>
+      <w:r>
+        <w:t>in order to</w:t>
+      </w:r>
+      <w:proofErr w:type="gramEnd"/>
+      <w:r>
+        <w:t xml:space="preserve"> determine which would best suit and perform the best against the UNSW NB-15 dataset</w:t>
       </w:r>
       <w:r>
         <w:t>. Below is a section of the code showing the parameters that were used for training.</w:t>
@@ -6444,7 +6608,15 @@
         <w:t xml:space="preserve"> </w:t>
       </w:r>
       <w:r>
-        <w:t xml:space="preserve">ensure the model trains to the same precision as it showed during first round of training the same steps of preprocessing were used, including dropping the columns to reduce the risk of feature leak to prevent the model from cheating, to ensure fairness all of the data was encoded in the same datatype as it was previously. </w:t>
+        <w:t xml:space="preserve">ensure the model trains to the same precision as it showed during first round of training the same steps of preprocessing were used, including dropping the columns to reduce the risk of feature leak to prevent the model from cheating, to ensure fairness </w:t>
+      </w:r>
+      <w:proofErr w:type="gramStart"/>
+      <w:r>
+        <w:t>all of</w:t>
+      </w:r>
+      <w:proofErr w:type="gramEnd"/>
+      <w:r>
+        <w:t xml:space="preserve"> the data was encoded in the same datatype as it was previously. </w:t>
       </w:r>
     </w:p>
     <w:p>
@@ -7108,10 +7280,26 @@
         <w:t xml:space="preserve"> on its own to prevent </w:t>
       </w:r>
       <w:r>
-        <w:t>system intrusion, it can only alert the analyst or user who can take action on the information.</w:t>
-      </w:r>
-      <w:r>
-        <w:t xml:space="preserve"> Below is an example of the output, in real world usage, the attack_cat column wouldn’t be </w:t>
+        <w:t xml:space="preserve">system intrusion, it can only alert the analyst or user who can </w:t>
+      </w:r>
+      <w:proofErr w:type="gramStart"/>
+      <w:r>
+        <w:t>take action</w:t>
+      </w:r>
+      <w:proofErr w:type="gramEnd"/>
+      <w:r>
+        <w:t xml:space="preserve"> on the information.</w:t>
+      </w:r>
+      <w:r>
+        <w:t xml:space="preserve"> Below is an example of the output, in real world usage, the </w:t>
+      </w:r>
+      <w:proofErr w:type="spellStart"/>
+      <w:r>
+        <w:t>attack_cat</w:t>
+      </w:r>
+      <w:proofErr w:type="spellEnd"/>
+      <w:r>
+        <w:t xml:space="preserve"> column wouldn’t be </w:t>
       </w:r>
       <w:r>
         <w:t>present,</w:t>
@@ -7867,7 +8055,15 @@
         <w:t xml:space="preserve">the </w:t>
       </w:r>
       <w:r>
-        <w:t>previous sprint but issues occurred since I was not making use of the training dataset</w:t>
+        <w:t xml:space="preserve">previous </w:t>
+      </w:r>
+      <w:proofErr w:type="gramStart"/>
+      <w:r>
+        <w:t>sprint</w:t>
+      </w:r>
+      <w:proofErr w:type="gramEnd"/>
+      <w:r>
+        <w:t xml:space="preserve"> but issues occurred since I was not making use of the training dataset</w:t>
       </w:r>
       <w:r>
         <w:t>.</w:t>
@@ -7929,7 +8125,23 @@
     </w:p>
     <w:p>
       <w:r>
-        <w:t>The system threw errors relating to feature mismatch between what the was expecting from the columns and what it got, this is due to the columns of test and train for UNSW NB-15 being slightly different, an example of this is the srcip and dstip columns which the train set has while the test does not.</w:t>
+        <w:t xml:space="preserve">The system threw errors relating to feature mismatch between what the was expecting from the columns and what it got, this is due to the columns of test and train for UNSW NB-15 being slightly different, an example of this is the </w:t>
+      </w:r>
+      <w:proofErr w:type="spellStart"/>
+      <w:r>
+        <w:t>srcip</w:t>
+      </w:r>
+      <w:proofErr w:type="spellEnd"/>
+      <w:r>
+        <w:t xml:space="preserve"> and </w:t>
+      </w:r>
+      <w:proofErr w:type="spellStart"/>
+      <w:r>
+        <w:t>dstip</w:t>
+      </w:r>
+      <w:proofErr w:type="spellEnd"/>
+      <w:r>
+        <w:t xml:space="preserve"> columns which the train set has while the test does not.</w:t>
       </w:r>
     </w:p>
     <w:p>
@@ -8360,7 +8572,15 @@
     </w:p>
     <w:p>
       <w:r>
-        <w:t>With how key the output is for a NIDS, making sure that the information outputted by the system is valid was key, the results were validated by including the attack_cat column in the output, the use of this column allowed analysis to see if the predictions made by the system were accurate and while there were a number of false positives within the output which while unfortunate was expected due to the nature of machine learning, the output was accurate to expectation with a high levels of true positives within the output.</w:t>
+        <w:t xml:space="preserve">With how key the output is for a NIDS, making sure that the information outputted by the system is valid was key, the results were validated by including the </w:t>
+      </w:r>
+      <w:proofErr w:type="spellStart"/>
+      <w:r>
+        <w:t>attack_cat</w:t>
+      </w:r>
+      <w:proofErr w:type="spellEnd"/>
+      <w:r>
+        <w:t xml:space="preserve"> column in the output, the use of this column allowed analysis to see if the predictions made by the system were accurate and while there were a number of false positives within the output which while unfortunate was expected due to the nature of machine learning, the output was accurate to expectation with a high levels of true positives within the output.</w:t>
       </w:r>
       <w:r>
         <w:t xml:space="preserve"> </w:t>
@@ -8946,7 +9166,15 @@
         <w:t>anomaly-based</w:t>
       </w:r>
       <w:r>
-        <w:t xml:space="preserve"> detection methods have, but tend to have higher false positive rates which increases the work load on analysts and shows one of the main limitations of only using ML based detection.</w:t>
+        <w:t xml:space="preserve"> detection methods have, but tend to have higher false positive rates which increases the </w:t>
+      </w:r>
+      <w:proofErr w:type="gramStart"/>
+      <w:r>
+        <w:t>work load</w:t>
+      </w:r>
+      <w:proofErr w:type="gramEnd"/>
+      <w:r>
+        <w:t xml:space="preserve"> on analysts and shows one of the main limitations of only using ML based detection.</w:t>
       </w:r>
     </w:p>
     <w:p>
@@ -8966,7 +9194,15 @@
     </w:p>
     <w:p>
       <w:r>
-        <w:t>While the system has met all set objectives relating to its development, there are some features or improvements that could be made if work were to continue into the future but fell beyond the original scope of this project or would make it more suitable for a live running environment or weren’t key due to the academic nature of this project.</w:t>
+        <w:t xml:space="preserve">While the system has met all set objectives relating to its development, there are some features or improvements that could be made if work were to </w:t>
+      </w:r>
+      <w:proofErr w:type="gramStart"/>
+      <w:r>
+        <w:t>continue into the future</w:t>
+      </w:r>
+      <w:proofErr w:type="gramEnd"/>
+      <w:r>
+        <w:t xml:space="preserve"> but fell beyond the original scope of this project or would make it more suitable for a live running environment or weren’t key due to the academic nature of this project.</w:t>
       </w:r>
     </w:p>
     <w:p>
@@ -9011,7 +9247,15 @@
         <w:t>-</w:t>
       </w:r>
       <w:r>
-        <w:t xml:space="preserve">world dataset but the issue is obtaining them due to the sensitive nature of the </w:t>
+        <w:t xml:space="preserve">world </w:t>
+      </w:r>
+      <w:proofErr w:type="gramStart"/>
+      <w:r>
+        <w:t>dataset</w:t>
+      </w:r>
+      <w:proofErr w:type="gramEnd"/>
+      <w:r>
+        <w:t xml:space="preserve"> but the issue is obtaining them due to the sensitive nature of the </w:t>
       </w:r>
       <w:r>
         <w:t>real-world</w:t>
@@ -9048,7 +9292,15 @@
     </w:p>
     <w:p>
       <w:r>
-        <w:t>The technical objectives set out in the beginning have been completed successfully, with all features designed and implemented, including the training and accuracy testing of multiple AI algorithms, these models where then tested using appropriate metrics namely, precision, accuracy, recall, and f1. The alert system detailed in the objectives was successfully implemented through the use of SMTPlib and googles smtp server.</w:t>
+        <w:t xml:space="preserve">The technical objectives set out in the beginning have been completed successfully, with all features designed and implemented, including the training and accuracy testing of multiple AI algorithms, these models where then tested using appropriate metrics namely, precision, accuracy, recall, and f1. The alert system detailed in the objectives was successfully implemented </w:t>
+      </w:r>
+      <w:proofErr w:type="gramStart"/>
+      <w:r>
+        <w:t>through the use of</w:t>
+      </w:r>
+      <w:proofErr w:type="gramEnd"/>
+      <w:r>
+        <w:t xml:space="preserve"> SMTPlib and googles smtp server.</w:t>
       </w:r>
     </w:p>
     <w:p>

</xml_diff>